<commit_message>
feat: Aprimora geração de relatórios com multi-contexto e formatação avançada
- **Geração de Relatórios ():**
    - Implementa upload múltiplo de planilhas de contexto, com consolidação de dados e alerta de colunas duplicadas.
    - Adiciona seletor (multiselect) para escolher quais auditados terão relatórios gerados.
    - Inclui o arquivo Markdown processado () no ZIP final para fins de debug.

- **Utilitários e Formatação ():**
    - Adiciona : Aplica formatação automática em tabelas DOCX (autofit, fonte Calibri, tamanhos parametrizáveis para cabeçalho/corpo e justificação).
    - Adiciona : Implementa numeração automática e legendas padronizadas para tabelas (suporta sintaxe Pandoc  e ).
    - Adiciona : Substitui  por quebras de página nativas OpenXML para compatibilidade com Word.

- **Dependências:**
    - Remove referência ao filtro Lua externo, priorizando processamento via Python.
</commit_message>
<xml_diff>
--- a/docs/template-relatorio-individual.docx
+++ b/docs/template-relatorio-individual.docx
@@ -457,6 +457,277 @@
         <w:t xml:space="preserve"> – CSA), por meio do qual foi disponibilizado um questionário eletrônico para que os gestores preenchessem as respostas que melhor refletiam a situação das respectivas organizações com relação às medidas de segurança e controles elencados. Além de permitir que as organizações verificassem quais controles foram implementados, as questões também devem ser utilizadas como referência para a condução de futuras iniciativas de adequação.</w:t>
       </w:r>
     </w:p>
+    <w:tbl>
+      <w:tblPr>
+        <w:tblStyle w:val="TabeladeGrade4-nfase1"/>
+        <w:tblW w:w="0" w:type="auto"/>
+        <w:tblLook w:val="04A0" w:firstRow="1" w:lastRow="0" w:firstColumn="1" w:lastColumn="0" w:noHBand="0" w:noVBand="1"/>
+      </w:tblPr>
+      <w:tblGrid>
+        <w:gridCol w:w="2265"/>
+        <w:gridCol w:w="2265"/>
+        <w:gridCol w:w="2265"/>
+        <w:gridCol w:w="2266"/>
+      </w:tblGrid>
+      <w:tr>
+        <w:trPr>
+          <w:cnfStyle w:val="100000000000" w:firstRow="1" w:lastRow="0" w:firstColumn="0" w:lastColumn="0" w:oddVBand="0" w:evenVBand="0" w:oddHBand="0" w:evenHBand="0" w:firstRowFirstColumn="0" w:firstRowLastColumn="0" w:lastRowFirstColumn="0" w:lastRowLastColumn="0"/>
+        </w:trPr>
+        <w:tc>
+          <w:tcPr>
+            <w:cnfStyle w:val="001000000000" w:firstRow="0" w:lastRow="0" w:firstColumn="1" w:lastColumn="0" w:oddVBand="0" w:evenVBand="0" w:oddHBand="0" w:evenHBand="0" w:firstRowFirstColumn="0" w:firstRowLastColumn="0" w:lastRowFirstColumn="0" w:lastRowLastColumn="0"/>
+            <w:tcW w:w="2265" w:type="dxa"/>
+          </w:tcPr>
+          <w:p>
+            <w:pPr>
+              <w:ind w:firstLine="0"/>
+              <w:rPr>
+                <w:rFonts w:eastAsia="Arial" w:cs="Arial"/>
+                <w:szCs w:val="24"/>
+              </w:rPr>
+            </w:pPr>
+          </w:p>
+        </w:tc>
+        <w:tc>
+          <w:tcPr>
+            <w:tcW w:w="2265" w:type="dxa"/>
+          </w:tcPr>
+          <w:p>
+            <w:pPr>
+              <w:ind w:firstLine="0"/>
+              <w:cnfStyle w:val="100000000000" w:firstRow="1" w:lastRow="0" w:firstColumn="0" w:lastColumn="0" w:oddVBand="0" w:evenVBand="0" w:oddHBand="0" w:evenHBand="0" w:firstRowFirstColumn="0" w:firstRowLastColumn="0" w:lastRowFirstColumn="0" w:lastRowLastColumn="0"/>
+              <w:rPr>
+                <w:rFonts w:eastAsia="Arial" w:cs="Arial"/>
+                <w:szCs w:val="24"/>
+              </w:rPr>
+            </w:pPr>
+          </w:p>
+        </w:tc>
+        <w:tc>
+          <w:tcPr>
+            <w:tcW w:w="2265" w:type="dxa"/>
+          </w:tcPr>
+          <w:p>
+            <w:pPr>
+              <w:ind w:firstLine="0"/>
+              <w:cnfStyle w:val="100000000000" w:firstRow="1" w:lastRow="0" w:firstColumn="0" w:lastColumn="0" w:oddVBand="0" w:evenVBand="0" w:oddHBand="0" w:evenHBand="0" w:firstRowFirstColumn="0" w:firstRowLastColumn="0" w:lastRowFirstColumn="0" w:lastRowLastColumn="0"/>
+              <w:rPr>
+                <w:rFonts w:eastAsia="Arial" w:cs="Arial"/>
+                <w:szCs w:val="24"/>
+              </w:rPr>
+            </w:pPr>
+          </w:p>
+        </w:tc>
+        <w:tc>
+          <w:tcPr>
+            <w:tcW w:w="2266" w:type="dxa"/>
+          </w:tcPr>
+          <w:p>
+            <w:pPr>
+              <w:ind w:firstLine="0"/>
+              <w:cnfStyle w:val="100000000000" w:firstRow="1" w:lastRow="0" w:firstColumn="0" w:lastColumn="0" w:oddVBand="0" w:evenVBand="0" w:oddHBand="0" w:evenHBand="0" w:firstRowFirstColumn="0" w:firstRowLastColumn="0" w:lastRowFirstColumn="0" w:lastRowLastColumn="0"/>
+              <w:rPr>
+                <w:rFonts w:eastAsia="Arial" w:cs="Arial"/>
+                <w:szCs w:val="24"/>
+              </w:rPr>
+            </w:pPr>
+          </w:p>
+        </w:tc>
+      </w:tr>
+      <w:tr>
+        <w:trPr>
+          <w:cnfStyle w:val="000000100000" w:firstRow="0" w:lastRow="0" w:firstColumn="0" w:lastColumn="0" w:oddVBand="0" w:evenVBand="0" w:oddHBand="1" w:evenHBand="0" w:firstRowFirstColumn="0" w:firstRowLastColumn="0" w:lastRowFirstColumn="0" w:lastRowLastColumn="0"/>
+        </w:trPr>
+        <w:tc>
+          <w:tcPr>
+            <w:cnfStyle w:val="001000000000" w:firstRow="0" w:lastRow="0" w:firstColumn="1" w:lastColumn="0" w:oddVBand="0" w:evenVBand="0" w:oddHBand="0" w:evenHBand="0" w:firstRowFirstColumn="0" w:firstRowLastColumn="0" w:lastRowFirstColumn="0" w:lastRowLastColumn="0"/>
+            <w:tcW w:w="2265" w:type="dxa"/>
+          </w:tcPr>
+          <w:p>
+            <w:pPr>
+              <w:ind w:firstLine="0"/>
+              <w:rPr>
+                <w:rFonts w:eastAsia="Arial" w:cs="Arial"/>
+                <w:szCs w:val="24"/>
+              </w:rPr>
+            </w:pPr>
+          </w:p>
+        </w:tc>
+        <w:tc>
+          <w:tcPr>
+            <w:tcW w:w="2265" w:type="dxa"/>
+          </w:tcPr>
+          <w:p>
+            <w:pPr>
+              <w:ind w:firstLine="0"/>
+              <w:cnfStyle w:val="000000100000" w:firstRow="0" w:lastRow="0" w:firstColumn="0" w:lastColumn="0" w:oddVBand="0" w:evenVBand="0" w:oddHBand="1" w:evenHBand="0" w:firstRowFirstColumn="0" w:firstRowLastColumn="0" w:lastRowFirstColumn="0" w:lastRowLastColumn="0"/>
+              <w:rPr>
+                <w:rFonts w:eastAsia="Arial" w:cs="Arial"/>
+                <w:szCs w:val="24"/>
+                <w:u w:val="single"/>
+              </w:rPr>
+            </w:pPr>
+          </w:p>
+        </w:tc>
+        <w:tc>
+          <w:tcPr>
+            <w:tcW w:w="2265" w:type="dxa"/>
+          </w:tcPr>
+          <w:p>
+            <w:pPr>
+              <w:ind w:firstLine="0"/>
+              <w:cnfStyle w:val="000000100000" w:firstRow="0" w:lastRow="0" w:firstColumn="0" w:lastColumn="0" w:oddVBand="0" w:evenVBand="0" w:oddHBand="1" w:evenHBand="0" w:firstRowFirstColumn="0" w:firstRowLastColumn="0" w:lastRowFirstColumn="0" w:lastRowLastColumn="0"/>
+              <w:rPr>
+                <w:rFonts w:eastAsia="Arial" w:cs="Arial"/>
+                <w:szCs w:val="24"/>
+              </w:rPr>
+            </w:pPr>
+          </w:p>
+        </w:tc>
+        <w:tc>
+          <w:tcPr>
+            <w:tcW w:w="2266" w:type="dxa"/>
+          </w:tcPr>
+          <w:p>
+            <w:pPr>
+              <w:ind w:firstLine="0"/>
+              <w:cnfStyle w:val="000000100000" w:firstRow="0" w:lastRow="0" w:firstColumn="0" w:lastColumn="0" w:oddVBand="0" w:evenVBand="0" w:oddHBand="1" w:evenHBand="0" w:firstRowFirstColumn="0" w:firstRowLastColumn="0" w:lastRowFirstColumn="0" w:lastRowLastColumn="0"/>
+              <w:rPr>
+                <w:rFonts w:eastAsia="Arial" w:cs="Arial"/>
+                <w:szCs w:val="24"/>
+              </w:rPr>
+            </w:pPr>
+          </w:p>
+        </w:tc>
+      </w:tr>
+      <w:tr>
+        <w:tc>
+          <w:tcPr>
+            <w:cnfStyle w:val="001000000000" w:firstRow="0" w:lastRow="0" w:firstColumn="1" w:lastColumn="0" w:oddVBand="0" w:evenVBand="0" w:oddHBand="0" w:evenHBand="0" w:firstRowFirstColumn="0" w:firstRowLastColumn="0" w:lastRowFirstColumn="0" w:lastRowLastColumn="0"/>
+            <w:tcW w:w="2265" w:type="dxa"/>
+          </w:tcPr>
+          <w:p>
+            <w:pPr>
+              <w:ind w:firstLine="0"/>
+              <w:rPr>
+                <w:rFonts w:eastAsia="Arial" w:cs="Arial"/>
+                <w:szCs w:val="24"/>
+              </w:rPr>
+            </w:pPr>
+          </w:p>
+        </w:tc>
+        <w:tc>
+          <w:tcPr>
+            <w:tcW w:w="2265" w:type="dxa"/>
+          </w:tcPr>
+          <w:p>
+            <w:pPr>
+              <w:ind w:firstLine="0"/>
+              <w:cnfStyle w:val="000000000000" w:firstRow="0" w:lastRow="0" w:firstColumn="0" w:lastColumn="0" w:oddVBand="0" w:evenVBand="0" w:oddHBand="0" w:evenHBand="0" w:firstRowFirstColumn="0" w:firstRowLastColumn="0" w:lastRowFirstColumn="0" w:lastRowLastColumn="0"/>
+              <w:rPr>
+                <w:rFonts w:eastAsia="Arial" w:cs="Arial"/>
+                <w:szCs w:val="24"/>
+              </w:rPr>
+            </w:pPr>
+          </w:p>
+        </w:tc>
+        <w:tc>
+          <w:tcPr>
+            <w:tcW w:w="2265" w:type="dxa"/>
+          </w:tcPr>
+          <w:p>
+            <w:pPr>
+              <w:ind w:firstLine="0"/>
+              <w:cnfStyle w:val="000000000000" w:firstRow="0" w:lastRow="0" w:firstColumn="0" w:lastColumn="0" w:oddVBand="0" w:evenVBand="0" w:oddHBand="0" w:evenHBand="0" w:firstRowFirstColumn="0" w:firstRowLastColumn="0" w:lastRowFirstColumn="0" w:lastRowLastColumn="0"/>
+              <w:rPr>
+                <w:rFonts w:eastAsia="Arial" w:cs="Arial"/>
+                <w:szCs w:val="24"/>
+              </w:rPr>
+            </w:pPr>
+          </w:p>
+        </w:tc>
+        <w:tc>
+          <w:tcPr>
+            <w:tcW w:w="2266" w:type="dxa"/>
+          </w:tcPr>
+          <w:p>
+            <w:pPr>
+              <w:ind w:firstLine="0"/>
+              <w:cnfStyle w:val="000000000000" w:firstRow="0" w:lastRow="0" w:firstColumn="0" w:lastColumn="0" w:oddVBand="0" w:evenVBand="0" w:oddHBand="0" w:evenHBand="0" w:firstRowFirstColumn="0" w:firstRowLastColumn="0" w:lastRowFirstColumn="0" w:lastRowLastColumn="0"/>
+              <w:rPr>
+                <w:rFonts w:eastAsia="Arial" w:cs="Arial"/>
+                <w:szCs w:val="24"/>
+              </w:rPr>
+            </w:pPr>
+          </w:p>
+        </w:tc>
+      </w:tr>
+      <w:tr>
+        <w:trPr>
+          <w:cnfStyle w:val="000000100000" w:firstRow="0" w:lastRow="0" w:firstColumn="0" w:lastColumn="0" w:oddVBand="0" w:evenVBand="0" w:oddHBand="1" w:evenHBand="0" w:firstRowFirstColumn="0" w:firstRowLastColumn="0" w:lastRowFirstColumn="0" w:lastRowLastColumn="0"/>
+        </w:trPr>
+        <w:tc>
+          <w:tcPr>
+            <w:cnfStyle w:val="001000000000" w:firstRow="0" w:lastRow="0" w:firstColumn="1" w:lastColumn="0" w:oddVBand="0" w:evenVBand="0" w:oddHBand="0" w:evenHBand="0" w:firstRowFirstColumn="0" w:firstRowLastColumn="0" w:lastRowFirstColumn="0" w:lastRowLastColumn="0"/>
+            <w:tcW w:w="2265" w:type="dxa"/>
+          </w:tcPr>
+          <w:p>
+            <w:pPr>
+              <w:ind w:firstLine="0"/>
+              <w:rPr>
+                <w:rFonts w:eastAsia="Arial" w:cs="Arial"/>
+                <w:szCs w:val="24"/>
+              </w:rPr>
+            </w:pPr>
+          </w:p>
+        </w:tc>
+        <w:tc>
+          <w:tcPr>
+            <w:tcW w:w="2265" w:type="dxa"/>
+          </w:tcPr>
+          <w:p>
+            <w:pPr>
+              <w:ind w:firstLine="0"/>
+              <w:cnfStyle w:val="000000100000" w:firstRow="0" w:lastRow="0" w:firstColumn="0" w:lastColumn="0" w:oddVBand="0" w:evenVBand="0" w:oddHBand="1" w:evenHBand="0" w:firstRowFirstColumn="0" w:firstRowLastColumn="0" w:lastRowFirstColumn="0" w:lastRowLastColumn="0"/>
+              <w:rPr>
+                <w:rFonts w:eastAsia="Arial" w:cs="Arial"/>
+                <w:szCs w:val="24"/>
+              </w:rPr>
+            </w:pPr>
+          </w:p>
+        </w:tc>
+        <w:tc>
+          <w:tcPr>
+            <w:tcW w:w="2265" w:type="dxa"/>
+          </w:tcPr>
+          <w:p>
+            <w:pPr>
+              <w:ind w:firstLine="0"/>
+              <w:cnfStyle w:val="000000100000" w:firstRow="0" w:lastRow="0" w:firstColumn="0" w:lastColumn="0" w:oddVBand="0" w:evenVBand="0" w:oddHBand="1" w:evenHBand="0" w:firstRowFirstColumn="0" w:firstRowLastColumn="0" w:lastRowFirstColumn="0" w:lastRowLastColumn="0"/>
+              <w:rPr>
+                <w:rFonts w:eastAsia="Arial" w:cs="Arial"/>
+                <w:szCs w:val="24"/>
+              </w:rPr>
+            </w:pPr>
+          </w:p>
+        </w:tc>
+        <w:tc>
+          <w:tcPr>
+            <w:tcW w:w="2266" w:type="dxa"/>
+          </w:tcPr>
+          <w:p>
+            <w:pPr>
+              <w:ind w:firstLine="0"/>
+              <w:cnfStyle w:val="000000100000" w:firstRow="0" w:lastRow="0" w:firstColumn="0" w:lastColumn="0" w:oddVBand="0" w:evenVBand="0" w:oddHBand="1" w:evenHBand="0" w:firstRowFirstColumn="0" w:firstRowLastColumn="0" w:lastRowFirstColumn="0" w:lastRowLastColumn="0"/>
+              <w:rPr>
+                <w:rFonts w:eastAsia="Arial" w:cs="Arial"/>
+                <w:szCs w:val="24"/>
+              </w:rPr>
+            </w:pPr>
+          </w:p>
+        </w:tc>
+      </w:tr>
+    </w:tbl>
     <w:p>
       <w:pPr>
         <w:ind w:firstLine="709"/>
@@ -465,6 +736,15 @@
           <w:szCs w:val="24"/>
         </w:rPr>
       </w:pPr>
+    </w:p>
+    <w:p>
+      <w:pPr>
+        <w:ind w:firstLine="709"/>
+        <w:rPr>
+          <w:rFonts w:eastAsia="Arial" w:cs="Arial"/>
+          <w:szCs w:val="24"/>
+        </w:rPr>
+      </w:pPr>
       <w:r>
         <w:rPr>
           <w:rFonts w:eastAsia="Arial" w:cs="Arial"/>
@@ -478,7 +758,7 @@
           <w:rFonts w:eastAsia="Arial" w:cs="Arial"/>
           <w:szCs w:val="24"/>
         </w:rPr>
-        <w:footnoteReference w:id="1"/>
+        <w:footnoteReference w:id="2"/>
       </w:r>
       <w:r>
         <w:rPr>
@@ -535,7 +815,7 @@
           <w:rFonts w:eastAsia="Arial" w:cs="Arial"/>
           <w:szCs w:val="24"/>
         </w:rPr>
-        <w:footnoteReference w:id="2"/>
+        <w:footnoteReference w:id="3"/>
       </w:r>
       <w:r>
         <w:rPr>
@@ -558,6 +838,7 @@
           <w:rFonts w:eastAsia="Arial" w:cs="Arial"/>
           <w:szCs w:val="24"/>
         </w:rPr>
+        <w:lastRenderedPageBreak/>
         <w:t xml:space="preserve">As medidas básicas dos Controles CIS, também conhecidas como medidas de higiene cibernética, integram o grupo de implementação 1 (IG1) do framework, representando o padrão mínimo a ser adotado por toda organização. Essas salvaguardas, segundo o </w:t>
       </w:r>
       <w:r>
@@ -600,15 +881,7 @@
           <w:rFonts w:eastAsia="Arial" w:cs="Arial"/>
           <w:szCs w:val="24"/>
         </w:rPr>
-        <w:t xml:space="preserve">m </w:t>
-      </w:r>
-      <w:r>
-        <w:rPr>
-          <w:rFonts w:eastAsia="Arial" w:cs="Arial"/>
-          <w:szCs w:val="24"/>
-        </w:rPr>
-        <w:lastRenderedPageBreak/>
-        <w:t xml:space="preserve">defender as organizações contra cerca de 77% dos ataques de </w:t>
+        <w:t xml:space="preserve">m defender as organizações contra cerca de 77% dos ataques de </w:t>
       </w:r>
       <w:r>
         <w:rPr>
@@ -1004,7 +1277,7 @@
           <w:rFonts w:eastAsia="Arial" w:cs="Arial"/>
           <w:szCs w:val="24"/>
         </w:rPr>
-        <w:footnoteReference w:id="3"/>
+        <w:footnoteReference w:id="4"/>
       </w:r>
       <w:r>
         <w:rPr>
@@ -1084,6 +1357,7 @@
             </w:pPr>
             <w:proofErr w:type="spellStart"/>
             <w:r>
+              <w:lastRenderedPageBreak/>
               <w:t>Coluna</w:t>
             </w:r>
             <w:proofErr w:type="spellEnd"/>
@@ -1099,7 +1373,6 @@
           <w:p>
             <w:pPr>
               <w:pStyle w:val="Compact"/>
-              <w:jc w:val="center"/>
             </w:pPr>
             <w:proofErr w:type="spellStart"/>
             <w:r>
@@ -1156,7 +1429,6 @@
           <w:p>
             <w:pPr>
               <w:pStyle w:val="Compact"/>
-              <w:jc w:val="center"/>
             </w:pPr>
             <w:r>
               <w:t>Centro</w:t>
@@ -1203,7 +1475,6 @@
           <w:p>
             <w:pPr>
               <w:pStyle w:val="Compact"/>
-              <w:jc w:val="center"/>
             </w:pPr>
             <w:r>
               <w:t>2</w:t>
@@ -1248,7 +1519,6 @@
           <w:p>
             <w:pPr>
               <w:pStyle w:val="Compact"/>
-              <w:jc w:val="center"/>
             </w:pPr>
             <w:r>
               <w:t>5</w:t>
@@ -1292,7 +1562,6 @@
           <w:rFonts w:eastAsia="Arial" w:cs="Arial"/>
           <w:szCs w:val="24"/>
         </w:rPr>
-        <w:lastRenderedPageBreak/>
         <w:t xml:space="preserve">Ao final, calculou-se o índice parcial de adequação às medidas </w:t>
       </w:r>
       <w:r>
@@ -1568,7 +1837,7 @@
           <w:rFonts w:eastAsia="Arial" w:cs="Arial"/>
           <w:szCs w:val="24"/>
         </w:rPr>
-        <w:footnoteReference w:id="4"/>
+        <w:footnoteReference w:id="5"/>
       </w:r>
       <w:r>
         <w:rPr>
@@ -1620,6 +1889,7 @@
         <w:pStyle w:val="Ttulo2"/>
       </w:pPr>
       <w:r>
+        <w:lastRenderedPageBreak/>
         <w:t xml:space="preserve">2.1. </w:t>
       </w:r>
       <w:r>
@@ -1667,7 +1937,6 @@
         <w:rPr>
           <w:noProof/>
         </w:rPr>
-        <w:lastRenderedPageBreak/>
         <w:drawing>
           <wp:inline distT="0" distB="0" distL="0" distR="0" wp14:anchorId="0D8C7B0A" wp14:editId="15FF6F15">
             <wp:extent cx="5760085" cy="2826849"/>
@@ -1937,6 +2206,7 @@
         <w:rPr>
           <w:rFonts w:eastAsia="Arial"/>
         </w:rPr>
+        <w:lastRenderedPageBreak/>
         <w:t>Observando o cenário geral de adoção dos controles de medidas básicas de segurança da informação e segurança cibernética</w:t>
       </w:r>
       <w:r>
@@ -2057,7 +2327,6 @@
         <w:rPr>
           <w:noProof/>
         </w:rPr>
-        <w:lastRenderedPageBreak/>
         <w:drawing>
           <wp:inline distT="0" distB="0" distL="0" distR="0" wp14:anchorId="4C4EA44E" wp14:editId="6600DD53">
             <wp:extent cx="5760085" cy="3326130"/>
@@ -2758,6 +3027,7 @@
         <w:rPr>
           <w:rFonts w:eastAsia="Arial"/>
         </w:rPr>
+        <w:lastRenderedPageBreak/>
         <w:t>2.2.1. Controle 00 – Estrutura de Segurança da Informação</w:t>
       </w:r>
     </w:p>
@@ -2832,7 +3102,6 @@
           <w:rFonts w:eastAsia="Arial" w:cs="Arial"/>
           <w:szCs w:val="24"/>
         </w:rPr>
-        <w:lastRenderedPageBreak/>
         <w:t>Um dos resultados esperados desse controle é a elaboração e manutenção da Política de Segurança da Informação que norteará como a organização realiza o tratamento dos riscos de segurança.</w:t>
       </w:r>
     </w:p>
@@ -3758,7 +4027,15 @@
           <w:rFonts w:eastAsia="Arial" w:cs="Arial"/>
           <w:szCs w:val="24"/>
         </w:rPr>
-        <w:t>Este controle verifica a existência de processos formais e contínuos para o inventário, rastreamento e gestão de todos os ativos corporativos conectados à infraestrutura da organização, sejam dispositivos físicos, virtuais ou baseados em nuvem. A adoção de uma gestão ativa e estruturada desses ativos permite identificar, corrigir e, se necessário, remover dispositivos não autorizados ou não gerenciados, reduzindo significativamente os riscos de segurança.</w:t>
+        <w:t xml:space="preserve">Este controle verifica a existência de processos formais e contínuos para o inventário, rastreamento e gestão de todos os ativos corporativos conectados à infraestrutura da </w:t>
+      </w:r>
+      <w:r>
+        <w:rPr>
+          <w:rFonts w:eastAsia="Arial" w:cs="Arial"/>
+          <w:szCs w:val="24"/>
+        </w:rPr>
+        <w:lastRenderedPageBreak/>
+        <w:t>organização, sejam dispositivos físicos, virtuais ou baseados em nuvem. A adoção de uma gestão ativa e estruturada desses ativos permite identificar, corrigir e, se necessário, remover dispositivos não autorizados ou não gerenciados, reduzindo significativamente os riscos de segurança.</w:t>
       </w:r>
     </w:p>
     <w:p>
@@ -3774,15 +4051,7 @@
           <w:rFonts w:eastAsia="Arial" w:cs="Arial"/>
           <w:szCs w:val="24"/>
         </w:rPr>
-        <w:t xml:space="preserve">Um dos principais resultados esperados deste controle é a visibilidade precisa e em tempo real sobre os ativos da organização, fundamental para proteger a infraestrutura, mitigar </w:t>
-      </w:r>
-      <w:r>
-        <w:rPr>
-          <w:rFonts w:eastAsia="Arial" w:cs="Arial"/>
-          <w:szCs w:val="24"/>
-        </w:rPr>
-        <w:lastRenderedPageBreak/>
-        <w:t>vulnerabilidades e assegurar que medidas de segurança sejam aplicadas de forma consistente e eficaz.</w:t>
+        <w:t>Um dos principais resultados esperados deste controle é a visibilidade precisa e em tempo real sobre os ativos da organização, fundamental para proteger a infraestrutura, mitigar vulnerabilidades e assegurar que medidas de segurança sejam aplicadas de forma consistente e eficaz.</w:t>
       </w:r>
     </w:p>
     <w:p>
@@ -4121,11 +4390,11 @@
         </w:trPr>
         <w:tc>
           <w:tcPr>
-            <w:cnfStyle w:val="001000000000" w:firstRow="0" w:lastRow="0" w:firstColumn="1" w:lastColumn="0" w:oddVBand="0" w:evenVBand="0" w:oddHBand="0" w:evenHBand="0" w:firstRowFirstColumn="0" w:firstRowLastColumn="0" w:lastRowFirstColumn="0" w:lastRowLastColumn="0"/>
             <w:tcW w:w="1129" w:type="dxa"/>
           </w:tcPr>
           <w:p>
             <w:pPr>
+              <w:cnfStyle w:val="101000000000" w:firstRow="1" w:lastRow="0" w:firstColumn="1" w:lastColumn="0" w:oddVBand="0" w:evenVBand="0" w:oddHBand="0" w:evenHBand="0" w:firstRowFirstColumn="0" w:firstRowLastColumn="0" w:lastRowFirstColumn="0" w:lastRowLastColumn="0"/>
               <w:rPr>
                 <w:rFonts w:asciiTheme="minorHAnsi" w:eastAsia="Arial" w:hAnsiTheme="minorHAnsi" w:cstheme="minorHAnsi"/>
                 <w:szCs w:val="18"/>
@@ -4146,7 +4415,6 @@
           </w:tcPr>
           <w:p>
             <w:pPr>
-              <w:cnfStyle w:val="100000000000" w:firstRow="1" w:lastRow="0" w:firstColumn="0" w:lastColumn="0" w:oddVBand="0" w:evenVBand="0" w:oddHBand="0" w:evenHBand="0" w:firstRowFirstColumn="0" w:firstRowLastColumn="0" w:lastRowFirstColumn="0" w:lastRowLastColumn="0"/>
               <w:rPr>
                 <w:rFonts w:asciiTheme="minorHAnsi" w:hAnsiTheme="minorHAnsi" w:cstheme="minorHAnsi"/>
                 <w:szCs w:val="18"/>
@@ -4167,7 +4435,6 @@
           </w:tcPr>
           <w:p>
             <w:pPr>
-              <w:cnfStyle w:val="100000000000" w:firstRow="1" w:lastRow="0" w:firstColumn="0" w:lastColumn="0" w:oddVBand="0" w:evenVBand="0" w:oddHBand="0" w:evenHBand="0" w:firstRowFirstColumn="0" w:firstRowLastColumn="0" w:lastRowFirstColumn="0" w:lastRowLastColumn="0"/>
               <w:rPr>
                 <w:rFonts w:asciiTheme="minorHAnsi" w:eastAsia="Arial" w:hAnsiTheme="minorHAnsi" w:cstheme="minorHAnsi"/>
                 <w:szCs w:val="18"/>
@@ -4189,12 +4456,12 @@
         </w:trPr>
         <w:tc>
           <w:tcPr>
-            <w:cnfStyle w:val="001000000000" w:firstRow="0" w:lastRow="0" w:firstColumn="1" w:lastColumn="0" w:oddVBand="0" w:evenVBand="0" w:oddHBand="0" w:evenHBand="0" w:firstRowFirstColumn="0" w:firstRowLastColumn="0" w:lastRowFirstColumn="0" w:lastRowLastColumn="0"/>
             <w:tcW w:w="1129" w:type="dxa"/>
           </w:tcPr>
           <w:p>
             <w:pPr>
               <w:spacing w:line="276" w:lineRule="auto"/>
+              <w:cnfStyle w:val="001000100000" w:firstRow="0" w:lastRow="0" w:firstColumn="1" w:lastColumn="0" w:oddVBand="0" w:evenVBand="0" w:oddHBand="1" w:evenHBand="0" w:firstRowFirstColumn="0" w:firstRowLastColumn="0" w:lastRowFirstColumn="0" w:lastRowLastColumn="0"/>
               <w:rPr>
                 <w:rFonts w:asciiTheme="minorHAnsi" w:eastAsia="Arial" w:hAnsiTheme="minorHAnsi" w:cstheme="minorHAnsi"/>
               </w:rPr>
@@ -4220,7 +4487,6 @@
           <w:p>
             <w:pPr>
               <w:spacing w:line="276" w:lineRule="auto"/>
-              <w:cnfStyle w:val="000000100000" w:firstRow="0" w:lastRow="0" w:firstColumn="0" w:lastColumn="0" w:oddVBand="0" w:evenVBand="0" w:oddHBand="1" w:evenHBand="0" w:firstRowFirstColumn="0" w:firstRowLastColumn="0" w:lastRowFirstColumn="0" w:lastRowLastColumn="0"/>
               <w:rPr>
                 <w:rFonts w:asciiTheme="minorHAnsi" w:eastAsia="Arial" w:hAnsiTheme="minorHAnsi" w:cstheme="minorHAnsi"/>
               </w:rPr>
@@ -4237,7 +4503,6 @@
           <w:p>
             <w:pPr>
               <w:spacing w:line="276" w:lineRule="auto"/>
-              <w:cnfStyle w:val="000000100000" w:firstRow="0" w:lastRow="0" w:firstColumn="0" w:lastColumn="0" w:oddVBand="0" w:evenVBand="0" w:oddHBand="1" w:evenHBand="0" w:firstRowFirstColumn="0" w:firstRowLastColumn="0" w:lastRowFirstColumn="0" w:lastRowLastColumn="0"/>
               <w:rPr>
                 <w:rFonts w:asciiTheme="minorHAnsi" w:eastAsia="Arial" w:hAnsiTheme="minorHAnsi" w:cstheme="minorHAnsi"/>
               </w:rPr>
@@ -4294,12 +4559,12 @@
       <w:tr>
         <w:tc>
           <w:tcPr>
-            <w:cnfStyle w:val="001000000000" w:firstRow="0" w:lastRow="0" w:firstColumn="1" w:lastColumn="0" w:oddVBand="0" w:evenVBand="0" w:oddHBand="0" w:evenHBand="0" w:firstRowFirstColumn="0" w:firstRowLastColumn="0" w:lastRowFirstColumn="0" w:lastRowLastColumn="0"/>
             <w:tcW w:w="1129" w:type="dxa"/>
           </w:tcPr>
           <w:p>
             <w:pPr>
               <w:spacing w:line="276" w:lineRule="auto"/>
+              <w:cnfStyle w:val="001000000000" w:firstRow="0" w:lastRow="0" w:firstColumn="1" w:lastColumn="0" w:oddVBand="0" w:evenVBand="0" w:oddHBand="0" w:evenHBand="0" w:firstRowFirstColumn="0" w:firstRowLastColumn="0" w:lastRowFirstColumn="0" w:lastRowLastColumn="0"/>
               <w:rPr>
                 <w:rFonts w:asciiTheme="minorHAnsi" w:eastAsia="Arial" w:hAnsiTheme="minorHAnsi" w:cstheme="minorHAnsi"/>
               </w:rPr>
@@ -4325,7 +4590,6 @@
           <w:p>
             <w:pPr>
               <w:spacing w:line="276" w:lineRule="auto"/>
-              <w:cnfStyle w:val="000000000000" w:firstRow="0" w:lastRow="0" w:firstColumn="0" w:lastColumn="0" w:oddVBand="0" w:evenVBand="0" w:oddHBand="0" w:evenHBand="0" w:firstRowFirstColumn="0" w:firstRowLastColumn="0" w:lastRowFirstColumn="0" w:lastRowLastColumn="0"/>
               <w:rPr>
                 <w:rFonts w:asciiTheme="minorHAnsi" w:eastAsia="Arial" w:hAnsiTheme="minorHAnsi" w:cstheme="minorHAnsi"/>
               </w:rPr>
@@ -4342,7 +4606,6 @@
           <w:p>
             <w:pPr>
               <w:spacing w:line="276" w:lineRule="auto"/>
-              <w:cnfStyle w:val="000000000000" w:firstRow="0" w:lastRow="0" w:firstColumn="0" w:lastColumn="0" w:oddVBand="0" w:evenVBand="0" w:oddHBand="0" w:evenHBand="0" w:firstRowFirstColumn="0" w:firstRowLastColumn="0" w:lastRowFirstColumn="0" w:lastRowLastColumn="0"/>
               <w:rPr>
                 <w:rFonts w:asciiTheme="minorHAnsi" w:eastAsia="Arial" w:hAnsiTheme="minorHAnsi" w:cstheme="minorHAnsi"/>
               </w:rPr>
@@ -4484,7 +4747,15 @@
           <w:rFonts w:eastAsia="Arial" w:cs="Arial"/>
           <w:szCs w:val="24"/>
         </w:rPr>
-        <w:t>Um dos principais resultados esperados deste controle é a manutenção de um ambiente de software seguro e em conformidade, permitindo à organização identificar vulnerabilidades, prevenir ataques cibernéticos e evitar problemas relacionados a licenciamento ou uso desnecessário de aplicações.</w:t>
+        <w:t xml:space="preserve">Um dos principais resultados esperados deste controle é a manutenção de um ambiente de software seguro e em conformidade, permitindo à organização identificar </w:t>
+      </w:r>
+      <w:r>
+        <w:rPr>
+          <w:rFonts w:eastAsia="Arial" w:cs="Arial"/>
+          <w:szCs w:val="24"/>
+        </w:rPr>
+        <w:lastRenderedPageBreak/>
+        <w:t>vulnerabilidades, prevenir ataques cibernéticos e evitar problemas relacionados a licenciamento ou uso desnecessário de aplicações.</w:t>
       </w:r>
     </w:p>
     <w:p>
@@ -4726,7 +4997,6 @@
         <w:pStyle w:val="Legenda"/>
       </w:pPr>
       <w:r>
-        <w:lastRenderedPageBreak/>
         <w:t xml:space="preserve">Figura </w:t>
       </w:r>
       <w:r>
@@ -4827,11 +5097,11 @@
         </w:trPr>
         <w:tc>
           <w:tcPr>
-            <w:cnfStyle w:val="001000000000" w:firstRow="0" w:lastRow="0" w:firstColumn="1" w:lastColumn="0" w:oddVBand="0" w:evenVBand="0" w:oddHBand="0" w:evenHBand="0" w:firstRowFirstColumn="0" w:firstRowLastColumn="0" w:lastRowFirstColumn="0" w:lastRowLastColumn="0"/>
             <w:tcW w:w="1129" w:type="dxa"/>
           </w:tcPr>
           <w:p>
             <w:pPr>
+              <w:cnfStyle w:val="101000000000" w:firstRow="1" w:lastRow="0" w:firstColumn="1" w:lastColumn="0" w:oddVBand="0" w:evenVBand="0" w:oddHBand="0" w:evenHBand="0" w:firstRowFirstColumn="0" w:firstRowLastColumn="0" w:lastRowFirstColumn="0" w:lastRowLastColumn="0"/>
               <w:rPr>
                 <w:rFonts w:asciiTheme="minorHAnsi" w:eastAsia="Arial" w:hAnsiTheme="minorHAnsi" w:cstheme="minorHAnsi"/>
                 <w:szCs w:val="18"/>
@@ -4852,7 +5122,6 @@
           </w:tcPr>
           <w:p>
             <w:pPr>
-              <w:cnfStyle w:val="100000000000" w:firstRow="1" w:lastRow="0" w:firstColumn="0" w:lastColumn="0" w:oddVBand="0" w:evenVBand="0" w:oddHBand="0" w:evenHBand="0" w:firstRowFirstColumn="0" w:firstRowLastColumn="0" w:lastRowFirstColumn="0" w:lastRowLastColumn="0"/>
               <w:rPr>
                 <w:rFonts w:asciiTheme="minorHAnsi" w:hAnsiTheme="minorHAnsi" w:cstheme="minorHAnsi"/>
                 <w:szCs w:val="18"/>
@@ -4873,7 +5142,6 @@
           </w:tcPr>
           <w:p>
             <w:pPr>
-              <w:cnfStyle w:val="100000000000" w:firstRow="1" w:lastRow="0" w:firstColumn="0" w:lastColumn="0" w:oddVBand="0" w:evenVBand="0" w:oddHBand="0" w:evenHBand="0" w:firstRowFirstColumn="0" w:firstRowLastColumn="0" w:lastRowFirstColumn="0" w:lastRowLastColumn="0"/>
               <w:rPr>
                 <w:rFonts w:asciiTheme="minorHAnsi" w:eastAsia="Arial" w:hAnsiTheme="minorHAnsi" w:cstheme="minorHAnsi"/>
                 <w:szCs w:val="18"/>
@@ -4895,12 +5163,12 @@
         </w:trPr>
         <w:tc>
           <w:tcPr>
-            <w:cnfStyle w:val="001000000000" w:firstRow="0" w:lastRow="0" w:firstColumn="1" w:lastColumn="0" w:oddVBand="0" w:evenVBand="0" w:oddHBand="0" w:evenHBand="0" w:firstRowFirstColumn="0" w:firstRowLastColumn="0" w:lastRowFirstColumn="0" w:lastRowLastColumn="0"/>
             <w:tcW w:w="1129" w:type="dxa"/>
           </w:tcPr>
           <w:p>
             <w:pPr>
               <w:spacing w:line="276" w:lineRule="auto"/>
+              <w:cnfStyle w:val="001000100000" w:firstRow="0" w:lastRow="0" w:firstColumn="1" w:lastColumn="0" w:oddVBand="0" w:evenVBand="0" w:oddHBand="1" w:evenHBand="0" w:firstRowFirstColumn="0" w:firstRowLastColumn="0" w:lastRowFirstColumn="0" w:lastRowLastColumn="0"/>
               <w:rPr>
                 <w:rFonts w:asciiTheme="minorHAnsi" w:eastAsia="Arial" w:hAnsiTheme="minorHAnsi" w:cstheme="minorHAnsi"/>
               </w:rPr>
@@ -4926,7 +5194,6 @@
           <w:p>
             <w:pPr>
               <w:spacing w:line="276" w:lineRule="auto"/>
-              <w:cnfStyle w:val="000000100000" w:firstRow="0" w:lastRow="0" w:firstColumn="0" w:lastColumn="0" w:oddVBand="0" w:evenVBand="0" w:oddHBand="1" w:evenHBand="0" w:firstRowFirstColumn="0" w:firstRowLastColumn="0" w:lastRowFirstColumn="0" w:lastRowLastColumn="0"/>
               <w:rPr>
                 <w:rFonts w:asciiTheme="minorHAnsi" w:eastAsia="Arial" w:hAnsiTheme="minorHAnsi" w:cstheme="minorHAnsi"/>
               </w:rPr>
@@ -4943,7 +5210,6 @@
           <w:p>
             <w:pPr>
               <w:spacing w:line="276" w:lineRule="auto"/>
-              <w:cnfStyle w:val="000000100000" w:firstRow="0" w:lastRow="0" w:firstColumn="0" w:lastColumn="0" w:oddVBand="0" w:evenVBand="0" w:oddHBand="1" w:evenHBand="0" w:firstRowFirstColumn="0" w:firstRowLastColumn="0" w:lastRowFirstColumn="0" w:lastRowLastColumn="0"/>
               <w:rPr>
                 <w:rFonts w:asciiTheme="minorHAnsi" w:eastAsia="Arial" w:hAnsiTheme="minorHAnsi" w:cstheme="minorHAnsi"/>
               </w:rPr>
@@ -5000,12 +5266,12 @@
       <w:tr>
         <w:tc>
           <w:tcPr>
-            <w:cnfStyle w:val="001000000000" w:firstRow="0" w:lastRow="0" w:firstColumn="1" w:lastColumn="0" w:oddVBand="0" w:evenVBand="0" w:oddHBand="0" w:evenHBand="0" w:firstRowFirstColumn="0" w:firstRowLastColumn="0" w:lastRowFirstColumn="0" w:lastRowLastColumn="0"/>
             <w:tcW w:w="1129" w:type="dxa"/>
           </w:tcPr>
           <w:p>
             <w:pPr>
               <w:spacing w:line="276" w:lineRule="auto"/>
+              <w:cnfStyle w:val="001000000000" w:firstRow="0" w:lastRow="0" w:firstColumn="1" w:lastColumn="0" w:oddVBand="0" w:evenVBand="0" w:oddHBand="0" w:evenHBand="0" w:firstRowFirstColumn="0" w:firstRowLastColumn="0" w:lastRowFirstColumn="0" w:lastRowLastColumn="0"/>
               <w:rPr>
                 <w:rFonts w:asciiTheme="minorHAnsi" w:eastAsia="Arial" w:hAnsiTheme="minorHAnsi" w:cstheme="minorHAnsi"/>
               </w:rPr>
@@ -5031,7 +5297,6 @@
           <w:p>
             <w:pPr>
               <w:spacing w:line="276" w:lineRule="auto"/>
-              <w:cnfStyle w:val="000000000000" w:firstRow="0" w:lastRow="0" w:firstColumn="0" w:lastColumn="0" w:oddVBand="0" w:evenVBand="0" w:oddHBand="0" w:evenHBand="0" w:firstRowFirstColumn="0" w:firstRowLastColumn="0" w:lastRowFirstColumn="0" w:lastRowLastColumn="0"/>
               <w:rPr>
                 <w:rFonts w:asciiTheme="minorHAnsi" w:eastAsia="Arial" w:hAnsiTheme="minorHAnsi" w:cstheme="minorHAnsi"/>
               </w:rPr>
@@ -5048,7 +5313,6 @@
           <w:p>
             <w:pPr>
               <w:spacing w:line="276" w:lineRule="auto"/>
-              <w:cnfStyle w:val="000000000000" w:firstRow="0" w:lastRow="0" w:firstColumn="0" w:lastColumn="0" w:oddVBand="0" w:evenVBand="0" w:oddHBand="0" w:evenHBand="0" w:firstRowFirstColumn="0" w:firstRowLastColumn="0" w:lastRowFirstColumn="0" w:lastRowLastColumn="0"/>
               <w:rPr>
                 <w:rFonts w:asciiTheme="minorHAnsi" w:eastAsia="Arial" w:hAnsiTheme="minorHAnsi" w:cstheme="minorHAnsi"/>
               </w:rPr>
@@ -5108,11 +5372,11 @@
         </w:trPr>
         <w:tc>
           <w:tcPr>
-            <w:cnfStyle w:val="001000000000" w:firstRow="0" w:lastRow="0" w:firstColumn="1" w:lastColumn="0" w:oddVBand="0" w:evenVBand="0" w:oddHBand="0" w:evenHBand="0" w:firstRowFirstColumn="0" w:firstRowLastColumn="0" w:lastRowFirstColumn="0" w:lastRowLastColumn="0"/>
             <w:tcW w:w="1129" w:type="dxa"/>
           </w:tcPr>
           <w:p>
             <w:pPr>
+              <w:cnfStyle w:val="001000100000" w:firstRow="0" w:lastRow="0" w:firstColumn="1" w:lastColumn="0" w:oddVBand="0" w:evenVBand="0" w:oddHBand="1" w:evenHBand="0" w:firstRowFirstColumn="0" w:firstRowLastColumn="0" w:lastRowFirstColumn="0" w:lastRowLastColumn="0"/>
               <w:rPr>
                 <w:rFonts w:asciiTheme="minorHAnsi" w:eastAsia="Arial" w:hAnsiTheme="minorHAnsi" w:cstheme="minorHAnsi"/>
               </w:rPr>
@@ -5130,9 +5394,6 @@
             <w:tcW w:w="6308" w:type="dxa"/>
           </w:tcPr>
           <w:p>
-            <w:pPr>
-              <w:cnfStyle w:val="000000100000" w:firstRow="0" w:lastRow="0" w:firstColumn="0" w:lastColumn="0" w:oddVBand="0" w:evenVBand="0" w:oddHBand="1" w:evenHBand="0" w:firstRowFirstColumn="0" w:firstRowLastColumn="0" w:lastRowFirstColumn="0" w:lastRowLastColumn="0"/>
-            </w:pPr>
             <w:r>
               <w:t>Endereçar o software não autorizado</w:t>
             </w:r>
@@ -5144,7 +5405,6 @@
           </w:tcPr>
           <w:p>
             <w:pPr>
-              <w:cnfStyle w:val="000000100000" w:firstRow="0" w:lastRow="0" w:firstColumn="0" w:lastColumn="0" w:oddVBand="0" w:evenVBand="0" w:oddHBand="1" w:evenHBand="0" w:firstRowFirstColumn="0" w:firstRowLastColumn="0" w:lastRowFirstColumn="0" w:lastRowLastColumn="0"/>
               <w:rPr>
                 <w:rFonts w:asciiTheme="minorHAnsi" w:eastAsia="Arial" w:hAnsiTheme="minorHAnsi" w:cstheme="minorHAnsi"/>
                 <w:b/>
@@ -5303,6 +5563,7 @@
           <w:rFonts w:eastAsia="Arial" w:cs="Arial"/>
           <w:szCs w:val="24"/>
         </w:rPr>
+        <w:lastRenderedPageBreak/>
         <w:t>Nesse controle (</w:t>
       </w:r>
       <w:r>
@@ -5605,7 +5866,6 @@
           <w:rFonts w:eastAsia="Arial" w:cs="Arial"/>
           <w:szCs w:val="24"/>
         </w:rPr>
-        <w:lastRenderedPageBreak/>
         <w:t>Para alcançar o resultado, considerou-se o seguinte conjunto de medidas de segurança básica:</w:t>
       </w:r>
     </w:p>
@@ -5628,11 +5888,11 @@
         </w:trPr>
         <w:tc>
           <w:tcPr>
-            <w:cnfStyle w:val="001000000000" w:firstRow="0" w:lastRow="0" w:firstColumn="1" w:lastColumn="0" w:oddVBand="0" w:evenVBand="0" w:oddHBand="0" w:evenHBand="0" w:firstRowFirstColumn="0" w:firstRowLastColumn="0" w:lastRowFirstColumn="0" w:lastRowLastColumn="0"/>
             <w:tcW w:w="1129" w:type="dxa"/>
           </w:tcPr>
           <w:p>
             <w:pPr>
+              <w:cnfStyle w:val="101000000000" w:firstRow="1" w:lastRow="0" w:firstColumn="1" w:lastColumn="0" w:oddVBand="0" w:evenVBand="0" w:oddHBand="0" w:evenHBand="0" w:firstRowFirstColumn="0" w:firstRowLastColumn="0" w:lastRowFirstColumn="0" w:lastRowLastColumn="0"/>
               <w:rPr>
                 <w:rFonts w:asciiTheme="minorHAnsi" w:eastAsia="Arial" w:hAnsiTheme="minorHAnsi" w:cstheme="minorHAnsi"/>
                 <w:szCs w:val="18"/>
@@ -5654,7 +5914,6 @@
           </w:tcPr>
           <w:p>
             <w:pPr>
-              <w:cnfStyle w:val="100000000000" w:firstRow="1" w:lastRow="0" w:firstColumn="0" w:lastColumn="0" w:oddVBand="0" w:evenVBand="0" w:oddHBand="0" w:evenHBand="0" w:firstRowFirstColumn="0" w:firstRowLastColumn="0" w:lastRowFirstColumn="0" w:lastRowLastColumn="0"/>
               <w:rPr>
                 <w:rFonts w:asciiTheme="minorHAnsi" w:hAnsiTheme="minorHAnsi" w:cstheme="minorHAnsi"/>
                 <w:szCs w:val="18"/>
@@ -5675,7 +5934,6 @@
           </w:tcPr>
           <w:p>
             <w:pPr>
-              <w:cnfStyle w:val="100000000000" w:firstRow="1" w:lastRow="0" w:firstColumn="0" w:lastColumn="0" w:oddVBand="0" w:evenVBand="0" w:oddHBand="0" w:evenHBand="0" w:firstRowFirstColumn="0" w:firstRowLastColumn="0" w:lastRowFirstColumn="0" w:lastRowLastColumn="0"/>
               <w:rPr>
                 <w:rFonts w:asciiTheme="minorHAnsi" w:eastAsia="Arial" w:hAnsiTheme="minorHAnsi" w:cstheme="minorHAnsi"/>
                 <w:szCs w:val="18"/>
@@ -5697,13 +5955,13 @@
         </w:trPr>
         <w:tc>
           <w:tcPr>
-            <w:cnfStyle w:val="001000000000" w:firstRow="0" w:lastRow="0" w:firstColumn="1" w:lastColumn="0" w:oddVBand="0" w:evenVBand="0" w:oddHBand="0" w:evenHBand="0" w:firstRowFirstColumn="0" w:firstRowLastColumn="0" w:lastRowFirstColumn="0" w:lastRowLastColumn="0"/>
             <w:tcW w:w="1668" w:type="dxa"/>
             <w:gridSpan w:val="2"/>
           </w:tcPr>
           <w:p>
             <w:pPr>
               <w:spacing w:line="276" w:lineRule="auto"/>
+              <w:cnfStyle w:val="001000100000" w:firstRow="0" w:lastRow="0" w:firstColumn="1" w:lastColumn="0" w:oddVBand="0" w:evenVBand="0" w:oddHBand="1" w:evenHBand="0" w:firstRowFirstColumn="0" w:firstRowLastColumn="0" w:lastRowFirstColumn="0" w:lastRowLastColumn="0"/>
               <w:rPr>
                 <w:rFonts w:asciiTheme="minorHAnsi" w:eastAsia="Arial" w:hAnsiTheme="minorHAnsi" w:cstheme="minorHAnsi"/>
               </w:rPr>
@@ -5729,7 +5987,6 @@
           <w:p>
             <w:pPr>
               <w:spacing w:line="276" w:lineRule="auto"/>
-              <w:cnfStyle w:val="000000100000" w:firstRow="0" w:lastRow="0" w:firstColumn="0" w:lastColumn="0" w:oddVBand="0" w:evenVBand="0" w:oddHBand="1" w:evenHBand="0" w:firstRowFirstColumn="0" w:firstRowLastColumn="0" w:lastRowFirstColumn="0" w:lastRowLastColumn="0"/>
               <w:rPr>
                 <w:rFonts w:asciiTheme="minorHAnsi" w:eastAsia="Arial" w:hAnsiTheme="minorHAnsi" w:cstheme="minorHAnsi"/>
               </w:rPr>
@@ -5746,7 +6003,6 @@
           <w:p>
             <w:pPr>
               <w:spacing w:line="276" w:lineRule="auto"/>
-              <w:cnfStyle w:val="000000100000" w:firstRow="0" w:lastRow="0" w:firstColumn="0" w:lastColumn="0" w:oddVBand="0" w:evenVBand="0" w:oddHBand="1" w:evenHBand="0" w:firstRowFirstColumn="0" w:firstRowLastColumn="0" w:lastRowFirstColumn="0" w:lastRowLastColumn="0"/>
               <w:rPr>
                 <w:rFonts w:asciiTheme="minorHAnsi" w:eastAsia="Arial" w:hAnsiTheme="minorHAnsi" w:cstheme="minorHAnsi"/>
               </w:rPr>
@@ -5803,13 +6059,13 @@
       <w:tr>
         <w:tc>
           <w:tcPr>
-            <w:cnfStyle w:val="001000000000" w:firstRow="0" w:lastRow="0" w:firstColumn="1" w:lastColumn="0" w:oddVBand="0" w:evenVBand="0" w:oddHBand="0" w:evenHBand="0" w:firstRowFirstColumn="0" w:firstRowLastColumn="0" w:lastRowFirstColumn="0" w:lastRowLastColumn="0"/>
             <w:tcW w:w="1668" w:type="dxa"/>
             <w:gridSpan w:val="2"/>
           </w:tcPr>
           <w:p>
             <w:pPr>
               <w:spacing w:line="276" w:lineRule="auto"/>
+              <w:cnfStyle w:val="001000000000" w:firstRow="0" w:lastRow="0" w:firstColumn="1" w:lastColumn="0" w:oddVBand="0" w:evenVBand="0" w:oddHBand="0" w:evenHBand="0" w:firstRowFirstColumn="0" w:firstRowLastColumn="0" w:lastRowFirstColumn="0" w:lastRowLastColumn="0"/>
               <w:rPr>
                 <w:rFonts w:asciiTheme="minorHAnsi" w:eastAsia="Arial" w:hAnsiTheme="minorHAnsi" w:cstheme="minorHAnsi"/>
               </w:rPr>
@@ -5835,7 +6091,6 @@
           <w:p>
             <w:pPr>
               <w:spacing w:line="276" w:lineRule="auto"/>
-              <w:cnfStyle w:val="000000000000" w:firstRow="0" w:lastRow="0" w:firstColumn="0" w:lastColumn="0" w:oddVBand="0" w:evenVBand="0" w:oddHBand="0" w:evenHBand="0" w:firstRowFirstColumn="0" w:firstRowLastColumn="0" w:lastRowFirstColumn="0" w:lastRowLastColumn="0"/>
               <w:rPr>
                 <w:rFonts w:asciiTheme="minorHAnsi" w:eastAsia="Arial" w:hAnsiTheme="minorHAnsi" w:cstheme="minorHAnsi"/>
               </w:rPr>
@@ -5852,7 +6107,6 @@
           <w:p>
             <w:pPr>
               <w:spacing w:line="276" w:lineRule="auto"/>
-              <w:cnfStyle w:val="000000000000" w:firstRow="0" w:lastRow="0" w:firstColumn="0" w:lastColumn="0" w:oddVBand="0" w:evenVBand="0" w:oddHBand="0" w:evenHBand="0" w:firstRowFirstColumn="0" w:firstRowLastColumn="0" w:lastRowFirstColumn="0" w:lastRowLastColumn="0"/>
               <w:rPr>
                 <w:rFonts w:asciiTheme="minorHAnsi" w:eastAsia="Arial" w:hAnsiTheme="minorHAnsi" w:cstheme="minorHAnsi"/>
               </w:rPr>
@@ -5912,12 +6166,12 @@
         </w:trPr>
         <w:tc>
           <w:tcPr>
-            <w:cnfStyle w:val="001000000000" w:firstRow="0" w:lastRow="0" w:firstColumn="1" w:lastColumn="0" w:oddVBand="0" w:evenVBand="0" w:oddHBand="0" w:evenHBand="0" w:firstRowFirstColumn="0" w:firstRowLastColumn="0" w:lastRowFirstColumn="0" w:lastRowLastColumn="0"/>
             <w:tcW w:w="1668" w:type="dxa"/>
             <w:gridSpan w:val="2"/>
           </w:tcPr>
           <w:p>
             <w:pPr>
+              <w:cnfStyle w:val="001000100000" w:firstRow="0" w:lastRow="0" w:firstColumn="1" w:lastColumn="0" w:oddVBand="0" w:evenVBand="0" w:oddHBand="1" w:evenHBand="0" w:firstRowFirstColumn="0" w:firstRowLastColumn="0" w:lastRowFirstColumn="0" w:lastRowLastColumn="0"/>
               <w:rPr>
                 <w:rFonts w:asciiTheme="minorHAnsi" w:eastAsia="Arial" w:hAnsiTheme="minorHAnsi" w:cstheme="minorHAnsi"/>
               </w:rPr>
@@ -5935,9 +6189,6 @@
             <w:tcW w:w="5769" w:type="dxa"/>
           </w:tcPr>
           <w:p>
-            <w:pPr>
-              <w:cnfStyle w:val="000000100000" w:firstRow="0" w:lastRow="0" w:firstColumn="0" w:lastColumn="0" w:oddVBand="0" w:evenVBand="0" w:oddHBand="1" w:evenHBand="0" w:firstRowFirstColumn="0" w:firstRowLastColumn="0" w:lastRowFirstColumn="0" w:lastRowLastColumn="0"/>
-            </w:pPr>
             <w:r>
               <w:t>Configurar listas de controle de acesso a dados</w:t>
             </w:r>
@@ -5949,7 +6200,6 @@
           </w:tcPr>
           <w:p>
             <w:pPr>
-              <w:cnfStyle w:val="000000100000" w:firstRow="0" w:lastRow="0" w:firstColumn="0" w:lastColumn="0" w:oddVBand="0" w:evenVBand="0" w:oddHBand="1" w:evenHBand="0" w:firstRowFirstColumn="0" w:firstRowLastColumn="0" w:lastRowFirstColumn="0" w:lastRowLastColumn="0"/>
               <w:rPr>
                 <w:rFonts w:asciiTheme="minorHAnsi" w:eastAsia="Arial" w:hAnsiTheme="minorHAnsi" w:cstheme="minorHAnsi"/>
                 <w:b/>
@@ -6007,13 +6257,13 @@
       <w:tr>
         <w:tc>
           <w:tcPr>
-            <w:cnfStyle w:val="001000000000" w:firstRow="0" w:lastRow="0" w:firstColumn="1" w:lastColumn="0" w:oddVBand="0" w:evenVBand="0" w:oddHBand="0" w:evenHBand="0" w:firstRowFirstColumn="0" w:firstRowLastColumn="0" w:lastRowFirstColumn="0" w:lastRowLastColumn="0"/>
             <w:tcW w:w="1668" w:type="dxa"/>
             <w:gridSpan w:val="2"/>
           </w:tcPr>
           <w:p>
             <w:pPr>
               <w:spacing w:line="276" w:lineRule="auto"/>
+              <w:cnfStyle w:val="001000000000" w:firstRow="0" w:lastRow="0" w:firstColumn="1" w:lastColumn="0" w:oddVBand="0" w:evenVBand="0" w:oddHBand="0" w:evenHBand="0" w:firstRowFirstColumn="0" w:firstRowLastColumn="0" w:lastRowFirstColumn="0" w:lastRowLastColumn="0"/>
               <w:rPr>
                 <w:rFonts w:asciiTheme="minorHAnsi" w:eastAsia="Arial" w:hAnsiTheme="minorHAnsi" w:cstheme="minorHAnsi"/>
               </w:rPr>
@@ -6039,7 +6289,6 @@
           <w:p>
             <w:pPr>
               <w:spacing w:line="276" w:lineRule="auto"/>
-              <w:cnfStyle w:val="000000000000" w:firstRow="0" w:lastRow="0" w:firstColumn="0" w:lastColumn="0" w:oddVBand="0" w:evenVBand="0" w:oddHBand="0" w:evenHBand="0" w:firstRowFirstColumn="0" w:firstRowLastColumn="0" w:lastRowFirstColumn="0" w:lastRowLastColumn="0"/>
               <w:rPr>
                 <w:rFonts w:asciiTheme="minorHAnsi" w:eastAsia="Arial" w:hAnsiTheme="minorHAnsi" w:cstheme="minorHAnsi"/>
               </w:rPr>
@@ -6056,7 +6305,6 @@
           <w:p>
             <w:pPr>
               <w:spacing w:line="276" w:lineRule="auto"/>
-              <w:cnfStyle w:val="000000000000" w:firstRow="0" w:lastRow="0" w:firstColumn="0" w:lastColumn="0" w:oddVBand="0" w:evenVBand="0" w:oddHBand="0" w:evenHBand="0" w:firstRowFirstColumn="0" w:firstRowLastColumn="0" w:lastRowFirstColumn="0" w:lastRowLastColumn="0"/>
               <w:rPr>
                 <w:rFonts w:asciiTheme="minorHAnsi" w:eastAsia="Arial" w:hAnsiTheme="minorHAnsi" w:cstheme="minorHAnsi"/>
               </w:rPr>
@@ -6116,13 +6364,13 @@
         </w:trPr>
         <w:tc>
           <w:tcPr>
-            <w:cnfStyle w:val="001000000000" w:firstRow="0" w:lastRow="0" w:firstColumn="1" w:lastColumn="0" w:oddVBand="0" w:evenVBand="0" w:oddHBand="0" w:evenHBand="0" w:firstRowFirstColumn="0" w:firstRowLastColumn="0" w:lastRowFirstColumn="0" w:lastRowLastColumn="0"/>
             <w:tcW w:w="1668" w:type="dxa"/>
             <w:gridSpan w:val="2"/>
           </w:tcPr>
           <w:p>
             <w:pPr>
               <w:spacing w:line="276" w:lineRule="auto"/>
+              <w:cnfStyle w:val="001000100000" w:firstRow="0" w:lastRow="0" w:firstColumn="1" w:lastColumn="0" w:oddVBand="0" w:evenVBand="0" w:oddHBand="1" w:evenHBand="0" w:firstRowFirstColumn="0" w:firstRowLastColumn="0" w:lastRowFirstColumn="0" w:lastRowLastColumn="0"/>
               <w:rPr>
                 <w:rFonts w:asciiTheme="minorHAnsi" w:eastAsia="Arial" w:hAnsiTheme="minorHAnsi" w:cstheme="minorHAnsi"/>
               </w:rPr>
@@ -6148,7 +6396,6 @@
           <w:p>
             <w:pPr>
               <w:spacing w:line="276" w:lineRule="auto"/>
-              <w:cnfStyle w:val="000000100000" w:firstRow="0" w:lastRow="0" w:firstColumn="0" w:lastColumn="0" w:oddVBand="0" w:evenVBand="0" w:oddHBand="1" w:evenHBand="0" w:firstRowFirstColumn="0" w:firstRowLastColumn="0" w:lastRowFirstColumn="0" w:lastRowLastColumn="0"/>
               <w:rPr>
                 <w:rFonts w:asciiTheme="minorHAnsi" w:eastAsia="Arial" w:hAnsiTheme="minorHAnsi" w:cstheme="minorHAnsi"/>
               </w:rPr>
@@ -6165,7 +6412,6 @@
           <w:p>
             <w:pPr>
               <w:spacing w:line="276" w:lineRule="auto"/>
-              <w:cnfStyle w:val="000000100000" w:firstRow="0" w:lastRow="0" w:firstColumn="0" w:lastColumn="0" w:oddVBand="0" w:evenVBand="0" w:oddHBand="1" w:evenHBand="0" w:firstRowFirstColumn="0" w:firstRowLastColumn="0" w:lastRowFirstColumn="0" w:lastRowLastColumn="0"/>
               <w:rPr>
                 <w:rFonts w:asciiTheme="minorHAnsi" w:eastAsia="Arial" w:hAnsiTheme="minorHAnsi" w:cstheme="minorHAnsi"/>
               </w:rPr>
@@ -6222,12 +6468,12 @@
       <w:tr>
         <w:tc>
           <w:tcPr>
-            <w:cnfStyle w:val="001000000000" w:firstRow="0" w:lastRow="0" w:firstColumn="1" w:lastColumn="0" w:oddVBand="0" w:evenVBand="0" w:oddHBand="0" w:evenHBand="0" w:firstRowFirstColumn="0" w:firstRowLastColumn="0" w:lastRowFirstColumn="0" w:lastRowLastColumn="0"/>
             <w:tcW w:w="1668" w:type="dxa"/>
             <w:gridSpan w:val="2"/>
           </w:tcPr>
           <w:p>
             <w:pPr>
+              <w:cnfStyle w:val="001000000000" w:firstRow="0" w:lastRow="0" w:firstColumn="1" w:lastColumn="0" w:oddVBand="0" w:evenVBand="0" w:oddHBand="0" w:evenHBand="0" w:firstRowFirstColumn="0" w:firstRowLastColumn="0" w:lastRowFirstColumn="0" w:lastRowLastColumn="0"/>
               <w:rPr>
                 <w:rFonts w:asciiTheme="minorHAnsi" w:eastAsia="Arial" w:hAnsiTheme="minorHAnsi" w:cstheme="minorHAnsi"/>
               </w:rPr>
@@ -6245,9 +6491,6 @@
             <w:tcW w:w="5769" w:type="dxa"/>
           </w:tcPr>
           <w:p>
-            <w:pPr>
-              <w:cnfStyle w:val="000000000000" w:firstRow="0" w:lastRow="0" w:firstColumn="0" w:lastColumn="0" w:oddVBand="0" w:evenVBand="0" w:oddHBand="0" w:evenHBand="0" w:firstRowFirstColumn="0" w:firstRowLastColumn="0" w:lastRowFirstColumn="0" w:lastRowLastColumn="0"/>
-            </w:pPr>
             <w:r>
               <w:t>Criptografar dados em dispositivos de usuário final</w:t>
             </w:r>
@@ -6259,7 +6502,6 @@
           </w:tcPr>
           <w:p>
             <w:pPr>
-              <w:cnfStyle w:val="000000000000" w:firstRow="0" w:lastRow="0" w:firstColumn="0" w:lastColumn="0" w:oddVBand="0" w:evenVBand="0" w:oddHBand="0" w:evenHBand="0" w:firstRowFirstColumn="0" w:firstRowLastColumn="0" w:lastRowFirstColumn="0" w:lastRowLastColumn="0"/>
               <w:rPr>
                 <w:rFonts w:asciiTheme="minorHAnsi" w:eastAsia="Arial" w:hAnsiTheme="minorHAnsi" w:cstheme="minorHAnsi"/>
                 <w:b/>
@@ -6403,7 +6645,15 @@
           <w:rFonts w:eastAsia="Arial" w:cs="Arial"/>
           <w:szCs w:val="24"/>
         </w:rPr>
-        <w:t>) desde o início e sua revisão contínua reduzem vulnerabilidades associadas a configurações padrão ou inadequadas, protegendo a infraestrutura contra ameaças cibernéticas.</w:t>
+        <w:t xml:space="preserve">) desde o início e sua revisão contínua reduzem vulnerabilidades associadas a </w:t>
+      </w:r>
+      <w:r>
+        <w:rPr>
+          <w:rFonts w:eastAsia="Arial" w:cs="Arial"/>
+          <w:szCs w:val="24"/>
+        </w:rPr>
+        <w:lastRenderedPageBreak/>
+        <w:t>configurações padrão ou inadequadas, protegendo a infraestrutura contra ameaças cibernéticas.</w:t>
       </w:r>
     </w:p>
     <w:p>
@@ -6419,15 +6669,7 @@
           <w:rFonts w:eastAsia="Arial" w:cs="Arial"/>
           <w:szCs w:val="24"/>
         </w:rPr>
-        <w:t xml:space="preserve">Um dos principais resultados esperados deste controle é a redução de riscos provenientes de brechas de segurança, como serviços desnecessários ou contas com senhas padrão, fortalecendo a proteção de dados e sistemas. A manutenção de configurações </w:t>
-      </w:r>
-      <w:r>
-        <w:rPr>
-          <w:rFonts w:eastAsia="Arial" w:cs="Arial"/>
-          <w:szCs w:val="24"/>
-        </w:rPr>
-        <w:lastRenderedPageBreak/>
-        <w:t xml:space="preserve">seguras promove a resiliência organizacional diante de ameaças e incidentes, assegurando um ambiente tecnológico confiável e robusto. </w:t>
+        <w:t xml:space="preserve">Um dos principais resultados esperados deste controle é a redução de riscos provenientes de brechas de segurança, como serviços desnecessários ou contas com senhas padrão, fortalecendo a proteção de dados e sistemas. A manutenção de configurações seguras promove a resiliência organizacional diante de ameaças e incidentes, assegurando um ambiente tecnológico confiável e robusto. </w:t>
       </w:r>
     </w:p>
     <w:p>
@@ -6766,11 +7008,11 @@
         </w:trPr>
         <w:tc>
           <w:tcPr>
-            <w:cnfStyle w:val="001000000000" w:firstRow="0" w:lastRow="0" w:firstColumn="1" w:lastColumn="0" w:oddVBand="0" w:evenVBand="0" w:oddHBand="0" w:evenHBand="0" w:firstRowFirstColumn="0" w:firstRowLastColumn="0" w:lastRowFirstColumn="0" w:lastRowLastColumn="0"/>
             <w:tcW w:w="1129" w:type="dxa"/>
           </w:tcPr>
           <w:p>
             <w:pPr>
+              <w:cnfStyle w:val="101000000000" w:firstRow="1" w:lastRow="0" w:firstColumn="1" w:lastColumn="0" w:oddVBand="0" w:evenVBand="0" w:oddHBand="0" w:evenHBand="0" w:firstRowFirstColumn="0" w:firstRowLastColumn="0" w:lastRowFirstColumn="0" w:lastRowLastColumn="0"/>
               <w:rPr>
                 <w:rFonts w:asciiTheme="minorHAnsi" w:eastAsia="Arial" w:hAnsiTheme="minorHAnsi" w:cstheme="minorHAnsi"/>
                 <w:szCs w:val="18"/>
@@ -6791,7 +7033,6 @@
           </w:tcPr>
           <w:p>
             <w:pPr>
-              <w:cnfStyle w:val="100000000000" w:firstRow="1" w:lastRow="0" w:firstColumn="0" w:lastColumn="0" w:oddVBand="0" w:evenVBand="0" w:oddHBand="0" w:evenHBand="0" w:firstRowFirstColumn="0" w:firstRowLastColumn="0" w:lastRowFirstColumn="0" w:lastRowLastColumn="0"/>
               <w:rPr>
                 <w:rFonts w:asciiTheme="minorHAnsi" w:hAnsiTheme="minorHAnsi" w:cstheme="minorHAnsi"/>
                 <w:szCs w:val="18"/>
@@ -6812,7 +7053,6 @@
           </w:tcPr>
           <w:p>
             <w:pPr>
-              <w:cnfStyle w:val="100000000000" w:firstRow="1" w:lastRow="0" w:firstColumn="0" w:lastColumn="0" w:oddVBand="0" w:evenVBand="0" w:oddHBand="0" w:evenHBand="0" w:firstRowFirstColumn="0" w:firstRowLastColumn="0" w:lastRowFirstColumn="0" w:lastRowLastColumn="0"/>
               <w:rPr>
                 <w:rFonts w:asciiTheme="minorHAnsi" w:eastAsia="Arial" w:hAnsiTheme="minorHAnsi" w:cstheme="minorHAnsi"/>
                 <w:szCs w:val="18"/>
@@ -6834,12 +7074,12 @@
         </w:trPr>
         <w:tc>
           <w:tcPr>
-            <w:cnfStyle w:val="001000000000" w:firstRow="0" w:lastRow="0" w:firstColumn="1" w:lastColumn="0" w:oddVBand="0" w:evenVBand="0" w:oddHBand="0" w:evenHBand="0" w:firstRowFirstColumn="0" w:firstRowLastColumn="0" w:lastRowFirstColumn="0" w:lastRowLastColumn="0"/>
             <w:tcW w:w="1129" w:type="dxa"/>
           </w:tcPr>
           <w:p>
             <w:pPr>
               <w:spacing w:line="276" w:lineRule="auto"/>
+              <w:cnfStyle w:val="001000100000" w:firstRow="0" w:lastRow="0" w:firstColumn="1" w:lastColumn="0" w:oddVBand="0" w:evenVBand="0" w:oddHBand="1" w:evenHBand="0" w:firstRowFirstColumn="0" w:firstRowLastColumn="0" w:lastRowFirstColumn="0" w:lastRowLastColumn="0"/>
               <w:rPr>
                 <w:rFonts w:asciiTheme="minorHAnsi" w:eastAsia="Arial" w:hAnsiTheme="minorHAnsi" w:cstheme="minorHAnsi"/>
               </w:rPr>
@@ -6865,7 +7105,6 @@
           <w:p>
             <w:pPr>
               <w:spacing w:line="276" w:lineRule="auto"/>
-              <w:cnfStyle w:val="000000100000" w:firstRow="0" w:lastRow="0" w:firstColumn="0" w:lastColumn="0" w:oddVBand="0" w:evenVBand="0" w:oddHBand="1" w:evenHBand="0" w:firstRowFirstColumn="0" w:firstRowLastColumn="0" w:lastRowFirstColumn="0" w:lastRowLastColumn="0"/>
               <w:rPr>
                 <w:rFonts w:asciiTheme="minorHAnsi" w:eastAsia="Arial" w:hAnsiTheme="minorHAnsi" w:cstheme="minorHAnsi"/>
               </w:rPr>
@@ -6882,7 +7121,6 @@
           <w:p>
             <w:pPr>
               <w:spacing w:line="276" w:lineRule="auto"/>
-              <w:cnfStyle w:val="000000100000" w:firstRow="0" w:lastRow="0" w:firstColumn="0" w:lastColumn="0" w:oddVBand="0" w:evenVBand="0" w:oddHBand="1" w:evenHBand="0" w:firstRowFirstColumn="0" w:firstRowLastColumn="0" w:lastRowFirstColumn="0" w:lastRowLastColumn="0"/>
               <w:rPr>
                 <w:rFonts w:asciiTheme="minorHAnsi" w:eastAsia="Arial" w:hAnsiTheme="minorHAnsi" w:cstheme="minorHAnsi"/>
               </w:rPr>
@@ -6939,12 +7177,12 @@
       <w:tr>
         <w:tc>
           <w:tcPr>
-            <w:cnfStyle w:val="001000000000" w:firstRow="0" w:lastRow="0" w:firstColumn="1" w:lastColumn="0" w:oddVBand="0" w:evenVBand="0" w:oddHBand="0" w:evenHBand="0" w:firstRowFirstColumn="0" w:firstRowLastColumn="0" w:lastRowFirstColumn="0" w:lastRowLastColumn="0"/>
             <w:tcW w:w="1129" w:type="dxa"/>
           </w:tcPr>
           <w:p>
             <w:pPr>
               <w:spacing w:line="276" w:lineRule="auto"/>
+              <w:cnfStyle w:val="001000000000" w:firstRow="0" w:lastRow="0" w:firstColumn="1" w:lastColumn="0" w:oddVBand="0" w:evenVBand="0" w:oddHBand="0" w:evenHBand="0" w:firstRowFirstColumn="0" w:firstRowLastColumn="0" w:lastRowFirstColumn="0" w:lastRowLastColumn="0"/>
               <w:rPr>
                 <w:rFonts w:asciiTheme="minorHAnsi" w:eastAsia="Arial" w:hAnsiTheme="minorHAnsi" w:cstheme="minorHAnsi"/>
               </w:rPr>
@@ -6970,7 +7208,6 @@
           <w:p>
             <w:pPr>
               <w:spacing w:line="276" w:lineRule="auto"/>
-              <w:cnfStyle w:val="000000000000" w:firstRow="0" w:lastRow="0" w:firstColumn="0" w:lastColumn="0" w:oddVBand="0" w:evenVBand="0" w:oddHBand="0" w:evenHBand="0" w:firstRowFirstColumn="0" w:firstRowLastColumn="0" w:lastRowFirstColumn="0" w:lastRowLastColumn="0"/>
               <w:rPr>
                 <w:rFonts w:asciiTheme="minorHAnsi" w:eastAsia="Arial" w:hAnsiTheme="minorHAnsi" w:cstheme="minorHAnsi"/>
               </w:rPr>
@@ -6987,7 +7224,6 @@
           <w:p>
             <w:pPr>
               <w:spacing w:line="276" w:lineRule="auto"/>
-              <w:cnfStyle w:val="000000000000" w:firstRow="0" w:lastRow="0" w:firstColumn="0" w:lastColumn="0" w:oddVBand="0" w:evenVBand="0" w:oddHBand="0" w:evenHBand="0" w:firstRowFirstColumn="0" w:firstRowLastColumn="0" w:lastRowFirstColumn="0" w:lastRowLastColumn="0"/>
               <w:rPr>
                 <w:rFonts w:asciiTheme="minorHAnsi" w:eastAsia="Arial" w:hAnsiTheme="minorHAnsi" w:cstheme="minorHAnsi"/>
               </w:rPr>
@@ -7047,11 +7283,11 @@
         </w:trPr>
         <w:tc>
           <w:tcPr>
-            <w:cnfStyle w:val="001000000000" w:firstRow="0" w:lastRow="0" w:firstColumn="1" w:lastColumn="0" w:oddVBand="0" w:evenVBand="0" w:oddHBand="0" w:evenHBand="0" w:firstRowFirstColumn="0" w:firstRowLastColumn="0" w:lastRowFirstColumn="0" w:lastRowLastColumn="0"/>
             <w:tcW w:w="1129" w:type="dxa"/>
           </w:tcPr>
           <w:p>
             <w:pPr>
+              <w:cnfStyle w:val="001000100000" w:firstRow="0" w:lastRow="0" w:firstColumn="1" w:lastColumn="0" w:oddVBand="0" w:evenVBand="0" w:oddHBand="1" w:evenHBand="0" w:firstRowFirstColumn="0" w:firstRowLastColumn="0" w:lastRowFirstColumn="0" w:lastRowLastColumn="0"/>
               <w:rPr>
                 <w:rFonts w:asciiTheme="minorHAnsi" w:eastAsia="Arial" w:hAnsiTheme="minorHAnsi" w:cstheme="minorHAnsi"/>
               </w:rPr>
@@ -7069,9 +7305,6 @@
             <w:tcW w:w="6308" w:type="dxa"/>
           </w:tcPr>
           <w:p>
-            <w:pPr>
-              <w:cnfStyle w:val="000000100000" w:firstRow="0" w:lastRow="0" w:firstColumn="0" w:lastColumn="0" w:oddVBand="0" w:evenVBand="0" w:oddHBand="1" w:evenHBand="0" w:firstRowFirstColumn="0" w:firstRowLastColumn="0" w:lastRowFirstColumn="0" w:lastRowLastColumn="0"/>
-            </w:pPr>
             <w:r>
               <w:t>Configurar o bloqueio automático de sessão nos ativos corporativos</w:t>
             </w:r>
@@ -7083,7 +7316,6 @@
           </w:tcPr>
           <w:p>
             <w:pPr>
-              <w:cnfStyle w:val="000000100000" w:firstRow="0" w:lastRow="0" w:firstColumn="0" w:lastColumn="0" w:oddVBand="0" w:evenVBand="0" w:oddHBand="1" w:evenHBand="0" w:firstRowFirstColumn="0" w:firstRowLastColumn="0" w:lastRowFirstColumn="0" w:lastRowLastColumn="0"/>
               <w:rPr>
                 <w:rFonts w:asciiTheme="minorHAnsi" w:eastAsia="Arial" w:hAnsiTheme="minorHAnsi" w:cstheme="minorHAnsi"/>
                 <w:b/>
@@ -7141,12 +7373,12 @@
       <w:tr>
         <w:tc>
           <w:tcPr>
-            <w:cnfStyle w:val="001000000000" w:firstRow="0" w:lastRow="0" w:firstColumn="1" w:lastColumn="0" w:oddVBand="0" w:evenVBand="0" w:oddHBand="0" w:evenHBand="0" w:firstRowFirstColumn="0" w:firstRowLastColumn="0" w:lastRowFirstColumn="0" w:lastRowLastColumn="0"/>
             <w:tcW w:w="1129" w:type="dxa"/>
           </w:tcPr>
           <w:p>
             <w:pPr>
               <w:spacing w:line="276" w:lineRule="auto"/>
+              <w:cnfStyle w:val="001000000000" w:firstRow="0" w:lastRow="0" w:firstColumn="1" w:lastColumn="0" w:oddVBand="0" w:evenVBand="0" w:oddHBand="0" w:evenHBand="0" w:firstRowFirstColumn="0" w:firstRowLastColumn="0" w:lastRowFirstColumn="0" w:lastRowLastColumn="0"/>
               <w:rPr>
                 <w:rFonts w:asciiTheme="minorHAnsi" w:eastAsia="Arial" w:hAnsiTheme="minorHAnsi" w:cstheme="minorHAnsi"/>
               </w:rPr>
@@ -7172,7 +7404,6 @@
           <w:p>
             <w:pPr>
               <w:spacing w:line="276" w:lineRule="auto"/>
-              <w:cnfStyle w:val="000000000000" w:firstRow="0" w:lastRow="0" w:firstColumn="0" w:lastColumn="0" w:oddVBand="0" w:evenVBand="0" w:oddHBand="0" w:evenHBand="0" w:firstRowFirstColumn="0" w:firstRowLastColumn="0" w:lastRowFirstColumn="0" w:lastRowLastColumn="0"/>
               <w:rPr>
                 <w:rFonts w:asciiTheme="minorHAnsi" w:eastAsia="Arial" w:hAnsiTheme="minorHAnsi" w:cstheme="minorHAnsi"/>
               </w:rPr>
@@ -7189,7 +7420,6 @@
           <w:p>
             <w:pPr>
               <w:spacing w:line="276" w:lineRule="auto"/>
-              <w:cnfStyle w:val="000000000000" w:firstRow="0" w:lastRow="0" w:firstColumn="0" w:lastColumn="0" w:oddVBand="0" w:evenVBand="0" w:oddHBand="0" w:evenHBand="0" w:firstRowFirstColumn="0" w:firstRowLastColumn="0" w:lastRowFirstColumn="0" w:lastRowLastColumn="0"/>
               <w:rPr>
                 <w:rFonts w:asciiTheme="minorHAnsi" w:eastAsia="Arial" w:hAnsiTheme="minorHAnsi" w:cstheme="minorHAnsi"/>
               </w:rPr>
@@ -7249,12 +7479,12 @@
         </w:trPr>
         <w:tc>
           <w:tcPr>
-            <w:cnfStyle w:val="001000000000" w:firstRow="0" w:lastRow="0" w:firstColumn="1" w:lastColumn="0" w:oddVBand="0" w:evenVBand="0" w:oddHBand="0" w:evenHBand="0" w:firstRowFirstColumn="0" w:firstRowLastColumn="0" w:lastRowFirstColumn="0" w:lastRowLastColumn="0"/>
             <w:tcW w:w="1129" w:type="dxa"/>
           </w:tcPr>
           <w:p>
             <w:pPr>
               <w:spacing w:line="276" w:lineRule="auto"/>
+              <w:cnfStyle w:val="001000100000" w:firstRow="0" w:lastRow="0" w:firstColumn="1" w:lastColumn="0" w:oddVBand="0" w:evenVBand="0" w:oddHBand="1" w:evenHBand="0" w:firstRowFirstColumn="0" w:firstRowLastColumn="0" w:lastRowFirstColumn="0" w:lastRowLastColumn="0"/>
               <w:rPr>
                 <w:rFonts w:asciiTheme="minorHAnsi" w:eastAsia="Arial" w:hAnsiTheme="minorHAnsi" w:cstheme="minorHAnsi"/>
               </w:rPr>
@@ -7280,7 +7510,6 @@
           <w:p>
             <w:pPr>
               <w:spacing w:line="276" w:lineRule="auto"/>
-              <w:cnfStyle w:val="000000100000" w:firstRow="0" w:lastRow="0" w:firstColumn="0" w:lastColumn="0" w:oddVBand="0" w:evenVBand="0" w:oddHBand="1" w:evenHBand="0" w:firstRowFirstColumn="0" w:firstRowLastColumn="0" w:lastRowFirstColumn="0" w:lastRowLastColumn="0"/>
               <w:rPr>
                 <w:rFonts w:asciiTheme="minorHAnsi" w:eastAsia="Arial" w:hAnsiTheme="minorHAnsi" w:cstheme="minorHAnsi"/>
               </w:rPr>
@@ -7297,7 +7526,6 @@
           <w:p>
             <w:pPr>
               <w:spacing w:line="276" w:lineRule="auto"/>
-              <w:cnfStyle w:val="000000100000" w:firstRow="0" w:lastRow="0" w:firstColumn="0" w:lastColumn="0" w:oddVBand="0" w:evenVBand="0" w:oddHBand="1" w:evenHBand="0" w:firstRowFirstColumn="0" w:firstRowLastColumn="0" w:lastRowFirstColumn="0" w:lastRowLastColumn="0"/>
               <w:rPr>
                 <w:rFonts w:asciiTheme="minorHAnsi" w:eastAsia="Arial" w:hAnsiTheme="minorHAnsi" w:cstheme="minorHAnsi"/>
               </w:rPr>
@@ -7354,11 +7582,11 @@
       <w:tr>
         <w:tc>
           <w:tcPr>
-            <w:cnfStyle w:val="001000000000" w:firstRow="0" w:lastRow="0" w:firstColumn="1" w:lastColumn="0" w:oddVBand="0" w:evenVBand="0" w:oddHBand="0" w:evenHBand="0" w:firstRowFirstColumn="0" w:firstRowLastColumn="0" w:lastRowFirstColumn="0" w:lastRowLastColumn="0"/>
             <w:tcW w:w="1129" w:type="dxa"/>
           </w:tcPr>
           <w:p>
             <w:pPr>
+              <w:cnfStyle w:val="001000000000" w:firstRow="0" w:lastRow="0" w:firstColumn="1" w:lastColumn="0" w:oddVBand="0" w:evenVBand="0" w:oddHBand="0" w:evenHBand="0" w:firstRowFirstColumn="0" w:firstRowLastColumn="0" w:lastRowFirstColumn="0" w:lastRowLastColumn="0"/>
               <w:rPr>
                 <w:rFonts w:asciiTheme="minorHAnsi" w:eastAsia="Arial" w:hAnsiTheme="minorHAnsi" w:cstheme="minorHAnsi"/>
               </w:rPr>
@@ -7376,9 +7604,6 @@
             <w:tcW w:w="6308" w:type="dxa"/>
           </w:tcPr>
           <w:p>
-            <w:pPr>
-              <w:cnfStyle w:val="000000000000" w:firstRow="0" w:lastRow="0" w:firstColumn="0" w:lastColumn="0" w:oddVBand="0" w:evenVBand="0" w:oddHBand="0" w:evenHBand="0" w:firstRowFirstColumn="0" w:firstRowLastColumn="0" w:lastRowFirstColumn="0" w:lastRowLastColumn="0"/>
-            </w:pPr>
             <w:r>
               <w:t>Gerenciar com segurança os ativos e softwares corporativos</w:t>
             </w:r>
@@ -7390,7 +7615,6 @@
           </w:tcPr>
           <w:p>
             <w:pPr>
-              <w:cnfStyle w:val="000000000000" w:firstRow="0" w:lastRow="0" w:firstColumn="0" w:lastColumn="0" w:oddVBand="0" w:evenVBand="0" w:oddHBand="0" w:evenHBand="0" w:firstRowFirstColumn="0" w:firstRowLastColumn="0" w:lastRowFirstColumn="0" w:lastRowLastColumn="0"/>
               <w:rPr>
                 <w:rFonts w:asciiTheme="minorHAnsi" w:eastAsia="Arial" w:hAnsiTheme="minorHAnsi" w:cstheme="minorHAnsi"/>
                 <w:b/>
@@ -7451,11 +7675,11 @@
         </w:trPr>
         <w:tc>
           <w:tcPr>
-            <w:cnfStyle w:val="001000000000" w:firstRow="0" w:lastRow="0" w:firstColumn="1" w:lastColumn="0" w:oddVBand="0" w:evenVBand="0" w:oddHBand="0" w:evenHBand="0" w:firstRowFirstColumn="0" w:firstRowLastColumn="0" w:lastRowFirstColumn="0" w:lastRowLastColumn="0"/>
             <w:tcW w:w="1129" w:type="dxa"/>
           </w:tcPr>
           <w:p>
             <w:pPr>
+              <w:cnfStyle w:val="001000100000" w:firstRow="0" w:lastRow="0" w:firstColumn="1" w:lastColumn="0" w:oddVBand="0" w:evenVBand="0" w:oddHBand="1" w:evenHBand="0" w:firstRowFirstColumn="0" w:firstRowLastColumn="0" w:lastRowFirstColumn="0" w:lastRowLastColumn="0"/>
               <w:rPr>
                 <w:rFonts w:asciiTheme="minorHAnsi" w:eastAsia="Arial" w:hAnsiTheme="minorHAnsi" w:cstheme="minorHAnsi"/>
               </w:rPr>
@@ -7464,6 +7688,7 @@
               <w:rPr>
                 <w:rFonts w:asciiTheme="minorHAnsi" w:eastAsia="Arial" w:hAnsiTheme="minorHAnsi" w:cstheme="minorHAnsi"/>
               </w:rPr>
+              <w:lastRenderedPageBreak/>
               <w:t>ms47</w:t>
             </w:r>
           </w:p>
@@ -7473,9 +7698,6 @@
             <w:tcW w:w="6308" w:type="dxa"/>
           </w:tcPr>
           <w:p>
-            <w:pPr>
-              <w:cnfStyle w:val="000000100000" w:firstRow="0" w:lastRow="0" w:firstColumn="0" w:lastColumn="0" w:oddVBand="0" w:evenVBand="0" w:oddHBand="1" w:evenHBand="0" w:firstRowFirstColumn="0" w:firstRowLastColumn="0" w:lastRowFirstColumn="0" w:lastRowLastColumn="0"/>
-            </w:pPr>
             <w:r>
               <w:t>Gerenciar contas padrão nos ativos e softwares corporativos</w:t>
             </w:r>
@@ -7487,7 +7709,6 @@
           </w:tcPr>
           <w:p>
             <w:pPr>
-              <w:cnfStyle w:val="000000100000" w:firstRow="0" w:lastRow="0" w:firstColumn="0" w:lastColumn="0" w:oddVBand="0" w:evenVBand="0" w:oddHBand="1" w:evenHBand="0" w:firstRowFirstColumn="0" w:firstRowLastColumn="0" w:lastRowFirstColumn="0" w:lastRowLastColumn="0"/>
               <w:rPr>
                 <w:rFonts w:asciiTheme="minorHAnsi" w:eastAsia="Arial" w:hAnsiTheme="minorHAnsi" w:cstheme="minorHAnsi"/>
                 <w:b/>
@@ -7603,7 +7824,6 @@
         <w:rPr>
           <w:rFonts w:eastAsia="Arial"/>
         </w:rPr>
-        <w:lastRenderedPageBreak/>
         <w:t xml:space="preserve">2.2.6. Controle 05 – </w:t>
       </w:r>
       <w:r>
@@ -7978,11 +8198,11 @@
         </w:trPr>
         <w:tc>
           <w:tcPr>
-            <w:cnfStyle w:val="001000000000" w:firstRow="0" w:lastRow="0" w:firstColumn="1" w:lastColumn="0" w:oddVBand="0" w:evenVBand="0" w:oddHBand="0" w:evenHBand="0" w:firstRowFirstColumn="0" w:firstRowLastColumn="0" w:lastRowFirstColumn="0" w:lastRowLastColumn="0"/>
             <w:tcW w:w="1129" w:type="dxa"/>
           </w:tcPr>
           <w:p>
             <w:pPr>
+              <w:cnfStyle w:val="101000000000" w:firstRow="1" w:lastRow="0" w:firstColumn="1" w:lastColumn="0" w:oddVBand="0" w:evenVBand="0" w:oddHBand="0" w:evenHBand="0" w:firstRowFirstColumn="0" w:firstRowLastColumn="0" w:lastRowFirstColumn="0" w:lastRowLastColumn="0"/>
               <w:rPr>
                 <w:rFonts w:asciiTheme="minorHAnsi" w:eastAsia="Arial" w:hAnsiTheme="minorHAnsi" w:cstheme="minorHAnsi"/>
                 <w:szCs w:val="18"/>
@@ -8003,7 +8223,6 @@
           </w:tcPr>
           <w:p>
             <w:pPr>
-              <w:cnfStyle w:val="100000000000" w:firstRow="1" w:lastRow="0" w:firstColumn="0" w:lastColumn="0" w:oddVBand="0" w:evenVBand="0" w:oddHBand="0" w:evenHBand="0" w:firstRowFirstColumn="0" w:firstRowLastColumn="0" w:lastRowFirstColumn="0" w:lastRowLastColumn="0"/>
               <w:rPr>
                 <w:rFonts w:asciiTheme="minorHAnsi" w:hAnsiTheme="minorHAnsi" w:cstheme="minorHAnsi"/>
                 <w:szCs w:val="18"/>
@@ -8024,7 +8243,6 @@
           </w:tcPr>
           <w:p>
             <w:pPr>
-              <w:cnfStyle w:val="100000000000" w:firstRow="1" w:lastRow="0" w:firstColumn="0" w:lastColumn="0" w:oddVBand="0" w:evenVBand="0" w:oddHBand="0" w:evenHBand="0" w:firstRowFirstColumn="0" w:firstRowLastColumn="0" w:lastRowFirstColumn="0" w:lastRowLastColumn="0"/>
               <w:rPr>
                 <w:rFonts w:asciiTheme="minorHAnsi" w:eastAsia="Arial" w:hAnsiTheme="minorHAnsi" w:cstheme="minorHAnsi"/>
                 <w:szCs w:val="18"/>
@@ -8046,12 +8264,12 @@
         </w:trPr>
         <w:tc>
           <w:tcPr>
-            <w:cnfStyle w:val="001000000000" w:firstRow="0" w:lastRow="0" w:firstColumn="1" w:lastColumn="0" w:oddVBand="0" w:evenVBand="0" w:oddHBand="0" w:evenHBand="0" w:firstRowFirstColumn="0" w:firstRowLastColumn="0" w:lastRowFirstColumn="0" w:lastRowLastColumn="0"/>
             <w:tcW w:w="1129" w:type="dxa"/>
           </w:tcPr>
           <w:p>
             <w:pPr>
               <w:spacing w:line="276" w:lineRule="auto"/>
+              <w:cnfStyle w:val="001000100000" w:firstRow="0" w:lastRow="0" w:firstColumn="1" w:lastColumn="0" w:oddVBand="0" w:evenVBand="0" w:oddHBand="1" w:evenHBand="0" w:firstRowFirstColumn="0" w:firstRowLastColumn="0" w:lastRowFirstColumn="0" w:lastRowLastColumn="0"/>
               <w:rPr>
                 <w:rFonts w:asciiTheme="minorHAnsi" w:eastAsia="Arial" w:hAnsiTheme="minorHAnsi" w:cstheme="minorHAnsi"/>
               </w:rPr>
@@ -8077,7 +8295,6 @@
           <w:p>
             <w:pPr>
               <w:spacing w:line="276" w:lineRule="auto"/>
-              <w:cnfStyle w:val="000000100000" w:firstRow="0" w:lastRow="0" w:firstColumn="0" w:lastColumn="0" w:oddVBand="0" w:evenVBand="0" w:oddHBand="1" w:evenHBand="0" w:firstRowFirstColumn="0" w:firstRowLastColumn="0" w:lastRowFirstColumn="0" w:lastRowLastColumn="0"/>
               <w:rPr>
                 <w:rFonts w:asciiTheme="minorHAnsi" w:eastAsia="Arial" w:hAnsiTheme="minorHAnsi" w:cstheme="minorHAnsi"/>
               </w:rPr>
@@ -8094,7 +8311,6 @@
           <w:p>
             <w:pPr>
               <w:spacing w:line="276" w:lineRule="auto"/>
-              <w:cnfStyle w:val="000000100000" w:firstRow="0" w:lastRow="0" w:firstColumn="0" w:lastColumn="0" w:oddVBand="0" w:evenVBand="0" w:oddHBand="1" w:evenHBand="0" w:firstRowFirstColumn="0" w:firstRowLastColumn="0" w:lastRowFirstColumn="0" w:lastRowLastColumn="0"/>
               <w:rPr>
                 <w:rFonts w:asciiTheme="minorHAnsi" w:eastAsia="Arial" w:hAnsiTheme="minorHAnsi" w:cstheme="minorHAnsi"/>
               </w:rPr>
@@ -8151,12 +8367,12 @@
       <w:tr>
         <w:tc>
           <w:tcPr>
-            <w:cnfStyle w:val="001000000000" w:firstRow="0" w:lastRow="0" w:firstColumn="1" w:lastColumn="0" w:oddVBand="0" w:evenVBand="0" w:oddHBand="0" w:evenHBand="0" w:firstRowFirstColumn="0" w:firstRowLastColumn="0" w:lastRowFirstColumn="0" w:lastRowLastColumn="0"/>
             <w:tcW w:w="1129" w:type="dxa"/>
           </w:tcPr>
           <w:p>
             <w:pPr>
               <w:spacing w:line="276" w:lineRule="auto"/>
+              <w:cnfStyle w:val="001000000000" w:firstRow="0" w:lastRow="0" w:firstColumn="1" w:lastColumn="0" w:oddVBand="0" w:evenVBand="0" w:oddHBand="0" w:evenHBand="0" w:firstRowFirstColumn="0" w:firstRowLastColumn="0" w:lastRowFirstColumn="0" w:lastRowLastColumn="0"/>
               <w:rPr>
                 <w:rFonts w:asciiTheme="minorHAnsi" w:eastAsia="Arial" w:hAnsiTheme="minorHAnsi" w:cstheme="minorHAnsi"/>
               </w:rPr>
@@ -8182,7 +8398,6 @@
           <w:p>
             <w:pPr>
               <w:spacing w:line="276" w:lineRule="auto"/>
-              <w:cnfStyle w:val="000000000000" w:firstRow="0" w:lastRow="0" w:firstColumn="0" w:lastColumn="0" w:oddVBand="0" w:evenVBand="0" w:oddHBand="0" w:evenHBand="0" w:firstRowFirstColumn="0" w:firstRowLastColumn="0" w:lastRowFirstColumn="0" w:lastRowLastColumn="0"/>
               <w:rPr>
                 <w:rFonts w:asciiTheme="minorHAnsi" w:eastAsia="Arial" w:hAnsiTheme="minorHAnsi" w:cstheme="minorHAnsi"/>
               </w:rPr>
@@ -8199,7 +8414,6 @@
           <w:p>
             <w:pPr>
               <w:spacing w:line="276" w:lineRule="auto"/>
-              <w:cnfStyle w:val="000000000000" w:firstRow="0" w:lastRow="0" w:firstColumn="0" w:lastColumn="0" w:oddVBand="0" w:evenVBand="0" w:oddHBand="0" w:evenHBand="0" w:firstRowFirstColumn="0" w:firstRowLastColumn="0" w:lastRowFirstColumn="0" w:lastRowLastColumn="0"/>
               <w:rPr>
                 <w:rFonts w:asciiTheme="minorHAnsi" w:eastAsia="Arial" w:hAnsiTheme="minorHAnsi" w:cstheme="minorHAnsi"/>
               </w:rPr>
@@ -8259,11 +8473,11 @@
         </w:trPr>
         <w:tc>
           <w:tcPr>
-            <w:cnfStyle w:val="001000000000" w:firstRow="0" w:lastRow="0" w:firstColumn="1" w:lastColumn="0" w:oddVBand="0" w:evenVBand="0" w:oddHBand="0" w:evenHBand="0" w:firstRowFirstColumn="0" w:firstRowLastColumn="0" w:lastRowFirstColumn="0" w:lastRowLastColumn="0"/>
             <w:tcW w:w="1129" w:type="dxa"/>
           </w:tcPr>
           <w:p>
             <w:pPr>
+              <w:cnfStyle w:val="001000100000" w:firstRow="0" w:lastRow="0" w:firstColumn="1" w:lastColumn="0" w:oddVBand="0" w:evenVBand="0" w:oddHBand="1" w:evenHBand="0" w:firstRowFirstColumn="0" w:firstRowLastColumn="0" w:lastRowFirstColumn="0" w:lastRowLastColumn="0"/>
               <w:rPr>
                 <w:rFonts w:asciiTheme="minorHAnsi" w:eastAsia="Arial" w:hAnsiTheme="minorHAnsi" w:cstheme="minorHAnsi"/>
               </w:rPr>
@@ -8281,9 +8495,6 @@
             <w:tcW w:w="6308" w:type="dxa"/>
           </w:tcPr>
           <w:p>
-            <w:pPr>
-              <w:cnfStyle w:val="000000100000" w:firstRow="0" w:lastRow="0" w:firstColumn="0" w:lastColumn="0" w:oddVBand="0" w:evenVBand="0" w:oddHBand="1" w:evenHBand="0" w:firstRowFirstColumn="0" w:firstRowLastColumn="0" w:lastRowFirstColumn="0" w:lastRowLastColumn="0"/>
-            </w:pPr>
             <w:r>
               <w:t>Desabilitar contas inativas</w:t>
             </w:r>
@@ -8295,7 +8506,6 @@
           </w:tcPr>
           <w:p>
             <w:pPr>
-              <w:cnfStyle w:val="000000100000" w:firstRow="0" w:lastRow="0" w:firstColumn="0" w:lastColumn="0" w:oddVBand="0" w:evenVBand="0" w:oddHBand="1" w:evenHBand="0" w:firstRowFirstColumn="0" w:firstRowLastColumn="0" w:lastRowFirstColumn="0" w:lastRowLastColumn="0"/>
               <w:rPr>
                 <w:rFonts w:asciiTheme="minorHAnsi" w:eastAsia="Arial" w:hAnsiTheme="minorHAnsi" w:cstheme="minorHAnsi"/>
                 <w:b/>
@@ -8353,12 +8563,12 @@
       <w:tr>
         <w:tc>
           <w:tcPr>
-            <w:cnfStyle w:val="001000000000" w:firstRow="0" w:lastRow="0" w:firstColumn="1" w:lastColumn="0" w:oddVBand="0" w:evenVBand="0" w:oddHBand="0" w:evenHBand="0" w:firstRowFirstColumn="0" w:firstRowLastColumn="0" w:lastRowFirstColumn="0" w:lastRowLastColumn="0"/>
             <w:tcW w:w="1129" w:type="dxa"/>
           </w:tcPr>
           <w:p>
             <w:pPr>
               <w:spacing w:line="276" w:lineRule="auto"/>
+              <w:cnfStyle w:val="001000000000" w:firstRow="0" w:lastRow="0" w:firstColumn="1" w:lastColumn="0" w:oddVBand="0" w:evenVBand="0" w:oddHBand="0" w:evenHBand="0" w:firstRowFirstColumn="0" w:firstRowLastColumn="0" w:lastRowFirstColumn="0" w:lastRowLastColumn="0"/>
               <w:rPr>
                 <w:rFonts w:asciiTheme="minorHAnsi" w:eastAsia="Arial" w:hAnsiTheme="minorHAnsi" w:cstheme="minorHAnsi"/>
               </w:rPr>
@@ -8367,6 +8577,7 @@
               <w:rPr>
                 <w:rFonts w:asciiTheme="minorHAnsi" w:eastAsia="Arial" w:hAnsiTheme="minorHAnsi" w:cstheme="minorHAnsi"/>
               </w:rPr>
+              <w:lastRenderedPageBreak/>
               <w:t>ms</w:t>
             </w:r>
             <w:r>
@@ -8384,7 +8595,6 @@
           <w:p>
             <w:pPr>
               <w:spacing w:line="276" w:lineRule="auto"/>
-              <w:cnfStyle w:val="000000000000" w:firstRow="0" w:lastRow="0" w:firstColumn="0" w:lastColumn="0" w:oddVBand="0" w:evenVBand="0" w:oddHBand="0" w:evenHBand="0" w:firstRowFirstColumn="0" w:firstRowLastColumn="0" w:lastRowFirstColumn="0" w:lastRowLastColumn="0"/>
               <w:rPr>
                 <w:rFonts w:asciiTheme="minorHAnsi" w:eastAsia="Arial" w:hAnsiTheme="minorHAnsi" w:cstheme="minorHAnsi"/>
               </w:rPr>
@@ -8401,7 +8611,6 @@
           <w:p>
             <w:pPr>
               <w:spacing w:line="276" w:lineRule="auto"/>
-              <w:cnfStyle w:val="000000000000" w:firstRow="0" w:lastRow="0" w:firstColumn="0" w:lastColumn="0" w:oddVBand="0" w:evenVBand="0" w:oddHBand="0" w:evenHBand="0" w:firstRowFirstColumn="0" w:firstRowLastColumn="0" w:lastRowFirstColumn="0" w:lastRowLastColumn="0"/>
               <w:rPr>
                 <w:rFonts w:asciiTheme="minorHAnsi" w:eastAsia="Arial" w:hAnsiTheme="minorHAnsi" w:cstheme="minorHAnsi"/>
               </w:rPr>
@@ -8536,7 +8745,6 @@
         <w:rPr>
           <w:rFonts w:eastAsia="Arial"/>
         </w:rPr>
-        <w:lastRenderedPageBreak/>
         <w:t xml:space="preserve">2.2.6. Controle 06 – </w:t>
       </w:r>
       <w:r>
@@ -8908,11 +9116,11 @@
         </w:trPr>
         <w:tc>
           <w:tcPr>
-            <w:cnfStyle w:val="001000000000" w:firstRow="0" w:lastRow="0" w:firstColumn="1" w:lastColumn="0" w:oddVBand="0" w:evenVBand="0" w:oddHBand="0" w:evenHBand="0" w:firstRowFirstColumn="0" w:firstRowLastColumn="0" w:lastRowFirstColumn="0" w:lastRowLastColumn="0"/>
             <w:tcW w:w="1129" w:type="dxa"/>
           </w:tcPr>
           <w:p>
             <w:pPr>
+              <w:cnfStyle w:val="101000000000" w:firstRow="1" w:lastRow="0" w:firstColumn="1" w:lastColumn="0" w:oddVBand="0" w:evenVBand="0" w:oddHBand="0" w:evenHBand="0" w:firstRowFirstColumn="0" w:firstRowLastColumn="0" w:lastRowFirstColumn="0" w:lastRowLastColumn="0"/>
               <w:rPr>
                 <w:rFonts w:asciiTheme="minorHAnsi" w:eastAsia="Arial" w:hAnsiTheme="minorHAnsi" w:cstheme="minorHAnsi"/>
                 <w:szCs w:val="18"/>
@@ -8933,7 +9141,6 @@
           </w:tcPr>
           <w:p>
             <w:pPr>
-              <w:cnfStyle w:val="100000000000" w:firstRow="1" w:lastRow="0" w:firstColumn="0" w:lastColumn="0" w:oddVBand="0" w:evenVBand="0" w:oddHBand="0" w:evenHBand="0" w:firstRowFirstColumn="0" w:firstRowLastColumn="0" w:lastRowFirstColumn="0" w:lastRowLastColumn="0"/>
               <w:rPr>
                 <w:rFonts w:asciiTheme="minorHAnsi" w:hAnsiTheme="minorHAnsi" w:cstheme="minorHAnsi"/>
                 <w:szCs w:val="18"/>
@@ -8954,7 +9161,6 @@
           </w:tcPr>
           <w:p>
             <w:pPr>
-              <w:cnfStyle w:val="100000000000" w:firstRow="1" w:lastRow="0" w:firstColumn="0" w:lastColumn="0" w:oddVBand="0" w:evenVBand="0" w:oddHBand="0" w:evenHBand="0" w:firstRowFirstColumn="0" w:firstRowLastColumn="0" w:lastRowFirstColumn="0" w:lastRowLastColumn="0"/>
               <w:rPr>
                 <w:rFonts w:asciiTheme="minorHAnsi" w:eastAsia="Arial" w:hAnsiTheme="minorHAnsi" w:cstheme="minorHAnsi"/>
                 <w:szCs w:val="18"/>
@@ -8976,12 +9182,12 @@
         </w:trPr>
         <w:tc>
           <w:tcPr>
-            <w:cnfStyle w:val="001000000000" w:firstRow="0" w:lastRow="0" w:firstColumn="1" w:lastColumn="0" w:oddVBand="0" w:evenVBand="0" w:oddHBand="0" w:evenHBand="0" w:firstRowFirstColumn="0" w:firstRowLastColumn="0" w:lastRowFirstColumn="0" w:lastRowLastColumn="0"/>
             <w:tcW w:w="1129" w:type="dxa"/>
           </w:tcPr>
           <w:p>
             <w:pPr>
               <w:spacing w:line="276" w:lineRule="auto"/>
+              <w:cnfStyle w:val="001000100000" w:firstRow="0" w:lastRow="0" w:firstColumn="1" w:lastColumn="0" w:oddVBand="0" w:evenVBand="0" w:oddHBand="1" w:evenHBand="0" w:firstRowFirstColumn="0" w:firstRowLastColumn="0" w:lastRowFirstColumn="0" w:lastRowLastColumn="0"/>
               <w:rPr>
                 <w:rFonts w:asciiTheme="minorHAnsi" w:eastAsia="Arial" w:hAnsiTheme="minorHAnsi" w:cstheme="minorHAnsi"/>
               </w:rPr>
@@ -9007,7 +9213,6 @@
           <w:p>
             <w:pPr>
               <w:spacing w:line="276" w:lineRule="auto"/>
-              <w:cnfStyle w:val="000000100000" w:firstRow="0" w:lastRow="0" w:firstColumn="0" w:lastColumn="0" w:oddVBand="0" w:evenVBand="0" w:oddHBand="1" w:evenHBand="0" w:firstRowFirstColumn="0" w:firstRowLastColumn="0" w:lastRowFirstColumn="0" w:lastRowLastColumn="0"/>
               <w:rPr>
                 <w:rFonts w:asciiTheme="minorHAnsi" w:eastAsia="Arial" w:hAnsiTheme="minorHAnsi" w:cstheme="minorHAnsi"/>
               </w:rPr>
@@ -9024,7 +9229,6 @@
           <w:p>
             <w:pPr>
               <w:spacing w:line="276" w:lineRule="auto"/>
-              <w:cnfStyle w:val="000000100000" w:firstRow="0" w:lastRow="0" w:firstColumn="0" w:lastColumn="0" w:oddVBand="0" w:evenVBand="0" w:oddHBand="1" w:evenHBand="0" w:firstRowFirstColumn="0" w:firstRowLastColumn="0" w:lastRowFirstColumn="0" w:lastRowLastColumn="0"/>
               <w:rPr>
                 <w:rFonts w:asciiTheme="minorHAnsi" w:eastAsia="Arial" w:hAnsiTheme="minorHAnsi" w:cstheme="minorHAnsi"/>
               </w:rPr>
@@ -9081,12 +9285,12 @@
       <w:tr>
         <w:tc>
           <w:tcPr>
-            <w:cnfStyle w:val="001000000000" w:firstRow="0" w:lastRow="0" w:firstColumn="1" w:lastColumn="0" w:oddVBand="0" w:evenVBand="0" w:oddHBand="0" w:evenHBand="0" w:firstRowFirstColumn="0" w:firstRowLastColumn="0" w:lastRowFirstColumn="0" w:lastRowLastColumn="0"/>
             <w:tcW w:w="1129" w:type="dxa"/>
           </w:tcPr>
           <w:p>
             <w:pPr>
               <w:spacing w:line="276" w:lineRule="auto"/>
+              <w:cnfStyle w:val="001000000000" w:firstRow="0" w:lastRow="0" w:firstColumn="1" w:lastColumn="0" w:oddVBand="0" w:evenVBand="0" w:oddHBand="0" w:evenHBand="0" w:firstRowFirstColumn="0" w:firstRowLastColumn="0" w:lastRowFirstColumn="0" w:lastRowLastColumn="0"/>
               <w:rPr>
                 <w:rFonts w:asciiTheme="minorHAnsi" w:eastAsia="Arial" w:hAnsiTheme="minorHAnsi" w:cstheme="minorHAnsi"/>
               </w:rPr>
@@ -9112,7 +9316,6 @@
           <w:p>
             <w:pPr>
               <w:spacing w:line="276" w:lineRule="auto"/>
-              <w:cnfStyle w:val="000000000000" w:firstRow="0" w:lastRow="0" w:firstColumn="0" w:lastColumn="0" w:oddVBand="0" w:evenVBand="0" w:oddHBand="0" w:evenHBand="0" w:firstRowFirstColumn="0" w:firstRowLastColumn="0" w:lastRowFirstColumn="0" w:lastRowLastColumn="0"/>
               <w:rPr>
                 <w:rFonts w:asciiTheme="minorHAnsi" w:eastAsia="Arial" w:hAnsiTheme="minorHAnsi" w:cstheme="minorHAnsi"/>
               </w:rPr>
@@ -9129,7 +9332,6 @@
           <w:p>
             <w:pPr>
               <w:spacing w:line="276" w:lineRule="auto"/>
-              <w:cnfStyle w:val="000000000000" w:firstRow="0" w:lastRow="0" w:firstColumn="0" w:lastColumn="0" w:oddVBand="0" w:evenVBand="0" w:oddHBand="0" w:evenHBand="0" w:firstRowFirstColumn="0" w:firstRowLastColumn="0" w:lastRowFirstColumn="0" w:lastRowLastColumn="0"/>
               <w:rPr>
                 <w:rFonts w:asciiTheme="minorHAnsi" w:eastAsia="Arial" w:hAnsiTheme="minorHAnsi" w:cstheme="minorHAnsi"/>
               </w:rPr>
@@ -9189,11 +9391,11 @@
         </w:trPr>
         <w:tc>
           <w:tcPr>
-            <w:cnfStyle w:val="001000000000" w:firstRow="0" w:lastRow="0" w:firstColumn="1" w:lastColumn="0" w:oddVBand="0" w:evenVBand="0" w:oddHBand="0" w:evenHBand="0" w:firstRowFirstColumn="0" w:firstRowLastColumn="0" w:lastRowFirstColumn="0" w:lastRowLastColumn="0"/>
             <w:tcW w:w="1129" w:type="dxa"/>
           </w:tcPr>
           <w:p>
             <w:pPr>
+              <w:cnfStyle w:val="001000100000" w:firstRow="0" w:lastRow="0" w:firstColumn="1" w:lastColumn="0" w:oddVBand="0" w:evenVBand="0" w:oddHBand="1" w:evenHBand="0" w:firstRowFirstColumn="0" w:firstRowLastColumn="0" w:lastRowFirstColumn="0" w:lastRowLastColumn="0"/>
               <w:rPr>
                 <w:rFonts w:asciiTheme="minorHAnsi" w:eastAsia="Arial" w:hAnsiTheme="minorHAnsi" w:cstheme="minorHAnsi"/>
               </w:rPr>
@@ -9211,9 +9413,6 @@
             <w:tcW w:w="6308" w:type="dxa"/>
           </w:tcPr>
           <w:p>
-            <w:pPr>
-              <w:cnfStyle w:val="000000100000" w:firstRow="0" w:lastRow="0" w:firstColumn="0" w:lastColumn="0" w:oddVBand="0" w:evenVBand="0" w:oddHBand="1" w:evenHBand="0" w:firstRowFirstColumn="0" w:firstRowLastColumn="0" w:lastRowFirstColumn="0" w:lastRowLastColumn="0"/>
-            </w:pPr>
             <w:r>
               <w:t>Exigir MFA para aplicações expostas externamente</w:t>
             </w:r>
@@ -9225,7 +9424,6 @@
           </w:tcPr>
           <w:p>
             <w:pPr>
-              <w:cnfStyle w:val="000000100000" w:firstRow="0" w:lastRow="0" w:firstColumn="0" w:lastColumn="0" w:oddVBand="0" w:evenVBand="0" w:oddHBand="1" w:evenHBand="0" w:firstRowFirstColumn="0" w:firstRowLastColumn="0" w:lastRowFirstColumn="0" w:lastRowLastColumn="0"/>
               <w:rPr>
                 <w:rFonts w:asciiTheme="minorHAnsi" w:eastAsia="Arial" w:hAnsiTheme="minorHAnsi" w:cstheme="minorHAnsi"/>
                 <w:b/>
@@ -9283,12 +9481,12 @@
       <w:tr>
         <w:tc>
           <w:tcPr>
-            <w:cnfStyle w:val="001000000000" w:firstRow="0" w:lastRow="0" w:firstColumn="1" w:lastColumn="0" w:oddVBand="0" w:evenVBand="0" w:oddHBand="0" w:evenHBand="0" w:firstRowFirstColumn="0" w:firstRowLastColumn="0" w:lastRowFirstColumn="0" w:lastRowLastColumn="0"/>
             <w:tcW w:w="1129" w:type="dxa"/>
           </w:tcPr>
           <w:p>
             <w:pPr>
               <w:spacing w:line="276" w:lineRule="auto"/>
+              <w:cnfStyle w:val="001000000000" w:firstRow="0" w:lastRow="0" w:firstColumn="1" w:lastColumn="0" w:oddVBand="0" w:evenVBand="0" w:oddHBand="0" w:evenHBand="0" w:firstRowFirstColumn="0" w:firstRowLastColumn="0" w:lastRowFirstColumn="0" w:lastRowLastColumn="0"/>
               <w:rPr>
                 <w:rFonts w:asciiTheme="minorHAnsi" w:eastAsia="Arial" w:hAnsiTheme="minorHAnsi" w:cstheme="minorHAnsi"/>
               </w:rPr>
@@ -9297,6 +9495,7 @@
               <w:rPr>
                 <w:rFonts w:asciiTheme="minorHAnsi" w:eastAsia="Arial" w:hAnsiTheme="minorHAnsi" w:cstheme="minorHAnsi"/>
               </w:rPr>
+              <w:lastRenderedPageBreak/>
               <w:t>ms</w:t>
             </w:r>
             <w:r>
@@ -9314,7 +9513,6 @@
           <w:p>
             <w:pPr>
               <w:spacing w:line="276" w:lineRule="auto"/>
-              <w:cnfStyle w:val="000000000000" w:firstRow="0" w:lastRow="0" w:firstColumn="0" w:lastColumn="0" w:oddVBand="0" w:evenVBand="0" w:oddHBand="0" w:evenHBand="0" w:firstRowFirstColumn="0" w:firstRowLastColumn="0" w:lastRowFirstColumn="0" w:lastRowLastColumn="0"/>
               <w:rPr>
                 <w:rFonts w:asciiTheme="minorHAnsi" w:eastAsia="Arial" w:hAnsiTheme="minorHAnsi" w:cstheme="minorHAnsi"/>
               </w:rPr>
@@ -9331,7 +9529,6 @@
           <w:p>
             <w:pPr>
               <w:spacing w:line="276" w:lineRule="auto"/>
-              <w:cnfStyle w:val="000000000000" w:firstRow="0" w:lastRow="0" w:firstColumn="0" w:lastColumn="0" w:oddVBand="0" w:evenVBand="0" w:oddHBand="0" w:evenHBand="0" w:firstRowFirstColumn="0" w:firstRowLastColumn="0" w:lastRowFirstColumn="0" w:lastRowLastColumn="0"/>
               <w:rPr>
                 <w:rFonts w:asciiTheme="minorHAnsi" w:eastAsia="Arial" w:hAnsiTheme="minorHAnsi" w:cstheme="minorHAnsi"/>
               </w:rPr>
@@ -9391,11 +9588,11 @@
         </w:trPr>
         <w:tc>
           <w:tcPr>
-            <w:cnfStyle w:val="001000000000" w:firstRow="0" w:lastRow="0" w:firstColumn="1" w:lastColumn="0" w:oddVBand="0" w:evenVBand="0" w:oddHBand="0" w:evenHBand="0" w:firstRowFirstColumn="0" w:firstRowLastColumn="0" w:lastRowFirstColumn="0" w:lastRowLastColumn="0"/>
             <w:tcW w:w="1129" w:type="dxa"/>
           </w:tcPr>
           <w:p>
             <w:pPr>
+              <w:cnfStyle w:val="001000100000" w:firstRow="0" w:lastRow="0" w:firstColumn="1" w:lastColumn="0" w:oddVBand="0" w:evenVBand="0" w:oddHBand="1" w:evenHBand="0" w:firstRowFirstColumn="0" w:firstRowLastColumn="0" w:lastRowFirstColumn="0" w:lastRowLastColumn="0"/>
               <w:rPr>
                 <w:rFonts w:asciiTheme="minorHAnsi" w:eastAsia="Arial" w:hAnsiTheme="minorHAnsi" w:cstheme="minorHAnsi"/>
               </w:rPr>
@@ -9404,7 +9601,6 @@
               <w:rPr>
                 <w:rFonts w:asciiTheme="minorHAnsi" w:eastAsia="Arial" w:hAnsiTheme="minorHAnsi" w:cstheme="minorHAnsi"/>
               </w:rPr>
-              <w:lastRenderedPageBreak/>
               <w:t>ms65</w:t>
             </w:r>
           </w:p>
@@ -9414,9 +9610,6 @@
             <w:tcW w:w="6308" w:type="dxa"/>
           </w:tcPr>
           <w:p>
-            <w:pPr>
-              <w:cnfStyle w:val="000000100000" w:firstRow="0" w:lastRow="0" w:firstColumn="0" w:lastColumn="0" w:oddVBand="0" w:evenVBand="0" w:oddHBand="1" w:evenHBand="0" w:firstRowFirstColumn="0" w:firstRowLastColumn="0" w:lastRowFirstColumn="0" w:lastRowLastColumn="0"/>
-            </w:pPr>
             <w:r>
               <w:t>Exigir MFA para acesso administrativo</w:t>
             </w:r>
@@ -9428,7 +9621,6 @@
           </w:tcPr>
           <w:p>
             <w:pPr>
-              <w:cnfStyle w:val="000000100000" w:firstRow="0" w:lastRow="0" w:firstColumn="0" w:lastColumn="0" w:oddVBand="0" w:evenVBand="0" w:oddHBand="1" w:evenHBand="0" w:firstRowFirstColumn="0" w:firstRowLastColumn="0" w:lastRowFirstColumn="0" w:lastRowLastColumn="0"/>
               <w:rPr>
                 <w:rFonts w:asciiTheme="minorHAnsi" w:eastAsia="Arial" w:hAnsiTheme="minorHAnsi" w:cstheme="minorHAnsi"/>
                 <w:b/>
@@ -10597,7 +10789,6 @@
         <w:pStyle w:val="Ttulo3"/>
       </w:pPr>
       <w:r>
-        <w:lastRenderedPageBreak/>
         <w:t>Situação Encontrada</w:t>
       </w:r>
     </w:p>
@@ -12911,6 +13102,7 @@
         <w:pStyle w:val="Ttulo3"/>
       </w:pPr>
       <w:r>
+        <w:lastRenderedPageBreak/>
         <w:t>Evidências</w:t>
       </w:r>
     </w:p>
@@ -12951,7 +13143,6 @@
           <w:rFonts w:eastAsia="Arial" w:cs="Arial"/>
           <w:color w:val="000000"/>
         </w:rPr>
-        <w:lastRenderedPageBreak/>
         <w:t>{{ e</w:t>
       </w:r>
       <w:proofErr w:type="gramEnd"/>
@@ -13611,7 +13802,15 @@
           <w:rFonts w:eastAsia="Arial" w:cs="Arial"/>
           <w:szCs w:val="24"/>
         </w:rPr>
-        <w:t xml:space="preserve"> a organização deixa de adotar as medidas de segurança técnicas e administrativas necessárias à proteção dos dados pessoais, conforme disposto nos artigos 46 e 47 da LGPD</w:t>
+        <w:t xml:space="preserve"> a organização deixa de adotar as medidas de segurança técnicas e administrativas necessárias à proteção dos dados </w:t>
+      </w:r>
+      <w:r>
+        <w:rPr>
+          <w:rFonts w:eastAsia="Arial" w:cs="Arial"/>
+          <w:szCs w:val="24"/>
+        </w:rPr>
+        <w:lastRenderedPageBreak/>
+        <w:t>pessoais, conforme disposto nos artigos 46 e 47 da LGPD</w:t>
       </w:r>
       <w:r>
         <w:rPr>
@@ -13626,16 +13825,7 @@
           <w:color w:val="000000"/>
           <w:szCs w:val="24"/>
         </w:rPr>
-        <w:t xml:space="preserve"> o dever </w:t>
-      </w:r>
-      <w:r>
-        <w:rPr>
-          <w:rFonts w:eastAsia="Arial" w:cs="Arial"/>
-          <w:color w:val="000000"/>
-          <w:szCs w:val="24"/>
-        </w:rPr>
-        <w:lastRenderedPageBreak/>
-        <w:t>de proteger as informações sob sua tutela, conforme art. 6º</w:t>
+        <w:t xml:space="preserve"> o dever de proteger as informações sob sua tutela, conforme art. 6º</w:t>
       </w:r>
       <w:r>
         <w:rPr>
@@ -14518,6 +14708,7 @@
           <w:color w:val="000000" w:themeColor="text1"/>
           <w:szCs w:val="22"/>
         </w:rPr>
+        <w:lastRenderedPageBreak/>
         <w:t xml:space="preserve">A </w:t>
       </w:r>
       <w:r>
@@ -14558,16 +14749,7 @@
           <w:color w:val="000000" w:themeColor="text1"/>
           <w:szCs w:val="22"/>
         </w:rPr>
-        <w:t xml:space="preserve">no perímetro das organizações aumentam a superfície e as chances de ataque por terceiros, uma vez que são ativos não </w:t>
-      </w:r>
-      <w:r>
-        <w:rPr>
-          <w:rFonts w:eastAsia="Arial" w:cs="Arial"/>
-          <w:color w:val="000000" w:themeColor="text1"/>
-          <w:szCs w:val="22"/>
-        </w:rPr>
-        <w:lastRenderedPageBreak/>
-        <w:t xml:space="preserve">gerenciados pela organização e podem ser usados como vetores de ataques ao conter vulnerabilidades, </w:t>
+        <w:t xml:space="preserve">no perímetro das organizações aumentam a superfície e as chances de ataque por terceiros, uma vez que são ativos não gerenciados pela organização e podem ser usados como vetores de ataques ao conter vulnerabilidades, </w:t>
       </w:r>
       <w:proofErr w:type="spellStart"/>
       <w:r>
@@ -15965,6 +16147,7 @@
           <w:rFonts w:eastAsia="Arial" w:cs="Arial"/>
           <w:szCs w:val="22"/>
         </w:rPr>
+        <w:lastRenderedPageBreak/>
         <w:t>Manuseio, retenção e descarte de dados. </w:t>
       </w:r>
     </w:p>
@@ -15981,7 +16164,6 @@
           <w:rFonts w:eastAsia="Arial" w:cs="Arial"/>
           <w:szCs w:val="22"/>
         </w:rPr>
-        <w:lastRenderedPageBreak/>
         <w:t>A Equipe de Auditoria por meio de análise dos itens 0301, 0302, 0303, 0304, 0305 e 0306 do Questionário submetido pelo TSID02 verificou, conforme apontado na seção de Evidências, que:</w:t>
       </w:r>
     </w:p>
@@ -16504,14 +16686,7 @@
           <w:rFonts w:eastAsia="Arial" w:cs="Arial"/>
           <w:szCs w:val="22"/>
         </w:rPr>
-        <w:t xml:space="preserve"> dispõe diretrizes que devem ser observadas pelas organizações </w:t>
-      </w:r>
-      <w:r>
-        <w:rPr>
-          <w:rFonts w:eastAsia="Arial" w:cs="Arial"/>
-          <w:szCs w:val="22"/>
-        </w:rPr>
-        <w:t xml:space="preserve">para estabelecerem seu processo de gestão de dados, como </w:t>
+        <w:t xml:space="preserve"> dispõe diretrizes que devem ser </w:t>
       </w:r>
       <w:r>
         <w:rPr>
@@ -16519,7 +16694,14 @@
           <w:szCs w:val="22"/>
         </w:rPr>
         <w:lastRenderedPageBreak/>
-        <w:t>o tratamento da sensibilidade dos dados, do proprietário dos dados, seu manuseio, respeito dos limites de retenção e dos requisitos de descarte de acordo com as políticas da organização.</w:t>
+        <w:t xml:space="preserve">observadas pelas organizações </w:t>
+      </w:r>
+      <w:r>
+        <w:rPr>
+          <w:rFonts w:eastAsia="Arial" w:cs="Arial"/>
+          <w:szCs w:val="22"/>
+        </w:rPr>
+        <w:t>para estabelecerem seu processo de gestão de dados, como o tratamento da sensibilidade dos dados, do proprietário dos dados, seu manuseio, respeito dos limites de retenção e dos requisitos de descarte de acordo com as políticas da organização.</w:t>
       </w:r>
     </w:p>
     <w:p>
@@ -17089,6 +17271,7 @@
         <w:rPr>
           <w:color w:val="000000"/>
         </w:rPr>
+        <w:lastRenderedPageBreak/>
         <w:t xml:space="preserve">{%p </w:t>
       </w:r>
       <w:proofErr w:type="spellStart"/>
@@ -17271,7 +17454,6 @@
           <w:sz w:val="24"/>
           <w:szCs w:val="24"/>
         </w:rPr>
-        <w:lastRenderedPageBreak/>
         <w:t>Retenção adequada</w:t>
       </w:r>
       <w:r>
@@ -17819,6 +18001,7 @@
           <w:rFonts w:eastAsia="Arial" w:cs="Arial"/>
           <w:szCs w:val="24"/>
         </w:rPr>
+        <w:lastRenderedPageBreak/>
         <w:t xml:space="preserve">Diante disso, será sugerida proposta de encaminhamento à organização a fim de que </w:t>
       </w:r>
       <w:r>
@@ -17835,7 +18018,6 @@
         <w:pStyle w:val="Ttulo3"/>
       </w:pPr>
       <w:r>
-        <w:lastRenderedPageBreak/>
         <w:t>Propostas de Encaminhamento</w:t>
       </w:r>
     </w:p>
@@ -18793,6 +18975,7 @@
         <w:pStyle w:val="Ttulo3"/>
       </w:pPr>
       <w:r>
+        <w:lastRenderedPageBreak/>
         <w:t>Situação Encontrada</w:t>
       </w:r>
     </w:p>
@@ -18862,16 +19045,7 @@
           <w:rFonts w:ascii="Arial" w:hAnsi="Arial" w:cs="Arial"/>
           <w:sz w:val="22"/>
         </w:rPr>
-        <w:t xml:space="preserve">Tais configurações não consideram aspectos de segurança da informação, permitindo vulnerabilidades que podem ser exploradas. Ademais, mesmo após implementar um conjunto </w:t>
-      </w:r>
-      <w:r>
-        <w:rPr>
-          <w:rStyle w:val="normaltextrun"/>
-          <w:rFonts w:ascii="Arial" w:hAnsi="Arial" w:cs="Arial"/>
-          <w:sz w:val="22"/>
-        </w:rPr>
-        <w:lastRenderedPageBreak/>
-        <w:t>seguro de configurações, é necessário revisá-las continuamente e atualizá-las frente a novos requisitos.</w:t>
+        <w:t>Tais configurações não consideram aspectos de segurança da informação, permitindo vulnerabilidades que podem ser exploradas. Ademais, mesmo após implementar um conjunto seguro de configurações, é necessário revisá-las continuamente e atualizá-las frente a novos requisitos.</w:t>
       </w:r>
       <w:r>
         <w:rPr>
@@ -19418,6 +19592,7 @@
           <w:rFonts w:eastAsia="Arial" w:cs="Arial"/>
           <w:szCs w:val="22"/>
         </w:rPr>
+        <w:lastRenderedPageBreak/>
         <w:t xml:space="preserve">Estabelecer um processo de configuração segura </w:t>
       </w:r>
       <w:r>
@@ -19490,7 +19665,6 @@
           <w:color w:val="000000" w:themeColor="text1"/>
           <w:szCs w:val="22"/>
         </w:rPr>
-        <w:lastRenderedPageBreak/>
         <w:t>As medidas de segurança 4.1</w:t>
       </w:r>
       <w:r>
@@ -20154,6 +20328,7 @@
         <w:rPr>
           <w:color w:val="000000"/>
         </w:rPr>
+        <w:lastRenderedPageBreak/>
         <w:t xml:space="preserve">{%p </w:t>
       </w:r>
       <w:proofErr w:type="spellStart"/>
@@ -20273,7 +20448,6 @@
           <w:rFonts w:eastAsia="Arial" w:cs="Arial"/>
           <w:szCs w:val="22"/>
         </w:rPr>
-        <w:lastRenderedPageBreak/>
         <w:t xml:space="preserve">A utilização de protocolos seguros para realizar a gestão dos ativos configura-se como prática importante a fim de </w:t>
       </w:r>
       <w:r>
@@ -21020,6 +21194,7 @@
         <w:pStyle w:val="Ttulo2"/>
       </w:pPr>
       <w:r>
+        <w:lastRenderedPageBreak/>
         <w:t xml:space="preserve">Achado </w:t>
       </w:r>
       <w:proofErr w:type="gramStart"/>
@@ -21149,7 +21324,6 @@
           <w:color w:val="000000"/>
           <w:szCs w:val="24"/>
         </w:rPr>
-        <w:lastRenderedPageBreak/>
         <w:t xml:space="preserve">Lei Federal nº </w:t>
       </w:r>
       <w:r>
@@ -21769,7 +21943,16 @@
           <w:rFonts w:ascii="Arial" w:hAnsi="Arial" w:cs="Arial"/>
           <w:sz w:val="22"/>
         </w:rPr>
-        <w:t>Ademais, a gestão do controle de acesso é essencial para garantir que os usuários tenham acesso apenas aos dados e sistemas necessários para realizar suas funções, minimizando o risco de exposição indevida. Contas com privilégios excessivos ou mal gerenciadas podem representar uma vulnerabilidade significativa, especialmente em caso de ataques. </w:t>
+        <w:t xml:space="preserve">Ademais, a gestão do controle de acesso é essencial para garantir que os usuários tenham acesso apenas aos dados e sistemas necessários para realizar suas funções, minimizando o risco de exposição indevida. Contas com privilégios excessivos ou mal </w:t>
+      </w:r>
+      <w:r>
+        <w:rPr>
+          <w:rStyle w:val="normaltextrun"/>
+          <w:rFonts w:ascii="Arial" w:hAnsi="Arial" w:cs="Arial"/>
+          <w:sz w:val="22"/>
+        </w:rPr>
+        <w:lastRenderedPageBreak/>
+        <w:t>gerenciadas podem representar uma vulnerabilidade significativa, especialmente em caso de ataques. </w:t>
       </w:r>
       <w:r>
         <w:rPr>
@@ -21797,16 +21980,7 @@
           <w:rFonts w:ascii="Arial" w:hAnsi="Arial" w:cs="Arial"/>
           <w:sz w:val="22"/>
         </w:rPr>
-        <w:t xml:space="preserve">Tal controle aborda a criação e a gestão centralizada de permissões, além da aplicação de autenticação multifator (MFA) para proteger as contas, principalmente as administrativas. Ao implementar esse controle, a organização garante que o acesso seja </w:t>
-      </w:r>
-      <w:r>
-        <w:rPr>
-          <w:rStyle w:val="normaltextrun"/>
-          <w:rFonts w:ascii="Arial" w:hAnsi="Arial" w:cs="Arial"/>
-          <w:sz w:val="22"/>
-        </w:rPr>
-        <w:lastRenderedPageBreak/>
-        <w:t>baseado na função e na necessidade, protegendo dados sensíveis e reduzindo a probabilidade de comprometimento dos sistemas.</w:t>
+        <w:t>Tal controle aborda a criação e a gestão centralizada de permissões, além da aplicação de autenticação multifator (MFA) para proteger as contas, principalmente as administrativas. Ao implementar esse controle, a organização garante que o acesso seja baseado na função e na necessidade, protegendo dados sensíveis e reduzindo a probabilidade de comprometimento dos sistemas.</w:t>
       </w:r>
     </w:p>
     <w:p>
@@ -22346,6 +22520,7 @@
         <w:rPr>
           <w:color w:val="000000"/>
         </w:rPr>
+        <w:lastRenderedPageBreak/>
         <w:t xml:space="preserve">{%p </w:t>
       </w:r>
       <w:proofErr w:type="spellStart"/>
@@ -22463,7 +22638,6 @@
         <w:rPr>
           <w:rFonts w:cs="Arial"/>
         </w:rPr>
-        <w:lastRenderedPageBreak/>
         <w:t>Por senhas exclusivas, entendem-se as senhas que são unicamente criadas e usadas por um único usuário ou sistema e não são compartilhadas ou reutilizadas entre contas, dispositivos, ou aplicações diferentes.</w:t>
       </w:r>
     </w:p>
@@ -22994,7 +23168,15 @@
           <w:rFonts w:eastAsia="Arial" w:cs="Arial"/>
           <w:szCs w:val="22"/>
         </w:rPr>
-        <w:t xml:space="preserve"> ao comprometimento de contas administrativas, o que aumenta o impacto lesivo do vazamento pelas possibilidades de acesso do usuário, facilitando movimentos laterais dos invasores.</w:t>
+        <w:t xml:space="preserve"> ao comprometimento de contas administrativas, o que aumenta o impacto lesivo </w:t>
+      </w:r>
+      <w:r>
+        <w:rPr>
+          <w:rFonts w:eastAsia="Arial" w:cs="Arial"/>
+          <w:szCs w:val="22"/>
+        </w:rPr>
+        <w:lastRenderedPageBreak/>
+        <w:t>do vazamento pelas possibilidades de acesso do usuário, facilitando movimentos laterais dos invasores.</w:t>
       </w:r>
     </w:p>
     <w:p>
@@ -23063,7 +23245,6 @@
     </w:p>
     <w:p>
       <w:r>
-        <w:lastRenderedPageBreak/>
         <w:t xml:space="preserve">{%p </w:t>
       </w:r>
       <w:proofErr w:type="spellStart"/>
@@ -23772,6 +23953,7 @@
           <w:rFonts w:eastAsia="Arial" w:cs="Arial"/>
           <w:szCs w:val="24"/>
         </w:rPr>
+        <w:lastRenderedPageBreak/>
         <w:t xml:space="preserve">Diante disso, será sugerida proposta de encaminhamento à organização a fim de que </w:t>
       </w:r>
       <w:r>
@@ -23794,7 +23976,6 @@
         <w:pStyle w:val="Ttulo3"/>
       </w:pPr>
       <w:r>
-        <w:lastRenderedPageBreak/>
         <w:t>Propostas de Encaminhamento</w:t>
       </w:r>
     </w:p>
@@ -24120,10 +24301,12 @@
         </w:trPr>
         <w:tc>
           <w:tcPr>
-            <w:cnfStyle w:val="001000000000" w:firstRow="0" w:lastRow="0" w:firstColumn="1" w:lastColumn="0" w:oddVBand="0" w:evenVBand="0" w:oddHBand="0" w:evenHBand="0" w:firstRowFirstColumn="0" w:firstRowLastColumn="0" w:lastRowFirstColumn="0" w:lastRowLastColumn="0"/>
             <w:tcW w:w="1128" w:type="dxa"/>
           </w:tcPr>
           <w:p>
+            <w:pPr>
+              <w:cnfStyle w:val="101000000000" w:firstRow="1" w:lastRow="0" w:firstColumn="1" w:lastColumn="0" w:oddVBand="0" w:evenVBand="0" w:oddHBand="0" w:evenHBand="0" w:firstRowFirstColumn="0" w:firstRowLastColumn="0" w:lastRowFirstColumn="0" w:lastRowLastColumn="0"/>
+            </w:pPr>
             <w:r>
               <w:t>Achado</w:t>
             </w:r>
@@ -24134,9 +24317,6 @@
             <w:tcW w:w="5386" w:type="dxa"/>
           </w:tcPr>
           <w:p>
-            <w:pPr>
-              <w:cnfStyle w:val="100000000000" w:firstRow="1" w:lastRow="0" w:firstColumn="0" w:lastColumn="0" w:oddVBand="0" w:evenVBand="0" w:oddHBand="0" w:evenHBand="0" w:firstRowFirstColumn="0" w:firstRowLastColumn="0" w:lastRowFirstColumn="0" w:lastRowLastColumn="0"/>
-            </w:pPr>
             <w:r>
               <w:t>Atividade</w:t>
             </w:r>
@@ -24147,9 +24327,6 @@
             <w:tcW w:w="1276" w:type="dxa"/>
           </w:tcPr>
           <w:p>
-            <w:pPr>
-              <w:cnfStyle w:val="100000000000" w:firstRow="1" w:lastRow="0" w:firstColumn="0" w:lastColumn="0" w:oddVBand="0" w:evenVBand="0" w:oddHBand="0" w:evenHBand="0" w:firstRowFirstColumn="0" w:firstRowLastColumn="0" w:lastRowFirstColumn="0" w:lastRowLastColumn="0"/>
-            </w:pPr>
             <w:r>
               <w:t>Responsável</w:t>
             </w:r>
@@ -24160,9 +24337,6 @@
             <w:tcW w:w="709" w:type="dxa"/>
           </w:tcPr>
           <w:p>
-            <w:pPr>
-              <w:cnfStyle w:val="100000000000" w:firstRow="1" w:lastRow="0" w:firstColumn="0" w:lastColumn="0" w:oddVBand="0" w:evenVBand="0" w:oddHBand="0" w:evenHBand="0" w:firstRowFirstColumn="0" w:firstRowLastColumn="0" w:lastRowFirstColumn="0" w:lastRowLastColumn="0"/>
-            </w:pPr>
             <w:r>
               <w:t>Data Início</w:t>
             </w:r>
@@ -24173,9 +24347,6 @@
             <w:tcW w:w="624" w:type="dxa"/>
           </w:tcPr>
           <w:p>
-            <w:pPr>
-              <w:cnfStyle w:val="100000000000" w:firstRow="1" w:lastRow="0" w:firstColumn="0" w:lastColumn="0" w:oddVBand="0" w:evenVBand="0" w:oddHBand="0" w:evenHBand="0" w:firstRowFirstColumn="0" w:firstRowLastColumn="0" w:lastRowFirstColumn="0" w:lastRowLastColumn="0"/>
-            </w:pPr>
             <w:r>
               <w:t>Data Fim</w:t>
             </w:r>
@@ -24188,11 +24359,11 @@
         </w:trPr>
         <w:tc>
           <w:tcPr>
-            <w:cnfStyle w:val="001000000000" w:firstRow="0" w:lastRow="0" w:firstColumn="1" w:lastColumn="0" w:oddVBand="0" w:evenVBand="0" w:oddHBand="0" w:evenHBand="0" w:firstRowFirstColumn="0" w:firstRowLastColumn="0" w:lastRowFirstColumn="0" w:lastRowLastColumn="0"/>
             <w:tcW w:w="1128" w:type="dxa"/>
           </w:tcPr>
           <w:p>
             <w:pPr>
+              <w:cnfStyle w:val="001000100000" w:firstRow="0" w:lastRow="0" w:firstColumn="1" w:lastColumn="0" w:oddVBand="0" w:evenVBand="0" w:oddHBand="1" w:evenHBand="0" w:firstRowFirstColumn="0" w:firstRowLastColumn="0" w:lastRowFirstColumn="0" w:lastRowLastColumn="0"/>
               <w:rPr>
                 <w:sz w:val="18"/>
                 <w:szCs w:val="18"/>
@@ -24235,7 +24406,6 @@
           </w:tcPr>
           <w:p>
             <w:pPr>
-              <w:cnfStyle w:val="000000100000" w:firstRow="0" w:lastRow="0" w:firstColumn="0" w:lastColumn="0" w:oddVBand="0" w:evenVBand="0" w:oddHBand="1" w:evenHBand="0" w:firstRowFirstColumn="0" w:firstRowLastColumn="0" w:lastRowFirstColumn="0" w:lastRowLastColumn="0"/>
               <w:rPr>
                 <w:sz w:val="18"/>
                 <w:szCs w:val="18"/>
@@ -24250,7 +24420,6 @@
           </w:tcPr>
           <w:p>
             <w:pPr>
-              <w:cnfStyle w:val="000000100000" w:firstRow="0" w:lastRow="0" w:firstColumn="0" w:lastColumn="0" w:oddVBand="0" w:evenVBand="0" w:oddHBand="1" w:evenHBand="0" w:firstRowFirstColumn="0" w:firstRowLastColumn="0" w:lastRowFirstColumn="0" w:lastRowLastColumn="0"/>
               <w:rPr>
                 <w:sz w:val="18"/>
                 <w:szCs w:val="18"/>
@@ -24265,7 +24434,6 @@
           </w:tcPr>
           <w:p>
             <w:pPr>
-              <w:cnfStyle w:val="000000100000" w:firstRow="0" w:lastRow="0" w:firstColumn="0" w:lastColumn="0" w:oddVBand="0" w:evenVBand="0" w:oddHBand="1" w:evenHBand="0" w:firstRowFirstColumn="0" w:firstRowLastColumn="0" w:lastRowFirstColumn="0" w:lastRowLastColumn="0"/>
               <w:rPr>
                 <w:sz w:val="18"/>
                 <w:szCs w:val="18"/>
@@ -24280,7 +24448,6 @@
           </w:tcPr>
           <w:p>
             <w:pPr>
-              <w:cnfStyle w:val="000000100000" w:firstRow="0" w:lastRow="0" w:firstColumn="0" w:lastColumn="0" w:oddVBand="0" w:evenVBand="0" w:oddHBand="1" w:evenHBand="0" w:firstRowFirstColumn="0" w:firstRowLastColumn="0" w:lastRowFirstColumn="0" w:lastRowLastColumn="0"/>
               <w:rPr>
                 <w:sz w:val="18"/>
                 <w:szCs w:val="18"/>
@@ -24293,11 +24460,11 @@
       <w:tr>
         <w:tc>
           <w:tcPr>
-            <w:cnfStyle w:val="001000000000" w:firstRow="0" w:lastRow="0" w:firstColumn="1" w:lastColumn="0" w:oddVBand="0" w:evenVBand="0" w:oddHBand="0" w:evenHBand="0" w:firstRowFirstColumn="0" w:firstRowLastColumn="0" w:lastRowFirstColumn="0" w:lastRowLastColumn="0"/>
             <w:tcW w:w="1128" w:type="dxa"/>
           </w:tcPr>
           <w:p>
             <w:pPr>
+              <w:cnfStyle w:val="001000000000" w:firstRow="0" w:lastRow="0" w:firstColumn="1" w:lastColumn="0" w:oddVBand="0" w:evenVBand="0" w:oddHBand="0" w:evenHBand="0" w:firstRowFirstColumn="0" w:firstRowLastColumn="0" w:lastRowFirstColumn="0" w:lastRowLastColumn="0"/>
               <w:rPr>
                 <w:sz w:val="18"/>
                 <w:szCs w:val="18"/>
@@ -24350,7 +24517,6 @@
           </w:tcPr>
           <w:p>
             <w:pPr>
-              <w:cnfStyle w:val="000000000000" w:firstRow="0" w:lastRow="0" w:firstColumn="0" w:lastColumn="0" w:oddVBand="0" w:evenVBand="0" w:oddHBand="0" w:evenHBand="0" w:firstRowFirstColumn="0" w:firstRowLastColumn="0" w:lastRowFirstColumn="0" w:lastRowLastColumn="0"/>
               <w:rPr>
                 <w:sz w:val="18"/>
                 <w:szCs w:val="18"/>
@@ -24380,7 +24546,6 @@
           </w:tcPr>
           <w:p>
             <w:pPr>
-              <w:cnfStyle w:val="000000000000" w:firstRow="0" w:lastRow="0" w:firstColumn="0" w:lastColumn="0" w:oddVBand="0" w:evenVBand="0" w:oddHBand="0" w:evenHBand="0" w:firstRowFirstColumn="0" w:firstRowLastColumn="0" w:lastRowFirstColumn="0" w:lastRowLastColumn="0"/>
               <w:rPr>
                 <w:sz w:val="18"/>
                 <w:szCs w:val="18"/>
@@ -24394,7 +24559,6 @@
           </w:tcPr>
           <w:p>
             <w:pPr>
-              <w:cnfStyle w:val="000000000000" w:firstRow="0" w:lastRow="0" w:firstColumn="0" w:lastColumn="0" w:oddVBand="0" w:evenVBand="0" w:oddHBand="0" w:evenHBand="0" w:firstRowFirstColumn="0" w:firstRowLastColumn="0" w:lastRowFirstColumn="0" w:lastRowLastColumn="0"/>
               <w:rPr>
                 <w:sz w:val="18"/>
                 <w:szCs w:val="18"/>
@@ -24408,7 +24572,6 @@
           </w:tcPr>
           <w:p>
             <w:pPr>
-              <w:cnfStyle w:val="000000000000" w:firstRow="0" w:lastRow="0" w:firstColumn="0" w:lastColumn="0" w:oddVBand="0" w:evenVBand="0" w:oddHBand="0" w:evenHBand="0" w:firstRowFirstColumn="0" w:firstRowLastColumn="0" w:lastRowFirstColumn="0" w:lastRowLastColumn="0"/>
               <w:rPr>
                 <w:sz w:val="18"/>
                 <w:szCs w:val="18"/>
@@ -24423,11 +24586,11 @@
         </w:trPr>
         <w:tc>
           <w:tcPr>
-            <w:cnfStyle w:val="001000000000" w:firstRow="0" w:lastRow="0" w:firstColumn="1" w:lastColumn="0" w:oddVBand="0" w:evenVBand="0" w:oddHBand="0" w:evenHBand="0" w:firstRowFirstColumn="0" w:firstRowLastColumn="0" w:lastRowFirstColumn="0" w:lastRowLastColumn="0"/>
             <w:tcW w:w="1128" w:type="dxa"/>
           </w:tcPr>
           <w:p>
             <w:pPr>
+              <w:cnfStyle w:val="001000100000" w:firstRow="0" w:lastRow="0" w:firstColumn="1" w:lastColumn="0" w:oddVBand="0" w:evenVBand="0" w:oddHBand="1" w:evenHBand="0" w:firstRowFirstColumn="0" w:firstRowLastColumn="0" w:lastRowFirstColumn="0" w:lastRowLastColumn="0"/>
               <w:rPr>
                 <w:sz w:val="18"/>
                 <w:szCs w:val="18"/>
@@ -24485,7 +24648,6 @@
           </w:tcPr>
           <w:p>
             <w:pPr>
-              <w:cnfStyle w:val="000000100000" w:firstRow="0" w:lastRow="0" w:firstColumn="0" w:lastColumn="0" w:oddVBand="0" w:evenVBand="0" w:oddHBand="1" w:evenHBand="0" w:firstRowFirstColumn="0" w:firstRowLastColumn="0" w:lastRowFirstColumn="0" w:lastRowLastColumn="0"/>
               <w:rPr>
                 <w:sz w:val="18"/>
                 <w:szCs w:val="18"/>
@@ -24499,7 +24661,6 @@
           </w:tcPr>
           <w:p>
             <w:pPr>
-              <w:cnfStyle w:val="000000100000" w:firstRow="0" w:lastRow="0" w:firstColumn="0" w:lastColumn="0" w:oddVBand="0" w:evenVBand="0" w:oddHBand="1" w:evenHBand="0" w:firstRowFirstColumn="0" w:firstRowLastColumn="0" w:lastRowFirstColumn="0" w:lastRowLastColumn="0"/>
               <w:rPr>
                 <w:sz w:val="18"/>
                 <w:szCs w:val="18"/>
@@ -24513,7 +24674,6 @@
           </w:tcPr>
           <w:p>
             <w:pPr>
-              <w:cnfStyle w:val="000000100000" w:firstRow="0" w:lastRow="0" w:firstColumn="0" w:lastColumn="0" w:oddVBand="0" w:evenVBand="0" w:oddHBand="1" w:evenHBand="0" w:firstRowFirstColumn="0" w:firstRowLastColumn="0" w:lastRowFirstColumn="0" w:lastRowLastColumn="0"/>
               <w:rPr>
                 <w:sz w:val="18"/>
                 <w:szCs w:val="18"/>
@@ -24527,7 +24687,6 @@
           </w:tcPr>
           <w:p>
             <w:pPr>
-              <w:cnfStyle w:val="000000100000" w:firstRow="0" w:lastRow="0" w:firstColumn="0" w:lastColumn="0" w:oddVBand="0" w:evenVBand="0" w:oddHBand="1" w:evenHBand="0" w:firstRowFirstColumn="0" w:firstRowLastColumn="0" w:lastRowFirstColumn="0" w:lastRowLastColumn="0"/>
               <w:rPr>
                 <w:sz w:val="18"/>
                 <w:szCs w:val="18"/>
@@ -24885,12 +25044,12 @@
         </w:trPr>
         <w:tc>
           <w:tcPr>
-            <w:cnfStyle w:val="001000000000" w:firstRow="0" w:lastRow="0" w:firstColumn="1" w:lastColumn="0" w:oddVBand="0" w:evenVBand="0" w:oddHBand="0" w:evenHBand="0" w:firstRowFirstColumn="0" w:firstRowLastColumn="0" w:lastRowFirstColumn="0" w:lastRowLastColumn="0"/>
             <w:tcW w:w="1837" w:type="dxa"/>
           </w:tcPr>
           <w:p>
             <w:pPr>
               <w:jc w:val="center"/>
+              <w:cnfStyle w:val="101000000000" w:firstRow="1" w:lastRow="0" w:firstColumn="1" w:lastColumn="0" w:oddVBand="0" w:evenVBand="0" w:oddHBand="0" w:evenHBand="0" w:firstRowFirstColumn="0" w:firstRowLastColumn="0" w:lastRowFirstColumn="0" w:lastRowLastColumn="0"/>
             </w:pPr>
             <w:r>
               <w:t>Questão</w:t>
@@ -24904,7 +25063,6 @@
           <w:p>
             <w:pPr>
               <w:jc w:val="center"/>
-              <w:cnfStyle w:val="100000000000" w:firstRow="1" w:lastRow="0" w:firstColumn="0" w:lastColumn="0" w:oddVBand="0" w:evenVBand="0" w:oddHBand="0" w:evenHBand="0" w:firstRowFirstColumn="0" w:firstRowLastColumn="0" w:lastRowFirstColumn="0" w:lastRowLastColumn="0"/>
             </w:pPr>
             <w:r>
               <w:t>Resposta Original</w:t>
@@ -24918,7 +25076,6 @@
           <w:p>
             <w:pPr>
               <w:jc w:val="center"/>
-              <w:cnfStyle w:val="100000000000" w:firstRow="1" w:lastRow="0" w:firstColumn="0" w:lastColumn="0" w:oddVBand="0" w:evenVBand="0" w:oddHBand="0" w:evenHBand="0" w:firstRowFirstColumn="0" w:firstRowLastColumn="0" w:lastRowFirstColumn="0" w:lastRowLastColumn="0"/>
             </w:pPr>
             <w:r>
               <w:t>Resposta Ajustada</w:t>
@@ -24932,7 +25089,6 @@
           <w:p>
             <w:pPr>
               <w:jc w:val="center"/>
-              <w:cnfStyle w:val="100000000000" w:firstRow="1" w:lastRow="0" w:firstColumn="0" w:lastColumn="0" w:oddVBand="0" w:evenVBand="0" w:oddHBand="0" w:evenHBand="0" w:firstRowFirstColumn="0" w:firstRowLastColumn="0" w:lastRowFirstColumn="0" w:lastRowLastColumn="0"/>
             </w:pPr>
             <w:r>
               <w:t>Justificativa</w:t>
@@ -24948,7 +25104,6 @@
         </w:trPr>
         <w:tc>
           <w:tcPr>
-            <w:cnfStyle w:val="001000000000" w:firstRow="0" w:lastRow="0" w:firstColumn="1" w:lastColumn="0" w:oddVBand="0" w:evenVBand="0" w:oddHBand="0" w:evenHBand="0" w:firstRowFirstColumn="0" w:firstRowLastColumn="0" w:lastRowFirstColumn="0" w:lastRowLastColumn="0"/>
             <w:tcW w:w="1837" w:type="dxa"/>
             <w:tcBorders>
               <w:top w:val="single" w:sz="4" w:space="0" w:color="8EAADB"/>
@@ -24959,6 +25114,7 @@
           </w:tcPr>
           <w:p>
             <w:pPr>
+              <w:cnfStyle w:val="001000100000" w:firstRow="0" w:lastRow="0" w:firstColumn="1" w:lastColumn="0" w:oddVBand="0" w:evenVBand="0" w:oddHBand="1" w:evenHBand="0" w:firstRowFirstColumn="0" w:firstRowLastColumn="0" w:lastRowFirstColumn="0" w:lastRowLastColumn="0"/>
               <w:rPr>
                 <w:lang w:val="en-US"/>
               </w:rPr>
@@ -24991,7 +25147,6 @@
       <w:tr>
         <w:tc>
           <w:tcPr>
-            <w:cnfStyle w:val="001000000000" w:firstRow="0" w:lastRow="0" w:firstColumn="1" w:lastColumn="0" w:oddVBand="0" w:evenVBand="0" w:oddHBand="0" w:evenHBand="0" w:firstRowFirstColumn="0" w:firstRowLastColumn="0" w:lastRowFirstColumn="0" w:lastRowLastColumn="0"/>
             <w:tcW w:w="1837" w:type="dxa"/>
             <w:tcBorders>
               <w:top w:val="single" w:sz="4" w:space="0" w:color="8EAADB"/>
@@ -25001,6 +25156,9 @@
             </w:tcBorders>
           </w:tcPr>
           <w:p>
+            <w:pPr>
+              <w:cnfStyle w:val="001000000000" w:firstRow="0" w:lastRow="0" w:firstColumn="1" w:lastColumn="0" w:oddVBand="0" w:evenVBand="0" w:oddHBand="0" w:evenHBand="0" w:firstRowFirstColumn="0" w:firstRowLastColumn="0" w:lastRowFirstColumn="0" w:lastRowLastColumn="0"/>
+            </w:pPr>
             <w:proofErr w:type="gramStart"/>
             <w:r>
               <w:t xml:space="preserve">{{ </w:t>
@@ -25030,7 +25188,6 @@
           <w:p>
             <w:pPr>
               <w:jc w:val="center"/>
-              <w:cnfStyle w:val="000000000000" w:firstRow="0" w:lastRow="0" w:firstColumn="0" w:lastColumn="0" w:oddVBand="0" w:evenVBand="0" w:oddHBand="0" w:evenHBand="0" w:firstRowFirstColumn="0" w:firstRowLastColumn="0" w:lastRowFirstColumn="0" w:lastRowLastColumn="0"/>
             </w:pPr>
             <w:proofErr w:type="gramStart"/>
             <w:r>
@@ -25061,7 +25218,6 @@
           <w:p>
             <w:pPr>
               <w:jc w:val="center"/>
-              <w:cnfStyle w:val="000000000000" w:firstRow="0" w:lastRow="0" w:firstColumn="0" w:lastColumn="0" w:oddVBand="0" w:evenVBand="0" w:oddHBand="0" w:evenHBand="0" w:firstRowFirstColumn="0" w:firstRowLastColumn="0" w:lastRowFirstColumn="0" w:lastRowLastColumn="0"/>
             </w:pPr>
             <w:proofErr w:type="gramStart"/>
             <w:r>
@@ -25089,9 +25245,6 @@
             </w:tcBorders>
           </w:tcPr>
           <w:p>
-            <w:pPr>
-              <w:cnfStyle w:val="000000000000" w:firstRow="0" w:lastRow="0" w:firstColumn="0" w:lastColumn="0" w:oddVBand="0" w:evenVBand="0" w:oddHBand="0" w:evenHBand="0" w:firstRowFirstColumn="0" w:firstRowLastColumn="0" w:lastRowFirstColumn="0" w:lastRowLastColumn="0"/>
-            </w:pPr>
             <w:proofErr w:type="gramStart"/>
             <w:r>
               <w:t xml:space="preserve">{{ </w:t>
@@ -25122,7 +25275,6 @@
         </w:trPr>
         <w:tc>
           <w:tcPr>
-            <w:cnfStyle w:val="001000000000" w:firstRow="0" w:lastRow="0" w:firstColumn="1" w:lastColumn="0" w:oddVBand="0" w:evenVBand="0" w:oddHBand="0" w:evenHBand="0" w:firstRowFirstColumn="0" w:firstRowLastColumn="0" w:lastRowFirstColumn="0" w:lastRowLastColumn="0"/>
             <w:tcW w:w="1837" w:type="dxa"/>
             <w:tcBorders>
               <w:top w:val="single" w:sz="4" w:space="0" w:color="8EAADB"/>
@@ -25134,6 +25286,7 @@
           <w:p>
             <w:pPr>
               <w:keepNext/>
+              <w:cnfStyle w:val="001000100000" w:firstRow="0" w:lastRow="0" w:firstColumn="1" w:lastColumn="0" w:oddVBand="0" w:evenVBand="0" w:oddHBand="1" w:evenHBand="0" w:firstRowFirstColumn="0" w:firstRowLastColumn="0" w:lastRowFirstColumn="0" w:lastRowLastColumn="0"/>
             </w:pPr>
             <w:r>
               <w:rPr>
@@ -25296,6 +25449,7 @@
     <w:p>
       <w:pPr>
         <w:spacing w:line="240" w:lineRule="auto"/>
+        <w:ind w:firstLine="0"/>
       </w:pPr>
       <w:r>
         <w:separator/>
@@ -25306,13 +25460,22 @@
     <w:p>
       <w:pPr>
         <w:spacing w:line="240" w:lineRule="auto"/>
+        <w:ind w:firstLine="0"/>
       </w:pPr>
       <w:r>
         <w:continuationSeparator/>
       </w:r>
     </w:p>
   </w:footnote>
-  <w:footnote w:id="1">
+  <w:footnote w:type="continuationNotice" w:id="1">
+    <w:p>
+      <w:pPr>
+        <w:spacing w:line="240" w:lineRule="auto"/>
+        <w:ind w:firstLine="0"/>
+      </w:pPr>
+    </w:p>
+  </w:footnote>
+  <w:footnote w:id="2">
     <w:p>
       <w:pPr>
         <w:pStyle w:val="Textodenotaderodap"/>
@@ -25336,7 +25499,7 @@
       </w:r>
     </w:p>
   </w:footnote>
-  <w:footnote w:id="2">
+  <w:footnote w:id="3">
     <w:p>
       <w:pPr>
         <w:pStyle w:val="Textodenotaderodap"/>
@@ -25446,7 +25609,7 @@
       </w:r>
     </w:p>
   </w:footnote>
-  <w:footnote w:id="3">
+  <w:footnote w:id="4">
     <w:p>
       <w:pPr>
         <w:pStyle w:val="Textodenotaderodap"/>
@@ -25475,7 +25638,7 @@
       </w:r>
     </w:p>
   </w:footnote>
-  <w:footnote w:id="4">
+  <w:footnote w:id="5">
     <w:p>
       <w:pPr>
         <w:pStyle w:val="Textodenotaderodap"/>
@@ -25951,7 +26114,7 @@
             </wp:anchor>
           </w:drawing>
         </mc:Choice>
-        <mc:Fallback xmlns:arto="http://schemas.microsoft.com/office/word/2006/arto" xmlns:cr="http://schemas.microsoft.com/office/comments/2020/reactions" xmlns="http://schemas.microsoft.com/office/tasks/2019/documenttasks" xmlns:dgm="http://schemas.openxmlformats.org/drawingml/2006/diagram" xmlns:lc="http://schemas.openxmlformats.org/drawingml/2006/lockedCanvas" xmlns:c="http://schemas.openxmlformats.org/drawingml/2006/chart" xmlns:pic="http://schemas.openxmlformats.org/drawingml/2006/picture" xmlns:a="http://schemas.openxmlformats.org/drawingml/2006/main" xmlns:sl="http://schemas.openxmlformats.org/schemaLibrary/2006/main">
+        <mc:Fallback xmlns:sl="http://schemas.openxmlformats.org/schemaLibrary/2006/main" xmlns:a="http://schemas.openxmlformats.org/drawingml/2006/main" xmlns:pic="http://schemas.openxmlformats.org/drawingml/2006/picture" xmlns:c="http://schemas.openxmlformats.org/drawingml/2006/chart" xmlns:lc="http://schemas.openxmlformats.org/drawingml/2006/lockedCanvas" xmlns:dgm="http://schemas.openxmlformats.org/drawingml/2006/diagram" xmlns="http://schemas.microsoft.com/office/tasks/2019/documenttasks" xmlns:cr="http://schemas.microsoft.com/office/comments/2020/reactions" xmlns:arto="http://schemas.microsoft.com/office/word/2006/arto">
           <w:drawing>
             <wp:anchor allowOverlap="1" behindDoc="0" distB="4294967295" distT="4294967295" distL="114300" distR="114300" hidden="0" layoutInCell="1" locked="0" relativeHeight="0" simplePos="0">
               <wp:simplePos x="0" y="0"/>
@@ -27941,7 +28104,7 @@
     <w:lsdException w:name="Closing" w:semiHidden="1" w:unhideWhenUsed="1"/>
     <w:lsdException w:name="Signature" w:semiHidden="1" w:unhideWhenUsed="1"/>
     <w:lsdException w:name="Default Paragraph Font" w:semiHidden="1" w:uiPriority="1" w:unhideWhenUsed="1"/>
-    <w:lsdException w:name="Body Text" w:semiHidden="1" w:unhideWhenUsed="1"/>
+    <w:lsdException w:name="Body Text" w:semiHidden="1" w:unhideWhenUsed="1" w:qFormat="1"/>
     <w:lsdException w:name="Body Text Indent" w:semiHidden="1" w:unhideWhenUsed="1"/>
     <w:lsdException w:name="List Continue" w:semiHidden="1" w:unhideWhenUsed="1"/>
     <w:lsdException w:name="List Continue 2" w:semiHidden="1" w:unhideWhenUsed="1"/>
@@ -28255,7 +28418,7 @@
   <w:style w:type="paragraph" w:default="1" w:styleId="Normal">
     <w:name w:val="Normal"/>
     <w:qFormat/>
-    <w:rsid w:val="001B3205"/>
+    <w:rsid w:val="00B05755"/>
     <w:pPr>
       <w:spacing w:after="0" w:line="360" w:lineRule="auto"/>
       <w:ind w:firstLine="720"/>
@@ -28298,7 +28461,7 @@
     <w:uiPriority w:val="9"/>
     <w:unhideWhenUsed/>
     <w:qFormat/>
-    <w:rsid w:val="00E9462F"/>
+    <w:rsid w:val="00B475F2"/>
     <w:pPr>
       <w:keepNext/>
       <w:keepLines/>
@@ -28307,7 +28470,7 @@
       <w:outlineLvl w:val="1"/>
     </w:pPr>
     <w:rPr>
-      <w:rFonts w:asciiTheme="majorHAnsi" w:eastAsia="Arial" w:hAnsiTheme="majorHAnsi" w:cstheme="majorBidi"/>
+      <w:rFonts w:ascii="Cambria" w:eastAsia="Arial" w:hAnsi="Cambria" w:cstheme="majorBidi"/>
       <w:b/>
       <w:color w:val="2F5496" w:themeColor="accent1" w:themeShade="BF"/>
       <w:sz w:val="28"/>
@@ -28323,16 +28486,16 @@
     <w:uiPriority w:val="9"/>
     <w:unhideWhenUsed/>
     <w:qFormat/>
-    <w:rsid w:val="00E9462F"/>
+    <w:rsid w:val="00B475F2"/>
     <w:pPr>
       <w:keepNext/>
       <w:keepLines/>
-      <w:spacing w:after="120"/>
+      <w:spacing w:before="120" w:after="120"/>
       <w:ind w:firstLine="0"/>
       <w:outlineLvl w:val="2"/>
     </w:pPr>
     <w:rPr>
-      <w:rFonts w:asciiTheme="majorHAnsi" w:eastAsiaTheme="majorEastAsia" w:hAnsiTheme="majorHAnsi" w:cstheme="majorBidi"/>
+      <w:rFonts w:ascii="Cambria" w:eastAsiaTheme="majorEastAsia" w:hAnsi="Cambria" w:cstheme="majorBidi"/>
       <w:b/>
       <w:color w:val="2F5496" w:themeColor="accent1" w:themeShade="BF"/>
       <w:sz w:val="26"/>
@@ -28549,9 +28712,9 @@
     <w:basedOn w:val="Fontepargpadro"/>
     <w:link w:val="Ttulo2"/>
     <w:uiPriority w:val="9"/>
-    <w:rsid w:val="00E9462F"/>
+    <w:rsid w:val="00B475F2"/>
     <w:rPr>
-      <w:rFonts w:asciiTheme="majorHAnsi" w:eastAsia="Arial" w:hAnsiTheme="majorHAnsi" w:cstheme="majorBidi"/>
+      <w:rFonts w:ascii="Cambria" w:eastAsia="Arial" w:hAnsi="Cambria" w:cstheme="majorBidi"/>
       <w:b/>
       <w:color w:val="2F5496" w:themeColor="accent1" w:themeShade="BF"/>
       <w:sz w:val="28"/>
@@ -28849,9 +29012,9 @@
     <w:basedOn w:val="Fontepargpadro"/>
     <w:link w:val="Ttulo3"/>
     <w:uiPriority w:val="9"/>
-    <w:rsid w:val="00E9462F"/>
+    <w:rsid w:val="00B475F2"/>
     <w:rPr>
-      <w:rFonts w:asciiTheme="majorHAnsi" w:eastAsiaTheme="majorEastAsia" w:hAnsiTheme="majorHAnsi" w:cstheme="majorBidi"/>
+      <w:rFonts w:ascii="Cambria" w:eastAsiaTheme="majorEastAsia" w:hAnsi="Cambria" w:cstheme="majorBidi"/>
       <w:b/>
       <w:color w:val="2F5496" w:themeColor="accent1" w:themeShade="BF"/>
       <w:sz w:val="26"/>
@@ -29711,37 +29874,42 @@
     <w:name w:val="Compact"/>
     <w:basedOn w:val="Corpodetexto"/>
     <w:qFormat/>
-    <w:rsid w:val="006D2117"/>
+    <w:rsid w:val="00B475F2"/>
     <w:pPr>
-      <w:spacing w:before="36" w:after="36" w:line="240" w:lineRule="auto"/>
+      <w:spacing w:before="36" w:after="36"/>
       <w:ind w:firstLine="0"/>
-      <w:jc w:val="left"/>
     </w:pPr>
     <w:rPr>
-      <w:rFonts w:asciiTheme="minorHAnsi" w:hAnsiTheme="minorHAnsi" w:cstheme="minorBidi"/>
-      <w:sz w:val="24"/>
+      <w:rFonts w:cstheme="minorBidi"/>
       <w:szCs w:val="24"/>
       <w:lang w:val="en-US" w:eastAsia="zh-CN"/>
     </w:rPr>
   </w:style>
   <w:style w:type="table" w:customStyle="1" w:styleId="Table">
     <w:name w:val="Table"/>
-    <w:basedOn w:val="TabeladeGrade4-nfase1"/>
+    <w:basedOn w:val="TabelaAuditoria"/>
     <w:semiHidden/>
     <w:unhideWhenUsed/>
     <w:qFormat/>
-    <w:rsid w:val="00C0577C"/>
+    <w:rsid w:val="00B05755"/>
     <w:pPr>
       <w:jc w:val="center"/>
     </w:pPr>
     <w:rPr>
       <w:rFonts w:asciiTheme="minorHAnsi" w:eastAsiaTheme="minorEastAsia" w:hAnsiTheme="minorHAnsi" w:cstheme="minorBidi"/>
-      <w:sz w:val="18"/>
       <w:szCs w:val="24"/>
       <w:lang w:val="en-US" w:eastAsia="zh-CN"/>
     </w:rPr>
     <w:tblPr>
       <w:jc w:val="center"/>
+      <w:tblBorders>
+        <w:top w:val="single" w:sz="4" w:space="0" w:color="8EAADB" w:themeColor="accent1" w:themeTint="99"/>
+        <w:left w:val="single" w:sz="4" w:space="0" w:color="8EAADB" w:themeColor="accent1" w:themeTint="99"/>
+        <w:bottom w:val="single" w:sz="4" w:space="0" w:color="8EAADB" w:themeColor="accent1" w:themeTint="99"/>
+        <w:right w:val="single" w:sz="4" w:space="0" w:color="8EAADB" w:themeColor="accent1" w:themeTint="99"/>
+        <w:insideH w:val="single" w:sz="4" w:space="0" w:color="8EAADB" w:themeColor="accent1" w:themeTint="99"/>
+        <w:insideV w:val="single" w:sz="4" w:space="0" w:color="8EAADB" w:themeColor="accent1" w:themeTint="99"/>
+      </w:tblBorders>
     </w:tblPr>
     <w:trPr>
       <w:jc w:val="center"/>
@@ -29772,6 +29940,8 @@
           <w:right w:val="single" w:sz="4" w:space="0" w:color="4472C4" w:themeColor="accent1"/>
           <w:insideH w:val="nil"/>
           <w:insideV w:val="nil"/>
+          <w:tl2br w:val="nil"/>
+          <w:tr2bl w:val="nil"/>
         </w:tcBorders>
         <w:shd w:val="clear" w:color="auto" w:fill="4472C4" w:themeFill="accent1"/>
         <w:vAlign w:val="center"/>
@@ -29832,6 +30002,10 @@
         <w:rFonts w:asciiTheme="minorHAnsi" w:hAnsiTheme="minorHAnsi"/>
         <w:sz w:val="18"/>
       </w:rPr>
+      <w:tblPr/>
+      <w:tcPr>
+        <w:shd w:val="clear" w:color="auto" w:fill="FFFFFF" w:themeFill="background1"/>
+      </w:tcPr>
     </w:tblStylePr>
   </w:style>
   <w:style w:type="paragraph" w:customStyle="1" w:styleId="FonteImagem">
@@ -29859,10 +30033,8 @@
     <w:uiPriority w:val="99"/>
     <w:semiHidden/>
     <w:unhideWhenUsed/>
-    <w:rsid w:val="006D2117"/>
-    <w:pPr>
-      <w:spacing w:after="120"/>
-    </w:pPr>
+    <w:qFormat/>
+    <w:rsid w:val="00B475F2"/>
   </w:style>
   <w:style w:type="character" w:customStyle="1" w:styleId="CorpodetextoChar">
     <w:name w:val="Corpo de texto Char"/>
@@ -29870,7 +30042,7 @@
     <w:link w:val="Corpodetexto"/>
     <w:uiPriority w:val="99"/>
     <w:semiHidden/>
-    <w:rsid w:val="006D2117"/>
+    <w:rsid w:val="00B475F2"/>
     <w:rPr>
       <w:rFonts w:ascii="Arial" w:eastAsiaTheme="minorEastAsia" w:hAnsi="Arial"/>
       <w:sz w:val="22"/>
@@ -29887,6 +30059,68 @@
     <w:rPr>
       <w:noProof/>
     </w:rPr>
+  </w:style>
+  <w:style w:type="table" w:customStyle="1" w:styleId="TabelaAuditoria">
+    <w:name w:val="TabelaAuditoria"/>
+    <w:basedOn w:val="Tabelanormal"/>
+    <w:uiPriority w:val="99"/>
+    <w:rsid w:val="00025418"/>
+    <w:pPr>
+      <w:spacing w:after="0" w:line="240" w:lineRule="auto"/>
+    </w:pPr>
+    <w:rPr>
+      <w:sz w:val="18"/>
+    </w:rPr>
+    <w:tblPr>
+      <w:tblStyleRowBandSize w:val="1"/>
+      <w:tblBorders>
+        <w:top w:val="single" w:sz="4" w:space="0" w:color="auto"/>
+        <w:left w:val="single" w:sz="4" w:space="0" w:color="auto"/>
+        <w:bottom w:val="single" w:sz="4" w:space="0" w:color="auto"/>
+        <w:right w:val="single" w:sz="4" w:space="0" w:color="auto"/>
+        <w:insideH w:val="single" w:sz="4" w:space="0" w:color="auto"/>
+        <w:insideV w:val="single" w:sz="4" w:space="0" w:color="auto"/>
+      </w:tblBorders>
+    </w:tblPr>
+    <w:tblStylePr w:type="firstRow">
+      <w:pPr>
+        <w:wordWrap/>
+        <w:spacing w:beforeLines="0" w:before="0" w:beforeAutospacing="0" w:afterLines="0" w:after="0" w:afterAutospacing="0" w:line="240" w:lineRule="auto"/>
+        <w:contextualSpacing/>
+      </w:pPr>
+      <w:rPr>
+        <w:rFonts w:asciiTheme="minorHAnsi" w:hAnsiTheme="minorHAnsi"/>
+        <w:b/>
+        <w:color w:val="FFFFFF" w:themeColor="background1"/>
+        <w:sz w:val="20"/>
+      </w:rPr>
+      <w:tblPr/>
+      <w:tcPr>
+        <w:tcBorders>
+          <w:top w:val="nil"/>
+          <w:left w:val="nil"/>
+          <w:bottom w:val="nil"/>
+          <w:right w:val="nil"/>
+          <w:insideH w:val="nil"/>
+          <w:insideV w:val="nil"/>
+          <w:tl2br w:val="nil"/>
+          <w:tr2bl w:val="nil"/>
+        </w:tcBorders>
+        <w:shd w:val="clear" w:color="auto" w:fill="4472C4" w:themeFill="accent1"/>
+      </w:tcPr>
+    </w:tblStylePr>
+    <w:tblStylePr w:type="band1Horz">
+      <w:tblPr/>
+      <w:tcPr>
+        <w:shd w:val="clear" w:color="auto" w:fill="B4C6E7" w:themeFill="accent1" w:themeFillTint="66"/>
+      </w:tcPr>
+    </w:tblStylePr>
+    <w:tblStylePr w:type="band2Horz">
+      <w:tblPr/>
+      <w:tcPr>
+        <w:shd w:val="clear" w:color="auto" w:fill="FFFFFF" w:themeFill="background1"/>
+      </w:tcPr>
+    </w:tblStylePr>
   </w:style>
 </w:styles>
 </file>
@@ -30191,12 +30425,21 @@
 </file>
 
 <file path=customXml/item2.xml><?xml version="1.0" encoding="utf-8"?>
-<go:gDocsCustomXmlDataStorage xmlns:go="http://customooxmlschemas.google.com/" xmlns:r="http://schemas.openxmlformats.org/officeDocument/2006/relationships" uri="GoogleDocsCustomDataVersion2">
-  <go:docsCustomData xmlns:go="http://customooxmlschemas.google.com/" roundtripDataSignature="AMtx7mjzI106X9uAE8/Y55RY9OBdAi8ivg==">CgMxLjAyDmgudjQ3dmlndW96M2NoOAByITFORk1la3hqN2NRcXFyekp4UWdmNjB6ZEVHWWlnbk9FQg==</go:docsCustomData>
-</go:gDocsCustomXmlDataStorage>
+<?mso-contentType ?>
+<FormTemplates xmlns="http://schemas.microsoft.com/sharepoint/v3/contenttype/forms">
+  <Display>DocumentLibraryForm</Display>
+  <Edit>DocumentLibraryForm</Edit>
+  <New>DocumentLibraryForm</New>
+</FormTemplates>
 </file>
 
 <file path=customXml/item3.xml><?xml version="1.0" encoding="utf-8"?>
+<p:properties xmlns:p="http://schemas.microsoft.com/office/2006/metadata/properties" xmlns:xsi="http://www.w3.org/2001/XMLSchema-instance" xmlns:pc="http://schemas.microsoft.com/office/infopath/2007/PartnerControls">
+  <documentManagement/>
+</p:properties>
+</file>
+
+<file path=customXml/item4.xml><?xml version="1.0" encoding="utf-8"?>
 <ct:contentTypeSchema xmlns:ct="http://schemas.microsoft.com/office/2006/metadata/contentType" xmlns:ma="http://schemas.microsoft.com/office/2006/metadata/properties/metaAttributes" ct:_="" ma:_="" ma:contentTypeName="Documento" ma:contentTypeID="0x0101003FDBC2031823944CAE7A47B474980AF9" ma:contentTypeVersion="4" ma:contentTypeDescription="Crie um novo documento." ma:contentTypeScope="" ma:versionID="f31fe37710458f3b3d8a0a690fca4453">
   <xsd:schema xmlns:xsd="http://www.w3.org/2001/XMLSchema" xmlns:xs="http://www.w3.org/2001/XMLSchema" xmlns:p="http://schemas.microsoft.com/office/2006/metadata/properties" xmlns:ns2="725921e2-8998-4eb1-9fb8-0a15db1010ad" targetNamespace="http://schemas.microsoft.com/office/2006/metadata/properties" ma:root="true" ma:fieldsID="40fe51cd24c191e2b75fbfba2c765529" ns2:_="">
     <xsd:import namespace="725921e2-8998-4eb1-9fb8-0a15db1010ad"/>
@@ -30340,19 +30583,10 @@
 </ct:contentTypeSchema>
 </file>
 
-<file path=customXml/item4.xml><?xml version="1.0" encoding="utf-8"?>
-<p:properties xmlns:p="http://schemas.microsoft.com/office/2006/metadata/properties" xmlns:xsi="http://www.w3.org/2001/XMLSchema-instance" xmlns:pc="http://schemas.microsoft.com/office/infopath/2007/PartnerControls">
-  <documentManagement/>
-</p:properties>
-</file>
-
 <file path=customXml/item5.xml><?xml version="1.0" encoding="utf-8"?>
-<?mso-contentType ?>
-<FormTemplates xmlns="http://schemas.microsoft.com/sharepoint/v3/contenttype/forms">
-  <Display>DocumentLibraryForm</Display>
-  <Edit>DocumentLibraryForm</Edit>
-  <New>DocumentLibraryForm</New>
-</FormTemplates>
+<go:gDocsCustomXmlDataStorage xmlns:go="http://customooxmlschemas.google.com/" xmlns:r="http://schemas.openxmlformats.org/officeDocument/2006/relationships" uri="GoogleDocsCustomDataVersion2">
+  <go:docsCustomData xmlns:go="http://customooxmlschemas.google.com/" roundtripDataSignature="AMtx7mjzI106X9uAE8/Y55RY9OBdAi8ivg==">CgMxLjAyDmgudjQ3dmlndW96M2NoOAByITFORk1la3hqN2NRcXFyekp4UWdmNjB6ZEVHWWlnbk9FQg==</go:docsCustomData>
+</go:gDocsCustomXmlDataStorage>
 </file>
 
 <file path=customXml/itemProps1.xml><?xml version="1.0" encoding="utf-8"?>
@@ -30364,15 +30598,23 @@
 </file>
 
 <file path=customXml/itemProps2.xml><?xml version="1.0" encoding="utf-8"?>
-<ds:datastoreItem xmlns:ds="http://schemas.openxmlformats.org/officeDocument/2006/customXml" ds:itemID="{11111111-1234-1234-1234-123412341234}">
+<ds:datastoreItem xmlns:ds="http://schemas.openxmlformats.org/officeDocument/2006/customXml" ds:itemID="{E8CD7CA6-34CB-4CBB-9D2A-B78A43F31D57}">
   <ds:schemaRefs>
-    <ds:schemaRef ds:uri="http://customooxmlschemas.google.com/"/>
-    <ds:schemaRef ds:uri="http://schemas.openxmlformats.org/officeDocument/2006/relationships"/>
+    <ds:schemaRef ds:uri="http://schemas.microsoft.com/sharepoint/v3/contenttype/forms"/>
   </ds:schemaRefs>
 </ds:datastoreItem>
 </file>
 
 <file path=customXml/itemProps3.xml><?xml version="1.0" encoding="utf-8"?>
+<ds:datastoreItem xmlns:ds="http://schemas.openxmlformats.org/officeDocument/2006/customXml" ds:itemID="{64F7848B-4C6F-4348-B4B7-5F5BA7D9C422}">
+  <ds:schemaRefs>
+    <ds:schemaRef ds:uri="http://schemas.microsoft.com/office/2006/metadata/properties"/>
+    <ds:schemaRef ds:uri="http://schemas.microsoft.com/office/infopath/2007/PartnerControls"/>
+  </ds:schemaRefs>
+</ds:datastoreItem>
+</file>
+
+<file path=customXml/itemProps4.xml><?xml version="1.0" encoding="utf-8"?>
 <ds:datastoreItem xmlns:ds="http://schemas.openxmlformats.org/officeDocument/2006/customXml" ds:itemID="{3CF5151D-A14D-43F4-900A-6ABA1741E34B}">
   <ds:schemaRefs>
     <ds:schemaRef ds:uri="http://schemas.microsoft.com/office/2006/metadata/contentType"/>
@@ -30390,19 +30632,11 @@
 </ds:datastoreItem>
 </file>
 
-<file path=customXml/itemProps4.xml><?xml version="1.0" encoding="utf-8"?>
-<ds:datastoreItem xmlns:ds="http://schemas.openxmlformats.org/officeDocument/2006/customXml" ds:itemID="{64F7848B-4C6F-4348-B4B7-5F5BA7D9C422}">
+<file path=customXml/itemProps5.xml><?xml version="1.0" encoding="utf-8"?>
+<ds:datastoreItem xmlns:ds="http://schemas.openxmlformats.org/officeDocument/2006/customXml" ds:itemID="{11111111-1234-1234-1234-123412341234}">
   <ds:schemaRefs>
-    <ds:schemaRef ds:uri="http://schemas.microsoft.com/office/2006/metadata/properties"/>
-    <ds:schemaRef ds:uri="http://schemas.microsoft.com/office/infopath/2007/PartnerControls"/>
-  </ds:schemaRefs>
-</ds:datastoreItem>
-</file>
-
-<file path=customXml/itemProps5.xml><?xml version="1.0" encoding="utf-8"?>
-<ds:datastoreItem xmlns:ds="http://schemas.openxmlformats.org/officeDocument/2006/customXml" ds:itemID="{E8CD7CA6-34CB-4CBB-9D2A-B78A43F31D57}">
-  <ds:schemaRefs>
-    <ds:schemaRef ds:uri="http://schemas.microsoft.com/sharepoint/v3/contenttype/forms"/>
+    <ds:schemaRef ds:uri="http://customooxmlschemas.google.com/"/>
+    <ds:schemaRef ds:uri="http://schemas.openxmlformats.org/officeDocument/2006/relationships"/>
   </ds:schemaRefs>
 </ds:datastoreItem>
 </file>
</xml_diff>

<commit_message>
ajuste no estilo titulo 4 do template
</commit_message>
<xml_diff>
--- a/docs/template-relatorio-individual.docx
+++ b/docs/template-relatorio-individual.docx
@@ -4390,11 +4390,11 @@
         </w:trPr>
         <w:tc>
           <w:tcPr>
+            <w:cnfStyle w:val="001000000000" w:firstRow="0" w:lastRow="0" w:firstColumn="1" w:lastColumn="0" w:oddVBand="0" w:evenVBand="0" w:oddHBand="0" w:evenHBand="0" w:firstRowFirstColumn="0" w:firstRowLastColumn="0" w:lastRowFirstColumn="0" w:lastRowLastColumn="0"/>
             <w:tcW w:w="1129" w:type="dxa"/>
           </w:tcPr>
           <w:p>
             <w:pPr>
-              <w:cnfStyle w:val="101000000000" w:firstRow="1" w:lastRow="0" w:firstColumn="1" w:lastColumn="0" w:oddVBand="0" w:evenVBand="0" w:oddHBand="0" w:evenHBand="0" w:firstRowFirstColumn="0" w:firstRowLastColumn="0" w:lastRowFirstColumn="0" w:lastRowLastColumn="0"/>
               <w:rPr>
                 <w:rFonts w:asciiTheme="minorHAnsi" w:eastAsia="Arial" w:hAnsiTheme="minorHAnsi" w:cstheme="minorHAnsi"/>
                 <w:szCs w:val="18"/>
@@ -4415,6 +4415,7 @@
           </w:tcPr>
           <w:p>
             <w:pPr>
+              <w:cnfStyle w:val="100000000000" w:firstRow="1" w:lastRow="0" w:firstColumn="0" w:lastColumn="0" w:oddVBand="0" w:evenVBand="0" w:oddHBand="0" w:evenHBand="0" w:firstRowFirstColumn="0" w:firstRowLastColumn="0" w:lastRowFirstColumn="0" w:lastRowLastColumn="0"/>
               <w:rPr>
                 <w:rFonts w:asciiTheme="minorHAnsi" w:hAnsiTheme="minorHAnsi" w:cstheme="minorHAnsi"/>
                 <w:szCs w:val="18"/>
@@ -4435,6 +4436,7 @@
           </w:tcPr>
           <w:p>
             <w:pPr>
+              <w:cnfStyle w:val="100000000000" w:firstRow="1" w:lastRow="0" w:firstColumn="0" w:lastColumn="0" w:oddVBand="0" w:evenVBand="0" w:oddHBand="0" w:evenHBand="0" w:firstRowFirstColumn="0" w:firstRowLastColumn="0" w:lastRowFirstColumn="0" w:lastRowLastColumn="0"/>
               <w:rPr>
                 <w:rFonts w:asciiTheme="minorHAnsi" w:eastAsia="Arial" w:hAnsiTheme="minorHAnsi" w:cstheme="minorHAnsi"/>
                 <w:szCs w:val="18"/>
@@ -4456,12 +4458,12 @@
         </w:trPr>
         <w:tc>
           <w:tcPr>
+            <w:cnfStyle w:val="001000000000" w:firstRow="0" w:lastRow="0" w:firstColumn="1" w:lastColumn="0" w:oddVBand="0" w:evenVBand="0" w:oddHBand="0" w:evenHBand="0" w:firstRowFirstColumn="0" w:firstRowLastColumn="0" w:lastRowFirstColumn="0" w:lastRowLastColumn="0"/>
             <w:tcW w:w="1129" w:type="dxa"/>
           </w:tcPr>
           <w:p>
             <w:pPr>
               <w:spacing w:line="276" w:lineRule="auto"/>
-              <w:cnfStyle w:val="001000100000" w:firstRow="0" w:lastRow="0" w:firstColumn="1" w:lastColumn="0" w:oddVBand="0" w:evenVBand="0" w:oddHBand="1" w:evenHBand="0" w:firstRowFirstColumn="0" w:firstRowLastColumn="0" w:lastRowFirstColumn="0" w:lastRowLastColumn="0"/>
               <w:rPr>
                 <w:rFonts w:asciiTheme="minorHAnsi" w:eastAsia="Arial" w:hAnsiTheme="minorHAnsi" w:cstheme="minorHAnsi"/>
               </w:rPr>
@@ -4487,6 +4489,7 @@
           <w:p>
             <w:pPr>
               <w:spacing w:line="276" w:lineRule="auto"/>
+              <w:cnfStyle w:val="000000100000" w:firstRow="0" w:lastRow="0" w:firstColumn="0" w:lastColumn="0" w:oddVBand="0" w:evenVBand="0" w:oddHBand="1" w:evenHBand="0" w:firstRowFirstColumn="0" w:firstRowLastColumn="0" w:lastRowFirstColumn="0" w:lastRowLastColumn="0"/>
               <w:rPr>
                 <w:rFonts w:asciiTheme="minorHAnsi" w:eastAsia="Arial" w:hAnsiTheme="minorHAnsi" w:cstheme="minorHAnsi"/>
               </w:rPr>
@@ -4503,6 +4506,7 @@
           <w:p>
             <w:pPr>
               <w:spacing w:line="276" w:lineRule="auto"/>
+              <w:cnfStyle w:val="000000100000" w:firstRow="0" w:lastRow="0" w:firstColumn="0" w:lastColumn="0" w:oddVBand="0" w:evenVBand="0" w:oddHBand="1" w:evenHBand="0" w:firstRowFirstColumn="0" w:firstRowLastColumn="0" w:lastRowFirstColumn="0" w:lastRowLastColumn="0"/>
               <w:rPr>
                 <w:rFonts w:asciiTheme="minorHAnsi" w:eastAsia="Arial" w:hAnsiTheme="minorHAnsi" w:cstheme="minorHAnsi"/>
               </w:rPr>
@@ -4559,12 +4563,12 @@
       <w:tr>
         <w:tc>
           <w:tcPr>
+            <w:cnfStyle w:val="001000000000" w:firstRow="0" w:lastRow="0" w:firstColumn="1" w:lastColumn="0" w:oddVBand="0" w:evenVBand="0" w:oddHBand="0" w:evenHBand="0" w:firstRowFirstColumn="0" w:firstRowLastColumn="0" w:lastRowFirstColumn="0" w:lastRowLastColumn="0"/>
             <w:tcW w:w="1129" w:type="dxa"/>
           </w:tcPr>
           <w:p>
             <w:pPr>
               <w:spacing w:line="276" w:lineRule="auto"/>
-              <w:cnfStyle w:val="001000000000" w:firstRow="0" w:lastRow="0" w:firstColumn="1" w:lastColumn="0" w:oddVBand="0" w:evenVBand="0" w:oddHBand="0" w:evenHBand="0" w:firstRowFirstColumn="0" w:firstRowLastColumn="0" w:lastRowFirstColumn="0" w:lastRowLastColumn="0"/>
               <w:rPr>
                 <w:rFonts w:asciiTheme="minorHAnsi" w:eastAsia="Arial" w:hAnsiTheme="minorHAnsi" w:cstheme="minorHAnsi"/>
               </w:rPr>
@@ -4590,6 +4594,7 @@
           <w:p>
             <w:pPr>
               <w:spacing w:line="276" w:lineRule="auto"/>
+              <w:cnfStyle w:val="000000000000" w:firstRow="0" w:lastRow="0" w:firstColumn="0" w:lastColumn="0" w:oddVBand="0" w:evenVBand="0" w:oddHBand="0" w:evenHBand="0" w:firstRowFirstColumn="0" w:firstRowLastColumn="0" w:lastRowFirstColumn="0" w:lastRowLastColumn="0"/>
               <w:rPr>
                 <w:rFonts w:asciiTheme="minorHAnsi" w:eastAsia="Arial" w:hAnsiTheme="minorHAnsi" w:cstheme="minorHAnsi"/>
               </w:rPr>
@@ -4606,6 +4611,7 @@
           <w:p>
             <w:pPr>
               <w:spacing w:line="276" w:lineRule="auto"/>
+              <w:cnfStyle w:val="000000000000" w:firstRow="0" w:lastRow="0" w:firstColumn="0" w:lastColumn="0" w:oddVBand="0" w:evenVBand="0" w:oddHBand="0" w:evenHBand="0" w:firstRowFirstColumn="0" w:firstRowLastColumn="0" w:lastRowFirstColumn="0" w:lastRowLastColumn="0"/>
               <w:rPr>
                 <w:rFonts w:asciiTheme="minorHAnsi" w:eastAsia="Arial" w:hAnsiTheme="minorHAnsi" w:cstheme="minorHAnsi"/>
               </w:rPr>
@@ -5097,11 +5103,11 @@
         </w:trPr>
         <w:tc>
           <w:tcPr>
+            <w:cnfStyle w:val="001000000000" w:firstRow="0" w:lastRow="0" w:firstColumn="1" w:lastColumn="0" w:oddVBand="0" w:evenVBand="0" w:oddHBand="0" w:evenHBand="0" w:firstRowFirstColumn="0" w:firstRowLastColumn="0" w:lastRowFirstColumn="0" w:lastRowLastColumn="0"/>
             <w:tcW w:w="1129" w:type="dxa"/>
           </w:tcPr>
           <w:p>
             <w:pPr>
-              <w:cnfStyle w:val="101000000000" w:firstRow="1" w:lastRow="0" w:firstColumn="1" w:lastColumn="0" w:oddVBand="0" w:evenVBand="0" w:oddHBand="0" w:evenHBand="0" w:firstRowFirstColumn="0" w:firstRowLastColumn="0" w:lastRowFirstColumn="0" w:lastRowLastColumn="0"/>
               <w:rPr>
                 <w:rFonts w:asciiTheme="minorHAnsi" w:eastAsia="Arial" w:hAnsiTheme="minorHAnsi" w:cstheme="minorHAnsi"/>
                 <w:szCs w:val="18"/>
@@ -5122,6 +5128,7 @@
           </w:tcPr>
           <w:p>
             <w:pPr>
+              <w:cnfStyle w:val="100000000000" w:firstRow="1" w:lastRow="0" w:firstColumn="0" w:lastColumn="0" w:oddVBand="0" w:evenVBand="0" w:oddHBand="0" w:evenHBand="0" w:firstRowFirstColumn="0" w:firstRowLastColumn="0" w:lastRowFirstColumn="0" w:lastRowLastColumn="0"/>
               <w:rPr>
                 <w:rFonts w:asciiTheme="minorHAnsi" w:hAnsiTheme="minorHAnsi" w:cstheme="minorHAnsi"/>
                 <w:szCs w:val="18"/>
@@ -5142,6 +5149,7 @@
           </w:tcPr>
           <w:p>
             <w:pPr>
+              <w:cnfStyle w:val="100000000000" w:firstRow="1" w:lastRow="0" w:firstColumn="0" w:lastColumn="0" w:oddVBand="0" w:evenVBand="0" w:oddHBand="0" w:evenHBand="0" w:firstRowFirstColumn="0" w:firstRowLastColumn="0" w:lastRowFirstColumn="0" w:lastRowLastColumn="0"/>
               <w:rPr>
                 <w:rFonts w:asciiTheme="minorHAnsi" w:eastAsia="Arial" w:hAnsiTheme="minorHAnsi" w:cstheme="minorHAnsi"/>
                 <w:szCs w:val="18"/>
@@ -5163,12 +5171,12 @@
         </w:trPr>
         <w:tc>
           <w:tcPr>
+            <w:cnfStyle w:val="001000000000" w:firstRow="0" w:lastRow="0" w:firstColumn="1" w:lastColumn="0" w:oddVBand="0" w:evenVBand="0" w:oddHBand="0" w:evenHBand="0" w:firstRowFirstColumn="0" w:firstRowLastColumn="0" w:lastRowFirstColumn="0" w:lastRowLastColumn="0"/>
             <w:tcW w:w="1129" w:type="dxa"/>
           </w:tcPr>
           <w:p>
             <w:pPr>
               <w:spacing w:line="276" w:lineRule="auto"/>
-              <w:cnfStyle w:val="001000100000" w:firstRow="0" w:lastRow="0" w:firstColumn="1" w:lastColumn="0" w:oddVBand="0" w:evenVBand="0" w:oddHBand="1" w:evenHBand="0" w:firstRowFirstColumn="0" w:firstRowLastColumn="0" w:lastRowFirstColumn="0" w:lastRowLastColumn="0"/>
               <w:rPr>
                 <w:rFonts w:asciiTheme="minorHAnsi" w:eastAsia="Arial" w:hAnsiTheme="minorHAnsi" w:cstheme="minorHAnsi"/>
               </w:rPr>
@@ -5194,6 +5202,7 @@
           <w:p>
             <w:pPr>
               <w:spacing w:line="276" w:lineRule="auto"/>
+              <w:cnfStyle w:val="000000100000" w:firstRow="0" w:lastRow="0" w:firstColumn="0" w:lastColumn="0" w:oddVBand="0" w:evenVBand="0" w:oddHBand="1" w:evenHBand="0" w:firstRowFirstColumn="0" w:firstRowLastColumn="0" w:lastRowFirstColumn="0" w:lastRowLastColumn="0"/>
               <w:rPr>
                 <w:rFonts w:asciiTheme="minorHAnsi" w:eastAsia="Arial" w:hAnsiTheme="minorHAnsi" w:cstheme="minorHAnsi"/>
               </w:rPr>
@@ -5210,6 +5219,7 @@
           <w:p>
             <w:pPr>
               <w:spacing w:line="276" w:lineRule="auto"/>
+              <w:cnfStyle w:val="000000100000" w:firstRow="0" w:lastRow="0" w:firstColumn="0" w:lastColumn="0" w:oddVBand="0" w:evenVBand="0" w:oddHBand="1" w:evenHBand="0" w:firstRowFirstColumn="0" w:firstRowLastColumn="0" w:lastRowFirstColumn="0" w:lastRowLastColumn="0"/>
               <w:rPr>
                 <w:rFonts w:asciiTheme="minorHAnsi" w:eastAsia="Arial" w:hAnsiTheme="minorHAnsi" w:cstheme="minorHAnsi"/>
               </w:rPr>
@@ -5266,12 +5276,12 @@
       <w:tr>
         <w:tc>
           <w:tcPr>
+            <w:cnfStyle w:val="001000000000" w:firstRow="0" w:lastRow="0" w:firstColumn="1" w:lastColumn="0" w:oddVBand="0" w:evenVBand="0" w:oddHBand="0" w:evenHBand="0" w:firstRowFirstColumn="0" w:firstRowLastColumn="0" w:lastRowFirstColumn="0" w:lastRowLastColumn="0"/>
             <w:tcW w:w="1129" w:type="dxa"/>
           </w:tcPr>
           <w:p>
             <w:pPr>
               <w:spacing w:line="276" w:lineRule="auto"/>
-              <w:cnfStyle w:val="001000000000" w:firstRow="0" w:lastRow="0" w:firstColumn="1" w:lastColumn="0" w:oddVBand="0" w:evenVBand="0" w:oddHBand="0" w:evenHBand="0" w:firstRowFirstColumn="0" w:firstRowLastColumn="0" w:lastRowFirstColumn="0" w:lastRowLastColumn="0"/>
               <w:rPr>
                 <w:rFonts w:asciiTheme="minorHAnsi" w:eastAsia="Arial" w:hAnsiTheme="minorHAnsi" w:cstheme="minorHAnsi"/>
               </w:rPr>
@@ -5297,6 +5307,7 @@
           <w:p>
             <w:pPr>
               <w:spacing w:line="276" w:lineRule="auto"/>
+              <w:cnfStyle w:val="000000000000" w:firstRow="0" w:lastRow="0" w:firstColumn="0" w:lastColumn="0" w:oddVBand="0" w:evenVBand="0" w:oddHBand="0" w:evenHBand="0" w:firstRowFirstColumn="0" w:firstRowLastColumn="0" w:lastRowFirstColumn="0" w:lastRowLastColumn="0"/>
               <w:rPr>
                 <w:rFonts w:asciiTheme="minorHAnsi" w:eastAsia="Arial" w:hAnsiTheme="minorHAnsi" w:cstheme="minorHAnsi"/>
               </w:rPr>
@@ -5313,6 +5324,7 @@
           <w:p>
             <w:pPr>
               <w:spacing w:line="276" w:lineRule="auto"/>
+              <w:cnfStyle w:val="000000000000" w:firstRow="0" w:lastRow="0" w:firstColumn="0" w:lastColumn="0" w:oddVBand="0" w:evenVBand="0" w:oddHBand="0" w:evenHBand="0" w:firstRowFirstColumn="0" w:firstRowLastColumn="0" w:lastRowFirstColumn="0" w:lastRowLastColumn="0"/>
               <w:rPr>
                 <w:rFonts w:asciiTheme="minorHAnsi" w:eastAsia="Arial" w:hAnsiTheme="minorHAnsi" w:cstheme="minorHAnsi"/>
               </w:rPr>
@@ -5372,11 +5384,11 @@
         </w:trPr>
         <w:tc>
           <w:tcPr>
+            <w:cnfStyle w:val="001000000000" w:firstRow="0" w:lastRow="0" w:firstColumn="1" w:lastColumn="0" w:oddVBand="0" w:evenVBand="0" w:oddHBand="0" w:evenHBand="0" w:firstRowFirstColumn="0" w:firstRowLastColumn="0" w:lastRowFirstColumn="0" w:lastRowLastColumn="0"/>
             <w:tcW w:w="1129" w:type="dxa"/>
           </w:tcPr>
           <w:p>
             <w:pPr>
-              <w:cnfStyle w:val="001000100000" w:firstRow="0" w:lastRow="0" w:firstColumn="1" w:lastColumn="0" w:oddVBand="0" w:evenVBand="0" w:oddHBand="1" w:evenHBand="0" w:firstRowFirstColumn="0" w:firstRowLastColumn="0" w:lastRowFirstColumn="0" w:lastRowLastColumn="0"/>
               <w:rPr>
                 <w:rFonts w:asciiTheme="minorHAnsi" w:eastAsia="Arial" w:hAnsiTheme="minorHAnsi" w:cstheme="minorHAnsi"/>
               </w:rPr>
@@ -5394,6 +5406,9 @@
             <w:tcW w:w="6308" w:type="dxa"/>
           </w:tcPr>
           <w:p>
+            <w:pPr>
+              <w:cnfStyle w:val="000000100000" w:firstRow="0" w:lastRow="0" w:firstColumn="0" w:lastColumn="0" w:oddVBand="0" w:evenVBand="0" w:oddHBand="1" w:evenHBand="0" w:firstRowFirstColumn="0" w:firstRowLastColumn="0" w:lastRowFirstColumn="0" w:lastRowLastColumn="0"/>
+            </w:pPr>
             <w:r>
               <w:t>Endereçar o software não autorizado</w:t>
             </w:r>
@@ -5405,6 +5420,7 @@
           </w:tcPr>
           <w:p>
             <w:pPr>
+              <w:cnfStyle w:val="000000100000" w:firstRow="0" w:lastRow="0" w:firstColumn="0" w:lastColumn="0" w:oddVBand="0" w:evenVBand="0" w:oddHBand="1" w:evenHBand="0" w:firstRowFirstColumn="0" w:firstRowLastColumn="0" w:lastRowFirstColumn="0" w:lastRowLastColumn="0"/>
               <w:rPr>
                 <w:rFonts w:asciiTheme="minorHAnsi" w:eastAsia="Arial" w:hAnsiTheme="minorHAnsi" w:cstheme="minorHAnsi"/>
                 <w:b/>
@@ -5888,11 +5904,11 @@
         </w:trPr>
         <w:tc>
           <w:tcPr>
+            <w:cnfStyle w:val="001000000000" w:firstRow="0" w:lastRow="0" w:firstColumn="1" w:lastColumn="0" w:oddVBand="0" w:evenVBand="0" w:oddHBand="0" w:evenHBand="0" w:firstRowFirstColumn="0" w:firstRowLastColumn="0" w:lastRowFirstColumn="0" w:lastRowLastColumn="0"/>
             <w:tcW w:w="1129" w:type="dxa"/>
           </w:tcPr>
           <w:p>
             <w:pPr>
-              <w:cnfStyle w:val="101000000000" w:firstRow="1" w:lastRow="0" w:firstColumn="1" w:lastColumn="0" w:oddVBand="0" w:evenVBand="0" w:oddHBand="0" w:evenHBand="0" w:firstRowFirstColumn="0" w:firstRowLastColumn="0" w:lastRowFirstColumn="0" w:lastRowLastColumn="0"/>
               <w:rPr>
                 <w:rFonts w:asciiTheme="minorHAnsi" w:eastAsia="Arial" w:hAnsiTheme="minorHAnsi" w:cstheme="minorHAnsi"/>
                 <w:szCs w:val="18"/>
@@ -5914,6 +5930,7 @@
           </w:tcPr>
           <w:p>
             <w:pPr>
+              <w:cnfStyle w:val="100000000000" w:firstRow="1" w:lastRow="0" w:firstColumn="0" w:lastColumn="0" w:oddVBand="0" w:evenVBand="0" w:oddHBand="0" w:evenHBand="0" w:firstRowFirstColumn="0" w:firstRowLastColumn="0" w:lastRowFirstColumn="0" w:lastRowLastColumn="0"/>
               <w:rPr>
                 <w:rFonts w:asciiTheme="minorHAnsi" w:hAnsiTheme="minorHAnsi" w:cstheme="minorHAnsi"/>
                 <w:szCs w:val="18"/>
@@ -5934,6 +5951,7 @@
           </w:tcPr>
           <w:p>
             <w:pPr>
+              <w:cnfStyle w:val="100000000000" w:firstRow="1" w:lastRow="0" w:firstColumn="0" w:lastColumn="0" w:oddVBand="0" w:evenVBand="0" w:oddHBand="0" w:evenHBand="0" w:firstRowFirstColumn="0" w:firstRowLastColumn="0" w:lastRowFirstColumn="0" w:lastRowLastColumn="0"/>
               <w:rPr>
                 <w:rFonts w:asciiTheme="minorHAnsi" w:eastAsia="Arial" w:hAnsiTheme="minorHAnsi" w:cstheme="minorHAnsi"/>
                 <w:szCs w:val="18"/>
@@ -5955,13 +5973,13 @@
         </w:trPr>
         <w:tc>
           <w:tcPr>
+            <w:cnfStyle w:val="001000000000" w:firstRow="0" w:lastRow="0" w:firstColumn="1" w:lastColumn="0" w:oddVBand="0" w:evenVBand="0" w:oddHBand="0" w:evenHBand="0" w:firstRowFirstColumn="0" w:firstRowLastColumn="0" w:lastRowFirstColumn="0" w:lastRowLastColumn="0"/>
             <w:tcW w:w="1668" w:type="dxa"/>
             <w:gridSpan w:val="2"/>
           </w:tcPr>
           <w:p>
             <w:pPr>
               <w:spacing w:line="276" w:lineRule="auto"/>
-              <w:cnfStyle w:val="001000100000" w:firstRow="0" w:lastRow="0" w:firstColumn="1" w:lastColumn="0" w:oddVBand="0" w:evenVBand="0" w:oddHBand="1" w:evenHBand="0" w:firstRowFirstColumn="0" w:firstRowLastColumn="0" w:lastRowFirstColumn="0" w:lastRowLastColumn="0"/>
               <w:rPr>
                 <w:rFonts w:asciiTheme="minorHAnsi" w:eastAsia="Arial" w:hAnsiTheme="minorHAnsi" w:cstheme="minorHAnsi"/>
               </w:rPr>
@@ -5987,6 +6005,7 @@
           <w:p>
             <w:pPr>
               <w:spacing w:line="276" w:lineRule="auto"/>
+              <w:cnfStyle w:val="000000100000" w:firstRow="0" w:lastRow="0" w:firstColumn="0" w:lastColumn="0" w:oddVBand="0" w:evenVBand="0" w:oddHBand="1" w:evenHBand="0" w:firstRowFirstColumn="0" w:firstRowLastColumn="0" w:lastRowFirstColumn="0" w:lastRowLastColumn="0"/>
               <w:rPr>
                 <w:rFonts w:asciiTheme="minorHAnsi" w:eastAsia="Arial" w:hAnsiTheme="minorHAnsi" w:cstheme="minorHAnsi"/>
               </w:rPr>
@@ -6003,6 +6022,7 @@
           <w:p>
             <w:pPr>
               <w:spacing w:line="276" w:lineRule="auto"/>
+              <w:cnfStyle w:val="000000100000" w:firstRow="0" w:lastRow="0" w:firstColumn="0" w:lastColumn="0" w:oddVBand="0" w:evenVBand="0" w:oddHBand="1" w:evenHBand="0" w:firstRowFirstColumn="0" w:firstRowLastColumn="0" w:lastRowFirstColumn="0" w:lastRowLastColumn="0"/>
               <w:rPr>
                 <w:rFonts w:asciiTheme="minorHAnsi" w:eastAsia="Arial" w:hAnsiTheme="minorHAnsi" w:cstheme="minorHAnsi"/>
               </w:rPr>
@@ -6059,13 +6079,13 @@
       <w:tr>
         <w:tc>
           <w:tcPr>
+            <w:cnfStyle w:val="001000000000" w:firstRow="0" w:lastRow="0" w:firstColumn="1" w:lastColumn="0" w:oddVBand="0" w:evenVBand="0" w:oddHBand="0" w:evenHBand="0" w:firstRowFirstColumn="0" w:firstRowLastColumn="0" w:lastRowFirstColumn="0" w:lastRowLastColumn="0"/>
             <w:tcW w:w="1668" w:type="dxa"/>
             <w:gridSpan w:val="2"/>
           </w:tcPr>
           <w:p>
             <w:pPr>
               <w:spacing w:line="276" w:lineRule="auto"/>
-              <w:cnfStyle w:val="001000000000" w:firstRow="0" w:lastRow="0" w:firstColumn="1" w:lastColumn="0" w:oddVBand="0" w:evenVBand="0" w:oddHBand="0" w:evenHBand="0" w:firstRowFirstColumn="0" w:firstRowLastColumn="0" w:lastRowFirstColumn="0" w:lastRowLastColumn="0"/>
               <w:rPr>
                 <w:rFonts w:asciiTheme="minorHAnsi" w:eastAsia="Arial" w:hAnsiTheme="minorHAnsi" w:cstheme="minorHAnsi"/>
               </w:rPr>
@@ -6091,6 +6111,7 @@
           <w:p>
             <w:pPr>
               <w:spacing w:line="276" w:lineRule="auto"/>
+              <w:cnfStyle w:val="000000000000" w:firstRow="0" w:lastRow="0" w:firstColumn="0" w:lastColumn="0" w:oddVBand="0" w:evenVBand="0" w:oddHBand="0" w:evenHBand="0" w:firstRowFirstColumn="0" w:firstRowLastColumn="0" w:lastRowFirstColumn="0" w:lastRowLastColumn="0"/>
               <w:rPr>
                 <w:rFonts w:asciiTheme="minorHAnsi" w:eastAsia="Arial" w:hAnsiTheme="minorHAnsi" w:cstheme="minorHAnsi"/>
               </w:rPr>
@@ -6107,6 +6128,7 @@
           <w:p>
             <w:pPr>
               <w:spacing w:line="276" w:lineRule="auto"/>
+              <w:cnfStyle w:val="000000000000" w:firstRow="0" w:lastRow="0" w:firstColumn="0" w:lastColumn="0" w:oddVBand="0" w:evenVBand="0" w:oddHBand="0" w:evenHBand="0" w:firstRowFirstColumn="0" w:firstRowLastColumn="0" w:lastRowFirstColumn="0" w:lastRowLastColumn="0"/>
               <w:rPr>
                 <w:rFonts w:asciiTheme="minorHAnsi" w:eastAsia="Arial" w:hAnsiTheme="minorHAnsi" w:cstheme="minorHAnsi"/>
               </w:rPr>
@@ -6166,12 +6188,12 @@
         </w:trPr>
         <w:tc>
           <w:tcPr>
+            <w:cnfStyle w:val="001000000000" w:firstRow="0" w:lastRow="0" w:firstColumn="1" w:lastColumn="0" w:oddVBand="0" w:evenVBand="0" w:oddHBand="0" w:evenHBand="0" w:firstRowFirstColumn="0" w:firstRowLastColumn="0" w:lastRowFirstColumn="0" w:lastRowLastColumn="0"/>
             <w:tcW w:w="1668" w:type="dxa"/>
             <w:gridSpan w:val="2"/>
           </w:tcPr>
           <w:p>
             <w:pPr>
-              <w:cnfStyle w:val="001000100000" w:firstRow="0" w:lastRow="0" w:firstColumn="1" w:lastColumn="0" w:oddVBand="0" w:evenVBand="0" w:oddHBand="1" w:evenHBand="0" w:firstRowFirstColumn="0" w:firstRowLastColumn="0" w:lastRowFirstColumn="0" w:lastRowLastColumn="0"/>
               <w:rPr>
                 <w:rFonts w:asciiTheme="minorHAnsi" w:eastAsia="Arial" w:hAnsiTheme="minorHAnsi" w:cstheme="minorHAnsi"/>
               </w:rPr>
@@ -6189,6 +6211,9 @@
             <w:tcW w:w="5769" w:type="dxa"/>
           </w:tcPr>
           <w:p>
+            <w:pPr>
+              <w:cnfStyle w:val="000000100000" w:firstRow="0" w:lastRow="0" w:firstColumn="0" w:lastColumn="0" w:oddVBand="0" w:evenVBand="0" w:oddHBand="1" w:evenHBand="0" w:firstRowFirstColumn="0" w:firstRowLastColumn="0" w:lastRowFirstColumn="0" w:lastRowLastColumn="0"/>
+            </w:pPr>
             <w:r>
               <w:t>Configurar listas de controle de acesso a dados</w:t>
             </w:r>
@@ -6200,6 +6225,7 @@
           </w:tcPr>
           <w:p>
             <w:pPr>
+              <w:cnfStyle w:val="000000100000" w:firstRow="0" w:lastRow="0" w:firstColumn="0" w:lastColumn="0" w:oddVBand="0" w:evenVBand="0" w:oddHBand="1" w:evenHBand="0" w:firstRowFirstColumn="0" w:firstRowLastColumn="0" w:lastRowFirstColumn="0" w:lastRowLastColumn="0"/>
               <w:rPr>
                 <w:rFonts w:asciiTheme="minorHAnsi" w:eastAsia="Arial" w:hAnsiTheme="minorHAnsi" w:cstheme="minorHAnsi"/>
                 <w:b/>
@@ -6257,13 +6283,13 @@
       <w:tr>
         <w:tc>
           <w:tcPr>
+            <w:cnfStyle w:val="001000000000" w:firstRow="0" w:lastRow="0" w:firstColumn="1" w:lastColumn="0" w:oddVBand="0" w:evenVBand="0" w:oddHBand="0" w:evenHBand="0" w:firstRowFirstColumn="0" w:firstRowLastColumn="0" w:lastRowFirstColumn="0" w:lastRowLastColumn="0"/>
             <w:tcW w:w="1668" w:type="dxa"/>
             <w:gridSpan w:val="2"/>
           </w:tcPr>
           <w:p>
             <w:pPr>
               <w:spacing w:line="276" w:lineRule="auto"/>
-              <w:cnfStyle w:val="001000000000" w:firstRow="0" w:lastRow="0" w:firstColumn="1" w:lastColumn="0" w:oddVBand="0" w:evenVBand="0" w:oddHBand="0" w:evenHBand="0" w:firstRowFirstColumn="0" w:firstRowLastColumn="0" w:lastRowFirstColumn="0" w:lastRowLastColumn="0"/>
               <w:rPr>
                 <w:rFonts w:asciiTheme="minorHAnsi" w:eastAsia="Arial" w:hAnsiTheme="minorHAnsi" w:cstheme="minorHAnsi"/>
               </w:rPr>
@@ -6289,6 +6315,7 @@
           <w:p>
             <w:pPr>
               <w:spacing w:line="276" w:lineRule="auto"/>
+              <w:cnfStyle w:val="000000000000" w:firstRow="0" w:lastRow="0" w:firstColumn="0" w:lastColumn="0" w:oddVBand="0" w:evenVBand="0" w:oddHBand="0" w:evenHBand="0" w:firstRowFirstColumn="0" w:firstRowLastColumn="0" w:lastRowFirstColumn="0" w:lastRowLastColumn="0"/>
               <w:rPr>
                 <w:rFonts w:asciiTheme="minorHAnsi" w:eastAsia="Arial" w:hAnsiTheme="minorHAnsi" w:cstheme="minorHAnsi"/>
               </w:rPr>
@@ -6305,6 +6332,7 @@
           <w:p>
             <w:pPr>
               <w:spacing w:line="276" w:lineRule="auto"/>
+              <w:cnfStyle w:val="000000000000" w:firstRow="0" w:lastRow="0" w:firstColumn="0" w:lastColumn="0" w:oddVBand="0" w:evenVBand="0" w:oddHBand="0" w:evenHBand="0" w:firstRowFirstColumn="0" w:firstRowLastColumn="0" w:lastRowFirstColumn="0" w:lastRowLastColumn="0"/>
               <w:rPr>
                 <w:rFonts w:asciiTheme="minorHAnsi" w:eastAsia="Arial" w:hAnsiTheme="minorHAnsi" w:cstheme="minorHAnsi"/>
               </w:rPr>
@@ -6364,13 +6392,13 @@
         </w:trPr>
         <w:tc>
           <w:tcPr>
+            <w:cnfStyle w:val="001000000000" w:firstRow="0" w:lastRow="0" w:firstColumn="1" w:lastColumn="0" w:oddVBand="0" w:evenVBand="0" w:oddHBand="0" w:evenHBand="0" w:firstRowFirstColumn="0" w:firstRowLastColumn="0" w:lastRowFirstColumn="0" w:lastRowLastColumn="0"/>
             <w:tcW w:w="1668" w:type="dxa"/>
             <w:gridSpan w:val="2"/>
           </w:tcPr>
           <w:p>
             <w:pPr>
               <w:spacing w:line="276" w:lineRule="auto"/>
-              <w:cnfStyle w:val="001000100000" w:firstRow="0" w:lastRow="0" w:firstColumn="1" w:lastColumn="0" w:oddVBand="0" w:evenVBand="0" w:oddHBand="1" w:evenHBand="0" w:firstRowFirstColumn="0" w:firstRowLastColumn="0" w:lastRowFirstColumn="0" w:lastRowLastColumn="0"/>
               <w:rPr>
                 <w:rFonts w:asciiTheme="minorHAnsi" w:eastAsia="Arial" w:hAnsiTheme="minorHAnsi" w:cstheme="minorHAnsi"/>
               </w:rPr>
@@ -6396,6 +6424,7 @@
           <w:p>
             <w:pPr>
               <w:spacing w:line="276" w:lineRule="auto"/>
+              <w:cnfStyle w:val="000000100000" w:firstRow="0" w:lastRow="0" w:firstColumn="0" w:lastColumn="0" w:oddVBand="0" w:evenVBand="0" w:oddHBand="1" w:evenHBand="0" w:firstRowFirstColumn="0" w:firstRowLastColumn="0" w:lastRowFirstColumn="0" w:lastRowLastColumn="0"/>
               <w:rPr>
                 <w:rFonts w:asciiTheme="minorHAnsi" w:eastAsia="Arial" w:hAnsiTheme="minorHAnsi" w:cstheme="minorHAnsi"/>
               </w:rPr>
@@ -6412,6 +6441,7 @@
           <w:p>
             <w:pPr>
               <w:spacing w:line="276" w:lineRule="auto"/>
+              <w:cnfStyle w:val="000000100000" w:firstRow="0" w:lastRow="0" w:firstColumn="0" w:lastColumn="0" w:oddVBand="0" w:evenVBand="0" w:oddHBand="1" w:evenHBand="0" w:firstRowFirstColumn="0" w:firstRowLastColumn="0" w:lastRowFirstColumn="0" w:lastRowLastColumn="0"/>
               <w:rPr>
                 <w:rFonts w:asciiTheme="minorHAnsi" w:eastAsia="Arial" w:hAnsiTheme="minorHAnsi" w:cstheme="minorHAnsi"/>
               </w:rPr>
@@ -6468,12 +6498,12 @@
       <w:tr>
         <w:tc>
           <w:tcPr>
+            <w:cnfStyle w:val="001000000000" w:firstRow="0" w:lastRow="0" w:firstColumn="1" w:lastColumn="0" w:oddVBand="0" w:evenVBand="0" w:oddHBand="0" w:evenHBand="0" w:firstRowFirstColumn="0" w:firstRowLastColumn="0" w:lastRowFirstColumn="0" w:lastRowLastColumn="0"/>
             <w:tcW w:w="1668" w:type="dxa"/>
             <w:gridSpan w:val="2"/>
           </w:tcPr>
           <w:p>
             <w:pPr>
-              <w:cnfStyle w:val="001000000000" w:firstRow="0" w:lastRow="0" w:firstColumn="1" w:lastColumn="0" w:oddVBand="0" w:evenVBand="0" w:oddHBand="0" w:evenHBand="0" w:firstRowFirstColumn="0" w:firstRowLastColumn="0" w:lastRowFirstColumn="0" w:lastRowLastColumn="0"/>
               <w:rPr>
                 <w:rFonts w:asciiTheme="minorHAnsi" w:eastAsia="Arial" w:hAnsiTheme="minorHAnsi" w:cstheme="minorHAnsi"/>
               </w:rPr>
@@ -6491,6 +6521,9 @@
             <w:tcW w:w="5769" w:type="dxa"/>
           </w:tcPr>
           <w:p>
+            <w:pPr>
+              <w:cnfStyle w:val="000000000000" w:firstRow="0" w:lastRow="0" w:firstColumn="0" w:lastColumn="0" w:oddVBand="0" w:evenVBand="0" w:oddHBand="0" w:evenHBand="0" w:firstRowFirstColumn="0" w:firstRowLastColumn="0" w:lastRowFirstColumn="0" w:lastRowLastColumn="0"/>
+            </w:pPr>
             <w:r>
               <w:t>Criptografar dados em dispositivos de usuário final</w:t>
             </w:r>
@@ -6502,6 +6535,7 @@
           </w:tcPr>
           <w:p>
             <w:pPr>
+              <w:cnfStyle w:val="000000000000" w:firstRow="0" w:lastRow="0" w:firstColumn="0" w:lastColumn="0" w:oddVBand="0" w:evenVBand="0" w:oddHBand="0" w:evenHBand="0" w:firstRowFirstColumn="0" w:firstRowLastColumn="0" w:lastRowFirstColumn="0" w:lastRowLastColumn="0"/>
               <w:rPr>
                 <w:rFonts w:asciiTheme="minorHAnsi" w:eastAsia="Arial" w:hAnsiTheme="minorHAnsi" w:cstheme="minorHAnsi"/>
                 <w:b/>
@@ -7008,11 +7042,11 @@
         </w:trPr>
         <w:tc>
           <w:tcPr>
+            <w:cnfStyle w:val="001000000000" w:firstRow="0" w:lastRow="0" w:firstColumn="1" w:lastColumn="0" w:oddVBand="0" w:evenVBand="0" w:oddHBand="0" w:evenHBand="0" w:firstRowFirstColumn="0" w:firstRowLastColumn="0" w:lastRowFirstColumn="0" w:lastRowLastColumn="0"/>
             <w:tcW w:w="1129" w:type="dxa"/>
           </w:tcPr>
           <w:p>
             <w:pPr>
-              <w:cnfStyle w:val="101000000000" w:firstRow="1" w:lastRow="0" w:firstColumn="1" w:lastColumn="0" w:oddVBand="0" w:evenVBand="0" w:oddHBand="0" w:evenHBand="0" w:firstRowFirstColumn="0" w:firstRowLastColumn="0" w:lastRowFirstColumn="0" w:lastRowLastColumn="0"/>
               <w:rPr>
                 <w:rFonts w:asciiTheme="minorHAnsi" w:eastAsia="Arial" w:hAnsiTheme="minorHAnsi" w:cstheme="minorHAnsi"/>
                 <w:szCs w:val="18"/>
@@ -7033,6 +7067,7 @@
           </w:tcPr>
           <w:p>
             <w:pPr>
+              <w:cnfStyle w:val="100000000000" w:firstRow="1" w:lastRow="0" w:firstColumn="0" w:lastColumn="0" w:oddVBand="0" w:evenVBand="0" w:oddHBand="0" w:evenHBand="0" w:firstRowFirstColumn="0" w:firstRowLastColumn="0" w:lastRowFirstColumn="0" w:lastRowLastColumn="0"/>
               <w:rPr>
                 <w:rFonts w:asciiTheme="minorHAnsi" w:hAnsiTheme="minorHAnsi" w:cstheme="minorHAnsi"/>
                 <w:szCs w:val="18"/>
@@ -7053,6 +7088,7 @@
           </w:tcPr>
           <w:p>
             <w:pPr>
+              <w:cnfStyle w:val="100000000000" w:firstRow="1" w:lastRow="0" w:firstColumn="0" w:lastColumn="0" w:oddVBand="0" w:evenVBand="0" w:oddHBand="0" w:evenHBand="0" w:firstRowFirstColumn="0" w:firstRowLastColumn="0" w:lastRowFirstColumn="0" w:lastRowLastColumn="0"/>
               <w:rPr>
                 <w:rFonts w:asciiTheme="minorHAnsi" w:eastAsia="Arial" w:hAnsiTheme="minorHAnsi" w:cstheme="minorHAnsi"/>
                 <w:szCs w:val="18"/>
@@ -7074,12 +7110,12 @@
         </w:trPr>
         <w:tc>
           <w:tcPr>
+            <w:cnfStyle w:val="001000000000" w:firstRow="0" w:lastRow="0" w:firstColumn="1" w:lastColumn="0" w:oddVBand="0" w:evenVBand="0" w:oddHBand="0" w:evenHBand="0" w:firstRowFirstColumn="0" w:firstRowLastColumn="0" w:lastRowFirstColumn="0" w:lastRowLastColumn="0"/>
             <w:tcW w:w="1129" w:type="dxa"/>
           </w:tcPr>
           <w:p>
             <w:pPr>
               <w:spacing w:line="276" w:lineRule="auto"/>
-              <w:cnfStyle w:val="001000100000" w:firstRow="0" w:lastRow="0" w:firstColumn="1" w:lastColumn="0" w:oddVBand="0" w:evenVBand="0" w:oddHBand="1" w:evenHBand="0" w:firstRowFirstColumn="0" w:firstRowLastColumn="0" w:lastRowFirstColumn="0" w:lastRowLastColumn="0"/>
               <w:rPr>
                 <w:rFonts w:asciiTheme="minorHAnsi" w:eastAsia="Arial" w:hAnsiTheme="minorHAnsi" w:cstheme="minorHAnsi"/>
               </w:rPr>
@@ -7105,6 +7141,7 @@
           <w:p>
             <w:pPr>
               <w:spacing w:line="276" w:lineRule="auto"/>
+              <w:cnfStyle w:val="000000100000" w:firstRow="0" w:lastRow="0" w:firstColumn="0" w:lastColumn="0" w:oddVBand="0" w:evenVBand="0" w:oddHBand="1" w:evenHBand="0" w:firstRowFirstColumn="0" w:firstRowLastColumn="0" w:lastRowFirstColumn="0" w:lastRowLastColumn="0"/>
               <w:rPr>
                 <w:rFonts w:asciiTheme="minorHAnsi" w:eastAsia="Arial" w:hAnsiTheme="minorHAnsi" w:cstheme="minorHAnsi"/>
               </w:rPr>
@@ -7121,6 +7158,7 @@
           <w:p>
             <w:pPr>
               <w:spacing w:line="276" w:lineRule="auto"/>
+              <w:cnfStyle w:val="000000100000" w:firstRow="0" w:lastRow="0" w:firstColumn="0" w:lastColumn="0" w:oddVBand="0" w:evenVBand="0" w:oddHBand="1" w:evenHBand="0" w:firstRowFirstColumn="0" w:firstRowLastColumn="0" w:lastRowFirstColumn="0" w:lastRowLastColumn="0"/>
               <w:rPr>
                 <w:rFonts w:asciiTheme="minorHAnsi" w:eastAsia="Arial" w:hAnsiTheme="minorHAnsi" w:cstheme="minorHAnsi"/>
               </w:rPr>
@@ -7177,12 +7215,12 @@
       <w:tr>
         <w:tc>
           <w:tcPr>
+            <w:cnfStyle w:val="001000000000" w:firstRow="0" w:lastRow="0" w:firstColumn="1" w:lastColumn="0" w:oddVBand="0" w:evenVBand="0" w:oddHBand="0" w:evenHBand="0" w:firstRowFirstColumn="0" w:firstRowLastColumn="0" w:lastRowFirstColumn="0" w:lastRowLastColumn="0"/>
             <w:tcW w:w="1129" w:type="dxa"/>
           </w:tcPr>
           <w:p>
             <w:pPr>
               <w:spacing w:line="276" w:lineRule="auto"/>
-              <w:cnfStyle w:val="001000000000" w:firstRow="0" w:lastRow="0" w:firstColumn="1" w:lastColumn="0" w:oddVBand="0" w:evenVBand="0" w:oddHBand="0" w:evenHBand="0" w:firstRowFirstColumn="0" w:firstRowLastColumn="0" w:lastRowFirstColumn="0" w:lastRowLastColumn="0"/>
               <w:rPr>
                 <w:rFonts w:asciiTheme="minorHAnsi" w:eastAsia="Arial" w:hAnsiTheme="minorHAnsi" w:cstheme="minorHAnsi"/>
               </w:rPr>
@@ -7208,6 +7246,7 @@
           <w:p>
             <w:pPr>
               <w:spacing w:line="276" w:lineRule="auto"/>
+              <w:cnfStyle w:val="000000000000" w:firstRow="0" w:lastRow="0" w:firstColumn="0" w:lastColumn="0" w:oddVBand="0" w:evenVBand="0" w:oddHBand="0" w:evenHBand="0" w:firstRowFirstColumn="0" w:firstRowLastColumn="0" w:lastRowFirstColumn="0" w:lastRowLastColumn="0"/>
               <w:rPr>
                 <w:rFonts w:asciiTheme="minorHAnsi" w:eastAsia="Arial" w:hAnsiTheme="minorHAnsi" w:cstheme="minorHAnsi"/>
               </w:rPr>
@@ -7224,6 +7263,7 @@
           <w:p>
             <w:pPr>
               <w:spacing w:line="276" w:lineRule="auto"/>
+              <w:cnfStyle w:val="000000000000" w:firstRow="0" w:lastRow="0" w:firstColumn="0" w:lastColumn="0" w:oddVBand="0" w:evenVBand="0" w:oddHBand="0" w:evenHBand="0" w:firstRowFirstColumn="0" w:firstRowLastColumn="0" w:lastRowFirstColumn="0" w:lastRowLastColumn="0"/>
               <w:rPr>
                 <w:rFonts w:asciiTheme="minorHAnsi" w:eastAsia="Arial" w:hAnsiTheme="minorHAnsi" w:cstheme="minorHAnsi"/>
               </w:rPr>
@@ -7283,11 +7323,11 @@
         </w:trPr>
         <w:tc>
           <w:tcPr>
+            <w:cnfStyle w:val="001000000000" w:firstRow="0" w:lastRow="0" w:firstColumn="1" w:lastColumn="0" w:oddVBand="0" w:evenVBand="0" w:oddHBand="0" w:evenHBand="0" w:firstRowFirstColumn="0" w:firstRowLastColumn="0" w:lastRowFirstColumn="0" w:lastRowLastColumn="0"/>
             <w:tcW w:w="1129" w:type="dxa"/>
           </w:tcPr>
           <w:p>
             <w:pPr>
-              <w:cnfStyle w:val="001000100000" w:firstRow="0" w:lastRow="0" w:firstColumn="1" w:lastColumn="0" w:oddVBand="0" w:evenVBand="0" w:oddHBand="1" w:evenHBand="0" w:firstRowFirstColumn="0" w:firstRowLastColumn="0" w:lastRowFirstColumn="0" w:lastRowLastColumn="0"/>
               <w:rPr>
                 <w:rFonts w:asciiTheme="minorHAnsi" w:eastAsia="Arial" w:hAnsiTheme="minorHAnsi" w:cstheme="minorHAnsi"/>
               </w:rPr>
@@ -7305,6 +7345,9 @@
             <w:tcW w:w="6308" w:type="dxa"/>
           </w:tcPr>
           <w:p>
+            <w:pPr>
+              <w:cnfStyle w:val="000000100000" w:firstRow="0" w:lastRow="0" w:firstColumn="0" w:lastColumn="0" w:oddVBand="0" w:evenVBand="0" w:oddHBand="1" w:evenHBand="0" w:firstRowFirstColumn="0" w:firstRowLastColumn="0" w:lastRowFirstColumn="0" w:lastRowLastColumn="0"/>
+            </w:pPr>
             <w:r>
               <w:t>Configurar o bloqueio automático de sessão nos ativos corporativos</w:t>
             </w:r>
@@ -7316,6 +7359,7 @@
           </w:tcPr>
           <w:p>
             <w:pPr>
+              <w:cnfStyle w:val="000000100000" w:firstRow="0" w:lastRow="0" w:firstColumn="0" w:lastColumn="0" w:oddVBand="0" w:evenVBand="0" w:oddHBand="1" w:evenHBand="0" w:firstRowFirstColumn="0" w:firstRowLastColumn="0" w:lastRowFirstColumn="0" w:lastRowLastColumn="0"/>
               <w:rPr>
                 <w:rFonts w:asciiTheme="minorHAnsi" w:eastAsia="Arial" w:hAnsiTheme="minorHAnsi" w:cstheme="minorHAnsi"/>
                 <w:b/>
@@ -7373,12 +7417,12 @@
       <w:tr>
         <w:tc>
           <w:tcPr>
+            <w:cnfStyle w:val="001000000000" w:firstRow="0" w:lastRow="0" w:firstColumn="1" w:lastColumn="0" w:oddVBand="0" w:evenVBand="0" w:oddHBand="0" w:evenHBand="0" w:firstRowFirstColumn="0" w:firstRowLastColumn="0" w:lastRowFirstColumn="0" w:lastRowLastColumn="0"/>
             <w:tcW w:w="1129" w:type="dxa"/>
           </w:tcPr>
           <w:p>
             <w:pPr>
               <w:spacing w:line="276" w:lineRule="auto"/>
-              <w:cnfStyle w:val="001000000000" w:firstRow="0" w:lastRow="0" w:firstColumn="1" w:lastColumn="0" w:oddVBand="0" w:evenVBand="0" w:oddHBand="0" w:evenHBand="0" w:firstRowFirstColumn="0" w:firstRowLastColumn="0" w:lastRowFirstColumn="0" w:lastRowLastColumn="0"/>
               <w:rPr>
                 <w:rFonts w:asciiTheme="minorHAnsi" w:eastAsia="Arial" w:hAnsiTheme="minorHAnsi" w:cstheme="minorHAnsi"/>
               </w:rPr>
@@ -7404,6 +7448,7 @@
           <w:p>
             <w:pPr>
               <w:spacing w:line="276" w:lineRule="auto"/>
+              <w:cnfStyle w:val="000000000000" w:firstRow="0" w:lastRow="0" w:firstColumn="0" w:lastColumn="0" w:oddVBand="0" w:evenVBand="0" w:oddHBand="0" w:evenHBand="0" w:firstRowFirstColumn="0" w:firstRowLastColumn="0" w:lastRowFirstColumn="0" w:lastRowLastColumn="0"/>
               <w:rPr>
                 <w:rFonts w:asciiTheme="minorHAnsi" w:eastAsia="Arial" w:hAnsiTheme="minorHAnsi" w:cstheme="minorHAnsi"/>
               </w:rPr>
@@ -7420,6 +7465,7 @@
           <w:p>
             <w:pPr>
               <w:spacing w:line="276" w:lineRule="auto"/>
+              <w:cnfStyle w:val="000000000000" w:firstRow="0" w:lastRow="0" w:firstColumn="0" w:lastColumn="0" w:oddVBand="0" w:evenVBand="0" w:oddHBand="0" w:evenHBand="0" w:firstRowFirstColumn="0" w:firstRowLastColumn="0" w:lastRowFirstColumn="0" w:lastRowLastColumn="0"/>
               <w:rPr>
                 <w:rFonts w:asciiTheme="minorHAnsi" w:eastAsia="Arial" w:hAnsiTheme="minorHAnsi" w:cstheme="minorHAnsi"/>
               </w:rPr>
@@ -7479,12 +7525,12 @@
         </w:trPr>
         <w:tc>
           <w:tcPr>
+            <w:cnfStyle w:val="001000000000" w:firstRow="0" w:lastRow="0" w:firstColumn="1" w:lastColumn="0" w:oddVBand="0" w:evenVBand="0" w:oddHBand="0" w:evenHBand="0" w:firstRowFirstColumn="0" w:firstRowLastColumn="0" w:lastRowFirstColumn="0" w:lastRowLastColumn="0"/>
             <w:tcW w:w="1129" w:type="dxa"/>
           </w:tcPr>
           <w:p>
             <w:pPr>
               <w:spacing w:line="276" w:lineRule="auto"/>
-              <w:cnfStyle w:val="001000100000" w:firstRow="0" w:lastRow="0" w:firstColumn="1" w:lastColumn="0" w:oddVBand="0" w:evenVBand="0" w:oddHBand="1" w:evenHBand="0" w:firstRowFirstColumn="0" w:firstRowLastColumn="0" w:lastRowFirstColumn="0" w:lastRowLastColumn="0"/>
               <w:rPr>
                 <w:rFonts w:asciiTheme="minorHAnsi" w:eastAsia="Arial" w:hAnsiTheme="minorHAnsi" w:cstheme="minorHAnsi"/>
               </w:rPr>
@@ -7510,6 +7556,7 @@
           <w:p>
             <w:pPr>
               <w:spacing w:line="276" w:lineRule="auto"/>
+              <w:cnfStyle w:val="000000100000" w:firstRow="0" w:lastRow="0" w:firstColumn="0" w:lastColumn="0" w:oddVBand="0" w:evenVBand="0" w:oddHBand="1" w:evenHBand="0" w:firstRowFirstColumn="0" w:firstRowLastColumn="0" w:lastRowFirstColumn="0" w:lastRowLastColumn="0"/>
               <w:rPr>
                 <w:rFonts w:asciiTheme="minorHAnsi" w:eastAsia="Arial" w:hAnsiTheme="minorHAnsi" w:cstheme="minorHAnsi"/>
               </w:rPr>
@@ -7526,6 +7573,7 @@
           <w:p>
             <w:pPr>
               <w:spacing w:line="276" w:lineRule="auto"/>
+              <w:cnfStyle w:val="000000100000" w:firstRow="0" w:lastRow="0" w:firstColumn="0" w:lastColumn="0" w:oddVBand="0" w:evenVBand="0" w:oddHBand="1" w:evenHBand="0" w:firstRowFirstColumn="0" w:firstRowLastColumn="0" w:lastRowFirstColumn="0" w:lastRowLastColumn="0"/>
               <w:rPr>
                 <w:rFonts w:asciiTheme="minorHAnsi" w:eastAsia="Arial" w:hAnsiTheme="minorHAnsi" w:cstheme="minorHAnsi"/>
               </w:rPr>
@@ -7582,11 +7630,11 @@
       <w:tr>
         <w:tc>
           <w:tcPr>
+            <w:cnfStyle w:val="001000000000" w:firstRow="0" w:lastRow="0" w:firstColumn="1" w:lastColumn="0" w:oddVBand="0" w:evenVBand="0" w:oddHBand="0" w:evenHBand="0" w:firstRowFirstColumn="0" w:firstRowLastColumn="0" w:lastRowFirstColumn="0" w:lastRowLastColumn="0"/>
             <w:tcW w:w="1129" w:type="dxa"/>
           </w:tcPr>
           <w:p>
             <w:pPr>
-              <w:cnfStyle w:val="001000000000" w:firstRow="0" w:lastRow="0" w:firstColumn="1" w:lastColumn="0" w:oddVBand="0" w:evenVBand="0" w:oddHBand="0" w:evenHBand="0" w:firstRowFirstColumn="0" w:firstRowLastColumn="0" w:lastRowFirstColumn="0" w:lastRowLastColumn="0"/>
               <w:rPr>
                 <w:rFonts w:asciiTheme="minorHAnsi" w:eastAsia="Arial" w:hAnsiTheme="minorHAnsi" w:cstheme="minorHAnsi"/>
               </w:rPr>
@@ -7604,6 +7652,9 @@
             <w:tcW w:w="6308" w:type="dxa"/>
           </w:tcPr>
           <w:p>
+            <w:pPr>
+              <w:cnfStyle w:val="000000000000" w:firstRow="0" w:lastRow="0" w:firstColumn="0" w:lastColumn="0" w:oddVBand="0" w:evenVBand="0" w:oddHBand="0" w:evenHBand="0" w:firstRowFirstColumn="0" w:firstRowLastColumn="0" w:lastRowFirstColumn="0" w:lastRowLastColumn="0"/>
+            </w:pPr>
             <w:r>
               <w:t>Gerenciar com segurança os ativos e softwares corporativos</w:t>
             </w:r>
@@ -7615,6 +7666,7 @@
           </w:tcPr>
           <w:p>
             <w:pPr>
+              <w:cnfStyle w:val="000000000000" w:firstRow="0" w:lastRow="0" w:firstColumn="0" w:lastColumn="0" w:oddVBand="0" w:evenVBand="0" w:oddHBand="0" w:evenHBand="0" w:firstRowFirstColumn="0" w:firstRowLastColumn="0" w:lastRowFirstColumn="0" w:lastRowLastColumn="0"/>
               <w:rPr>
                 <w:rFonts w:asciiTheme="minorHAnsi" w:eastAsia="Arial" w:hAnsiTheme="minorHAnsi" w:cstheme="minorHAnsi"/>
                 <w:b/>
@@ -7675,11 +7727,11 @@
         </w:trPr>
         <w:tc>
           <w:tcPr>
+            <w:cnfStyle w:val="001000000000" w:firstRow="0" w:lastRow="0" w:firstColumn="1" w:lastColumn="0" w:oddVBand="0" w:evenVBand="0" w:oddHBand="0" w:evenHBand="0" w:firstRowFirstColumn="0" w:firstRowLastColumn="0" w:lastRowFirstColumn="0" w:lastRowLastColumn="0"/>
             <w:tcW w:w="1129" w:type="dxa"/>
           </w:tcPr>
           <w:p>
             <w:pPr>
-              <w:cnfStyle w:val="001000100000" w:firstRow="0" w:lastRow="0" w:firstColumn="1" w:lastColumn="0" w:oddVBand="0" w:evenVBand="0" w:oddHBand="1" w:evenHBand="0" w:firstRowFirstColumn="0" w:firstRowLastColumn="0" w:lastRowFirstColumn="0" w:lastRowLastColumn="0"/>
               <w:rPr>
                 <w:rFonts w:asciiTheme="minorHAnsi" w:eastAsia="Arial" w:hAnsiTheme="minorHAnsi" w:cstheme="minorHAnsi"/>
               </w:rPr>
@@ -7698,6 +7750,9 @@
             <w:tcW w:w="6308" w:type="dxa"/>
           </w:tcPr>
           <w:p>
+            <w:pPr>
+              <w:cnfStyle w:val="000000100000" w:firstRow="0" w:lastRow="0" w:firstColumn="0" w:lastColumn="0" w:oddVBand="0" w:evenVBand="0" w:oddHBand="1" w:evenHBand="0" w:firstRowFirstColumn="0" w:firstRowLastColumn="0" w:lastRowFirstColumn="0" w:lastRowLastColumn="0"/>
+            </w:pPr>
             <w:r>
               <w:t>Gerenciar contas padrão nos ativos e softwares corporativos</w:t>
             </w:r>
@@ -7709,6 +7764,7 @@
           </w:tcPr>
           <w:p>
             <w:pPr>
+              <w:cnfStyle w:val="000000100000" w:firstRow="0" w:lastRow="0" w:firstColumn="0" w:lastColumn="0" w:oddVBand="0" w:evenVBand="0" w:oddHBand="1" w:evenHBand="0" w:firstRowFirstColumn="0" w:firstRowLastColumn="0" w:lastRowFirstColumn="0" w:lastRowLastColumn="0"/>
               <w:rPr>
                 <w:rFonts w:asciiTheme="minorHAnsi" w:eastAsia="Arial" w:hAnsiTheme="minorHAnsi" w:cstheme="minorHAnsi"/>
                 <w:b/>
@@ -8198,11 +8254,11 @@
         </w:trPr>
         <w:tc>
           <w:tcPr>
+            <w:cnfStyle w:val="001000000000" w:firstRow="0" w:lastRow="0" w:firstColumn="1" w:lastColumn="0" w:oddVBand="0" w:evenVBand="0" w:oddHBand="0" w:evenHBand="0" w:firstRowFirstColumn="0" w:firstRowLastColumn="0" w:lastRowFirstColumn="0" w:lastRowLastColumn="0"/>
             <w:tcW w:w="1129" w:type="dxa"/>
           </w:tcPr>
           <w:p>
             <w:pPr>
-              <w:cnfStyle w:val="101000000000" w:firstRow="1" w:lastRow="0" w:firstColumn="1" w:lastColumn="0" w:oddVBand="0" w:evenVBand="0" w:oddHBand="0" w:evenHBand="0" w:firstRowFirstColumn="0" w:firstRowLastColumn="0" w:lastRowFirstColumn="0" w:lastRowLastColumn="0"/>
               <w:rPr>
                 <w:rFonts w:asciiTheme="minorHAnsi" w:eastAsia="Arial" w:hAnsiTheme="minorHAnsi" w:cstheme="minorHAnsi"/>
                 <w:szCs w:val="18"/>
@@ -8223,6 +8279,7 @@
           </w:tcPr>
           <w:p>
             <w:pPr>
+              <w:cnfStyle w:val="100000000000" w:firstRow="1" w:lastRow="0" w:firstColumn="0" w:lastColumn="0" w:oddVBand="0" w:evenVBand="0" w:oddHBand="0" w:evenHBand="0" w:firstRowFirstColumn="0" w:firstRowLastColumn="0" w:lastRowFirstColumn="0" w:lastRowLastColumn="0"/>
               <w:rPr>
                 <w:rFonts w:asciiTheme="minorHAnsi" w:hAnsiTheme="minorHAnsi" w:cstheme="minorHAnsi"/>
                 <w:szCs w:val="18"/>
@@ -8243,6 +8300,7 @@
           </w:tcPr>
           <w:p>
             <w:pPr>
+              <w:cnfStyle w:val="100000000000" w:firstRow="1" w:lastRow="0" w:firstColumn="0" w:lastColumn="0" w:oddVBand="0" w:evenVBand="0" w:oddHBand="0" w:evenHBand="0" w:firstRowFirstColumn="0" w:firstRowLastColumn="0" w:lastRowFirstColumn="0" w:lastRowLastColumn="0"/>
               <w:rPr>
                 <w:rFonts w:asciiTheme="minorHAnsi" w:eastAsia="Arial" w:hAnsiTheme="minorHAnsi" w:cstheme="minorHAnsi"/>
                 <w:szCs w:val="18"/>
@@ -8264,12 +8322,12 @@
         </w:trPr>
         <w:tc>
           <w:tcPr>
+            <w:cnfStyle w:val="001000000000" w:firstRow="0" w:lastRow="0" w:firstColumn="1" w:lastColumn="0" w:oddVBand="0" w:evenVBand="0" w:oddHBand="0" w:evenHBand="0" w:firstRowFirstColumn="0" w:firstRowLastColumn="0" w:lastRowFirstColumn="0" w:lastRowLastColumn="0"/>
             <w:tcW w:w="1129" w:type="dxa"/>
           </w:tcPr>
           <w:p>
             <w:pPr>
               <w:spacing w:line="276" w:lineRule="auto"/>
-              <w:cnfStyle w:val="001000100000" w:firstRow="0" w:lastRow="0" w:firstColumn="1" w:lastColumn="0" w:oddVBand="0" w:evenVBand="0" w:oddHBand="1" w:evenHBand="0" w:firstRowFirstColumn="0" w:firstRowLastColumn="0" w:lastRowFirstColumn="0" w:lastRowLastColumn="0"/>
               <w:rPr>
                 <w:rFonts w:asciiTheme="minorHAnsi" w:eastAsia="Arial" w:hAnsiTheme="minorHAnsi" w:cstheme="minorHAnsi"/>
               </w:rPr>
@@ -8295,6 +8353,7 @@
           <w:p>
             <w:pPr>
               <w:spacing w:line="276" w:lineRule="auto"/>
+              <w:cnfStyle w:val="000000100000" w:firstRow="0" w:lastRow="0" w:firstColumn="0" w:lastColumn="0" w:oddVBand="0" w:evenVBand="0" w:oddHBand="1" w:evenHBand="0" w:firstRowFirstColumn="0" w:firstRowLastColumn="0" w:lastRowFirstColumn="0" w:lastRowLastColumn="0"/>
               <w:rPr>
                 <w:rFonts w:asciiTheme="minorHAnsi" w:eastAsia="Arial" w:hAnsiTheme="minorHAnsi" w:cstheme="minorHAnsi"/>
               </w:rPr>
@@ -8311,6 +8370,7 @@
           <w:p>
             <w:pPr>
               <w:spacing w:line="276" w:lineRule="auto"/>
+              <w:cnfStyle w:val="000000100000" w:firstRow="0" w:lastRow="0" w:firstColumn="0" w:lastColumn="0" w:oddVBand="0" w:evenVBand="0" w:oddHBand="1" w:evenHBand="0" w:firstRowFirstColumn="0" w:firstRowLastColumn="0" w:lastRowFirstColumn="0" w:lastRowLastColumn="0"/>
               <w:rPr>
                 <w:rFonts w:asciiTheme="minorHAnsi" w:eastAsia="Arial" w:hAnsiTheme="minorHAnsi" w:cstheme="minorHAnsi"/>
               </w:rPr>
@@ -8367,12 +8427,12 @@
       <w:tr>
         <w:tc>
           <w:tcPr>
+            <w:cnfStyle w:val="001000000000" w:firstRow="0" w:lastRow="0" w:firstColumn="1" w:lastColumn="0" w:oddVBand="0" w:evenVBand="0" w:oddHBand="0" w:evenHBand="0" w:firstRowFirstColumn="0" w:firstRowLastColumn="0" w:lastRowFirstColumn="0" w:lastRowLastColumn="0"/>
             <w:tcW w:w="1129" w:type="dxa"/>
           </w:tcPr>
           <w:p>
             <w:pPr>
               <w:spacing w:line="276" w:lineRule="auto"/>
-              <w:cnfStyle w:val="001000000000" w:firstRow="0" w:lastRow="0" w:firstColumn="1" w:lastColumn="0" w:oddVBand="0" w:evenVBand="0" w:oddHBand="0" w:evenHBand="0" w:firstRowFirstColumn="0" w:firstRowLastColumn="0" w:lastRowFirstColumn="0" w:lastRowLastColumn="0"/>
               <w:rPr>
                 <w:rFonts w:asciiTheme="minorHAnsi" w:eastAsia="Arial" w:hAnsiTheme="minorHAnsi" w:cstheme="minorHAnsi"/>
               </w:rPr>
@@ -8398,6 +8458,7 @@
           <w:p>
             <w:pPr>
               <w:spacing w:line="276" w:lineRule="auto"/>
+              <w:cnfStyle w:val="000000000000" w:firstRow="0" w:lastRow="0" w:firstColumn="0" w:lastColumn="0" w:oddVBand="0" w:evenVBand="0" w:oddHBand="0" w:evenHBand="0" w:firstRowFirstColumn="0" w:firstRowLastColumn="0" w:lastRowFirstColumn="0" w:lastRowLastColumn="0"/>
               <w:rPr>
                 <w:rFonts w:asciiTheme="minorHAnsi" w:eastAsia="Arial" w:hAnsiTheme="minorHAnsi" w:cstheme="minorHAnsi"/>
               </w:rPr>
@@ -8414,6 +8475,7 @@
           <w:p>
             <w:pPr>
               <w:spacing w:line="276" w:lineRule="auto"/>
+              <w:cnfStyle w:val="000000000000" w:firstRow="0" w:lastRow="0" w:firstColumn="0" w:lastColumn="0" w:oddVBand="0" w:evenVBand="0" w:oddHBand="0" w:evenHBand="0" w:firstRowFirstColumn="0" w:firstRowLastColumn="0" w:lastRowFirstColumn="0" w:lastRowLastColumn="0"/>
               <w:rPr>
                 <w:rFonts w:asciiTheme="minorHAnsi" w:eastAsia="Arial" w:hAnsiTheme="minorHAnsi" w:cstheme="minorHAnsi"/>
               </w:rPr>
@@ -8473,11 +8535,11 @@
         </w:trPr>
         <w:tc>
           <w:tcPr>
+            <w:cnfStyle w:val="001000000000" w:firstRow="0" w:lastRow="0" w:firstColumn="1" w:lastColumn="0" w:oddVBand="0" w:evenVBand="0" w:oddHBand="0" w:evenHBand="0" w:firstRowFirstColumn="0" w:firstRowLastColumn="0" w:lastRowFirstColumn="0" w:lastRowLastColumn="0"/>
             <w:tcW w:w="1129" w:type="dxa"/>
           </w:tcPr>
           <w:p>
             <w:pPr>
-              <w:cnfStyle w:val="001000100000" w:firstRow="0" w:lastRow="0" w:firstColumn="1" w:lastColumn="0" w:oddVBand="0" w:evenVBand="0" w:oddHBand="1" w:evenHBand="0" w:firstRowFirstColumn="0" w:firstRowLastColumn="0" w:lastRowFirstColumn="0" w:lastRowLastColumn="0"/>
               <w:rPr>
                 <w:rFonts w:asciiTheme="minorHAnsi" w:eastAsia="Arial" w:hAnsiTheme="minorHAnsi" w:cstheme="minorHAnsi"/>
               </w:rPr>
@@ -8495,6 +8557,9 @@
             <w:tcW w:w="6308" w:type="dxa"/>
           </w:tcPr>
           <w:p>
+            <w:pPr>
+              <w:cnfStyle w:val="000000100000" w:firstRow="0" w:lastRow="0" w:firstColumn="0" w:lastColumn="0" w:oddVBand="0" w:evenVBand="0" w:oddHBand="1" w:evenHBand="0" w:firstRowFirstColumn="0" w:firstRowLastColumn="0" w:lastRowFirstColumn="0" w:lastRowLastColumn="0"/>
+            </w:pPr>
             <w:r>
               <w:t>Desabilitar contas inativas</w:t>
             </w:r>
@@ -8506,6 +8571,7 @@
           </w:tcPr>
           <w:p>
             <w:pPr>
+              <w:cnfStyle w:val="000000100000" w:firstRow="0" w:lastRow="0" w:firstColumn="0" w:lastColumn="0" w:oddVBand="0" w:evenVBand="0" w:oddHBand="1" w:evenHBand="0" w:firstRowFirstColumn="0" w:firstRowLastColumn="0" w:lastRowFirstColumn="0" w:lastRowLastColumn="0"/>
               <w:rPr>
                 <w:rFonts w:asciiTheme="minorHAnsi" w:eastAsia="Arial" w:hAnsiTheme="minorHAnsi" w:cstheme="minorHAnsi"/>
                 <w:b/>
@@ -8563,12 +8629,12 @@
       <w:tr>
         <w:tc>
           <w:tcPr>
+            <w:cnfStyle w:val="001000000000" w:firstRow="0" w:lastRow="0" w:firstColumn="1" w:lastColumn="0" w:oddVBand="0" w:evenVBand="0" w:oddHBand="0" w:evenHBand="0" w:firstRowFirstColumn="0" w:firstRowLastColumn="0" w:lastRowFirstColumn="0" w:lastRowLastColumn="0"/>
             <w:tcW w:w="1129" w:type="dxa"/>
           </w:tcPr>
           <w:p>
             <w:pPr>
               <w:spacing w:line="276" w:lineRule="auto"/>
-              <w:cnfStyle w:val="001000000000" w:firstRow="0" w:lastRow="0" w:firstColumn="1" w:lastColumn="0" w:oddVBand="0" w:evenVBand="0" w:oddHBand="0" w:evenHBand="0" w:firstRowFirstColumn="0" w:firstRowLastColumn="0" w:lastRowFirstColumn="0" w:lastRowLastColumn="0"/>
               <w:rPr>
                 <w:rFonts w:asciiTheme="minorHAnsi" w:eastAsia="Arial" w:hAnsiTheme="minorHAnsi" w:cstheme="minorHAnsi"/>
               </w:rPr>
@@ -8595,6 +8661,7 @@
           <w:p>
             <w:pPr>
               <w:spacing w:line="276" w:lineRule="auto"/>
+              <w:cnfStyle w:val="000000000000" w:firstRow="0" w:lastRow="0" w:firstColumn="0" w:lastColumn="0" w:oddVBand="0" w:evenVBand="0" w:oddHBand="0" w:evenHBand="0" w:firstRowFirstColumn="0" w:firstRowLastColumn="0" w:lastRowFirstColumn="0" w:lastRowLastColumn="0"/>
               <w:rPr>
                 <w:rFonts w:asciiTheme="minorHAnsi" w:eastAsia="Arial" w:hAnsiTheme="minorHAnsi" w:cstheme="minorHAnsi"/>
               </w:rPr>
@@ -8611,6 +8678,7 @@
           <w:p>
             <w:pPr>
               <w:spacing w:line="276" w:lineRule="auto"/>
+              <w:cnfStyle w:val="000000000000" w:firstRow="0" w:lastRow="0" w:firstColumn="0" w:lastColumn="0" w:oddVBand="0" w:evenVBand="0" w:oddHBand="0" w:evenHBand="0" w:firstRowFirstColumn="0" w:firstRowLastColumn="0" w:lastRowFirstColumn="0" w:lastRowLastColumn="0"/>
               <w:rPr>
                 <w:rFonts w:asciiTheme="minorHAnsi" w:eastAsia="Arial" w:hAnsiTheme="minorHAnsi" w:cstheme="minorHAnsi"/>
               </w:rPr>
@@ -9116,11 +9184,11 @@
         </w:trPr>
         <w:tc>
           <w:tcPr>
+            <w:cnfStyle w:val="001000000000" w:firstRow="0" w:lastRow="0" w:firstColumn="1" w:lastColumn="0" w:oddVBand="0" w:evenVBand="0" w:oddHBand="0" w:evenHBand="0" w:firstRowFirstColumn="0" w:firstRowLastColumn="0" w:lastRowFirstColumn="0" w:lastRowLastColumn="0"/>
             <w:tcW w:w="1129" w:type="dxa"/>
           </w:tcPr>
           <w:p>
             <w:pPr>
-              <w:cnfStyle w:val="101000000000" w:firstRow="1" w:lastRow="0" w:firstColumn="1" w:lastColumn="0" w:oddVBand="0" w:evenVBand="0" w:oddHBand="0" w:evenHBand="0" w:firstRowFirstColumn="0" w:firstRowLastColumn="0" w:lastRowFirstColumn="0" w:lastRowLastColumn="0"/>
               <w:rPr>
                 <w:rFonts w:asciiTheme="minorHAnsi" w:eastAsia="Arial" w:hAnsiTheme="minorHAnsi" w:cstheme="minorHAnsi"/>
                 <w:szCs w:val="18"/>
@@ -9141,6 +9209,7 @@
           </w:tcPr>
           <w:p>
             <w:pPr>
+              <w:cnfStyle w:val="100000000000" w:firstRow="1" w:lastRow="0" w:firstColumn="0" w:lastColumn="0" w:oddVBand="0" w:evenVBand="0" w:oddHBand="0" w:evenHBand="0" w:firstRowFirstColumn="0" w:firstRowLastColumn="0" w:lastRowFirstColumn="0" w:lastRowLastColumn="0"/>
               <w:rPr>
                 <w:rFonts w:asciiTheme="minorHAnsi" w:hAnsiTheme="minorHAnsi" w:cstheme="minorHAnsi"/>
                 <w:szCs w:val="18"/>
@@ -9161,6 +9230,7 @@
           </w:tcPr>
           <w:p>
             <w:pPr>
+              <w:cnfStyle w:val="100000000000" w:firstRow="1" w:lastRow="0" w:firstColumn="0" w:lastColumn="0" w:oddVBand="0" w:evenVBand="0" w:oddHBand="0" w:evenHBand="0" w:firstRowFirstColumn="0" w:firstRowLastColumn="0" w:lastRowFirstColumn="0" w:lastRowLastColumn="0"/>
               <w:rPr>
                 <w:rFonts w:asciiTheme="minorHAnsi" w:eastAsia="Arial" w:hAnsiTheme="minorHAnsi" w:cstheme="minorHAnsi"/>
                 <w:szCs w:val="18"/>
@@ -9182,12 +9252,12 @@
         </w:trPr>
         <w:tc>
           <w:tcPr>
+            <w:cnfStyle w:val="001000000000" w:firstRow="0" w:lastRow="0" w:firstColumn="1" w:lastColumn="0" w:oddVBand="0" w:evenVBand="0" w:oddHBand="0" w:evenHBand="0" w:firstRowFirstColumn="0" w:firstRowLastColumn="0" w:lastRowFirstColumn="0" w:lastRowLastColumn="0"/>
             <w:tcW w:w="1129" w:type="dxa"/>
           </w:tcPr>
           <w:p>
             <w:pPr>
               <w:spacing w:line="276" w:lineRule="auto"/>
-              <w:cnfStyle w:val="001000100000" w:firstRow="0" w:lastRow="0" w:firstColumn="1" w:lastColumn="0" w:oddVBand="0" w:evenVBand="0" w:oddHBand="1" w:evenHBand="0" w:firstRowFirstColumn="0" w:firstRowLastColumn="0" w:lastRowFirstColumn="0" w:lastRowLastColumn="0"/>
               <w:rPr>
                 <w:rFonts w:asciiTheme="minorHAnsi" w:eastAsia="Arial" w:hAnsiTheme="minorHAnsi" w:cstheme="minorHAnsi"/>
               </w:rPr>
@@ -9213,6 +9283,7 @@
           <w:p>
             <w:pPr>
               <w:spacing w:line="276" w:lineRule="auto"/>
+              <w:cnfStyle w:val="000000100000" w:firstRow="0" w:lastRow="0" w:firstColumn="0" w:lastColumn="0" w:oddVBand="0" w:evenVBand="0" w:oddHBand="1" w:evenHBand="0" w:firstRowFirstColumn="0" w:firstRowLastColumn="0" w:lastRowFirstColumn="0" w:lastRowLastColumn="0"/>
               <w:rPr>
                 <w:rFonts w:asciiTheme="minorHAnsi" w:eastAsia="Arial" w:hAnsiTheme="minorHAnsi" w:cstheme="minorHAnsi"/>
               </w:rPr>
@@ -9229,6 +9300,7 @@
           <w:p>
             <w:pPr>
               <w:spacing w:line="276" w:lineRule="auto"/>
+              <w:cnfStyle w:val="000000100000" w:firstRow="0" w:lastRow="0" w:firstColumn="0" w:lastColumn="0" w:oddVBand="0" w:evenVBand="0" w:oddHBand="1" w:evenHBand="0" w:firstRowFirstColumn="0" w:firstRowLastColumn="0" w:lastRowFirstColumn="0" w:lastRowLastColumn="0"/>
               <w:rPr>
                 <w:rFonts w:asciiTheme="minorHAnsi" w:eastAsia="Arial" w:hAnsiTheme="minorHAnsi" w:cstheme="minorHAnsi"/>
               </w:rPr>
@@ -9285,12 +9357,12 @@
       <w:tr>
         <w:tc>
           <w:tcPr>
+            <w:cnfStyle w:val="001000000000" w:firstRow="0" w:lastRow="0" w:firstColumn="1" w:lastColumn="0" w:oddVBand="0" w:evenVBand="0" w:oddHBand="0" w:evenHBand="0" w:firstRowFirstColumn="0" w:firstRowLastColumn="0" w:lastRowFirstColumn="0" w:lastRowLastColumn="0"/>
             <w:tcW w:w="1129" w:type="dxa"/>
           </w:tcPr>
           <w:p>
             <w:pPr>
               <w:spacing w:line="276" w:lineRule="auto"/>
-              <w:cnfStyle w:val="001000000000" w:firstRow="0" w:lastRow="0" w:firstColumn="1" w:lastColumn="0" w:oddVBand="0" w:evenVBand="0" w:oddHBand="0" w:evenHBand="0" w:firstRowFirstColumn="0" w:firstRowLastColumn="0" w:lastRowFirstColumn="0" w:lastRowLastColumn="0"/>
               <w:rPr>
                 <w:rFonts w:asciiTheme="minorHAnsi" w:eastAsia="Arial" w:hAnsiTheme="minorHAnsi" w:cstheme="minorHAnsi"/>
               </w:rPr>
@@ -9316,6 +9388,7 @@
           <w:p>
             <w:pPr>
               <w:spacing w:line="276" w:lineRule="auto"/>
+              <w:cnfStyle w:val="000000000000" w:firstRow="0" w:lastRow="0" w:firstColumn="0" w:lastColumn="0" w:oddVBand="0" w:evenVBand="0" w:oddHBand="0" w:evenHBand="0" w:firstRowFirstColumn="0" w:firstRowLastColumn="0" w:lastRowFirstColumn="0" w:lastRowLastColumn="0"/>
               <w:rPr>
                 <w:rFonts w:asciiTheme="minorHAnsi" w:eastAsia="Arial" w:hAnsiTheme="minorHAnsi" w:cstheme="minorHAnsi"/>
               </w:rPr>
@@ -9332,6 +9405,7 @@
           <w:p>
             <w:pPr>
               <w:spacing w:line="276" w:lineRule="auto"/>
+              <w:cnfStyle w:val="000000000000" w:firstRow="0" w:lastRow="0" w:firstColumn="0" w:lastColumn="0" w:oddVBand="0" w:evenVBand="0" w:oddHBand="0" w:evenHBand="0" w:firstRowFirstColumn="0" w:firstRowLastColumn="0" w:lastRowFirstColumn="0" w:lastRowLastColumn="0"/>
               <w:rPr>
                 <w:rFonts w:asciiTheme="minorHAnsi" w:eastAsia="Arial" w:hAnsiTheme="minorHAnsi" w:cstheme="minorHAnsi"/>
               </w:rPr>
@@ -9391,11 +9465,11 @@
         </w:trPr>
         <w:tc>
           <w:tcPr>
+            <w:cnfStyle w:val="001000000000" w:firstRow="0" w:lastRow="0" w:firstColumn="1" w:lastColumn="0" w:oddVBand="0" w:evenVBand="0" w:oddHBand="0" w:evenHBand="0" w:firstRowFirstColumn="0" w:firstRowLastColumn="0" w:lastRowFirstColumn="0" w:lastRowLastColumn="0"/>
             <w:tcW w:w="1129" w:type="dxa"/>
           </w:tcPr>
           <w:p>
             <w:pPr>
-              <w:cnfStyle w:val="001000100000" w:firstRow="0" w:lastRow="0" w:firstColumn="1" w:lastColumn="0" w:oddVBand="0" w:evenVBand="0" w:oddHBand="1" w:evenHBand="0" w:firstRowFirstColumn="0" w:firstRowLastColumn="0" w:lastRowFirstColumn="0" w:lastRowLastColumn="0"/>
               <w:rPr>
                 <w:rFonts w:asciiTheme="minorHAnsi" w:eastAsia="Arial" w:hAnsiTheme="minorHAnsi" w:cstheme="minorHAnsi"/>
               </w:rPr>
@@ -9413,6 +9487,9 @@
             <w:tcW w:w="6308" w:type="dxa"/>
           </w:tcPr>
           <w:p>
+            <w:pPr>
+              <w:cnfStyle w:val="000000100000" w:firstRow="0" w:lastRow="0" w:firstColumn="0" w:lastColumn="0" w:oddVBand="0" w:evenVBand="0" w:oddHBand="1" w:evenHBand="0" w:firstRowFirstColumn="0" w:firstRowLastColumn="0" w:lastRowFirstColumn="0" w:lastRowLastColumn="0"/>
+            </w:pPr>
             <w:r>
               <w:t>Exigir MFA para aplicações expostas externamente</w:t>
             </w:r>
@@ -9424,6 +9501,7 @@
           </w:tcPr>
           <w:p>
             <w:pPr>
+              <w:cnfStyle w:val="000000100000" w:firstRow="0" w:lastRow="0" w:firstColumn="0" w:lastColumn="0" w:oddVBand="0" w:evenVBand="0" w:oddHBand="1" w:evenHBand="0" w:firstRowFirstColumn="0" w:firstRowLastColumn="0" w:lastRowFirstColumn="0" w:lastRowLastColumn="0"/>
               <w:rPr>
                 <w:rFonts w:asciiTheme="minorHAnsi" w:eastAsia="Arial" w:hAnsiTheme="minorHAnsi" w:cstheme="minorHAnsi"/>
                 <w:b/>
@@ -9481,12 +9559,12 @@
       <w:tr>
         <w:tc>
           <w:tcPr>
+            <w:cnfStyle w:val="001000000000" w:firstRow="0" w:lastRow="0" w:firstColumn="1" w:lastColumn="0" w:oddVBand="0" w:evenVBand="0" w:oddHBand="0" w:evenHBand="0" w:firstRowFirstColumn="0" w:firstRowLastColumn="0" w:lastRowFirstColumn="0" w:lastRowLastColumn="0"/>
             <w:tcW w:w="1129" w:type="dxa"/>
           </w:tcPr>
           <w:p>
             <w:pPr>
               <w:spacing w:line="276" w:lineRule="auto"/>
-              <w:cnfStyle w:val="001000000000" w:firstRow="0" w:lastRow="0" w:firstColumn="1" w:lastColumn="0" w:oddVBand="0" w:evenVBand="0" w:oddHBand="0" w:evenHBand="0" w:firstRowFirstColumn="0" w:firstRowLastColumn="0" w:lastRowFirstColumn="0" w:lastRowLastColumn="0"/>
               <w:rPr>
                 <w:rFonts w:asciiTheme="minorHAnsi" w:eastAsia="Arial" w:hAnsiTheme="minorHAnsi" w:cstheme="minorHAnsi"/>
               </w:rPr>
@@ -9513,6 +9591,7 @@
           <w:p>
             <w:pPr>
               <w:spacing w:line="276" w:lineRule="auto"/>
+              <w:cnfStyle w:val="000000000000" w:firstRow="0" w:lastRow="0" w:firstColumn="0" w:lastColumn="0" w:oddVBand="0" w:evenVBand="0" w:oddHBand="0" w:evenHBand="0" w:firstRowFirstColumn="0" w:firstRowLastColumn="0" w:lastRowFirstColumn="0" w:lastRowLastColumn="0"/>
               <w:rPr>
                 <w:rFonts w:asciiTheme="minorHAnsi" w:eastAsia="Arial" w:hAnsiTheme="minorHAnsi" w:cstheme="minorHAnsi"/>
               </w:rPr>
@@ -9529,6 +9608,7 @@
           <w:p>
             <w:pPr>
               <w:spacing w:line="276" w:lineRule="auto"/>
+              <w:cnfStyle w:val="000000000000" w:firstRow="0" w:lastRow="0" w:firstColumn="0" w:lastColumn="0" w:oddVBand="0" w:evenVBand="0" w:oddHBand="0" w:evenHBand="0" w:firstRowFirstColumn="0" w:firstRowLastColumn="0" w:lastRowFirstColumn="0" w:lastRowLastColumn="0"/>
               <w:rPr>
                 <w:rFonts w:asciiTheme="minorHAnsi" w:eastAsia="Arial" w:hAnsiTheme="minorHAnsi" w:cstheme="minorHAnsi"/>
               </w:rPr>
@@ -9588,11 +9668,11 @@
         </w:trPr>
         <w:tc>
           <w:tcPr>
+            <w:cnfStyle w:val="001000000000" w:firstRow="0" w:lastRow="0" w:firstColumn="1" w:lastColumn="0" w:oddVBand="0" w:evenVBand="0" w:oddHBand="0" w:evenHBand="0" w:firstRowFirstColumn="0" w:firstRowLastColumn="0" w:lastRowFirstColumn="0" w:lastRowLastColumn="0"/>
             <w:tcW w:w="1129" w:type="dxa"/>
           </w:tcPr>
           <w:p>
             <w:pPr>
-              <w:cnfStyle w:val="001000100000" w:firstRow="0" w:lastRow="0" w:firstColumn="1" w:lastColumn="0" w:oddVBand="0" w:evenVBand="0" w:oddHBand="1" w:evenHBand="0" w:firstRowFirstColumn="0" w:firstRowLastColumn="0" w:lastRowFirstColumn="0" w:lastRowLastColumn="0"/>
               <w:rPr>
                 <w:rFonts w:asciiTheme="minorHAnsi" w:eastAsia="Arial" w:hAnsiTheme="minorHAnsi" w:cstheme="minorHAnsi"/>
               </w:rPr>
@@ -9610,6 +9690,9 @@
             <w:tcW w:w="6308" w:type="dxa"/>
           </w:tcPr>
           <w:p>
+            <w:pPr>
+              <w:cnfStyle w:val="000000100000" w:firstRow="0" w:lastRow="0" w:firstColumn="0" w:lastColumn="0" w:oddVBand="0" w:evenVBand="0" w:oddHBand="1" w:evenHBand="0" w:firstRowFirstColumn="0" w:firstRowLastColumn="0" w:lastRowFirstColumn="0" w:lastRowLastColumn="0"/>
+            </w:pPr>
             <w:r>
               <w:t>Exigir MFA para acesso administrativo</w:t>
             </w:r>
@@ -9621,6 +9704,7 @@
           </w:tcPr>
           <w:p>
             <w:pPr>
+              <w:cnfStyle w:val="000000100000" w:firstRow="0" w:lastRow="0" w:firstColumn="0" w:lastColumn="0" w:oddVBand="0" w:evenVBand="0" w:oddHBand="1" w:evenHBand="0" w:firstRowFirstColumn="0" w:firstRowLastColumn="0" w:lastRowFirstColumn="0" w:lastRowLastColumn="0"/>
               <w:rPr>
                 <w:rFonts w:asciiTheme="minorHAnsi" w:eastAsia="Arial" w:hAnsiTheme="minorHAnsi" w:cstheme="minorHAnsi"/>
                 <w:b/>
@@ -24301,12 +24385,10 @@
         </w:trPr>
         <w:tc>
           <w:tcPr>
+            <w:cnfStyle w:val="001000000000" w:firstRow="0" w:lastRow="0" w:firstColumn="1" w:lastColumn="0" w:oddVBand="0" w:evenVBand="0" w:oddHBand="0" w:evenHBand="0" w:firstRowFirstColumn="0" w:firstRowLastColumn="0" w:lastRowFirstColumn="0" w:lastRowLastColumn="0"/>
             <w:tcW w:w="1128" w:type="dxa"/>
           </w:tcPr>
           <w:p>
-            <w:pPr>
-              <w:cnfStyle w:val="101000000000" w:firstRow="1" w:lastRow="0" w:firstColumn="1" w:lastColumn="0" w:oddVBand="0" w:evenVBand="0" w:oddHBand="0" w:evenHBand="0" w:firstRowFirstColumn="0" w:firstRowLastColumn="0" w:lastRowFirstColumn="0" w:lastRowLastColumn="0"/>
-            </w:pPr>
             <w:r>
               <w:t>Achado</w:t>
             </w:r>
@@ -24317,6 +24399,9 @@
             <w:tcW w:w="5386" w:type="dxa"/>
           </w:tcPr>
           <w:p>
+            <w:pPr>
+              <w:cnfStyle w:val="100000000000" w:firstRow="1" w:lastRow="0" w:firstColumn="0" w:lastColumn="0" w:oddVBand="0" w:evenVBand="0" w:oddHBand="0" w:evenHBand="0" w:firstRowFirstColumn="0" w:firstRowLastColumn="0" w:lastRowFirstColumn="0" w:lastRowLastColumn="0"/>
+            </w:pPr>
             <w:r>
               <w:t>Atividade</w:t>
             </w:r>
@@ -24327,6 +24412,9 @@
             <w:tcW w:w="1276" w:type="dxa"/>
           </w:tcPr>
           <w:p>
+            <w:pPr>
+              <w:cnfStyle w:val="100000000000" w:firstRow="1" w:lastRow="0" w:firstColumn="0" w:lastColumn="0" w:oddVBand="0" w:evenVBand="0" w:oddHBand="0" w:evenHBand="0" w:firstRowFirstColumn="0" w:firstRowLastColumn="0" w:lastRowFirstColumn="0" w:lastRowLastColumn="0"/>
+            </w:pPr>
             <w:r>
               <w:t>Responsável</w:t>
             </w:r>
@@ -24337,6 +24425,9 @@
             <w:tcW w:w="709" w:type="dxa"/>
           </w:tcPr>
           <w:p>
+            <w:pPr>
+              <w:cnfStyle w:val="100000000000" w:firstRow="1" w:lastRow="0" w:firstColumn="0" w:lastColumn="0" w:oddVBand="0" w:evenVBand="0" w:oddHBand="0" w:evenHBand="0" w:firstRowFirstColumn="0" w:firstRowLastColumn="0" w:lastRowFirstColumn="0" w:lastRowLastColumn="0"/>
+            </w:pPr>
             <w:r>
               <w:t>Data Início</w:t>
             </w:r>
@@ -24347,6 +24438,9 @@
             <w:tcW w:w="624" w:type="dxa"/>
           </w:tcPr>
           <w:p>
+            <w:pPr>
+              <w:cnfStyle w:val="100000000000" w:firstRow="1" w:lastRow="0" w:firstColumn="0" w:lastColumn="0" w:oddVBand="0" w:evenVBand="0" w:oddHBand="0" w:evenHBand="0" w:firstRowFirstColumn="0" w:firstRowLastColumn="0" w:lastRowFirstColumn="0" w:lastRowLastColumn="0"/>
+            </w:pPr>
             <w:r>
               <w:t>Data Fim</w:t>
             </w:r>
@@ -24359,11 +24453,11 @@
         </w:trPr>
         <w:tc>
           <w:tcPr>
+            <w:cnfStyle w:val="001000000000" w:firstRow="0" w:lastRow="0" w:firstColumn="1" w:lastColumn="0" w:oddVBand="0" w:evenVBand="0" w:oddHBand="0" w:evenHBand="0" w:firstRowFirstColumn="0" w:firstRowLastColumn="0" w:lastRowFirstColumn="0" w:lastRowLastColumn="0"/>
             <w:tcW w:w="1128" w:type="dxa"/>
           </w:tcPr>
           <w:p>
             <w:pPr>
-              <w:cnfStyle w:val="001000100000" w:firstRow="0" w:lastRow="0" w:firstColumn="1" w:lastColumn="0" w:oddVBand="0" w:evenVBand="0" w:oddHBand="1" w:evenHBand="0" w:firstRowFirstColumn="0" w:firstRowLastColumn="0" w:lastRowFirstColumn="0" w:lastRowLastColumn="0"/>
               <w:rPr>
                 <w:sz w:val="18"/>
                 <w:szCs w:val="18"/>
@@ -24406,6 +24500,7 @@
           </w:tcPr>
           <w:p>
             <w:pPr>
+              <w:cnfStyle w:val="000000100000" w:firstRow="0" w:lastRow="0" w:firstColumn="0" w:lastColumn="0" w:oddVBand="0" w:evenVBand="0" w:oddHBand="1" w:evenHBand="0" w:firstRowFirstColumn="0" w:firstRowLastColumn="0" w:lastRowFirstColumn="0" w:lastRowLastColumn="0"/>
               <w:rPr>
                 <w:sz w:val="18"/>
                 <w:szCs w:val="18"/>
@@ -24420,6 +24515,7 @@
           </w:tcPr>
           <w:p>
             <w:pPr>
+              <w:cnfStyle w:val="000000100000" w:firstRow="0" w:lastRow="0" w:firstColumn="0" w:lastColumn="0" w:oddVBand="0" w:evenVBand="0" w:oddHBand="1" w:evenHBand="0" w:firstRowFirstColumn="0" w:firstRowLastColumn="0" w:lastRowFirstColumn="0" w:lastRowLastColumn="0"/>
               <w:rPr>
                 <w:sz w:val="18"/>
                 <w:szCs w:val="18"/>
@@ -24434,6 +24530,7 @@
           </w:tcPr>
           <w:p>
             <w:pPr>
+              <w:cnfStyle w:val="000000100000" w:firstRow="0" w:lastRow="0" w:firstColumn="0" w:lastColumn="0" w:oddVBand="0" w:evenVBand="0" w:oddHBand="1" w:evenHBand="0" w:firstRowFirstColumn="0" w:firstRowLastColumn="0" w:lastRowFirstColumn="0" w:lastRowLastColumn="0"/>
               <w:rPr>
                 <w:sz w:val="18"/>
                 <w:szCs w:val="18"/>
@@ -24448,6 +24545,7 @@
           </w:tcPr>
           <w:p>
             <w:pPr>
+              <w:cnfStyle w:val="000000100000" w:firstRow="0" w:lastRow="0" w:firstColumn="0" w:lastColumn="0" w:oddVBand="0" w:evenVBand="0" w:oddHBand="1" w:evenHBand="0" w:firstRowFirstColumn="0" w:firstRowLastColumn="0" w:lastRowFirstColumn="0" w:lastRowLastColumn="0"/>
               <w:rPr>
                 <w:sz w:val="18"/>
                 <w:szCs w:val="18"/>
@@ -24460,11 +24558,11 @@
       <w:tr>
         <w:tc>
           <w:tcPr>
+            <w:cnfStyle w:val="001000000000" w:firstRow="0" w:lastRow="0" w:firstColumn="1" w:lastColumn="0" w:oddVBand="0" w:evenVBand="0" w:oddHBand="0" w:evenHBand="0" w:firstRowFirstColumn="0" w:firstRowLastColumn="0" w:lastRowFirstColumn="0" w:lastRowLastColumn="0"/>
             <w:tcW w:w="1128" w:type="dxa"/>
           </w:tcPr>
           <w:p>
             <w:pPr>
-              <w:cnfStyle w:val="001000000000" w:firstRow="0" w:lastRow="0" w:firstColumn="1" w:lastColumn="0" w:oddVBand="0" w:evenVBand="0" w:oddHBand="0" w:evenHBand="0" w:firstRowFirstColumn="0" w:firstRowLastColumn="0" w:lastRowFirstColumn="0" w:lastRowLastColumn="0"/>
               <w:rPr>
                 <w:sz w:val="18"/>
                 <w:szCs w:val="18"/>
@@ -24517,6 +24615,7 @@
           </w:tcPr>
           <w:p>
             <w:pPr>
+              <w:cnfStyle w:val="000000000000" w:firstRow="0" w:lastRow="0" w:firstColumn="0" w:lastColumn="0" w:oddVBand="0" w:evenVBand="0" w:oddHBand="0" w:evenHBand="0" w:firstRowFirstColumn="0" w:firstRowLastColumn="0" w:lastRowFirstColumn="0" w:lastRowLastColumn="0"/>
               <w:rPr>
                 <w:sz w:val="18"/>
                 <w:szCs w:val="18"/>
@@ -24546,6 +24645,7 @@
           </w:tcPr>
           <w:p>
             <w:pPr>
+              <w:cnfStyle w:val="000000000000" w:firstRow="0" w:lastRow="0" w:firstColumn="0" w:lastColumn="0" w:oddVBand="0" w:evenVBand="0" w:oddHBand="0" w:evenHBand="0" w:firstRowFirstColumn="0" w:firstRowLastColumn="0" w:lastRowFirstColumn="0" w:lastRowLastColumn="0"/>
               <w:rPr>
                 <w:sz w:val="18"/>
                 <w:szCs w:val="18"/>
@@ -24559,6 +24659,7 @@
           </w:tcPr>
           <w:p>
             <w:pPr>
+              <w:cnfStyle w:val="000000000000" w:firstRow="0" w:lastRow="0" w:firstColumn="0" w:lastColumn="0" w:oddVBand="0" w:evenVBand="0" w:oddHBand="0" w:evenHBand="0" w:firstRowFirstColumn="0" w:firstRowLastColumn="0" w:lastRowFirstColumn="0" w:lastRowLastColumn="0"/>
               <w:rPr>
                 <w:sz w:val="18"/>
                 <w:szCs w:val="18"/>
@@ -24572,6 +24673,7 @@
           </w:tcPr>
           <w:p>
             <w:pPr>
+              <w:cnfStyle w:val="000000000000" w:firstRow="0" w:lastRow="0" w:firstColumn="0" w:lastColumn="0" w:oddVBand="0" w:evenVBand="0" w:oddHBand="0" w:evenHBand="0" w:firstRowFirstColumn="0" w:firstRowLastColumn="0" w:lastRowFirstColumn="0" w:lastRowLastColumn="0"/>
               <w:rPr>
                 <w:sz w:val="18"/>
                 <w:szCs w:val="18"/>
@@ -24586,11 +24688,11 @@
         </w:trPr>
         <w:tc>
           <w:tcPr>
+            <w:cnfStyle w:val="001000000000" w:firstRow="0" w:lastRow="0" w:firstColumn="1" w:lastColumn="0" w:oddVBand="0" w:evenVBand="0" w:oddHBand="0" w:evenHBand="0" w:firstRowFirstColumn="0" w:firstRowLastColumn="0" w:lastRowFirstColumn="0" w:lastRowLastColumn="0"/>
             <w:tcW w:w="1128" w:type="dxa"/>
           </w:tcPr>
           <w:p>
             <w:pPr>
-              <w:cnfStyle w:val="001000100000" w:firstRow="0" w:lastRow="0" w:firstColumn="1" w:lastColumn="0" w:oddVBand="0" w:evenVBand="0" w:oddHBand="1" w:evenHBand="0" w:firstRowFirstColumn="0" w:firstRowLastColumn="0" w:lastRowFirstColumn="0" w:lastRowLastColumn="0"/>
               <w:rPr>
                 <w:sz w:val="18"/>
                 <w:szCs w:val="18"/>
@@ -24648,6 +24750,7 @@
           </w:tcPr>
           <w:p>
             <w:pPr>
+              <w:cnfStyle w:val="000000100000" w:firstRow="0" w:lastRow="0" w:firstColumn="0" w:lastColumn="0" w:oddVBand="0" w:evenVBand="0" w:oddHBand="1" w:evenHBand="0" w:firstRowFirstColumn="0" w:firstRowLastColumn="0" w:lastRowFirstColumn="0" w:lastRowLastColumn="0"/>
               <w:rPr>
                 <w:sz w:val="18"/>
                 <w:szCs w:val="18"/>
@@ -24661,6 +24764,7 @@
           </w:tcPr>
           <w:p>
             <w:pPr>
+              <w:cnfStyle w:val="000000100000" w:firstRow="0" w:lastRow="0" w:firstColumn="0" w:lastColumn="0" w:oddVBand="0" w:evenVBand="0" w:oddHBand="1" w:evenHBand="0" w:firstRowFirstColumn="0" w:firstRowLastColumn="0" w:lastRowFirstColumn="0" w:lastRowLastColumn="0"/>
               <w:rPr>
                 <w:sz w:val="18"/>
                 <w:szCs w:val="18"/>
@@ -24674,6 +24778,7 @@
           </w:tcPr>
           <w:p>
             <w:pPr>
+              <w:cnfStyle w:val="000000100000" w:firstRow="0" w:lastRow="0" w:firstColumn="0" w:lastColumn="0" w:oddVBand="0" w:evenVBand="0" w:oddHBand="1" w:evenHBand="0" w:firstRowFirstColumn="0" w:firstRowLastColumn="0" w:lastRowFirstColumn="0" w:lastRowLastColumn="0"/>
               <w:rPr>
                 <w:sz w:val="18"/>
                 <w:szCs w:val="18"/>
@@ -24687,6 +24792,7 @@
           </w:tcPr>
           <w:p>
             <w:pPr>
+              <w:cnfStyle w:val="000000100000" w:firstRow="0" w:lastRow="0" w:firstColumn="0" w:lastColumn="0" w:oddVBand="0" w:evenVBand="0" w:oddHBand="1" w:evenHBand="0" w:firstRowFirstColumn="0" w:firstRowLastColumn="0" w:lastRowFirstColumn="0" w:lastRowLastColumn="0"/>
               <w:rPr>
                 <w:sz w:val="18"/>
                 <w:szCs w:val="18"/>
@@ -25044,12 +25150,12 @@
         </w:trPr>
         <w:tc>
           <w:tcPr>
+            <w:cnfStyle w:val="001000000000" w:firstRow="0" w:lastRow="0" w:firstColumn="1" w:lastColumn="0" w:oddVBand="0" w:evenVBand="0" w:oddHBand="0" w:evenHBand="0" w:firstRowFirstColumn="0" w:firstRowLastColumn="0" w:lastRowFirstColumn="0" w:lastRowLastColumn="0"/>
             <w:tcW w:w="1837" w:type="dxa"/>
           </w:tcPr>
           <w:p>
             <w:pPr>
               <w:jc w:val="center"/>
-              <w:cnfStyle w:val="101000000000" w:firstRow="1" w:lastRow="0" w:firstColumn="1" w:lastColumn="0" w:oddVBand="0" w:evenVBand="0" w:oddHBand="0" w:evenHBand="0" w:firstRowFirstColumn="0" w:firstRowLastColumn="0" w:lastRowFirstColumn="0" w:lastRowLastColumn="0"/>
             </w:pPr>
             <w:r>
               <w:t>Questão</w:t>
@@ -25063,6 +25169,7 @@
           <w:p>
             <w:pPr>
               <w:jc w:val="center"/>
+              <w:cnfStyle w:val="100000000000" w:firstRow="1" w:lastRow="0" w:firstColumn="0" w:lastColumn="0" w:oddVBand="0" w:evenVBand="0" w:oddHBand="0" w:evenHBand="0" w:firstRowFirstColumn="0" w:firstRowLastColumn="0" w:lastRowFirstColumn="0" w:lastRowLastColumn="0"/>
             </w:pPr>
             <w:r>
               <w:t>Resposta Original</w:t>
@@ -25076,6 +25183,7 @@
           <w:p>
             <w:pPr>
               <w:jc w:val="center"/>
+              <w:cnfStyle w:val="100000000000" w:firstRow="1" w:lastRow="0" w:firstColumn="0" w:lastColumn="0" w:oddVBand="0" w:evenVBand="0" w:oddHBand="0" w:evenHBand="0" w:firstRowFirstColumn="0" w:firstRowLastColumn="0" w:lastRowFirstColumn="0" w:lastRowLastColumn="0"/>
             </w:pPr>
             <w:r>
               <w:t>Resposta Ajustada</w:t>
@@ -25089,6 +25197,7 @@
           <w:p>
             <w:pPr>
               <w:jc w:val="center"/>
+              <w:cnfStyle w:val="100000000000" w:firstRow="1" w:lastRow="0" w:firstColumn="0" w:lastColumn="0" w:oddVBand="0" w:evenVBand="0" w:oddHBand="0" w:evenHBand="0" w:firstRowFirstColumn="0" w:firstRowLastColumn="0" w:lastRowFirstColumn="0" w:lastRowLastColumn="0"/>
             </w:pPr>
             <w:r>
               <w:t>Justificativa</w:t>
@@ -25104,6 +25213,7 @@
         </w:trPr>
         <w:tc>
           <w:tcPr>
+            <w:cnfStyle w:val="001000000000" w:firstRow="0" w:lastRow="0" w:firstColumn="1" w:lastColumn="0" w:oddVBand="0" w:evenVBand="0" w:oddHBand="0" w:evenHBand="0" w:firstRowFirstColumn="0" w:firstRowLastColumn="0" w:lastRowFirstColumn="0" w:lastRowLastColumn="0"/>
             <w:tcW w:w="1837" w:type="dxa"/>
             <w:tcBorders>
               <w:top w:val="single" w:sz="4" w:space="0" w:color="8EAADB"/>
@@ -25114,7 +25224,6 @@
           </w:tcPr>
           <w:p>
             <w:pPr>
-              <w:cnfStyle w:val="001000100000" w:firstRow="0" w:lastRow="0" w:firstColumn="1" w:lastColumn="0" w:oddVBand="0" w:evenVBand="0" w:oddHBand="1" w:evenHBand="0" w:firstRowFirstColumn="0" w:firstRowLastColumn="0" w:lastRowFirstColumn="0" w:lastRowLastColumn="0"/>
               <w:rPr>
                 <w:lang w:val="en-US"/>
               </w:rPr>
@@ -25147,6 +25256,7 @@
       <w:tr>
         <w:tc>
           <w:tcPr>
+            <w:cnfStyle w:val="001000000000" w:firstRow="0" w:lastRow="0" w:firstColumn="1" w:lastColumn="0" w:oddVBand="0" w:evenVBand="0" w:oddHBand="0" w:evenHBand="0" w:firstRowFirstColumn="0" w:firstRowLastColumn="0" w:lastRowFirstColumn="0" w:lastRowLastColumn="0"/>
             <w:tcW w:w="1837" w:type="dxa"/>
             <w:tcBorders>
               <w:top w:val="single" w:sz="4" w:space="0" w:color="8EAADB"/>
@@ -25156,9 +25266,6 @@
             </w:tcBorders>
           </w:tcPr>
           <w:p>
-            <w:pPr>
-              <w:cnfStyle w:val="001000000000" w:firstRow="0" w:lastRow="0" w:firstColumn="1" w:lastColumn="0" w:oddVBand="0" w:evenVBand="0" w:oddHBand="0" w:evenHBand="0" w:firstRowFirstColumn="0" w:firstRowLastColumn="0" w:lastRowFirstColumn="0" w:lastRowLastColumn="0"/>
-            </w:pPr>
             <w:proofErr w:type="gramStart"/>
             <w:r>
               <w:t xml:space="preserve">{{ </w:t>
@@ -25188,6 +25295,7 @@
           <w:p>
             <w:pPr>
               <w:jc w:val="center"/>
+              <w:cnfStyle w:val="000000000000" w:firstRow="0" w:lastRow="0" w:firstColumn="0" w:lastColumn="0" w:oddVBand="0" w:evenVBand="0" w:oddHBand="0" w:evenHBand="0" w:firstRowFirstColumn="0" w:firstRowLastColumn="0" w:lastRowFirstColumn="0" w:lastRowLastColumn="0"/>
             </w:pPr>
             <w:proofErr w:type="gramStart"/>
             <w:r>
@@ -25218,6 +25326,7 @@
           <w:p>
             <w:pPr>
               <w:jc w:val="center"/>
+              <w:cnfStyle w:val="000000000000" w:firstRow="0" w:lastRow="0" w:firstColumn="0" w:lastColumn="0" w:oddVBand="0" w:evenVBand="0" w:oddHBand="0" w:evenHBand="0" w:firstRowFirstColumn="0" w:firstRowLastColumn="0" w:lastRowFirstColumn="0" w:lastRowLastColumn="0"/>
             </w:pPr>
             <w:proofErr w:type="gramStart"/>
             <w:r>
@@ -25245,6 +25354,9 @@
             </w:tcBorders>
           </w:tcPr>
           <w:p>
+            <w:pPr>
+              <w:cnfStyle w:val="000000000000" w:firstRow="0" w:lastRow="0" w:firstColumn="0" w:lastColumn="0" w:oddVBand="0" w:evenVBand="0" w:oddHBand="0" w:evenHBand="0" w:firstRowFirstColumn="0" w:firstRowLastColumn="0" w:lastRowFirstColumn="0" w:lastRowLastColumn="0"/>
+            </w:pPr>
             <w:proofErr w:type="gramStart"/>
             <w:r>
               <w:t xml:space="preserve">{{ </w:t>
@@ -25275,6 +25387,7 @@
         </w:trPr>
         <w:tc>
           <w:tcPr>
+            <w:cnfStyle w:val="001000000000" w:firstRow="0" w:lastRow="0" w:firstColumn="1" w:lastColumn="0" w:oddVBand="0" w:evenVBand="0" w:oddHBand="0" w:evenHBand="0" w:firstRowFirstColumn="0" w:firstRowLastColumn="0" w:lastRowFirstColumn="0" w:lastRowLastColumn="0"/>
             <w:tcW w:w="1837" w:type="dxa"/>
             <w:tcBorders>
               <w:top w:val="single" w:sz="4" w:space="0" w:color="8EAADB"/>
@@ -25286,7 +25399,6 @@
           <w:p>
             <w:pPr>
               <w:keepNext/>
-              <w:cnfStyle w:val="001000100000" w:firstRow="0" w:lastRow="0" w:firstColumn="1" w:lastColumn="0" w:oddVBand="0" w:evenVBand="0" w:oddHBand="1" w:evenHBand="0" w:firstRowFirstColumn="0" w:firstRowLastColumn="0" w:lastRowFirstColumn="0" w:lastRowLastColumn="0"/>
             </w:pPr>
             <w:r>
               <w:rPr>
@@ -26114,7 +26226,7 @@
             </wp:anchor>
           </w:drawing>
         </mc:Choice>
-        <mc:Fallback xmlns:sl="http://schemas.openxmlformats.org/schemaLibrary/2006/main" xmlns:a="http://schemas.openxmlformats.org/drawingml/2006/main" xmlns:pic="http://schemas.openxmlformats.org/drawingml/2006/picture" xmlns:c="http://schemas.openxmlformats.org/drawingml/2006/chart" xmlns:lc="http://schemas.openxmlformats.org/drawingml/2006/lockedCanvas" xmlns:dgm="http://schemas.openxmlformats.org/drawingml/2006/diagram" xmlns="http://schemas.microsoft.com/office/tasks/2019/documenttasks" xmlns:cr="http://schemas.microsoft.com/office/comments/2020/reactions" xmlns:arto="http://schemas.microsoft.com/office/word/2006/arto">
+        <mc:Fallback xmlns:arto="http://schemas.microsoft.com/office/word/2006/arto" xmlns:cr="http://schemas.microsoft.com/office/comments/2020/reactions" xmlns="http://schemas.microsoft.com/office/tasks/2019/documenttasks" xmlns:dgm="http://schemas.openxmlformats.org/drawingml/2006/diagram" xmlns:lc="http://schemas.openxmlformats.org/drawingml/2006/lockedCanvas" xmlns:c="http://schemas.openxmlformats.org/drawingml/2006/chart" xmlns:pic="http://schemas.openxmlformats.org/drawingml/2006/picture" xmlns:a="http://schemas.openxmlformats.org/drawingml/2006/main" xmlns:sl="http://schemas.openxmlformats.org/schemaLibrary/2006/main">
           <w:drawing>
             <wp:anchor allowOverlap="1" behindDoc="0" distB="4294967295" distT="4294967295" distL="114300" distR="114300" hidden="0" layoutInCell="1" locked="0" relativeHeight="0" simplePos="0">
               <wp:simplePos x="0" y="0"/>
@@ -28507,22 +28619,24 @@
     <w:basedOn w:val="Normal"/>
     <w:next w:val="Normal"/>
     <w:link w:val="Ttulo4Char"/>
+    <w:autoRedefine/>
     <w:uiPriority w:val="9"/>
     <w:semiHidden/>
     <w:unhideWhenUsed/>
     <w:qFormat/>
-    <w:rsid w:val="00B64DE8"/>
+    <w:rsid w:val="00F018C0"/>
     <w:pPr>
       <w:keepNext/>
       <w:keepLines/>
-      <w:spacing w:before="40"/>
+      <w:spacing w:before="60" w:after="60"/>
+      <w:ind w:firstLine="0"/>
       <w:outlineLvl w:val="3"/>
     </w:pPr>
     <w:rPr>
-      <w:rFonts w:asciiTheme="majorHAnsi" w:eastAsiaTheme="majorEastAsia" w:hAnsiTheme="majorHAnsi" w:cstheme="majorBidi"/>
-      <w:i/>
+      <w:rFonts w:eastAsiaTheme="majorEastAsia" w:cstheme="majorBidi"/>
+      <w:b/>
       <w:iCs/>
-      <w:color w:val="2F5496" w:themeColor="accent1" w:themeShade="BF"/>
+      <w:color w:val="000000" w:themeColor="text1"/>
     </w:rPr>
   </w:style>
   <w:style w:type="paragraph" w:styleId="Ttulo5">
@@ -29134,14 +29248,14 @@
     <w:basedOn w:val="Fontepargpadro"/>
     <w:link w:val="Ttulo4"/>
     <w:uiPriority w:val="9"/>
-    <w:rsid w:val="00B64DE8"/>
+    <w:semiHidden/>
+    <w:rsid w:val="00F018C0"/>
     <w:rPr>
-      <w:rFonts w:asciiTheme="majorHAnsi" w:eastAsiaTheme="majorEastAsia" w:hAnsiTheme="majorHAnsi" w:cstheme="majorBidi"/>
-      <w:i/>
+      <w:rFonts w:ascii="Arial" w:eastAsiaTheme="majorEastAsia" w:hAnsi="Arial" w:cstheme="majorBidi"/>
+      <w:b/>
       <w:iCs/>
-      <w:color w:val="2F5496" w:themeColor="accent1" w:themeShade="BF"/>
-      <w:sz w:val="20"/>
-      <w:szCs w:val="20"/>
+      <w:color w:val="000000" w:themeColor="text1"/>
+      <w:sz w:val="22"/>
     </w:rPr>
   </w:style>
   <w:style w:type="character" w:styleId="MenoPendente">
@@ -30421,10 +30535,6 @@
 </file>
 
 <file path=customXml/item1.xml><?xml version="1.0" encoding="utf-8"?>
-<b:Sources xmlns:b="http://schemas.openxmlformats.org/officeDocument/2006/bibliography" xmlns="http://schemas.openxmlformats.org/officeDocument/2006/bibliography" SelectedStyle="\IEEE2006OfficeOnline.xsl" StyleName="IEEE" Version="2006"/>
-</file>
-
-<file path=customXml/item2.xml><?xml version="1.0" encoding="utf-8"?>
 <?mso-contentType ?>
 <FormTemplates xmlns="http://schemas.microsoft.com/sharepoint/v3/contenttype/forms">
   <Display>DocumentLibraryForm</Display>
@@ -30433,10 +30543,14 @@
 </FormTemplates>
 </file>
 
+<file path=customXml/item2.xml><?xml version="1.0" encoding="utf-8"?>
+<b:Sources xmlns:b="http://schemas.openxmlformats.org/officeDocument/2006/bibliography" xmlns="http://schemas.openxmlformats.org/officeDocument/2006/bibliography" SelectedStyle="\IEEE2006OfficeOnline.xsl" StyleName="IEEE" Version="2006"/>
+</file>
+
 <file path=customXml/item3.xml><?xml version="1.0" encoding="utf-8"?>
-<p:properties xmlns:p="http://schemas.microsoft.com/office/2006/metadata/properties" xmlns:xsi="http://www.w3.org/2001/XMLSchema-instance" xmlns:pc="http://schemas.microsoft.com/office/infopath/2007/PartnerControls">
-  <documentManagement/>
-</p:properties>
+<go:gDocsCustomXmlDataStorage xmlns:go="http://customooxmlschemas.google.com/" xmlns:r="http://schemas.openxmlformats.org/officeDocument/2006/relationships" uri="GoogleDocsCustomDataVersion2">
+  <go:docsCustomData xmlns:go="http://customooxmlschemas.google.com/" roundtripDataSignature="AMtx7mjzI106X9uAE8/Y55RY9OBdAi8ivg==">CgMxLjAyDmgudjQ3dmlndW96M2NoOAByITFORk1la3hqN2NRcXFyekp4UWdmNjB6ZEVHWWlnbk9FQg==</go:docsCustomData>
+</go:gDocsCustomXmlDataStorage>
 </file>
 
 <file path=customXml/item4.xml><?xml version="1.0" encoding="utf-8"?>
@@ -30584,12 +30698,20 @@
 </file>
 
 <file path=customXml/item5.xml><?xml version="1.0" encoding="utf-8"?>
-<go:gDocsCustomXmlDataStorage xmlns:go="http://customooxmlschemas.google.com/" xmlns:r="http://schemas.openxmlformats.org/officeDocument/2006/relationships" uri="GoogleDocsCustomDataVersion2">
-  <go:docsCustomData xmlns:go="http://customooxmlschemas.google.com/" roundtripDataSignature="AMtx7mjzI106X9uAE8/Y55RY9OBdAi8ivg==">CgMxLjAyDmgudjQ3dmlndW96M2NoOAByITFORk1la3hqN2NRcXFyekp4UWdmNjB6ZEVHWWlnbk9FQg==</go:docsCustomData>
-</go:gDocsCustomXmlDataStorage>
+<p:properties xmlns:p="http://schemas.microsoft.com/office/2006/metadata/properties" xmlns:xsi="http://www.w3.org/2001/XMLSchema-instance" xmlns:pc="http://schemas.microsoft.com/office/infopath/2007/PartnerControls">
+  <documentManagement/>
+</p:properties>
 </file>
 
 <file path=customXml/itemProps1.xml><?xml version="1.0" encoding="utf-8"?>
+<ds:datastoreItem xmlns:ds="http://schemas.openxmlformats.org/officeDocument/2006/customXml" ds:itemID="{E8CD7CA6-34CB-4CBB-9D2A-B78A43F31D57}">
+  <ds:schemaRefs>
+    <ds:schemaRef ds:uri="http://schemas.microsoft.com/sharepoint/v3/contenttype/forms"/>
+  </ds:schemaRefs>
+</ds:datastoreItem>
+</file>
+
+<file path=customXml/itemProps2.xml><?xml version="1.0" encoding="utf-8"?>
 <ds:datastoreItem xmlns:ds="http://schemas.openxmlformats.org/officeDocument/2006/customXml" ds:itemID="{983658B0-B94E-4C2C-B45C-2F06A54F1409}">
   <ds:schemaRefs>
     <ds:schemaRef ds:uri="http://schemas.openxmlformats.org/officeDocument/2006/bibliography"/>
@@ -30597,19 +30719,11 @@
 </ds:datastoreItem>
 </file>
 
-<file path=customXml/itemProps2.xml><?xml version="1.0" encoding="utf-8"?>
-<ds:datastoreItem xmlns:ds="http://schemas.openxmlformats.org/officeDocument/2006/customXml" ds:itemID="{E8CD7CA6-34CB-4CBB-9D2A-B78A43F31D57}">
+<file path=customXml/itemProps3.xml><?xml version="1.0" encoding="utf-8"?>
+<ds:datastoreItem xmlns:ds="http://schemas.openxmlformats.org/officeDocument/2006/customXml" ds:itemID="{11111111-1234-1234-1234-123412341234}">
   <ds:schemaRefs>
-    <ds:schemaRef ds:uri="http://schemas.microsoft.com/sharepoint/v3/contenttype/forms"/>
-  </ds:schemaRefs>
-</ds:datastoreItem>
-</file>
-
-<file path=customXml/itemProps3.xml><?xml version="1.0" encoding="utf-8"?>
-<ds:datastoreItem xmlns:ds="http://schemas.openxmlformats.org/officeDocument/2006/customXml" ds:itemID="{64F7848B-4C6F-4348-B4B7-5F5BA7D9C422}">
-  <ds:schemaRefs>
-    <ds:schemaRef ds:uri="http://schemas.microsoft.com/office/2006/metadata/properties"/>
-    <ds:schemaRef ds:uri="http://schemas.microsoft.com/office/infopath/2007/PartnerControls"/>
+    <ds:schemaRef ds:uri="http://customooxmlschemas.google.com/"/>
+    <ds:schemaRef ds:uri="http://schemas.openxmlformats.org/officeDocument/2006/relationships"/>
   </ds:schemaRefs>
 </ds:datastoreItem>
 </file>
@@ -30633,10 +30747,10 @@
 </file>
 
 <file path=customXml/itemProps5.xml><?xml version="1.0" encoding="utf-8"?>
-<ds:datastoreItem xmlns:ds="http://schemas.openxmlformats.org/officeDocument/2006/customXml" ds:itemID="{11111111-1234-1234-1234-123412341234}">
+<ds:datastoreItem xmlns:ds="http://schemas.openxmlformats.org/officeDocument/2006/customXml" ds:itemID="{64F7848B-4C6F-4348-B4B7-5F5BA7D9C422}">
   <ds:schemaRefs>
-    <ds:schemaRef ds:uri="http://customooxmlschemas.google.com/"/>
-    <ds:schemaRef ds:uri="http://schemas.openxmlformats.org/officeDocument/2006/relationships"/>
+    <ds:schemaRef ds:uri="http://schemas.microsoft.com/office/2006/metadata/properties"/>
+    <ds:schemaRef ds:uri="http://schemas.microsoft.com/office/infopath/2007/PartnerControls"/>
   </ds:schemaRefs>
 </ds:datastoreItem>
 </file>
</xml_diff>

<commit_message>
Feat: Support multiple MD templates and rich context columns
- Enable uploading multiple markdown template files in 'Gera Relatórios Individuais'.
- Implement automatic consolidation of templates using Jinja2 include syntax.
- Add automatic detection of the base template file based on include count.
- Process context columns ending in '*' as Python literals using ast.literal_eval.
- Add UI documentation for the new context and template features.
</commit_message>
<xml_diff>
--- a/docs/template-relatorio-individual.docx
+++ b/docs/template-relatorio-individual.docx
@@ -26226,7 +26226,7 @@
             </wp:anchor>
           </w:drawing>
         </mc:Choice>
-        <mc:Fallback xmlns:arto="http://schemas.microsoft.com/office/word/2006/arto" xmlns:cr="http://schemas.microsoft.com/office/comments/2020/reactions" xmlns="http://schemas.microsoft.com/office/tasks/2019/documenttasks" xmlns:dgm="http://schemas.openxmlformats.org/drawingml/2006/diagram" xmlns:lc="http://schemas.openxmlformats.org/drawingml/2006/lockedCanvas" xmlns:c="http://schemas.openxmlformats.org/drawingml/2006/chart" xmlns:pic="http://schemas.openxmlformats.org/drawingml/2006/picture" xmlns:a="http://schemas.openxmlformats.org/drawingml/2006/main" xmlns:sl="http://schemas.openxmlformats.org/schemaLibrary/2006/main">
+        <mc:Fallback xmlns:sl="http://schemas.openxmlformats.org/schemaLibrary/2006/main" xmlns:a="http://schemas.openxmlformats.org/drawingml/2006/main" xmlns:pic="http://schemas.openxmlformats.org/drawingml/2006/picture" xmlns:c="http://schemas.openxmlformats.org/drawingml/2006/chart" xmlns:lc="http://schemas.openxmlformats.org/drawingml/2006/lockedCanvas" xmlns:dgm="http://schemas.openxmlformats.org/drawingml/2006/diagram" xmlns="http://schemas.microsoft.com/office/tasks/2019/documenttasks" xmlns:cr="http://schemas.microsoft.com/office/comments/2020/reactions" xmlns:arto="http://schemas.microsoft.com/office/word/2006/arto">
           <w:drawing>
             <wp:anchor allowOverlap="1" behindDoc="0" distB="4294967295" distT="4294967295" distL="114300" distR="114300" hidden="0" layoutInCell="1" locked="0" relativeHeight="0" simplePos="0">
               <wp:simplePos x="0" y="0"/>
@@ -28624,7 +28624,7 @@
     <w:semiHidden/>
     <w:unhideWhenUsed/>
     <w:qFormat/>
-    <w:rsid w:val="00F018C0"/>
+    <w:rsid w:val="007D7507"/>
     <w:pPr>
       <w:keepNext/>
       <w:keepLines/>
@@ -28637,6 +28637,7 @@
       <w:b/>
       <w:iCs/>
       <w:color w:val="000000" w:themeColor="text1"/>
+      <w:sz w:val="24"/>
     </w:rPr>
   </w:style>
   <w:style w:type="paragraph" w:styleId="Ttulo5">
@@ -29249,13 +29250,13 @@
     <w:link w:val="Ttulo4"/>
     <w:uiPriority w:val="9"/>
     <w:semiHidden/>
-    <w:rsid w:val="00F018C0"/>
+    <w:rsid w:val="007D7507"/>
     <w:rPr>
       <w:rFonts w:ascii="Arial" w:eastAsiaTheme="majorEastAsia" w:hAnsi="Arial" w:cstheme="majorBidi"/>
       <w:b/>
       <w:iCs/>
       <w:color w:val="000000" w:themeColor="text1"/>
-      <w:sz w:val="22"/>
+      <w:sz w:val="24"/>
     </w:rPr>
   </w:style>
   <w:style w:type="character" w:styleId="MenoPendente">
@@ -30535,6 +30536,10 @@
 </file>
 
 <file path=customXml/item1.xml><?xml version="1.0" encoding="utf-8"?>
+<b:Sources xmlns:b="http://schemas.openxmlformats.org/officeDocument/2006/bibliography" xmlns="http://schemas.openxmlformats.org/officeDocument/2006/bibliography" SelectedStyle="\IEEE2006OfficeOnline.xsl" StyleName="IEEE" Version="2006"/>
+</file>
+
+<file path=customXml/item2.xml><?xml version="1.0" encoding="utf-8"?>
 <?mso-contentType ?>
 <FormTemplates xmlns="http://schemas.microsoft.com/sharepoint/v3/contenttype/forms">
   <Display>DocumentLibraryForm</Display>
@@ -30543,14 +30548,10 @@
 </FormTemplates>
 </file>
 
-<file path=customXml/item2.xml><?xml version="1.0" encoding="utf-8"?>
-<b:Sources xmlns:b="http://schemas.openxmlformats.org/officeDocument/2006/bibliography" xmlns="http://schemas.openxmlformats.org/officeDocument/2006/bibliography" SelectedStyle="\IEEE2006OfficeOnline.xsl" StyleName="IEEE" Version="2006"/>
-</file>
-
 <file path=customXml/item3.xml><?xml version="1.0" encoding="utf-8"?>
-<go:gDocsCustomXmlDataStorage xmlns:go="http://customooxmlschemas.google.com/" xmlns:r="http://schemas.openxmlformats.org/officeDocument/2006/relationships" uri="GoogleDocsCustomDataVersion2">
-  <go:docsCustomData xmlns:go="http://customooxmlschemas.google.com/" roundtripDataSignature="AMtx7mjzI106X9uAE8/Y55RY9OBdAi8ivg==">CgMxLjAyDmgudjQ3dmlndW96M2NoOAByITFORk1la3hqN2NRcXFyekp4UWdmNjB6ZEVHWWlnbk9FQg==</go:docsCustomData>
-</go:gDocsCustomXmlDataStorage>
+<p:properties xmlns:p="http://schemas.microsoft.com/office/2006/metadata/properties" xmlns:xsi="http://www.w3.org/2001/XMLSchema-instance" xmlns:pc="http://schemas.microsoft.com/office/infopath/2007/PartnerControls">
+  <documentManagement/>
+</p:properties>
 </file>
 
 <file path=customXml/item4.xml><?xml version="1.0" encoding="utf-8"?>
@@ -30698,12 +30699,20 @@
 </file>
 
 <file path=customXml/item5.xml><?xml version="1.0" encoding="utf-8"?>
-<p:properties xmlns:p="http://schemas.microsoft.com/office/2006/metadata/properties" xmlns:xsi="http://www.w3.org/2001/XMLSchema-instance" xmlns:pc="http://schemas.microsoft.com/office/infopath/2007/PartnerControls">
-  <documentManagement/>
-</p:properties>
+<go:gDocsCustomXmlDataStorage xmlns:go="http://customooxmlschemas.google.com/" xmlns:r="http://schemas.openxmlformats.org/officeDocument/2006/relationships" uri="GoogleDocsCustomDataVersion2">
+  <go:docsCustomData xmlns:go="http://customooxmlschemas.google.com/" roundtripDataSignature="AMtx7mjzI106X9uAE8/Y55RY9OBdAi8ivg==">CgMxLjAyDmgudjQ3dmlndW96M2NoOAByITFORk1la3hqN2NRcXFyekp4UWdmNjB6ZEVHWWlnbk9FQg==</go:docsCustomData>
+</go:gDocsCustomXmlDataStorage>
 </file>
 
 <file path=customXml/itemProps1.xml><?xml version="1.0" encoding="utf-8"?>
+<ds:datastoreItem xmlns:ds="http://schemas.openxmlformats.org/officeDocument/2006/customXml" ds:itemID="{983658B0-B94E-4C2C-B45C-2F06A54F1409}">
+  <ds:schemaRefs>
+    <ds:schemaRef ds:uri="http://schemas.openxmlformats.org/officeDocument/2006/bibliography"/>
+  </ds:schemaRefs>
+</ds:datastoreItem>
+</file>
+
+<file path=customXml/itemProps2.xml><?xml version="1.0" encoding="utf-8"?>
 <ds:datastoreItem xmlns:ds="http://schemas.openxmlformats.org/officeDocument/2006/customXml" ds:itemID="{E8CD7CA6-34CB-4CBB-9D2A-B78A43F31D57}">
   <ds:schemaRefs>
     <ds:schemaRef ds:uri="http://schemas.microsoft.com/sharepoint/v3/contenttype/forms"/>
@@ -30711,19 +30720,11 @@
 </ds:datastoreItem>
 </file>
 
-<file path=customXml/itemProps2.xml><?xml version="1.0" encoding="utf-8"?>
-<ds:datastoreItem xmlns:ds="http://schemas.openxmlformats.org/officeDocument/2006/customXml" ds:itemID="{983658B0-B94E-4C2C-B45C-2F06A54F1409}">
+<file path=customXml/itemProps3.xml><?xml version="1.0" encoding="utf-8"?>
+<ds:datastoreItem xmlns:ds="http://schemas.openxmlformats.org/officeDocument/2006/customXml" ds:itemID="{64F7848B-4C6F-4348-B4B7-5F5BA7D9C422}">
   <ds:schemaRefs>
-    <ds:schemaRef ds:uri="http://schemas.openxmlformats.org/officeDocument/2006/bibliography"/>
-  </ds:schemaRefs>
-</ds:datastoreItem>
-</file>
-
-<file path=customXml/itemProps3.xml><?xml version="1.0" encoding="utf-8"?>
-<ds:datastoreItem xmlns:ds="http://schemas.openxmlformats.org/officeDocument/2006/customXml" ds:itemID="{11111111-1234-1234-1234-123412341234}">
-  <ds:schemaRefs>
-    <ds:schemaRef ds:uri="http://customooxmlschemas.google.com/"/>
-    <ds:schemaRef ds:uri="http://schemas.openxmlformats.org/officeDocument/2006/relationships"/>
+    <ds:schemaRef ds:uri="http://schemas.microsoft.com/office/2006/metadata/properties"/>
+    <ds:schemaRef ds:uri="http://schemas.microsoft.com/office/infopath/2007/PartnerControls"/>
   </ds:schemaRefs>
 </ds:datastoreItem>
 </file>
@@ -30747,10 +30748,10 @@
 </file>
 
 <file path=customXml/itemProps5.xml><?xml version="1.0" encoding="utf-8"?>
-<ds:datastoreItem xmlns:ds="http://schemas.openxmlformats.org/officeDocument/2006/customXml" ds:itemID="{64F7848B-4C6F-4348-B4B7-5F5BA7D9C422}">
+<ds:datastoreItem xmlns:ds="http://schemas.openxmlformats.org/officeDocument/2006/customXml" ds:itemID="{11111111-1234-1234-1234-123412341234}">
   <ds:schemaRefs>
-    <ds:schemaRef ds:uri="http://schemas.microsoft.com/office/2006/metadata/properties"/>
-    <ds:schemaRef ds:uri="http://schemas.microsoft.com/office/infopath/2007/PartnerControls"/>
+    <ds:schemaRef ds:uri="http://customooxmlschemas.google.com/"/>
+    <ds:schemaRef ds:uri="http://schemas.openxmlformats.org/officeDocument/2006/relationships"/>
   </ds:schemaRefs>
 </ds:datastoreItem>
 </file>
</xml_diff>

<commit_message>
remocao de pixel no template
</commit_message>
<xml_diff>
--- a/docs/template-relatorio-individual.docx
+++ b/docs/template-relatorio-individual.docx
@@ -1357,7 +1357,6 @@
             </w:pPr>
             <w:proofErr w:type="spellStart"/>
             <w:r>
-              <w:lastRenderedPageBreak/>
               <w:t>Coluna</w:t>
             </w:r>
             <w:proofErr w:type="spellEnd"/>
@@ -1508,6 +1507,7 @@
               <w:pStyle w:val="Compact"/>
             </w:pPr>
             <w:r>
+              <w:lastRenderedPageBreak/>
               <w:t>4</w:t>
             </w:r>
           </w:p>
@@ -1889,54 +1889,54 @@
         <w:pStyle w:val="Ttulo2"/>
       </w:pPr>
       <w:r>
+        <w:t xml:space="preserve">2.1. </w:t>
+      </w:r>
+      <w:r>
+        <w:t xml:space="preserve">Cenário </w:t>
+      </w:r>
+      <w:r>
+        <w:t>Geral</w:t>
+      </w:r>
+    </w:p>
+    <w:p>
+      <w:pPr>
+        <w:ind w:firstLine="709"/>
+        <w:rPr>
+          <w:rFonts w:eastAsia="Arial" w:cs="Arial"/>
+          <w:szCs w:val="24"/>
+        </w:rPr>
+      </w:pPr>
+      <w:r>
+        <w:rPr>
+          <w:rFonts w:eastAsia="Arial" w:cs="Arial"/>
+          <w:szCs w:val="24"/>
+        </w:rPr>
+        <w:t xml:space="preserve">Nessa feita, apresenta-se na Figura </w:t>
+      </w:r>
+      <w:r>
+        <w:rPr>
+          <w:rFonts w:eastAsia="Arial" w:cs="Arial"/>
+          <w:szCs w:val="24"/>
+        </w:rPr>
+        <w:t>3</w:t>
+      </w:r>
+      <w:r>
+        <w:rPr>
+          <w:rFonts w:eastAsia="Arial" w:cs="Arial"/>
+          <w:szCs w:val="24"/>
+        </w:rPr>
+        <w:t xml:space="preserve"> a consolidação da distribuição dos níveis de maturidade das organizações auditadas.</w:t>
+      </w:r>
+    </w:p>
+    <w:p>
+      <w:pPr>
+        <w:pStyle w:val="Legenda"/>
+      </w:pPr>
+      <w:r>
+        <w:rPr>
+          <w:noProof/>
+        </w:rPr>
         <w:lastRenderedPageBreak/>
-        <w:t xml:space="preserve">2.1. </w:t>
-      </w:r>
-      <w:r>
-        <w:t xml:space="preserve">Cenário </w:t>
-      </w:r>
-      <w:r>
-        <w:t>Geral</w:t>
-      </w:r>
-    </w:p>
-    <w:p>
-      <w:pPr>
-        <w:ind w:firstLine="709"/>
-        <w:rPr>
-          <w:rFonts w:eastAsia="Arial" w:cs="Arial"/>
-          <w:szCs w:val="24"/>
-        </w:rPr>
-      </w:pPr>
-      <w:r>
-        <w:rPr>
-          <w:rFonts w:eastAsia="Arial" w:cs="Arial"/>
-          <w:szCs w:val="24"/>
-        </w:rPr>
-        <w:t xml:space="preserve">Nessa feita, apresenta-se na Figura </w:t>
-      </w:r>
-      <w:r>
-        <w:rPr>
-          <w:rFonts w:eastAsia="Arial" w:cs="Arial"/>
-          <w:szCs w:val="24"/>
-        </w:rPr>
-        <w:t>3</w:t>
-      </w:r>
-      <w:r>
-        <w:rPr>
-          <w:rFonts w:eastAsia="Arial" w:cs="Arial"/>
-          <w:szCs w:val="24"/>
-        </w:rPr>
-        <w:t xml:space="preserve"> a consolidação da distribuição dos níveis de maturidade das organizações auditadas.</w:t>
-      </w:r>
-    </w:p>
-    <w:p>
-      <w:pPr>
-        <w:pStyle w:val="Legenda"/>
-      </w:pPr>
-      <w:r>
-        <w:rPr>
-          <w:noProof/>
-        </w:rPr>
         <w:drawing>
           <wp:inline distT="0" distB="0" distL="0" distR="0" wp14:anchorId="0D8C7B0A" wp14:editId="15FF6F15">
             <wp:extent cx="5760085" cy="2826849"/>
@@ -2206,7 +2206,6 @@
         <w:rPr>
           <w:rFonts w:eastAsia="Arial"/>
         </w:rPr>
-        <w:lastRenderedPageBreak/>
         <w:t>Observando o cenário geral de adoção dos controles de medidas básicas de segurança da informação e segurança cibernética</w:t>
       </w:r>
       <w:r>
@@ -2327,6 +2326,7 @@
         <w:rPr>
           <w:noProof/>
         </w:rPr>
+        <w:lastRenderedPageBreak/>
         <w:drawing>
           <wp:inline distT="0" distB="0" distL="0" distR="0" wp14:anchorId="4C4EA44E" wp14:editId="6600DD53">
             <wp:extent cx="5760085" cy="3326130"/>
@@ -3027,81 +3027,81 @@
         <w:rPr>
           <w:rFonts w:eastAsia="Arial"/>
         </w:rPr>
+        <w:t>2.2.1. Controle 00 – Estrutura de Segurança da Informação</w:t>
+      </w:r>
+    </w:p>
+    <w:p>
+      <w:pPr>
+        <w:ind w:firstLine="709"/>
+        <w:rPr>
+          <w:rFonts w:eastAsia="Arial" w:cs="Arial"/>
+          <w:szCs w:val="24"/>
+        </w:rPr>
+      </w:pPr>
+      <w:r>
+        <w:rPr>
+          <w:rFonts w:eastAsia="Arial" w:cs="Arial"/>
+          <w:szCs w:val="24"/>
+        </w:rPr>
+        <w:t xml:space="preserve">Este controle </w:t>
+      </w:r>
+      <w:r>
+        <w:rPr>
+          <w:rFonts w:eastAsia="Arial" w:cs="Arial"/>
+          <w:szCs w:val="24"/>
+        </w:rPr>
+        <w:t xml:space="preserve">verifica </w:t>
+      </w:r>
+      <w:r>
+        <w:rPr>
+          <w:rFonts w:eastAsia="Arial" w:cs="Arial"/>
+          <w:szCs w:val="24"/>
+        </w:rPr>
+        <w:t xml:space="preserve">a </w:t>
+      </w:r>
+      <w:r>
+        <w:rPr>
+          <w:rFonts w:eastAsia="Arial" w:cs="Arial"/>
+          <w:szCs w:val="24"/>
+        </w:rPr>
+        <w:t xml:space="preserve">existência de uma estrutura organizacional </w:t>
+      </w:r>
+      <w:r>
+        <w:rPr>
+          <w:rFonts w:eastAsia="Arial" w:cs="Arial"/>
+          <w:szCs w:val="24"/>
+        </w:rPr>
+        <w:t xml:space="preserve">atuante </w:t>
+      </w:r>
+      <w:r>
+        <w:rPr>
+          <w:rFonts w:eastAsia="Arial" w:cs="Arial"/>
+          <w:szCs w:val="24"/>
+        </w:rPr>
+        <w:t xml:space="preserve">que </w:t>
+      </w:r>
+      <w:r>
+        <w:rPr>
+          <w:rFonts w:eastAsia="Arial" w:cs="Arial"/>
+          <w:szCs w:val="24"/>
+        </w:rPr>
+        <w:t>defina papéis e responsabilidades em segurança da informação. Essa estrutura formal e operacional demonstra o comprometimento da Alta administração com o tema e com as práticas de gestão de riscos necessárias para assegurar a confidencialidade, integridade e disponibilidade esperada das informações.</w:t>
+      </w:r>
+    </w:p>
+    <w:p>
+      <w:pPr>
+        <w:ind w:firstLine="709"/>
+        <w:rPr>
+          <w:rFonts w:eastAsia="Arial" w:cs="Arial"/>
+          <w:szCs w:val="24"/>
+        </w:rPr>
+      </w:pPr>
+      <w:r>
+        <w:rPr>
+          <w:rFonts w:eastAsia="Arial" w:cs="Arial"/>
+          <w:szCs w:val="24"/>
+        </w:rPr>
         <w:lastRenderedPageBreak/>
-        <w:t>2.2.1. Controle 00 – Estrutura de Segurança da Informação</w:t>
-      </w:r>
-    </w:p>
-    <w:p>
-      <w:pPr>
-        <w:ind w:firstLine="709"/>
-        <w:rPr>
-          <w:rFonts w:eastAsia="Arial" w:cs="Arial"/>
-          <w:szCs w:val="24"/>
-        </w:rPr>
-      </w:pPr>
-      <w:r>
-        <w:rPr>
-          <w:rFonts w:eastAsia="Arial" w:cs="Arial"/>
-          <w:szCs w:val="24"/>
-        </w:rPr>
-        <w:t xml:space="preserve">Este controle </w:t>
-      </w:r>
-      <w:r>
-        <w:rPr>
-          <w:rFonts w:eastAsia="Arial" w:cs="Arial"/>
-          <w:szCs w:val="24"/>
-        </w:rPr>
-        <w:t xml:space="preserve">verifica </w:t>
-      </w:r>
-      <w:r>
-        <w:rPr>
-          <w:rFonts w:eastAsia="Arial" w:cs="Arial"/>
-          <w:szCs w:val="24"/>
-        </w:rPr>
-        <w:t xml:space="preserve">a </w:t>
-      </w:r>
-      <w:r>
-        <w:rPr>
-          <w:rFonts w:eastAsia="Arial" w:cs="Arial"/>
-          <w:szCs w:val="24"/>
-        </w:rPr>
-        <w:t xml:space="preserve">existência de uma estrutura organizacional </w:t>
-      </w:r>
-      <w:r>
-        <w:rPr>
-          <w:rFonts w:eastAsia="Arial" w:cs="Arial"/>
-          <w:szCs w:val="24"/>
-        </w:rPr>
-        <w:t xml:space="preserve">atuante </w:t>
-      </w:r>
-      <w:r>
-        <w:rPr>
-          <w:rFonts w:eastAsia="Arial" w:cs="Arial"/>
-          <w:szCs w:val="24"/>
-        </w:rPr>
-        <w:t xml:space="preserve">que </w:t>
-      </w:r>
-      <w:r>
-        <w:rPr>
-          <w:rFonts w:eastAsia="Arial" w:cs="Arial"/>
-          <w:szCs w:val="24"/>
-        </w:rPr>
-        <w:t>defina papéis e responsabilidades em segurança da informação. Essa estrutura formal e operacional demonstra o comprometimento da Alta administração com o tema e com as práticas de gestão de riscos necessárias para assegurar a confidencialidade, integridade e disponibilidade esperada das informações.</w:t>
-      </w:r>
-    </w:p>
-    <w:p>
-      <w:pPr>
-        <w:ind w:firstLine="709"/>
-        <w:rPr>
-          <w:rFonts w:eastAsia="Arial" w:cs="Arial"/>
-          <w:szCs w:val="24"/>
-        </w:rPr>
-      </w:pPr>
-      <w:r>
-        <w:rPr>
-          <w:rFonts w:eastAsia="Arial" w:cs="Arial"/>
-          <w:szCs w:val="24"/>
-        </w:rPr>
         <w:t>Um dos resultados esperados desse controle é a elaboração e manutenção da Política de Segurança da Informação que norteará como a organização realiza o tratamento dos riscos de segurança.</w:t>
       </w:r>
     </w:p>
@@ -4027,7 +4027,23 @@
           <w:rFonts w:eastAsia="Arial" w:cs="Arial"/>
           <w:szCs w:val="24"/>
         </w:rPr>
-        <w:t xml:space="preserve">Este controle verifica a existência de processos formais e contínuos para o inventário, rastreamento e gestão de todos os ativos corporativos conectados à infraestrutura da </w:t>
+        <w:t>Este controle verifica a existência de processos formais e contínuos para o inventário, rastreamento e gestão de todos os ativos corporativos conectados à infraestrutura da organização, sejam dispositivos físicos, virtuais ou baseados em nuvem. A adoção de uma gestão ativa e estruturada desses ativos permite identificar, corrigir e, se necessário, remover dispositivos não autorizados ou não gerenciados, reduzindo significativamente os riscos de segurança.</w:t>
+      </w:r>
+    </w:p>
+    <w:p>
+      <w:pPr>
+        <w:ind w:firstLine="709"/>
+        <w:rPr>
+          <w:rFonts w:eastAsia="Arial" w:cs="Arial"/>
+          <w:szCs w:val="24"/>
+        </w:rPr>
+      </w:pPr>
+      <w:r>
+        <w:rPr>
+          <w:rFonts w:eastAsia="Arial" w:cs="Arial"/>
+          <w:szCs w:val="24"/>
+        </w:rPr>
+        <w:t xml:space="preserve">Um dos principais resultados esperados deste controle é a visibilidade precisa e em tempo real sobre os ativos da organização, fundamental para proteger a infraestrutura, mitigar </w:t>
       </w:r>
       <w:r>
         <w:rPr>
@@ -4035,23 +4051,7 @@
           <w:szCs w:val="24"/>
         </w:rPr>
         <w:lastRenderedPageBreak/>
-        <w:t>organização, sejam dispositivos físicos, virtuais ou baseados em nuvem. A adoção de uma gestão ativa e estruturada desses ativos permite identificar, corrigir e, se necessário, remover dispositivos não autorizados ou não gerenciados, reduzindo significativamente os riscos de segurança.</w:t>
-      </w:r>
-    </w:p>
-    <w:p>
-      <w:pPr>
-        <w:ind w:firstLine="709"/>
-        <w:rPr>
-          <w:rFonts w:eastAsia="Arial" w:cs="Arial"/>
-          <w:szCs w:val="24"/>
-        </w:rPr>
-      </w:pPr>
-      <w:r>
-        <w:rPr>
-          <w:rFonts w:eastAsia="Arial" w:cs="Arial"/>
-          <w:szCs w:val="24"/>
-        </w:rPr>
-        <w:t>Um dos principais resultados esperados deste controle é a visibilidade precisa e em tempo real sobre os ativos da organização, fundamental para proteger a infraestrutura, mitigar vulnerabilidades e assegurar que medidas de segurança sejam aplicadas de forma consistente e eficaz.</w:t>
+        <w:t>vulnerabilidades e assegurar que medidas de segurança sejam aplicadas de forma consistente e eficaz.</w:t>
       </w:r>
     </w:p>
     <w:p>
@@ -4753,335 +4753,328 @@
           <w:rFonts w:eastAsia="Arial" w:cs="Arial"/>
           <w:szCs w:val="24"/>
         </w:rPr>
-        <w:t xml:space="preserve">Um dos principais resultados esperados deste controle é a manutenção de um ambiente de software seguro e em conformidade, permitindo à organização identificar </w:t>
-      </w:r>
+        <w:t>Um dos principais resultados esperados deste controle é a manutenção de um ambiente de software seguro e em conformidade, permitindo à organização identificar vulnerabilidades, prevenir ataques cibernéticos e evitar problemas relacionados a licenciamento ou uso desnecessário de aplicações.</w:t>
+      </w:r>
+    </w:p>
+    <w:p>
+      <w:pPr>
+        <w:ind w:firstLine="709"/>
+        <w:rPr>
+          <w:rFonts w:eastAsia="Arial" w:cs="Arial"/>
+          <w:szCs w:val="24"/>
+        </w:rPr>
+      </w:pPr>
+      <w:r>
+        <w:rPr>
+          <w:rFonts w:eastAsia="Arial" w:cs="Arial"/>
+          <w:szCs w:val="24"/>
+        </w:rPr>
+        <w:t>Nesse controle (</w:t>
+      </w:r>
+      <w:r>
+        <w:rPr>
+          <w:rFonts w:eastAsia="Arial" w:cs="Arial"/>
+          <w:szCs w:val="24"/>
+        </w:rPr>
+        <w:t>iMBC</w:t>
+      </w:r>
+      <w:r>
+        <w:rPr>
+          <w:rFonts w:eastAsia="Arial" w:cs="Arial"/>
+          <w:szCs w:val="24"/>
+        </w:rPr>
+        <w:t xml:space="preserve">2) a organização apresentou </w:t>
+      </w:r>
+      <w:r>
+        <w:rPr>
+          <w:rFonts w:eastAsia="Arial" w:cs="Arial"/>
+          <w:b/>
+          <w:szCs w:val="24"/>
+        </w:rPr>
+        <w:t xml:space="preserve">valor </w:t>
+      </w:r>
+      <w:proofErr w:type="gramStart"/>
+      <w:r>
+        <w:rPr>
+          <w:rFonts w:eastAsia="Arial" w:cs="Arial"/>
+          <w:b/>
+          <w:szCs w:val="24"/>
+        </w:rPr>
+        <w:t>{{ notas</w:t>
+      </w:r>
+      <w:proofErr w:type="gramEnd"/>
+      <w:r>
+        <w:rPr>
+          <w:rFonts w:eastAsia="Arial" w:cs="Arial"/>
+          <w:b/>
+          <w:szCs w:val="24"/>
+        </w:rPr>
+        <w:t>[‘</w:t>
+      </w:r>
+      <w:r>
+        <w:rPr>
+          <w:rFonts w:eastAsia="Arial" w:cs="Arial"/>
+          <w:b/>
+          <w:szCs w:val="24"/>
+        </w:rPr>
+        <w:t>iMBC</w:t>
+      </w:r>
+      <w:r>
+        <w:rPr>
+          <w:rFonts w:eastAsia="Arial" w:cs="Arial"/>
+          <w:b/>
+          <w:szCs w:val="24"/>
+        </w:rPr>
+        <w:t>2</w:t>
+      </w:r>
+      <w:proofErr w:type="gramStart"/>
+      <w:r>
+        <w:rPr>
+          <w:rFonts w:eastAsia="Arial" w:cs="Arial"/>
+          <w:b/>
+          <w:szCs w:val="24"/>
+        </w:rPr>
+        <w:t>’]  }</w:t>
+      </w:r>
+      <w:proofErr w:type="gramEnd"/>
+      <w:r>
+        <w:rPr>
+          <w:rFonts w:eastAsia="Arial" w:cs="Arial"/>
+          <w:b/>
+          <w:szCs w:val="24"/>
+        </w:rPr>
+        <w:t>}</w:t>
+      </w:r>
+      <w:r>
+        <w:rPr>
+          <w:rFonts w:eastAsia="Arial" w:cs="Arial"/>
+          <w:szCs w:val="24"/>
+        </w:rPr>
+        <w:t xml:space="preserve">, alcançando um </w:t>
+      </w:r>
+      <w:r>
+        <w:rPr>
+          <w:rFonts w:eastAsia="Arial" w:cs="Arial"/>
+          <w:b/>
+          <w:szCs w:val="24"/>
+        </w:rPr>
+        <w:t>nível “</w:t>
+      </w:r>
+      <w:proofErr w:type="gramStart"/>
+      <w:r>
+        <w:rPr>
+          <w:rFonts w:eastAsia="Arial" w:cs="Arial"/>
+          <w:b/>
+          <w:szCs w:val="24"/>
+        </w:rPr>
+        <w:t>{{ notas</w:t>
+      </w:r>
+      <w:proofErr w:type="gramEnd"/>
+      <w:r>
+        <w:rPr>
+          <w:rFonts w:eastAsia="Arial" w:cs="Arial"/>
+          <w:b/>
+          <w:szCs w:val="24"/>
+        </w:rPr>
+        <w:t>[‘</w:t>
+      </w:r>
+      <w:r>
+        <w:rPr>
+          <w:rFonts w:eastAsia="Arial" w:cs="Arial"/>
+          <w:b/>
+          <w:szCs w:val="24"/>
+        </w:rPr>
+        <w:t>iMBC</w:t>
+      </w:r>
+      <w:r>
+        <w:rPr>
+          <w:rFonts w:eastAsia="Arial" w:cs="Arial"/>
+          <w:b/>
+          <w:szCs w:val="24"/>
+        </w:rPr>
+        <w:t>2_capacidade</w:t>
+      </w:r>
+      <w:proofErr w:type="gramStart"/>
+      <w:r>
+        <w:rPr>
+          <w:rFonts w:eastAsia="Arial" w:cs="Arial"/>
+          <w:b/>
+          <w:szCs w:val="24"/>
+        </w:rPr>
+        <w:t>’]</w:t>
+      </w:r>
+      <w:r>
+        <w:rPr>
+          <w:rFonts w:eastAsia="Arial" w:cs="Arial"/>
+          <w:b/>
+          <w:szCs w:val="24"/>
+          <w:u w:val="single"/>
+        </w:rPr>
+        <w:t xml:space="preserve"> </w:t>
+      </w:r>
+      <w:r>
+        <w:rPr>
+          <w:rFonts w:eastAsia="Arial" w:cs="Arial"/>
+          <w:b/>
+          <w:szCs w:val="24"/>
+        </w:rPr>
+        <w:t xml:space="preserve"> }</w:t>
+      </w:r>
+      <w:proofErr w:type="gramEnd"/>
+      <w:r>
+        <w:rPr>
+          <w:rFonts w:eastAsia="Arial" w:cs="Arial"/>
+          <w:b/>
+          <w:szCs w:val="24"/>
+        </w:rPr>
+        <w:t>}” de capacidade</w:t>
+      </w:r>
+      <w:r>
+        <w:rPr>
+          <w:rFonts w:eastAsia="Arial" w:cs="Arial"/>
+          <w:szCs w:val="24"/>
+        </w:rPr>
+        <w:t xml:space="preserve"> e sua posição relativa pode ser vista na Figura a seguir.</w:t>
+      </w:r>
+    </w:p>
+    <w:p>
+      <w:pPr>
+        <w:rPr>
+          <w:rFonts w:eastAsia="Arial" w:cs="Arial"/>
+          <w:sz w:val="24"/>
+          <w:szCs w:val="24"/>
+        </w:rPr>
+      </w:pPr>
+      <w:proofErr w:type="gramStart"/>
+      <w:r>
+        <w:rPr>
+          <w:rFonts w:eastAsia="Arial" w:cs="Arial"/>
+          <w:sz w:val="24"/>
+          <w:szCs w:val="24"/>
+        </w:rPr>
+        <w:t xml:space="preserve">{{ </w:t>
+      </w:r>
+      <w:r>
+        <w:rPr>
+          <w:rFonts w:eastAsia="Arial" w:cs="Arial"/>
+          <w:sz w:val="24"/>
+          <w:szCs w:val="24"/>
+        </w:rPr>
+        <w:t>fig</w:t>
+      </w:r>
+      <w:proofErr w:type="gramEnd"/>
+      <w:r>
+        <w:rPr>
+          <w:rFonts w:eastAsia="Arial" w:cs="Arial"/>
+          <w:sz w:val="24"/>
+          <w:szCs w:val="24"/>
+        </w:rPr>
+        <w:t>_hist_controle_</w:t>
+      </w:r>
+      <w:proofErr w:type="gramStart"/>
+      <w:r>
+        <w:rPr>
+          <w:rFonts w:eastAsia="Arial" w:cs="Arial"/>
+          <w:sz w:val="24"/>
+          <w:szCs w:val="24"/>
+        </w:rPr>
+        <w:t>2 }</w:t>
+      </w:r>
+      <w:proofErr w:type="gramEnd"/>
+      <w:r>
+        <w:rPr>
+          <w:rFonts w:eastAsia="Arial" w:cs="Arial"/>
+          <w:sz w:val="24"/>
+          <w:szCs w:val="24"/>
+        </w:rPr>
+        <w:t>}</w:t>
+      </w:r>
+    </w:p>
+    <w:p>
+      <w:pPr>
+        <w:pStyle w:val="Legenda"/>
+      </w:pPr>
+      <w:r>
+        <w:t xml:space="preserve">Figura </w:t>
+      </w:r>
+      <w:r>
+        <w:rPr>
+          <w:noProof/>
+        </w:rPr>
+        <w:fldChar w:fldCharType="begin"/>
+      </w:r>
+      <w:r>
+        <w:rPr>
+          <w:noProof/>
+        </w:rPr>
+        <w:instrText xml:space="preserve"> SEQ Figura \* ARABIC </w:instrText>
+      </w:r>
+      <w:r>
+        <w:rPr>
+          <w:noProof/>
+        </w:rPr>
+        <w:fldChar w:fldCharType="separate"/>
+      </w:r>
+      <w:r>
+        <w:rPr>
+          <w:noProof/>
+        </w:rPr>
+        <w:t>9</w:t>
+      </w:r>
+      <w:r>
+        <w:rPr>
+          <w:noProof/>
+        </w:rPr>
+        <w:fldChar w:fldCharType="end"/>
+      </w:r>
+      <w:r>
+        <w:t xml:space="preserve"> – </w:t>
+      </w:r>
+      <w:r>
+        <w:t xml:space="preserve">Histograma do nível de adoção do controle 02 por todos auditados, destacando-se a(o) </w:t>
+      </w:r>
+      <w:proofErr w:type="gramStart"/>
+      <w:r>
+        <w:t xml:space="preserve">{{ </w:t>
+      </w:r>
+      <w:proofErr w:type="spellStart"/>
+      <w:r>
+        <w:t>sigla</w:t>
+      </w:r>
+      <w:proofErr w:type="gramEnd"/>
+      <w:r>
+        <w:t>_</w:t>
+      </w:r>
+      <w:proofErr w:type="gramStart"/>
+      <w:r>
+        <w:t>orgao</w:t>
+      </w:r>
+      <w:proofErr w:type="spellEnd"/>
+      <w:r>
+        <w:t xml:space="preserve"> </w:t>
+      </w:r>
+      <w:r>
+        <w:t>}</w:t>
+      </w:r>
+      <w:proofErr w:type="gramEnd"/>
+      <w:r>
+        <w:t>}</w:t>
+      </w:r>
+    </w:p>
+    <w:p>
+      <w:pPr>
+        <w:ind w:firstLine="709"/>
+        <w:rPr>
+          <w:rFonts w:eastAsia="Arial" w:cs="Arial"/>
+          <w:szCs w:val="24"/>
+        </w:rPr>
+      </w:pPr>
       <w:r>
         <w:rPr>
           <w:rFonts w:eastAsia="Arial" w:cs="Arial"/>
           <w:szCs w:val="24"/>
         </w:rPr>
         <w:lastRenderedPageBreak/>
-        <w:t>vulnerabilidades, prevenir ataques cibernéticos e evitar problemas relacionados a licenciamento ou uso desnecessário de aplicações.</w:t>
-      </w:r>
-    </w:p>
-    <w:p>
-      <w:pPr>
-        <w:ind w:firstLine="709"/>
-        <w:rPr>
-          <w:rFonts w:eastAsia="Arial" w:cs="Arial"/>
-          <w:szCs w:val="24"/>
-        </w:rPr>
-      </w:pPr>
-      <w:r>
-        <w:rPr>
-          <w:rFonts w:eastAsia="Arial" w:cs="Arial"/>
-          <w:szCs w:val="24"/>
-        </w:rPr>
-        <w:t>Nesse controle (</w:t>
-      </w:r>
-      <w:r>
-        <w:rPr>
-          <w:rFonts w:eastAsia="Arial" w:cs="Arial"/>
-          <w:szCs w:val="24"/>
-        </w:rPr>
-        <w:t>iMBC</w:t>
-      </w:r>
-      <w:r>
-        <w:rPr>
-          <w:rFonts w:eastAsia="Arial" w:cs="Arial"/>
-          <w:szCs w:val="24"/>
-        </w:rPr>
-        <w:t xml:space="preserve">2) a organização apresentou </w:t>
-      </w:r>
-      <w:r>
-        <w:rPr>
-          <w:rFonts w:eastAsia="Arial" w:cs="Arial"/>
-          <w:b/>
-          <w:szCs w:val="24"/>
-        </w:rPr>
-        <w:t xml:space="preserve">valor </w:t>
-      </w:r>
-      <w:proofErr w:type="gramStart"/>
-      <w:r>
-        <w:rPr>
-          <w:rFonts w:eastAsia="Arial" w:cs="Arial"/>
-          <w:b/>
-          <w:szCs w:val="24"/>
-        </w:rPr>
-        <w:t>{{ notas</w:t>
-      </w:r>
-      <w:proofErr w:type="gramEnd"/>
-      <w:r>
-        <w:rPr>
-          <w:rFonts w:eastAsia="Arial" w:cs="Arial"/>
-          <w:b/>
-          <w:szCs w:val="24"/>
-        </w:rPr>
-        <w:t>[‘</w:t>
-      </w:r>
-      <w:r>
-        <w:rPr>
-          <w:rFonts w:eastAsia="Arial" w:cs="Arial"/>
-          <w:b/>
-          <w:szCs w:val="24"/>
-        </w:rPr>
-        <w:t>iMBC</w:t>
-      </w:r>
-      <w:r>
-        <w:rPr>
-          <w:rFonts w:eastAsia="Arial" w:cs="Arial"/>
-          <w:b/>
-          <w:szCs w:val="24"/>
-        </w:rPr>
-        <w:t>2</w:t>
-      </w:r>
-      <w:proofErr w:type="gramStart"/>
-      <w:r>
-        <w:rPr>
-          <w:rFonts w:eastAsia="Arial" w:cs="Arial"/>
-          <w:b/>
-          <w:szCs w:val="24"/>
-        </w:rPr>
-        <w:t>’]  }</w:t>
-      </w:r>
-      <w:proofErr w:type="gramEnd"/>
-      <w:r>
-        <w:rPr>
-          <w:rFonts w:eastAsia="Arial" w:cs="Arial"/>
-          <w:b/>
-          <w:szCs w:val="24"/>
-        </w:rPr>
-        <w:t>}</w:t>
-      </w:r>
-      <w:r>
-        <w:rPr>
-          <w:rFonts w:eastAsia="Arial" w:cs="Arial"/>
-          <w:szCs w:val="24"/>
-        </w:rPr>
-        <w:t xml:space="preserve">, alcançando um </w:t>
-      </w:r>
-      <w:r>
-        <w:rPr>
-          <w:rFonts w:eastAsia="Arial" w:cs="Arial"/>
-          <w:b/>
-          <w:szCs w:val="24"/>
-        </w:rPr>
-        <w:t>nível “</w:t>
-      </w:r>
-      <w:proofErr w:type="gramStart"/>
-      <w:r>
-        <w:rPr>
-          <w:rFonts w:eastAsia="Arial" w:cs="Arial"/>
-          <w:b/>
-          <w:szCs w:val="24"/>
-        </w:rPr>
-        <w:t>{{ notas</w:t>
-      </w:r>
-      <w:proofErr w:type="gramEnd"/>
-      <w:r>
-        <w:rPr>
-          <w:rFonts w:eastAsia="Arial" w:cs="Arial"/>
-          <w:b/>
-          <w:szCs w:val="24"/>
-        </w:rPr>
-        <w:t>[‘</w:t>
-      </w:r>
-      <w:r>
-        <w:rPr>
-          <w:rFonts w:eastAsia="Arial" w:cs="Arial"/>
-          <w:b/>
-          <w:szCs w:val="24"/>
-        </w:rPr>
-        <w:t>iMBC</w:t>
-      </w:r>
-      <w:r>
-        <w:rPr>
-          <w:rFonts w:eastAsia="Arial" w:cs="Arial"/>
-          <w:b/>
-          <w:szCs w:val="24"/>
-        </w:rPr>
-        <w:t>2_capacidade</w:t>
-      </w:r>
-      <w:proofErr w:type="gramStart"/>
-      <w:r>
-        <w:rPr>
-          <w:rFonts w:eastAsia="Arial" w:cs="Arial"/>
-          <w:b/>
-          <w:szCs w:val="24"/>
-        </w:rPr>
-        <w:t>’]</w:t>
-      </w:r>
-      <w:r>
-        <w:rPr>
-          <w:rFonts w:eastAsia="Arial" w:cs="Arial"/>
-          <w:b/>
-          <w:szCs w:val="24"/>
-          <w:u w:val="single"/>
-        </w:rPr>
-        <w:t xml:space="preserve"> </w:t>
-      </w:r>
-      <w:r>
-        <w:rPr>
-          <w:rFonts w:eastAsia="Arial" w:cs="Arial"/>
-          <w:b/>
-          <w:szCs w:val="24"/>
-        </w:rPr>
-        <w:t xml:space="preserve"> }</w:t>
-      </w:r>
-      <w:proofErr w:type="gramEnd"/>
-      <w:r>
-        <w:rPr>
-          <w:rFonts w:eastAsia="Arial" w:cs="Arial"/>
-          <w:b/>
-          <w:szCs w:val="24"/>
-        </w:rPr>
-        <w:t>}” de capacidade</w:t>
-      </w:r>
-      <w:r>
-        <w:rPr>
-          <w:rFonts w:eastAsia="Arial" w:cs="Arial"/>
-          <w:szCs w:val="24"/>
-        </w:rPr>
-        <w:t xml:space="preserve"> e sua posição relativa pode ser vista na Figura a seguir.</w:t>
-      </w:r>
-    </w:p>
-    <w:p>
-      <w:pPr>
-        <w:rPr>
-          <w:rFonts w:eastAsia="Arial" w:cs="Arial"/>
-          <w:sz w:val="24"/>
-          <w:szCs w:val="24"/>
-        </w:rPr>
-      </w:pPr>
-      <w:proofErr w:type="gramStart"/>
-      <w:r>
-        <w:rPr>
-          <w:rFonts w:eastAsia="Arial" w:cs="Arial"/>
-          <w:sz w:val="24"/>
-          <w:szCs w:val="24"/>
-        </w:rPr>
-        <w:t xml:space="preserve">{{ </w:t>
-      </w:r>
-      <w:r>
-        <w:rPr>
-          <w:rFonts w:eastAsia="Arial" w:cs="Arial"/>
-          <w:sz w:val="24"/>
-          <w:szCs w:val="24"/>
-        </w:rPr>
-        <w:t>fig</w:t>
-      </w:r>
-      <w:proofErr w:type="gramEnd"/>
-      <w:r>
-        <w:rPr>
-          <w:rFonts w:eastAsia="Arial" w:cs="Arial"/>
-          <w:sz w:val="24"/>
-          <w:szCs w:val="24"/>
-        </w:rPr>
-        <w:t>_hist_controle_</w:t>
-      </w:r>
-      <w:proofErr w:type="gramStart"/>
-      <w:r>
-        <w:rPr>
-          <w:rFonts w:eastAsia="Arial" w:cs="Arial"/>
-          <w:sz w:val="24"/>
-          <w:szCs w:val="24"/>
-        </w:rPr>
-        <w:t>2 }</w:t>
-      </w:r>
-      <w:proofErr w:type="gramEnd"/>
-      <w:r>
-        <w:rPr>
-          <w:rFonts w:eastAsia="Arial" w:cs="Arial"/>
-          <w:sz w:val="24"/>
-          <w:szCs w:val="24"/>
-        </w:rPr>
-        <w:t>}</w:t>
-      </w:r>
-    </w:p>
-    <w:p>
-      <w:pPr>
-        <w:pStyle w:val="Legenda"/>
-      </w:pPr>
-      <w:r>
-        <w:t xml:space="preserve">Figura </w:t>
-      </w:r>
-      <w:r>
-        <w:rPr>
-          <w:noProof/>
-        </w:rPr>
-        <w:fldChar w:fldCharType="begin"/>
-      </w:r>
-      <w:r>
-        <w:rPr>
-          <w:noProof/>
-        </w:rPr>
-        <w:instrText xml:space="preserve"> SEQ Figura \* ARABIC </w:instrText>
-      </w:r>
-      <w:r>
-        <w:rPr>
-          <w:noProof/>
-        </w:rPr>
-        <w:fldChar w:fldCharType="separate"/>
-      </w:r>
-      <w:r>
-        <w:rPr>
-          <w:noProof/>
-        </w:rPr>
-        <w:t>9</w:t>
-      </w:r>
-      <w:r>
-        <w:rPr>
-          <w:noProof/>
-        </w:rPr>
-        <w:fldChar w:fldCharType="end"/>
-      </w:r>
-      <w:r>
-        <w:t xml:space="preserve"> – </w:t>
-      </w:r>
-      <w:r>
-        <w:t xml:space="preserve">Histograma do nível de adoção do controle 02 por todos auditados, destacando-se a(o) </w:t>
-      </w:r>
-      <w:proofErr w:type="gramStart"/>
-      <w:r>
-        <w:t xml:space="preserve">{{ </w:t>
-      </w:r>
-      <w:proofErr w:type="spellStart"/>
-      <w:r>
-        <w:t>sigla</w:t>
-      </w:r>
-      <w:proofErr w:type="gramEnd"/>
-      <w:r>
-        <w:t>_</w:t>
-      </w:r>
-      <w:proofErr w:type="gramStart"/>
-      <w:r>
-        <w:t>orgao</w:t>
-      </w:r>
-      <w:proofErr w:type="spellEnd"/>
-      <w:r>
-        <w:t xml:space="preserve"> </w:t>
-      </w:r>
-      <w:r>
-        <w:t>}</w:t>
-      </w:r>
-      <w:proofErr w:type="gramEnd"/>
-      <w:r>
-        <w:t>}</w:t>
-      </w:r>
-    </w:p>
-    <w:p>
-      <w:pPr>
-        <w:ind w:firstLine="709"/>
-        <w:rPr>
-          <w:rFonts w:eastAsia="Arial" w:cs="Arial"/>
-          <w:szCs w:val="24"/>
-        </w:rPr>
-      </w:pPr>
-      <w:r>
-        <w:rPr>
-          <w:rFonts w:eastAsia="Arial" w:cs="Arial"/>
-          <w:szCs w:val="24"/>
-        </w:rPr>
         <w:t>Para alcançar o resultado, considerou-se o seguinte conjunto de medidas de segurança básica:</w:t>
       </w:r>
     </w:p>
@@ -5579,7 +5572,6 @@
           <w:rFonts w:eastAsia="Arial" w:cs="Arial"/>
           <w:szCs w:val="24"/>
         </w:rPr>
-        <w:lastRenderedPageBreak/>
         <w:t>Nesse controle (</w:t>
       </w:r>
       <w:r>
@@ -5919,7 +5911,15 @@
                 <w:rFonts w:asciiTheme="minorHAnsi" w:eastAsia="Arial" w:hAnsiTheme="minorHAnsi" w:cstheme="minorHAnsi"/>
                 <w:szCs w:val="18"/>
               </w:rPr>
-              <w:t>Medida de segurança</w:t>
+              <w:t xml:space="preserve">Medida de </w:t>
+            </w:r>
+            <w:r>
+              <w:rPr>
+                <w:rFonts w:asciiTheme="minorHAnsi" w:eastAsia="Arial" w:hAnsiTheme="minorHAnsi" w:cstheme="minorHAnsi"/>
+                <w:szCs w:val="18"/>
+              </w:rPr>
+              <w:lastRenderedPageBreak/>
+              <w:t>segurança</w:t>
             </w:r>
           </w:p>
         </w:tc>
@@ -5941,6 +5941,7 @@
                 <w:rFonts w:asciiTheme="minorHAnsi" w:hAnsiTheme="minorHAnsi" w:cstheme="minorHAnsi"/>
                 <w:szCs w:val="18"/>
               </w:rPr>
+              <w:lastRenderedPageBreak/>
               <w:t>Descrição</w:t>
             </w:r>
           </w:p>
@@ -6679,272 +6680,265 @@
           <w:rFonts w:eastAsia="Arial" w:cs="Arial"/>
           <w:szCs w:val="24"/>
         </w:rPr>
-        <w:t xml:space="preserve">) desde o início e sua revisão contínua reduzem vulnerabilidades associadas a </w:t>
-      </w:r>
-      <w:r>
-        <w:rPr>
-          <w:rFonts w:eastAsia="Arial" w:cs="Arial"/>
-          <w:szCs w:val="24"/>
-        </w:rPr>
+        <w:t>) desde o início e sua revisão contínua reduzem vulnerabilidades associadas a configurações padrão ou inadequadas, protegendo a infraestrutura contra ameaças cibernéticas.</w:t>
+      </w:r>
+    </w:p>
+    <w:p>
+      <w:pPr>
+        <w:ind w:firstLine="709"/>
+        <w:rPr>
+          <w:rFonts w:eastAsia="Arial" w:cs="Arial"/>
+          <w:szCs w:val="24"/>
+        </w:rPr>
+      </w:pPr>
+      <w:r>
+        <w:rPr>
+          <w:rFonts w:eastAsia="Arial" w:cs="Arial"/>
+          <w:szCs w:val="24"/>
+        </w:rPr>
+        <w:t xml:space="preserve">Um dos principais resultados esperados deste controle é a redução de riscos provenientes de brechas de segurança, como serviços desnecessários ou contas com senhas padrão, fortalecendo a proteção de dados e sistemas. A manutenção de configurações seguras promove a resiliência organizacional diante de ameaças e incidentes, assegurando um ambiente tecnológico confiável e robusto. </w:t>
+      </w:r>
+    </w:p>
+    <w:p>
+      <w:pPr>
+        <w:ind w:firstLine="709"/>
+        <w:rPr>
+          <w:rFonts w:eastAsia="Arial" w:cs="Arial"/>
+          <w:szCs w:val="24"/>
+        </w:rPr>
+      </w:pPr>
+      <w:r>
+        <w:rPr>
+          <w:rFonts w:eastAsia="Arial" w:cs="Arial"/>
+          <w:szCs w:val="24"/>
+        </w:rPr>
+        <w:t>Nesse controle (</w:t>
+      </w:r>
+      <w:r>
+        <w:rPr>
+          <w:rFonts w:eastAsia="Arial" w:cs="Arial"/>
+          <w:szCs w:val="24"/>
+        </w:rPr>
+        <w:t>iMBC</w:t>
+      </w:r>
+      <w:r>
+        <w:rPr>
+          <w:rFonts w:eastAsia="Arial" w:cs="Arial"/>
+          <w:szCs w:val="24"/>
+        </w:rPr>
+        <w:t xml:space="preserve">4) a organização apresentou </w:t>
+      </w:r>
+      <w:r>
+        <w:rPr>
+          <w:rFonts w:eastAsia="Arial" w:cs="Arial"/>
+          <w:b/>
+          <w:szCs w:val="24"/>
+        </w:rPr>
+        <w:t xml:space="preserve">valor </w:t>
+      </w:r>
+      <w:proofErr w:type="gramStart"/>
+      <w:r>
+        <w:rPr>
+          <w:rFonts w:eastAsia="Arial" w:cs="Arial"/>
+          <w:b/>
+          <w:szCs w:val="24"/>
+        </w:rPr>
+        <w:t>{{ notas</w:t>
+      </w:r>
+      <w:proofErr w:type="gramEnd"/>
+      <w:r>
+        <w:rPr>
+          <w:rFonts w:eastAsia="Arial" w:cs="Arial"/>
+          <w:b/>
+          <w:szCs w:val="24"/>
+        </w:rPr>
+        <w:t>[‘</w:t>
+      </w:r>
+      <w:r>
+        <w:rPr>
+          <w:rFonts w:eastAsia="Arial" w:cs="Arial"/>
+          <w:b/>
+          <w:szCs w:val="24"/>
+        </w:rPr>
+        <w:t>iMBC</w:t>
+      </w:r>
+      <w:r>
+        <w:rPr>
+          <w:rFonts w:eastAsia="Arial" w:cs="Arial"/>
+          <w:b/>
+          <w:szCs w:val="24"/>
+        </w:rPr>
+        <w:t>4</w:t>
+      </w:r>
+      <w:proofErr w:type="gramStart"/>
+      <w:r>
+        <w:rPr>
+          <w:rFonts w:eastAsia="Arial" w:cs="Arial"/>
+          <w:b/>
+          <w:szCs w:val="24"/>
+        </w:rPr>
+        <w:t>’]  }</w:t>
+      </w:r>
+      <w:proofErr w:type="gramEnd"/>
+      <w:r>
+        <w:rPr>
+          <w:rFonts w:eastAsia="Arial" w:cs="Arial"/>
+          <w:b/>
+          <w:szCs w:val="24"/>
+        </w:rPr>
+        <w:t>}</w:t>
+      </w:r>
+      <w:r>
+        <w:rPr>
+          <w:rFonts w:eastAsia="Arial" w:cs="Arial"/>
+          <w:szCs w:val="24"/>
+        </w:rPr>
+        <w:t xml:space="preserve">, alcançando um </w:t>
+      </w:r>
+      <w:r>
+        <w:rPr>
+          <w:rFonts w:eastAsia="Arial" w:cs="Arial"/>
+          <w:b/>
+          <w:szCs w:val="24"/>
+        </w:rPr>
+        <w:t>nível “</w:t>
+      </w:r>
+      <w:proofErr w:type="gramStart"/>
+      <w:r>
+        <w:rPr>
+          <w:rFonts w:eastAsia="Arial" w:cs="Arial"/>
+          <w:b/>
+          <w:szCs w:val="24"/>
+        </w:rPr>
+        <w:t>{{ notas</w:t>
+      </w:r>
+      <w:proofErr w:type="gramEnd"/>
+      <w:r>
+        <w:rPr>
+          <w:rFonts w:eastAsia="Arial" w:cs="Arial"/>
+          <w:b/>
+          <w:szCs w:val="24"/>
+        </w:rPr>
+        <w:t>[‘</w:t>
+      </w:r>
+      <w:r>
+        <w:rPr>
+          <w:rFonts w:eastAsia="Arial" w:cs="Arial"/>
+          <w:b/>
+          <w:szCs w:val="24"/>
+        </w:rPr>
+        <w:t>iMBC</w:t>
+      </w:r>
+      <w:r>
+        <w:rPr>
+          <w:rFonts w:eastAsia="Arial" w:cs="Arial"/>
+          <w:b/>
+          <w:szCs w:val="24"/>
+        </w:rPr>
+        <w:t>4_capacidade</w:t>
+      </w:r>
+      <w:proofErr w:type="gramStart"/>
+      <w:r>
+        <w:rPr>
+          <w:rFonts w:eastAsia="Arial" w:cs="Arial"/>
+          <w:b/>
+          <w:szCs w:val="24"/>
+        </w:rPr>
+        <w:t>’]</w:t>
+      </w:r>
+      <w:r>
+        <w:rPr>
+          <w:rFonts w:eastAsia="Arial" w:cs="Arial"/>
+          <w:b/>
+          <w:szCs w:val="24"/>
+          <w:u w:val="single"/>
+        </w:rPr>
+        <w:t xml:space="preserve"> </w:t>
+      </w:r>
+      <w:r>
+        <w:rPr>
+          <w:rFonts w:eastAsia="Arial" w:cs="Arial"/>
+          <w:b/>
+          <w:szCs w:val="24"/>
+        </w:rPr>
+        <w:t xml:space="preserve"> }</w:t>
+      </w:r>
+      <w:proofErr w:type="gramEnd"/>
+      <w:r>
+        <w:rPr>
+          <w:rFonts w:eastAsia="Arial" w:cs="Arial"/>
+          <w:b/>
+          <w:szCs w:val="24"/>
+        </w:rPr>
+        <w:t>}” de capacidade</w:t>
+      </w:r>
+      <w:r>
+        <w:rPr>
+          <w:rFonts w:eastAsia="Arial" w:cs="Arial"/>
+          <w:szCs w:val="24"/>
+        </w:rPr>
+        <w:t xml:space="preserve"> e sua posição relativa pode ser vista na Figura a seguir.</w:t>
+      </w:r>
+    </w:p>
+    <w:p>
+      <w:pPr>
+        <w:rPr>
+          <w:rFonts w:eastAsia="Arial" w:cs="Arial"/>
+          <w:sz w:val="24"/>
+          <w:szCs w:val="24"/>
+        </w:rPr>
+      </w:pPr>
+      <w:proofErr w:type="gramStart"/>
+      <w:r>
+        <w:rPr>
+          <w:rFonts w:eastAsia="Arial" w:cs="Arial"/>
+          <w:sz w:val="24"/>
+          <w:szCs w:val="24"/>
+        </w:rPr>
+        <w:t xml:space="preserve">{{ </w:t>
+      </w:r>
+      <w:r>
+        <w:rPr>
+          <w:rFonts w:eastAsia="Arial" w:cs="Arial"/>
+          <w:sz w:val="24"/>
+          <w:szCs w:val="24"/>
+        </w:rPr>
+        <w:t>fig</w:t>
+      </w:r>
+      <w:proofErr w:type="gramEnd"/>
+      <w:r>
+        <w:rPr>
+          <w:rFonts w:eastAsia="Arial" w:cs="Arial"/>
+          <w:sz w:val="24"/>
+          <w:szCs w:val="24"/>
+        </w:rPr>
+        <w:t>_hist_controle_</w:t>
+      </w:r>
+      <w:proofErr w:type="gramStart"/>
+      <w:r>
+        <w:rPr>
+          <w:rFonts w:eastAsia="Arial" w:cs="Arial"/>
+          <w:sz w:val="24"/>
+          <w:szCs w:val="24"/>
+        </w:rPr>
+        <w:t>4 }</w:t>
+      </w:r>
+      <w:proofErr w:type="gramEnd"/>
+      <w:r>
+        <w:rPr>
+          <w:rFonts w:eastAsia="Arial" w:cs="Arial"/>
+          <w:sz w:val="24"/>
+          <w:szCs w:val="24"/>
+        </w:rPr>
+        <w:t>}</w:t>
+      </w:r>
+    </w:p>
+    <w:p>
+      <w:pPr>
+        <w:pStyle w:val="Legenda"/>
+      </w:pPr>
+      <w:r>
         <w:lastRenderedPageBreak/>
-        <w:t>configurações padrão ou inadequadas, protegendo a infraestrutura contra ameaças cibernéticas.</w:t>
-      </w:r>
-    </w:p>
-    <w:p>
-      <w:pPr>
-        <w:ind w:firstLine="709"/>
-        <w:rPr>
-          <w:rFonts w:eastAsia="Arial" w:cs="Arial"/>
-          <w:szCs w:val="24"/>
-        </w:rPr>
-      </w:pPr>
-      <w:r>
-        <w:rPr>
-          <w:rFonts w:eastAsia="Arial" w:cs="Arial"/>
-          <w:szCs w:val="24"/>
-        </w:rPr>
-        <w:t xml:space="preserve">Um dos principais resultados esperados deste controle é a redução de riscos provenientes de brechas de segurança, como serviços desnecessários ou contas com senhas padrão, fortalecendo a proteção de dados e sistemas. A manutenção de configurações seguras promove a resiliência organizacional diante de ameaças e incidentes, assegurando um ambiente tecnológico confiável e robusto. </w:t>
-      </w:r>
-    </w:p>
-    <w:p>
-      <w:pPr>
-        <w:ind w:firstLine="709"/>
-        <w:rPr>
-          <w:rFonts w:eastAsia="Arial" w:cs="Arial"/>
-          <w:szCs w:val="24"/>
-        </w:rPr>
-      </w:pPr>
-      <w:r>
-        <w:rPr>
-          <w:rFonts w:eastAsia="Arial" w:cs="Arial"/>
-          <w:szCs w:val="24"/>
-        </w:rPr>
-        <w:t>Nesse controle (</w:t>
-      </w:r>
-      <w:r>
-        <w:rPr>
-          <w:rFonts w:eastAsia="Arial" w:cs="Arial"/>
-          <w:szCs w:val="24"/>
-        </w:rPr>
-        <w:t>iMBC</w:t>
-      </w:r>
-      <w:r>
-        <w:rPr>
-          <w:rFonts w:eastAsia="Arial" w:cs="Arial"/>
-          <w:szCs w:val="24"/>
-        </w:rPr>
-        <w:t xml:space="preserve">4) a organização apresentou </w:t>
-      </w:r>
-      <w:r>
-        <w:rPr>
-          <w:rFonts w:eastAsia="Arial" w:cs="Arial"/>
-          <w:b/>
-          <w:szCs w:val="24"/>
-        </w:rPr>
-        <w:t xml:space="preserve">valor </w:t>
-      </w:r>
-      <w:proofErr w:type="gramStart"/>
-      <w:r>
-        <w:rPr>
-          <w:rFonts w:eastAsia="Arial" w:cs="Arial"/>
-          <w:b/>
-          <w:szCs w:val="24"/>
-        </w:rPr>
-        <w:t>{{ notas</w:t>
-      </w:r>
-      <w:proofErr w:type="gramEnd"/>
-      <w:r>
-        <w:rPr>
-          <w:rFonts w:eastAsia="Arial" w:cs="Arial"/>
-          <w:b/>
-          <w:szCs w:val="24"/>
-        </w:rPr>
-        <w:t>[‘</w:t>
-      </w:r>
-      <w:r>
-        <w:rPr>
-          <w:rFonts w:eastAsia="Arial" w:cs="Arial"/>
-          <w:b/>
-          <w:szCs w:val="24"/>
-        </w:rPr>
-        <w:t>iMBC</w:t>
-      </w:r>
-      <w:r>
-        <w:rPr>
-          <w:rFonts w:eastAsia="Arial" w:cs="Arial"/>
-          <w:b/>
-          <w:szCs w:val="24"/>
-        </w:rPr>
-        <w:t>4</w:t>
-      </w:r>
-      <w:proofErr w:type="gramStart"/>
-      <w:r>
-        <w:rPr>
-          <w:rFonts w:eastAsia="Arial" w:cs="Arial"/>
-          <w:b/>
-          <w:szCs w:val="24"/>
-        </w:rPr>
-        <w:t>’]  }</w:t>
-      </w:r>
-      <w:proofErr w:type="gramEnd"/>
-      <w:r>
-        <w:rPr>
-          <w:rFonts w:eastAsia="Arial" w:cs="Arial"/>
-          <w:b/>
-          <w:szCs w:val="24"/>
-        </w:rPr>
-        <w:t>}</w:t>
-      </w:r>
-      <w:r>
-        <w:rPr>
-          <w:rFonts w:eastAsia="Arial" w:cs="Arial"/>
-          <w:szCs w:val="24"/>
-        </w:rPr>
-        <w:t xml:space="preserve">, alcançando um </w:t>
-      </w:r>
-      <w:r>
-        <w:rPr>
-          <w:rFonts w:eastAsia="Arial" w:cs="Arial"/>
-          <w:b/>
-          <w:szCs w:val="24"/>
-        </w:rPr>
-        <w:t>nível “</w:t>
-      </w:r>
-      <w:proofErr w:type="gramStart"/>
-      <w:r>
-        <w:rPr>
-          <w:rFonts w:eastAsia="Arial" w:cs="Arial"/>
-          <w:b/>
-          <w:szCs w:val="24"/>
-        </w:rPr>
-        <w:t>{{ notas</w:t>
-      </w:r>
-      <w:proofErr w:type="gramEnd"/>
-      <w:r>
-        <w:rPr>
-          <w:rFonts w:eastAsia="Arial" w:cs="Arial"/>
-          <w:b/>
-          <w:szCs w:val="24"/>
-        </w:rPr>
-        <w:t>[‘</w:t>
-      </w:r>
-      <w:r>
-        <w:rPr>
-          <w:rFonts w:eastAsia="Arial" w:cs="Arial"/>
-          <w:b/>
-          <w:szCs w:val="24"/>
-        </w:rPr>
-        <w:t>iMBC</w:t>
-      </w:r>
-      <w:r>
-        <w:rPr>
-          <w:rFonts w:eastAsia="Arial" w:cs="Arial"/>
-          <w:b/>
-          <w:szCs w:val="24"/>
-        </w:rPr>
-        <w:t>4_capacidade</w:t>
-      </w:r>
-      <w:proofErr w:type="gramStart"/>
-      <w:r>
-        <w:rPr>
-          <w:rFonts w:eastAsia="Arial" w:cs="Arial"/>
-          <w:b/>
-          <w:szCs w:val="24"/>
-        </w:rPr>
-        <w:t>’]</w:t>
-      </w:r>
-      <w:r>
-        <w:rPr>
-          <w:rFonts w:eastAsia="Arial" w:cs="Arial"/>
-          <w:b/>
-          <w:szCs w:val="24"/>
-          <w:u w:val="single"/>
-        </w:rPr>
-        <w:t xml:space="preserve"> </w:t>
-      </w:r>
-      <w:r>
-        <w:rPr>
-          <w:rFonts w:eastAsia="Arial" w:cs="Arial"/>
-          <w:b/>
-          <w:szCs w:val="24"/>
-        </w:rPr>
-        <w:t xml:space="preserve"> }</w:t>
-      </w:r>
-      <w:proofErr w:type="gramEnd"/>
-      <w:r>
-        <w:rPr>
-          <w:rFonts w:eastAsia="Arial" w:cs="Arial"/>
-          <w:b/>
-          <w:szCs w:val="24"/>
-        </w:rPr>
-        <w:t>}” de capacidade</w:t>
-      </w:r>
-      <w:r>
-        <w:rPr>
-          <w:rFonts w:eastAsia="Arial" w:cs="Arial"/>
-          <w:szCs w:val="24"/>
-        </w:rPr>
-        <w:t xml:space="preserve"> e sua posição relativa pode ser vista na Figura a seguir.</w:t>
-      </w:r>
-    </w:p>
-    <w:p>
-      <w:pPr>
-        <w:rPr>
-          <w:rFonts w:eastAsia="Arial" w:cs="Arial"/>
-          <w:sz w:val="24"/>
-          <w:szCs w:val="24"/>
-        </w:rPr>
-      </w:pPr>
-      <w:proofErr w:type="gramStart"/>
-      <w:r>
-        <w:rPr>
-          <w:rFonts w:eastAsia="Arial" w:cs="Arial"/>
-          <w:sz w:val="24"/>
-          <w:szCs w:val="24"/>
-        </w:rPr>
-        <w:t xml:space="preserve">{{ </w:t>
-      </w:r>
-      <w:r>
-        <w:rPr>
-          <w:rFonts w:eastAsia="Arial" w:cs="Arial"/>
-          <w:sz w:val="24"/>
-          <w:szCs w:val="24"/>
-        </w:rPr>
-        <w:t>fig</w:t>
-      </w:r>
-      <w:proofErr w:type="gramEnd"/>
-      <w:r>
-        <w:rPr>
-          <w:rFonts w:eastAsia="Arial" w:cs="Arial"/>
-          <w:sz w:val="24"/>
-          <w:szCs w:val="24"/>
-        </w:rPr>
-        <w:t>_hist_controle_</w:t>
-      </w:r>
-      <w:proofErr w:type="gramStart"/>
-      <w:r>
-        <w:rPr>
-          <w:rFonts w:eastAsia="Arial" w:cs="Arial"/>
-          <w:sz w:val="24"/>
-          <w:szCs w:val="24"/>
-        </w:rPr>
-        <w:t>4 }</w:t>
-      </w:r>
-      <w:proofErr w:type="gramEnd"/>
-      <w:r>
-        <w:rPr>
-          <w:rFonts w:eastAsia="Arial" w:cs="Arial"/>
-          <w:sz w:val="24"/>
-          <w:szCs w:val="24"/>
-        </w:rPr>
-        <w:t>}</w:t>
-      </w:r>
-    </w:p>
-    <w:p>
-      <w:pPr>
-        <w:pStyle w:val="Legenda"/>
-      </w:pPr>
-      <w:r>
         <w:t xml:space="preserve">Figura </w:t>
       </w:r>
       <w:r>
@@ -7740,7 +7734,6 @@
               <w:rPr>
                 <w:rFonts w:asciiTheme="minorHAnsi" w:eastAsia="Arial" w:hAnsiTheme="minorHAnsi" w:cstheme="minorHAnsi"/>
               </w:rPr>
-              <w:lastRenderedPageBreak/>
               <w:t>ms47</w:t>
             </w:r>
           </w:p>
@@ -7915,7 +7908,15 @@
           <w:rFonts w:eastAsia="Arial" w:cs="Arial"/>
           <w:szCs w:val="24"/>
         </w:rPr>
-        <w:t>Um dos principais resultados esperados deste controle é a implementação de práticas robustas, como o monitoramento contínuo de contas, a restrição de privilégios administrativos e a desativação de contas inativas. Essas medidas fortalecem a segurança organizacional e contribuem para a proteção de dados e sistemas críticos.</w:t>
+        <w:t xml:space="preserve">Um dos principais resultados esperados deste controle é a implementação de práticas robustas, como o monitoramento contínuo de contas, a restrição de privilégios administrativos </w:t>
+      </w:r>
+      <w:r>
+        <w:rPr>
+          <w:rFonts w:eastAsia="Arial" w:cs="Arial"/>
+          <w:szCs w:val="24"/>
+        </w:rPr>
+        <w:lastRenderedPageBreak/>
+        <w:t>e a desativação de contas inativas. Essas medidas fortalecem a segurança organizacional e contribuem para a proteção de dados e sistemas críticos.</w:t>
       </w:r>
     </w:p>
     <w:p>
@@ -8643,7 +8644,6 @@
               <w:rPr>
                 <w:rFonts w:asciiTheme="minorHAnsi" w:eastAsia="Arial" w:hAnsiTheme="minorHAnsi" w:cstheme="minorHAnsi"/>
               </w:rPr>
-              <w:lastRenderedPageBreak/>
               <w:t>ms</w:t>
             </w:r>
             <w:r>
@@ -8864,6 +8864,7 @@
           <w:rFonts w:eastAsia="Arial" w:cs="Arial"/>
           <w:szCs w:val="24"/>
         </w:rPr>
+        <w:lastRenderedPageBreak/>
         <w:t>Nesse controle (</w:t>
       </w:r>
       <w:r>
@@ -9573,7 +9574,6 @@
               <w:rPr>
                 <w:rFonts w:asciiTheme="minorHAnsi" w:eastAsia="Arial" w:hAnsiTheme="minorHAnsi" w:cstheme="minorHAnsi"/>
               </w:rPr>
-              <w:lastRenderedPageBreak/>
               <w:t>ms</w:t>
             </w:r>
             <w:r>
@@ -10873,6 +10873,7 @@
         <w:pStyle w:val="Ttulo3"/>
       </w:pPr>
       <w:r>
+        <w:lastRenderedPageBreak/>
         <w:t>Situação Encontrada</w:t>
       </w:r>
     </w:p>
@@ -11610,23 +11611,23 @@
           <w:b/>
           <w:szCs w:val="24"/>
         </w:rPr>
+        <w:t>Responsável pela segurança da informação</w:t>
+      </w:r>
+    </w:p>
+    <w:p>
+      <w:pPr>
+        <w:ind w:firstLine="709"/>
+        <w:rPr>
+          <w:rFonts w:eastAsia="Arial" w:cs="Arial"/>
+          <w:szCs w:val="24"/>
+        </w:rPr>
+      </w:pPr>
+      <w:r>
+        <w:rPr>
+          <w:rFonts w:eastAsia="Arial" w:cs="Arial"/>
+          <w:szCs w:val="24"/>
+        </w:rPr>
         <w:lastRenderedPageBreak/>
-        <w:t>Responsável pela segurança da informação</w:t>
-      </w:r>
-    </w:p>
-    <w:p>
-      <w:pPr>
-        <w:ind w:firstLine="709"/>
-        <w:rPr>
-          <w:rFonts w:eastAsia="Arial" w:cs="Arial"/>
-          <w:szCs w:val="24"/>
-        </w:rPr>
-      </w:pPr>
-      <w:r>
-        <w:rPr>
-          <w:rFonts w:eastAsia="Arial" w:cs="Arial"/>
-          <w:szCs w:val="24"/>
-        </w:rPr>
         <w:t>A Norma Técnica ABNT NBR ISO/IEC 27001:2022 em seu</w:t>
       </w:r>
       <w:r>
@@ -12162,37 +12163,30 @@
           <w:rFonts w:eastAsia="Arial" w:cs="Arial"/>
           <w:szCs w:val="24"/>
         </w:rPr>
-        <w:t xml:space="preserve">estabelecer uma Política de Segurança da </w:t>
-      </w:r>
+        <w:t>estabelecer uma Política de Segurança da Informação que seja disponível como informação documentada, comunicada e disponível às partes interessadas</w:t>
+      </w:r>
+      <w:r>
+        <w:rPr>
+          <w:rFonts w:eastAsia="Arial" w:cs="Arial"/>
+          <w:szCs w:val="24"/>
+        </w:rPr>
+        <w:t>.</w:t>
+      </w:r>
+    </w:p>
+    <w:p>
+      <w:pPr>
+        <w:ind w:firstLine="709"/>
+        <w:rPr>
+          <w:rFonts w:eastAsia="Arial" w:cs="Arial"/>
+          <w:szCs w:val="24"/>
+        </w:rPr>
+      </w:pPr>
       <w:r>
         <w:rPr>
           <w:rFonts w:eastAsia="Arial" w:cs="Arial"/>
           <w:szCs w:val="24"/>
         </w:rPr>
         <w:lastRenderedPageBreak/>
-        <w:t>Informação que seja disponível como informação documentada, comunicada e disponível às partes interessadas</w:t>
-      </w:r>
-      <w:r>
-        <w:rPr>
-          <w:rFonts w:eastAsia="Arial" w:cs="Arial"/>
-          <w:szCs w:val="24"/>
-        </w:rPr>
-        <w:t>.</w:t>
-      </w:r>
-    </w:p>
-    <w:p>
-      <w:pPr>
-        <w:ind w:firstLine="709"/>
-        <w:rPr>
-          <w:rFonts w:eastAsia="Arial" w:cs="Arial"/>
-          <w:szCs w:val="24"/>
-        </w:rPr>
-      </w:pPr>
-      <w:r>
-        <w:rPr>
-          <w:rFonts w:eastAsia="Arial" w:cs="Arial"/>
-          <w:szCs w:val="24"/>
-        </w:rPr>
         <w:t>A necessidade de elaborar e manter uma PSI já foi objeto de</w:t>
       </w:r>
       <w:r>
@@ -13186,7 +13180,6 @@
         <w:pStyle w:val="Ttulo3"/>
       </w:pPr>
       <w:r>
-        <w:lastRenderedPageBreak/>
         <w:t>Evidências</w:t>
       </w:r>
     </w:p>
@@ -13886,92 +13879,85 @@
           <w:rFonts w:eastAsia="Arial" w:cs="Arial"/>
           <w:szCs w:val="24"/>
         </w:rPr>
-        <w:t xml:space="preserve"> a organização deixa de adotar as medidas de segurança técnicas e administrativas necessárias à proteção dos dados </w:t>
-      </w:r>
+        <w:t xml:space="preserve"> a organização deixa de adotar as medidas de segurança técnicas e administrativas necessárias à proteção dos dados pessoais, conforme disposto nos artigos 46 e 47 da LGPD</w:t>
+      </w:r>
+      <w:r>
+        <w:rPr>
+          <w:rFonts w:eastAsia="Arial" w:cs="Arial"/>
+          <w:szCs w:val="24"/>
+        </w:rPr>
+        <w:t>. Além disso, não cumpre</w:t>
+      </w:r>
+      <w:r>
+        <w:rPr>
+          <w:rFonts w:eastAsia="Arial" w:cs="Arial"/>
+          <w:color w:val="000000"/>
+          <w:szCs w:val="24"/>
+        </w:rPr>
+        <w:t xml:space="preserve"> o dever de proteger as informações sob sua tutela, conforme art. 6º</w:t>
+      </w:r>
+      <w:r>
+        <w:rPr>
+          <w:rFonts w:eastAsia="Arial" w:cs="Arial"/>
+          <w:color w:val="000000"/>
+          <w:szCs w:val="24"/>
+        </w:rPr>
+        <w:t>, incisos II e III</w:t>
+      </w:r>
+      <w:r>
+        <w:rPr>
+          <w:rFonts w:eastAsia="Arial" w:cs="Arial"/>
+          <w:color w:val="000000"/>
+          <w:szCs w:val="24"/>
+        </w:rPr>
+        <w:t xml:space="preserve">, da LAI, e </w:t>
+      </w:r>
+      <w:r>
+        <w:rPr>
+          <w:rFonts w:eastAsia="Arial" w:cs="Arial"/>
+          <w:color w:val="000000"/>
+          <w:szCs w:val="24"/>
+        </w:rPr>
+        <w:t xml:space="preserve">não observa </w:t>
+      </w:r>
+      <w:r>
+        <w:rPr>
+          <w:rFonts w:eastAsia="Arial" w:cs="Arial"/>
+          <w:color w:val="000000"/>
+          <w:szCs w:val="24"/>
+        </w:rPr>
+        <w:t>os princípios elencados no art. 3º, inciso II e III</w:t>
+      </w:r>
+      <w:r>
+        <w:rPr>
+          <w:rFonts w:eastAsia="Arial" w:cs="Arial"/>
+          <w:color w:val="000000"/>
+          <w:szCs w:val="24"/>
+        </w:rPr>
+        <w:t>,</w:t>
+      </w:r>
+      <w:r>
+        <w:rPr>
+          <w:rFonts w:eastAsia="Arial" w:cs="Arial"/>
+          <w:color w:val="000000"/>
+          <w:szCs w:val="24"/>
+        </w:rPr>
+        <w:t xml:space="preserve"> do Marco Civil da Internet.</w:t>
+      </w:r>
+    </w:p>
+    <w:p>
+      <w:pPr>
+        <w:ind w:firstLine="709"/>
+        <w:rPr>
+          <w:rFonts w:eastAsia="Arial" w:cs="Arial"/>
+        </w:rPr>
+      </w:pPr>
       <w:r>
         <w:rPr>
           <w:rFonts w:eastAsia="Arial" w:cs="Arial"/>
           <w:szCs w:val="24"/>
         </w:rPr>
         <w:lastRenderedPageBreak/>
-        <w:t>pessoais, conforme disposto nos artigos 46 e 47 da LGPD</w:t>
-      </w:r>
-      <w:r>
-        <w:rPr>
-          <w:rFonts w:eastAsia="Arial" w:cs="Arial"/>
-          <w:szCs w:val="24"/>
-        </w:rPr>
-        <w:t>. Além disso, não cumpre</w:t>
-      </w:r>
-      <w:r>
-        <w:rPr>
-          <w:rFonts w:eastAsia="Arial" w:cs="Arial"/>
-          <w:color w:val="000000"/>
-          <w:szCs w:val="24"/>
-        </w:rPr>
-        <w:t xml:space="preserve"> o dever de proteger as informações sob sua tutela, conforme art. 6º</w:t>
-      </w:r>
-      <w:r>
-        <w:rPr>
-          <w:rFonts w:eastAsia="Arial" w:cs="Arial"/>
-          <w:color w:val="000000"/>
-          <w:szCs w:val="24"/>
-        </w:rPr>
-        <w:t>, incisos II e III</w:t>
-      </w:r>
-      <w:r>
-        <w:rPr>
-          <w:rFonts w:eastAsia="Arial" w:cs="Arial"/>
-          <w:color w:val="000000"/>
-          <w:szCs w:val="24"/>
-        </w:rPr>
-        <w:t xml:space="preserve">, da LAI, e </w:t>
-      </w:r>
-      <w:r>
-        <w:rPr>
-          <w:rFonts w:eastAsia="Arial" w:cs="Arial"/>
-          <w:color w:val="000000"/>
-          <w:szCs w:val="24"/>
-        </w:rPr>
-        <w:t xml:space="preserve">não observa </w:t>
-      </w:r>
-      <w:r>
-        <w:rPr>
-          <w:rFonts w:eastAsia="Arial" w:cs="Arial"/>
-          <w:color w:val="000000"/>
-          <w:szCs w:val="24"/>
-        </w:rPr>
-        <w:t>os princípios elencados no art. 3º, inciso II e III</w:t>
-      </w:r>
-      <w:r>
-        <w:rPr>
-          <w:rFonts w:eastAsia="Arial" w:cs="Arial"/>
-          <w:color w:val="000000"/>
-          <w:szCs w:val="24"/>
-        </w:rPr>
-        <w:t>,</w:t>
-      </w:r>
-      <w:r>
-        <w:rPr>
-          <w:rFonts w:eastAsia="Arial" w:cs="Arial"/>
-          <w:color w:val="000000"/>
-          <w:szCs w:val="24"/>
-        </w:rPr>
-        <w:t xml:space="preserve"> do Marco Civil da Internet.</w:t>
-      </w:r>
-    </w:p>
-    <w:p>
-      <w:pPr>
-        <w:ind w:firstLine="709"/>
-        <w:rPr>
-          <w:rFonts w:eastAsia="Arial" w:cs="Arial"/>
-        </w:rPr>
-      </w:pPr>
-      <w:r>
-        <w:rPr>
-          <w:rFonts w:eastAsia="Arial" w:cs="Arial"/>
-          <w:szCs w:val="24"/>
-        </w:rPr>
         <w:t>Por fim, descumpre</w:t>
       </w:r>
       <w:r>
@@ -14792,100 +14778,100 @@
           <w:color w:val="000000" w:themeColor="text1"/>
           <w:szCs w:val="22"/>
         </w:rPr>
+        <w:t xml:space="preserve">A </w:t>
+      </w:r>
+      <w:r>
+        <w:rPr>
+          <w:rFonts w:eastAsia="Arial" w:cs="Arial"/>
+          <w:color w:val="000000" w:themeColor="text1"/>
+          <w:szCs w:val="22"/>
+        </w:rPr>
+        <w:t xml:space="preserve">ocorrência </w:t>
+      </w:r>
+      <w:r>
+        <w:rPr>
+          <w:rFonts w:eastAsia="Arial" w:cs="Arial"/>
+          <w:color w:val="000000" w:themeColor="text1"/>
+          <w:szCs w:val="22"/>
+        </w:rPr>
+        <w:t xml:space="preserve">de ativos </w:t>
+      </w:r>
+      <w:r>
+        <w:rPr>
+          <w:rFonts w:eastAsia="Arial" w:cs="Arial"/>
+          <w:color w:val="000000" w:themeColor="text1"/>
+          <w:szCs w:val="22"/>
+        </w:rPr>
+        <w:t xml:space="preserve">e softwares </w:t>
+      </w:r>
+      <w:r>
+        <w:rPr>
+          <w:rFonts w:eastAsia="Arial" w:cs="Arial"/>
+          <w:color w:val="000000" w:themeColor="text1"/>
+          <w:szCs w:val="22"/>
+        </w:rPr>
+        <w:t xml:space="preserve">não autorizados </w:t>
+      </w:r>
+      <w:r>
+        <w:rPr>
+          <w:rFonts w:eastAsia="Arial" w:cs="Arial"/>
+          <w:color w:val="000000" w:themeColor="text1"/>
+          <w:szCs w:val="22"/>
+        </w:rPr>
+        <w:t xml:space="preserve">no perímetro das organizações aumentam a superfície e as chances de ataque por terceiros, uma vez que são ativos não gerenciados pela organização e podem ser usados como vetores de ataques ao conter vulnerabilidades, </w:t>
+      </w:r>
+      <w:proofErr w:type="spellStart"/>
+      <w:r>
+        <w:rPr>
+          <w:rFonts w:eastAsia="Arial" w:cs="Arial"/>
+          <w:i/>
+          <w:color w:val="000000" w:themeColor="text1"/>
+          <w:szCs w:val="22"/>
+        </w:rPr>
+        <w:t>exploits</w:t>
+      </w:r>
+      <w:proofErr w:type="spellEnd"/>
+      <w:r>
+        <w:rPr>
+          <w:rFonts w:eastAsia="Arial" w:cs="Arial"/>
+          <w:color w:val="000000" w:themeColor="text1"/>
+          <w:szCs w:val="22"/>
+        </w:rPr>
+        <w:t xml:space="preserve">, </w:t>
+      </w:r>
+      <w:r>
+        <w:rPr>
+          <w:rFonts w:eastAsia="Arial" w:cs="Arial"/>
+          <w:i/>
+          <w:color w:val="000000" w:themeColor="text1"/>
+          <w:szCs w:val="22"/>
+        </w:rPr>
+        <w:t>malwares</w:t>
+      </w:r>
+      <w:r>
+        <w:rPr>
+          <w:rFonts w:eastAsia="Arial" w:cs="Arial"/>
+          <w:color w:val="000000" w:themeColor="text1"/>
+          <w:szCs w:val="22"/>
+        </w:rPr>
+        <w:t>.</w:t>
+      </w:r>
+    </w:p>
+    <w:p>
+      <w:pPr>
+        <w:rPr>
+          <w:rFonts w:eastAsia="Arial" w:cs="Arial"/>
+          <w:color w:val="000000" w:themeColor="text1"/>
+          <w:szCs w:val="22"/>
+        </w:rPr>
+      </w:pPr>
+      <w:r>
+        <w:rPr>
+          <w:rFonts w:eastAsia="Arial" w:cs="Arial"/>
+          <w:color w:val="000000" w:themeColor="text1"/>
+          <w:szCs w:val="22"/>
+        </w:rPr>
         <w:lastRenderedPageBreak/>
-        <w:t xml:space="preserve">A </w:t>
-      </w:r>
-      <w:r>
-        <w:rPr>
-          <w:rFonts w:eastAsia="Arial" w:cs="Arial"/>
-          <w:color w:val="000000" w:themeColor="text1"/>
-          <w:szCs w:val="22"/>
-        </w:rPr>
-        <w:t xml:space="preserve">ocorrência </w:t>
-      </w:r>
-      <w:r>
-        <w:rPr>
-          <w:rFonts w:eastAsia="Arial" w:cs="Arial"/>
-          <w:color w:val="000000" w:themeColor="text1"/>
-          <w:szCs w:val="22"/>
-        </w:rPr>
-        <w:t xml:space="preserve">de ativos </w:t>
-      </w:r>
-      <w:r>
-        <w:rPr>
-          <w:rFonts w:eastAsia="Arial" w:cs="Arial"/>
-          <w:color w:val="000000" w:themeColor="text1"/>
-          <w:szCs w:val="22"/>
-        </w:rPr>
-        <w:t xml:space="preserve">e softwares </w:t>
-      </w:r>
-      <w:r>
-        <w:rPr>
-          <w:rFonts w:eastAsia="Arial" w:cs="Arial"/>
-          <w:color w:val="000000" w:themeColor="text1"/>
-          <w:szCs w:val="22"/>
-        </w:rPr>
-        <w:t xml:space="preserve">não autorizados </w:t>
-      </w:r>
-      <w:r>
-        <w:rPr>
-          <w:rFonts w:eastAsia="Arial" w:cs="Arial"/>
-          <w:color w:val="000000" w:themeColor="text1"/>
-          <w:szCs w:val="22"/>
-        </w:rPr>
-        <w:t xml:space="preserve">no perímetro das organizações aumentam a superfície e as chances de ataque por terceiros, uma vez que são ativos não gerenciados pela organização e podem ser usados como vetores de ataques ao conter vulnerabilidades, </w:t>
-      </w:r>
-      <w:proofErr w:type="spellStart"/>
-      <w:r>
-        <w:rPr>
-          <w:rFonts w:eastAsia="Arial" w:cs="Arial"/>
-          <w:i/>
-          <w:color w:val="000000" w:themeColor="text1"/>
-          <w:szCs w:val="22"/>
-        </w:rPr>
-        <w:t>exploits</w:t>
-      </w:r>
-      <w:proofErr w:type="spellEnd"/>
-      <w:r>
-        <w:rPr>
-          <w:rFonts w:eastAsia="Arial" w:cs="Arial"/>
-          <w:color w:val="000000" w:themeColor="text1"/>
-          <w:szCs w:val="22"/>
-        </w:rPr>
-        <w:t xml:space="preserve">, </w:t>
-      </w:r>
-      <w:r>
-        <w:rPr>
-          <w:rFonts w:eastAsia="Arial" w:cs="Arial"/>
-          <w:i/>
-          <w:color w:val="000000" w:themeColor="text1"/>
-          <w:szCs w:val="22"/>
-        </w:rPr>
-        <w:t>malwares</w:t>
-      </w:r>
-      <w:r>
-        <w:rPr>
-          <w:rFonts w:eastAsia="Arial" w:cs="Arial"/>
-          <w:color w:val="000000" w:themeColor="text1"/>
-          <w:szCs w:val="22"/>
-        </w:rPr>
-        <w:t>.</w:t>
-      </w:r>
-    </w:p>
-    <w:p>
-      <w:pPr>
-        <w:rPr>
-          <w:rFonts w:eastAsia="Arial" w:cs="Arial"/>
-          <w:color w:val="000000" w:themeColor="text1"/>
-          <w:szCs w:val="22"/>
-        </w:rPr>
-      </w:pPr>
-      <w:r>
-        <w:rPr>
-          <w:rFonts w:eastAsia="Arial" w:cs="Arial"/>
-          <w:color w:val="000000" w:themeColor="text1"/>
-          <w:szCs w:val="22"/>
-        </w:rPr>
         <w:t>Devem</w:t>
       </w:r>
       <w:r>
@@ -15623,7 +15609,6 @@
         <w:pStyle w:val="Ttulo2"/>
       </w:pPr>
       <w:r>
-        <w:lastRenderedPageBreak/>
         <w:t xml:space="preserve">Achado </w:t>
       </w:r>
       <w:proofErr w:type="gramStart"/>
@@ -15809,6 +15794,7 @@
           <w:color w:val="000000"/>
           <w:szCs w:val="24"/>
         </w:rPr>
+        <w:lastRenderedPageBreak/>
         <w:t>Lei Federal nº 13.709/2018</w:t>
       </w:r>
       <w:r>
@@ -16231,7 +16217,6 @@
           <w:rFonts w:eastAsia="Arial" w:cs="Arial"/>
           <w:szCs w:val="22"/>
         </w:rPr>
-        <w:lastRenderedPageBreak/>
         <w:t>Manuseio, retenção e descarte de dados. </w:t>
       </w:r>
     </w:p>
@@ -16416,6 +16401,7 @@
           <w:rFonts w:eastAsia="Arial" w:cs="Arial"/>
           <w:szCs w:val="24"/>
         </w:rPr>
+        <w:lastRenderedPageBreak/>
         <w:t>Na ocorrência do conjunto de situações descritas acima</w:t>
       </w:r>
       <w:r>
@@ -16770,15 +16756,7 @@
           <w:rFonts w:eastAsia="Arial" w:cs="Arial"/>
           <w:szCs w:val="22"/>
         </w:rPr>
-        <w:t xml:space="preserve"> dispõe diretrizes que devem ser </w:t>
-      </w:r>
-      <w:r>
-        <w:rPr>
-          <w:rFonts w:eastAsia="Arial" w:cs="Arial"/>
-          <w:szCs w:val="22"/>
-        </w:rPr>
-        <w:lastRenderedPageBreak/>
-        <w:t xml:space="preserve">observadas pelas organizações </w:t>
+        <w:t xml:space="preserve"> dispõe diretrizes que devem ser observadas pelas organizações </w:t>
       </w:r>
       <w:r>
         <w:rPr>
@@ -16933,6 +16911,7 @@
           <w:rFonts w:eastAsia="Arial" w:cs="Arial"/>
           <w:szCs w:val="22"/>
         </w:rPr>
+        <w:lastRenderedPageBreak/>
         <w:t xml:space="preserve">O </w:t>
       </w:r>
       <w:r>
@@ -17355,7 +17334,6 @@
         <w:rPr>
           <w:color w:val="000000"/>
         </w:rPr>
-        <w:lastRenderedPageBreak/>
         <w:t xml:space="preserve">{%p </w:t>
       </w:r>
       <w:proofErr w:type="spellStart"/>
@@ -17696,6 +17674,7 @@
           <w:color w:val="000000" w:themeColor="text1"/>
           <w:szCs w:val="22"/>
         </w:rPr>
+        <w:lastRenderedPageBreak/>
         <w:t xml:space="preserve">Já o descarte seguro dos dados </w:t>
       </w:r>
       <w:r>
@@ -18085,7 +18064,6 @@
           <w:rFonts w:eastAsia="Arial" w:cs="Arial"/>
           <w:szCs w:val="24"/>
         </w:rPr>
-        <w:lastRenderedPageBreak/>
         <w:t xml:space="preserve">Diante disso, será sugerida proposta de encaminhamento à organização a fim de que </w:t>
       </w:r>
       <w:r>
@@ -18383,6 +18361,7 @@
         <w:pStyle w:val="Ttulo2"/>
       </w:pPr>
       <w:r>
+        <w:lastRenderedPageBreak/>
         <w:t xml:space="preserve">Achado </w:t>
       </w:r>
       <w:proofErr w:type="gramStart"/>
@@ -19059,7 +19038,6 @@
         <w:pStyle w:val="Ttulo3"/>
       </w:pPr>
       <w:r>
-        <w:lastRenderedPageBreak/>
         <w:t>Situação Encontrada</w:t>
       </w:r>
     </w:p>
@@ -19196,6 +19174,7 @@
           <w:rFonts w:ascii="Arial" w:hAnsi="Arial" w:cs="Arial"/>
           <w:sz w:val="22"/>
         </w:rPr>
+        <w:lastRenderedPageBreak/>
         <w:t>Nesse contexto, a Norma Técnica ABNT NBR ISO/IEC 27002:2022 dispõe em seu item 8.9 que as configurações de segurança, de hardware e de software sejam estabelecidas, documentadas, implementadas, monitoradas e analisadas criticamente</w:t>
       </w:r>
       <w:r>
@@ -19676,7 +19655,6 @@
           <w:rFonts w:eastAsia="Arial" w:cs="Arial"/>
           <w:szCs w:val="22"/>
         </w:rPr>
-        <w:lastRenderedPageBreak/>
         <w:t xml:space="preserve">Estabelecer um processo de configuração segura </w:t>
       </w:r>
       <w:r>
@@ -19992,6 +19970,7 @@
           <w:rFonts w:cs="Arial"/>
           <w:szCs w:val="22"/>
         </w:rPr>
+        <w:lastRenderedPageBreak/>
         <w:t>A ausência de um bloqueio automático de sessão em ativos corporativos expõe a organização ao risco de perda de confidencialidade dos dados, permitindo o acesso por terceiros não autorizados.</w:t>
       </w:r>
     </w:p>
@@ -20412,7 +20391,6 @@
         <w:rPr>
           <w:color w:val="000000"/>
         </w:rPr>
-        <w:lastRenderedPageBreak/>
         <w:t xml:space="preserve">{%p </w:t>
       </w:r>
       <w:proofErr w:type="spellStart"/>
@@ -20821,6 +20799,7 @@
           <w:rFonts w:eastAsia="Arial" w:cs="Arial"/>
           <w:szCs w:val="22"/>
         </w:rPr>
+        <w:lastRenderedPageBreak/>
         <w:t xml:space="preserve">O tratamento de contas padrão </w:t>
       </w:r>
       <w:r>
@@ -21278,7 +21257,6 @@
         <w:pStyle w:val="Ttulo2"/>
       </w:pPr>
       <w:r>
-        <w:lastRenderedPageBreak/>
         <w:t xml:space="preserve">Achado </w:t>
       </w:r>
       <w:proofErr w:type="gramStart"/>
@@ -21850,6 +21828,7 @@
         <w:pStyle w:val="Ttulo3"/>
       </w:pPr>
       <w:r>
+        <w:lastRenderedPageBreak/>
         <w:t>Evidências</w:t>
       </w:r>
     </w:p>
@@ -22027,16 +22006,7 @@
           <w:rFonts w:ascii="Arial" w:hAnsi="Arial" w:cs="Arial"/>
           <w:sz w:val="22"/>
         </w:rPr>
-        <w:t xml:space="preserve">Ademais, a gestão do controle de acesso é essencial para garantir que os usuários tenham acesso apenas aos dados e sistemas necessários para realizar suas funções, minimizando o risco de exposição indevida. Contas com privilégios excessivos ou mal </w:t>
-      </w:r>
-      <w:r>
-        <w:rPr>
-          <w:rStyle w:val="normaltextrun"/>
-          <w:rFonts w:ascii="Arial" w:hAnsi="Arial" w:cs="Arial"/>
-          <w:sz w:val="22"/>
-        </w:rPr>
-        <w:lastRenderedPageBreak/>
-        <w:t>gerenciadas podem representar uma vulnerabilidade significativa, especialmente em caso de ataques. </w:t>
+        <w:t>Ademais, a gestão do controle de acesso é essencial para garantir que os usuários tenham acesso apenas aos dados e sistemas necessários para realizar suas funções, minimizando o risco de exposição indevida. Contas com privilégios excessivos ou mal gerenciadas podem representar uma vulnerabilidade significativa, especialmente em caso de ataques. </w:t>
       </w:r>
       <w:r>
         <w:rPr>
@@ -22388,6 +22358,7 @@
           <w:rFonts w:eastAsia="Arial" w:cs="Arial"/>
           <w:szCs w:val="24"/>
         </w:rPr>
+        <w:lastRenderedPageBreak/>
         <w:t xml:space="preserve">Por fim, descumprem-se, também, os requisitos previstos no conjunto de boas práticas da </w:t>
       </w:r>
       <w:r>
@@ -22604,7 +22575,6 @@
         <w:rPr>
           <w:color w:val="000000"/>
         </w:rPr>
-        <w:lastRenderedPageBreak/>
         <w:t xml:space="preserve">{%p </w:t>
       </w:r>
       <w:proofErr w:type="spellStart"/>
@@ -22983,7 +22953,15 @@
           <w:rFonts w:eastAsia="Arial" w:cs="Arial"/>
           <w:szCs w:val="22"/>
         </w:rPr>
-        <w:t xml:space="preserve">Contas inativas frequentemente passam despercebidas, tornando-se alvos fáceis para atacantes que desejam explorar sistemas sem serem detectados. Dessa forma, seu tratamento reduz o risco de acessos não autorizados e </w:t>
+        <w:t xml:space="preserve">Contas inativas frequentemente passam despercebidas, tornando-se alvos fáceis para atacantes que desejam explorar sistemas sem serem detectados. Dessa forma, seu </w:t>
+      </w:r>
+      <w:r>
+        <w:rPr>
+          <w:rFonts w:eastAsia="Arial" w:cs="Arial"/>
+          <w:szCs w:val="22"/>
+        </w:rPr>
+        <w:lastRenderedPageBreak/>
+        <w:t xml:space="preserve">tratamento reduz o risco de acessos não autorizados e </w:t>
       </w:r>
       <w:r>
         <w:rPr>
@@ -23252,15 +23230,7 @@
           <w:rFonts w:eastAsia="Arial" w:cs="Arial"/>
           <w:szCs w:val="22"/>
         </w:rPr>
-        <w:t xml:space="preserve"> ao comprometimento de contas administrativas, o que aumenta o impacto lesivo </w:t>
-      </w:r>
-      <w:r>
-        <w:rPr>
-          <w:rFonts w:eastAsia="Arial" w:cs="Arial"/>
-          <w:szCs w:val="22"/>
-        </w:rPr>
-        <w:lastRenderedPageBreak/>
-        <w:t>do vazamento pelas possibilidades de acesso do usuário, facilitando movimentos laterais dos invasores.</w:t>
+        <w:t xml:space="preserve"> ao comprometimento de contas administrativas, o que aumenta o impacto lesivo do vazamento pelas possibilidades de acesso do usuário, facilitando movimentos laterais dos invasores.</w:t>
       </w:r>
     </w:p>
     <w:p>
@@ -23774,6 +23744,7 @@
           <w:sz w:val="24"/>
           <w:szCs w:val="24"/>
         </w:rPr>
+        <w:lastRenderedPageBreak/>
         <w:t>Autenticação multifator (MFA)</w:t>
       </w:r>
     </w:p>
@@ -24037,7 +24008,6 @@
           <w:rFonts w:eastAsia="Arial" w:cs="Arial"/>
           <w:szCs w:val="24"/>
         </w:rPr>
-        <w:lastRenderedPageBreak/>
         <w:t xml:space="preserve">Diante disso, será sugerida proposta de encaminhamento à organização a fim de que </w:t>
       </w:r>
       <w:r>
@@ -26153,138 +26123,7 @@
         <w:tab w:val="right" w:pos="8504"/>
       </w:tabs>
       <w:spacing w:line="240" w:lineRule="auto"/>
-      <w:rPr>
-        <w:color w:val="000000"/>
-      </w:rPr>
-    </w:pPr>
-  </w:p>
-  <w:p>
-    <w:pPr>
-      <w:pBdr>
-        <w:top w:val="nil"/>
-        <w:left w:val="nil"/>
-        <w:bottom w:val="nil"/>
-        <w:right w:val="nil"/>
-        <w:between w:val="nil"/>
-      </w:pBdr>
-      <w:tabs>
-        <w:tab w:val="center" w:pos="4252"/>
-        <w:tab w:val="right" w:pos="8504"/>
-      </w:tabs>
-      <w:spacing w:line="240" w:lineRule="auto"/>
-      <w:rPr>
-        <w:color w:val="000000"/>
-      </w:rPr>
-    </w:pPr>
-    <w:r>
-      <w:rPr>
-        <w:noProof/>
-      </w:rPr>
-      <mc:AlternateContent>
-        <mc:Choice Requires="wps">
-          <w:drawing>
-            <wp:anchor distT="4294967295" distB="4294967295" distL="114300" distR="114300" simplePos="0" relativeHeight="251658241" behindDoc="0" locked="0" layoutInCell="1" hidden="0" allowOverlap="1" wp14:anchorId="7EA11D14" wp14:editId="05E58241">
-              <wp:simplePos x="0" y="0"/>
-              <wp:positionH relativeFrom="column">
-                <wp:posOffset>1</wp:posOffset>
-              </wp:positionH>
-              <wp:positionV relativeFrom="paragraph">
-                <wp:posOffset>68596</wp:posOffset>
-              </wp:positionV>
-              <wp:extent cx="0" cy="12700"/>
-              <wp:effectExtent l="0" t="0" r="0" b="0"/>
-              <wp:wrapNone/>
-              <wp:docPr id="1779875481" name="Conector de Seta Reta 1779875481"/>
-              <wp:cNvGraphicFramePr/>
-              <a:graphic xmlns:a="http://schemas.openxmlformats.org/drawingml/2006/main">
-                <a:graphicData uri="http://schemas.microsoft.com/office/word/2010/wordprocessingShape">
-                  <wps:wsp>
-                    <wps:cNvCnPr/>
-                    <wps:spPr>
-                      <a:xfrm>
-                        <a:off x="2552000" y="3780000"/>
-                        <a:ext cx="5588000" cy="0"/>
-                      </a:xfrm>
-                      <a:prstGeom prst="straightConnector1">
-                        <a:avLst/>
-                      </a:prstGeom>
-                      <a:noFill/>
-                      <a:ln w="9525" cap="flat" cmpd="sng">
-                        <a:solidFill>
-                          <a:srgbClr val="000000"/>
-                        </a:solidFill>
-                        <a:prstDash val="solid"/>
-                        <a:round/>
-                        <a:headEnd type="none" w="sm" len="sm"/>
-                        <a:tailEnd type="none" w="sm" len="sm"/>
-                      </a:ln>
-                    </wps:spPr>
-                    <wps:bodyPr/>
-                  </wps:wsp>
-                </a:graphicData>
-              </a:graphic>
-            </wp:anchor>
-          </w:drawing>
-        </mc:Choice>
-        <mc:Fallback xmlns:sl="http://schemas.openxmlformats.org/schemaLibrary/2006/main" xmlns:a="http://schemas.openxmlformats.org/drawingml/2006/main" xmlns:pic="http://schemas.openxmlformats.org/drawingml/2006/picture" xmlns:c="http://schemas.openxmlformats.org/drawingml/2006/chart" xmlns:lc="http://schemas.openxmlformats.org/drawingml/2006/lockedCanvas" xmlns:dgm="http://schemas.openxmlformats.org/drawingml/2006/diagram" xmlns="http://schemas.microsoft.com/office/tasks/2019/documenttasks" xmlns:cr="http://schemas.microsoft.com/office/comments/2020/reactions" xmlns:arto="http://schemas.microsoft.com/office/word/2006/arto">
-          <w:drawing>
-            <wp:anchor allowOverlap="1" behindDoc="0" distB="4294967295" distT="4294967295" distL="114300" distR="114300" hidden="0" layoutInCell="1" locked="0" relativeHeight="0" simplePos="0">
-              <wp:simplePos x="0" y="0"/>
-              <wp:positionH relativeFrom="column">
-                <wp:posOffset>1</wp:posOffset>
-              </wp:positionH>
-              <wp:positionV relativeFrom="paragraph">
-                <wp:posOffset>68596</wp:posOffset>
-              </wp:positionV>
-              <wp:extent cx="0" cy="12700"/>
-              <wp:effectExtent b="0" l="0" r="0" t="0"/>
-              <wp:wrapNone/>
-              <wp:docPr id="1779875481" name="image6.png"/>
-              <a:graphic>
-                <a:graphicData uri="http://schemas.openxmlformats.org/drawingml/2006/picture">
-                  <pic:pic>
-                    <pic:nvPicPr>
-                      <pic:cNvPr id="0" name="image6.png"/>
-                      <pic:cNvPicPr preferRelativeResize="0"/>
-                    </pic:nvPicPr>
-                    <pic:blipFill>
-                      <a:blip r:embed="rId3"/>
-                      <a:srcRect/>
-                      <a:stretch>
-                        <a:fillRect/>
-                      </a:stretch>
-                    </pic:blipFill>
-                    <pic:spPr>
-                      <a:xfrm>
-                        <a:off x="0" y="0"/>
-                        <a:ext cx="0" cy="12700"/>
-                      </a:xfrm>
-                      <a:prstGeom prst="rect"/>
-                      <a:ln/>
-                    </pic:spPr>
-                  </pic:pic>
-                </a:graphicData>
-              </a:graphic>
-            </wp:anchor>
-          </w:drawing>
-        </mc:Fallback>
-      </mc:AlternateContent>
-    </w:r>
-  </w:p>
-  <w:p>
-    <w:pPr>
-      <w:pBdr>
-        <w:top w:val="nil"/>
-        <w:left w:val="nil"/>
-        <w:bottom w:val="nil"/>
-        <w:right w:val="nil"/>
-        <w:between w:val="nil"/>
-      </w:pBdr>
-      <w:tabs>
-        <w:tab w:val="center" w:pos="4252"/>
-        <w:tab w:val="right" w:pos="8504"/>
-      </w:tabs>
-      <w:spacing w:line="240" w:lineRule="auto"/>
+      <w:ind w:firstLine="0"/>
       <w:rPr>
         <w:color w:val="000000"/>
       </w:rPr>
@@ -30536,10 +30375,6 @@
 </file>
 
 <file path=customXml/item1.xml><?xml version="1.0" encoding="utf-8"?>
-<b:Sources xmlns:b="http://schemas.openxmlformats.org/officeDocument/2006/bibliography" xmlns="http://schemas.openxmlformats.org/officeDocument/2006/bibliography" SelectedStyle="\IEEE2006OfficeOnline.xsl" StyleName="IEEE" Version="2006"/>
-</file>
-
-<file path=customXml/item2.xml><?xml version="1.0" encoding="utf-8"?>
 <?mso-contentType ?>
 <FormTemplates xmlns="http://schemas.microsoft.com/sharepoint/v3/contenttype/forms">
   <Display>DocumentLibraryForm</Display>
@@ -30548,10 +30383,14 @@
 </FormTemplates>
 </file>
 
+<file path=customXml/item2.xml><?xml version="1.0" encoding="utf-8"?>
+<b:Sources xmlns:b="http://schemas.openxmlformats.org/officeDocument/2006/bibliography" xmlns="http://schemas.openxmlformats.org/officeDocument/2006/bibliography" SelectedStyle="\IEEE2006OfficeOnline.xsl" StyleName="IEEE" Version="2006"/>
+</file>
+
 <file path=customXml/item3.xml><?xml version="1.0" encoding="utf-8"?>
-<p:properties xmlns:p="http://schemas.microsoft.com/office/2006/metadata/properties" xmlns:xsi="http://www.w3.org/2001/XMLSchema-instance" xmlns:pc="http://schemas.microsoft.com/office/infopath/2007/PartnerControls">
-  <documentManagement/>
-</p:properties>
+<go:gDocsCustomXmlDataStorage xmlns:go="http://customooxmlschemas.google.com/" xmlns:r="http://schemas.openxmlformats.org/officeDocument/2006/relationships" uri="GoogleDocsCustomDataVersion2">
+  <go:docsCustomData xmlns:go="http://customooxmlschemas.google.com/" roundtripDataSignature="AMtx7mjzI106X9uAE8/Y55RY9OBdAi8ivg==">CgMxLjAyDmgudjQ3dmlndW96M2NoOAByITFORk1la3hqN2NRcXFyekp4UWdmNjB6ZEVHWWlnbk9FQg==</go:docsCustomData>
+</go:gDocsCustomXmlDataStorage>
 </file>
 
 <file path=customXml/item4.xml><?xml version="1.0" encoding="utf-8"?>
@@ -30699,12 +30538,20 @@
 </file>
 
 <file path=customXml/item5.xml><?xml version="1.0" encoding="utf-8"?>
-<go:gDocsCustomXmlDataStorage xmlns:go="http://customooxmlschemas.google.com/" xmlns:r="http://schemas.openxmlformats.org/officeDocument/2006/relationships" uri="GoogleDocsCustomDataVersion2">
-  <go:docsCustomData xmlns:go="http://customooxmlschemas.google.com/" roundtripDataSignature="AMtx7mjzI106X9uAE8/Y55RY9OBdAi8ivg==">CgMxLjAyDmgudjQ3dmlndW96M2NoOAByITFORk1la3hqN2NRcXFyekp4UWdmNjB6ZEVHWWlnbk9FQg==</go:docsCustomData>
-</go:gDocsCustomXmlDataStorage>
+<p:properties xmlns:p="http://schemas.microsoft.com/office/2006/metadata/properties" xmlns:xsi="http://www.w3.org/2001/XMLSchema-instance" xmlns:pc="http://schemas.microsoft.com/office/infopath/2007/PartnerControls">
+  <documentManagement/>
+</p:properties>
 </file>
 
 <file path=customXml/itemProps1.xml><?xml version="1.0" encoding="utf-8"?>
+<ds:datastoreItem xmlns:ds="http://schemas.openxmlformats.org/officeDocument/2006/customXml" ds:itemID="{E8CD7CA6-34CB-4CBB-9D2A-B78A43F31D57}">
+  <ds:schemaRefs>
+    <ds:schemaRef ds:uri="http://schemas.microsoft.com/sharepoint/v3/contenttype/forms"/>
+  </ds:schemaRefs>
+</ds:datastoreItem>
+</file>
+
+<file path=customXml/itemProps2.xml><?xml version="1.0" encoding="utf-8"?>
 <ds:datastoreItem xmlns:ds="http://schemas.openxmlformats.org/officeDocument/2006/customXml" ds:itemID="{983658B0-B94E-4C2C-B45C-2F06A54F1409}">
   <ds:schemaRefs>
     <ds:schemaRef ds:uri="http://schemas.openxmlformats.org/officeDocument/2006/bibliography"/>
@@ -30712,19 +30559,11 @@
 </ds:datastoreItem>
 </file>
 
-<file path=customXml/itemProps2.xml><?xml version="1.0" encoding="utf-8"?>
-<ds:datastoreItem xmlns:ds="http://schemas.openxmlformats.org/officeDocument/2006/customXml" ds:itemID="{E8CD7CA6-34CB-4CBB-9D2A-B78A43F31D57}">
+<file path=customXml/itemProps3.xml><?xml version="1.0" encoding="utf-8"?>
+<ds:datastoreItem xmlns:ds="http://schemas.openxmlformats.org/officeDocument/2006/customXml" ds:itemID="{11111111-1234-1234-1234-123412341234}">
   <ds:schemaRefs>
-    <ds:schemaRef ds:uri="http://schemas.microsoft.com/sharepoint/v3/contenttype/forms"/>
-  </ds:schemaRefs>
-</ds:datastoreItem>
-</file>
-
-<file path=customXml/itemProps3.xml><?xml version="1.0" encoding="utf-8"?>
-<ds:datastoreItem xmlns:ds="http://schemas.openxmlformats.org/officeDocument/2006/customXml" ds:itemID="{64F7848B-4C6F-4348-B4B7-5F5BA7D9C422}">
-  <ds:schemaRefs>
-    <ds:schemaRef ds:uri="http://schemas.microsoft.com/office/2006/metadata/properties"/>
-    <ds:schemaRef ds:uri="http://schemas.microsoft.com/office/infopath/2007/PartnerControls"/>
+    <ds:schemaRef ds:uri="http://customooxmlschemas.google.com/"/>
+    <ds:schemaRef ds:uri="http://schemas.openxmlformats.org/officeDocument/2006/relationships"/>
   </ds:schemaRefs>
 </ds:datastoreItem>
 </file>
@@ -30748,10 +30587,10 @@
 </file>
 
 <file path=customXml/itemProps5.xml><?xml version="1.0" encoding="utf-8"?>
-<ds:datastoreItem xmlns:ds="http://schemas.openxmlformats.org/officeDocument/2006/customXml" ds:itemID="{11111111-1234-1234-1234-123412341234}">
+<ds:datastoreItem xmlns:ds="http://schemas.openxmlformats.org/officeDocument/2006/customXml" ds:itemID="{64F7848B-4C6F-4348-B4B7-5F5BA7D9C422}">
   <ds:schemaRefs>
-    <ds:schemaRef ds:uri="http://customooxmlschemas.google.com/"/>
-    <ds:schemaRef ds:uri="http://schemas.openxmlformats.org/officeDocument/2006/relationships"/>
+    <ds:schemaRef ds:uri="http://schemas.microsoft.com/office/2006/metadata/properties"/>
+    <ds:schemaRef ds:uri="http://schemas.microsoft.com/office/infopath/2007/PartnerControls"/>
   </ds:schemaRefs>
 </ds:datastoreItem>
 </file>
</xml_diff>

<commit_message>
ajustado espacamento da capa
</commit_message>
<xml_diff>
--- a/docs/template-relatorio-individual.docx
+++ b/docs/template-relatorio-individual.docx
@@ -29260,11 +29260,11 @@
     <w:autoRedefine/>
     <w:uiPriority w:val="11"/>
     <w:qFormat/>
-    <w:rsid w:val="00007557"/>
+    <w:rsid w:val="00A461E3"/>
     <w:pPr>
       <w:keepNext/>
       <w:keepLines/>
-      <w:spacing w:after="6200"/>
+      <w:spacing w:after="7000"/>
       <w:jc w:val="center"/>
     </w:pPr>
     <w:rPr>
@@ -30375,6 +30375,10 @@
 </file>
 
 <file path=customXml/item1.xml><?xml version="1.0" encoding="utf-8"?>
+<b:Sources xmlns:b="http://schemas.openxmlformats.org/officeDocument/2006/bibliography" xmlns="http://schemas.openxmlformats.org/officeDocument/2006/bibliography" SelectedStyle="\IEEE2006OfficeOnline.xsl" StyleName="IEEE" Version="2006"/>
+</file>
+
+<file path=customXml/item2.xml><?xml version="1.0" encoding="utf-8"?>
 <?mso-contentType ?>
 <FormTemplates xmlns="http://schemas.microsoft.com/sharepoint/v3/contenttype/forms">
   <Display>DocumentLibraryForm</Display>
@@ -30383,14 +30387,10 @@
 </FormTemplates>
 </file>
 
-<file path=customXml/item2.xml><?xml version="1.0" encoding="utf-8"?>
-<b:Sources xmlns:b="http://schemas.openxmlformats.org/officeDocument/2006/bibliography" xmlns="http://schemas.openxmlformats.org/officeDocument/2006/bibliography" SelectedStyle="\IEEE2006OfficeOnline.xsl" StyleName="IEEE" Version="2006"/>
-</file>
-
 <file path=customXml/item3.xml><?xml version="1.0" encoding="utf-8"?>
-<go:gDocsCustomXmlDataStorage xmlns:go="http://customooxmlschemas.google.com/" xmlns:r="http://schemas.openxmlformats.org/officeDocument/2006/relationships" uri="GoogleDocsCustomDataVersion2">
-  <go:docsCustomData xmlns:go="http://customooxmlschemas.google.com/" roundtripDataSignature="AMtx7mjzI106X9uAE8/Y55RY9OBdAi8ivg==">CgMxLjAyDmgudjQ3dmlndW96M2NoOAByITFORk1la3hqN2NRcXFyekp4UWdmNjB6ZEVHWWlnbk9FQg==</go:docsCustomData>
-</go:gDocsCustomXmlDataStorage>
+<p:properties xmlns:p="http://schemas.microsoft.com/office/2006/metadata/properties" xmlns:xsi="http://www.w3.org/2001/XMLSchema-instance" xmlns:pc="http://schemas.microsoft.com/office/infopath/2007/PartnerControls">
+  <documentManagement/>
+</p:properties>
 </file>
 
 <file path=customXml/item4.xml><?xml version="1.0" encoding="utf-8"?>
@@ -30538,12 +30538,20 @@
 </file>
 
 <file path=customXml/item5.xml><?xml version="1.0" encoding="utf-8"?>
-<p:properties xmlns:p="http://schemas.microsoft.com/office/2006/metadata/properties" xmlns:xsi="http://www.w3.org/2001/XMLSchema-instance" xmlns:pc="http://schemas.microsoft.com/office/infopath/2007/PartnerControls">
-  <documentManagement/>
-</p:properties>
+<go:gDocsCustomXmlDataStorage xmlns:go="http://customooxmlschemas.google.com/" xmlns:r="http://schemas.openxmlformats.org/officeDocument/2006/relationships" uri="GoogleDocsCustomDataVersion2">
+  <go:docsCustomData xmlns:go="http://customooxmlschemas.google.com/" roundtripDataSignature="AMtx7mjzI106X9uAE8/Y55RY9OBdAi8ivg==">CgMxLjAyDmgudjQ3dmlndW96M2NoOAByITFORk1la3hqN2NRcXFyekp4UWdmNjB6ZEVHWWlnbk9FQg==</go:docsCustomData>
+</go:gDocsCustomXmlDataStorage>
 </file>
 
 <file path=customXml/itemProps1.xml><?xml version="1.0" encoding="utf-8"?>
+<ds:datastoreItem xmlns:ds="http://schemas.openxmlformats.org/officeDocument/2006/customXml" ds:itemID="{983658B0-B94E-4C2C-B45C-2F06A54F1409}">
+  <ds:schemaRefs>
+    <ds:schemaRef ds:uri="http://schemas.openxmlformats.org/officeDocument/2006/bibliography"/>
+  </ds:schemaRefs>
+</ds:datastoreItem>
+</file>
+
+<file path=customXml/itemProps2.xml><?xml version="1.0" encoding="utf-8"?>
 <ds:datastoreItem xmlns:ds="http://schemas.openxmlformats.org/officeDocument/2006/customXml" ds:itemID="{E8CD7CA6-34CB-4CBB-9D2A-B78A43F31D57}">
   <ds:schemaRefs>
     <ds:schemaRef ds:uri="http://schemas.microsoft.com/sharepoint/v3/contenttype/forms"/>
@@ -30551,19 +30559,11 @@
 </ds:datastoreItem>
 </file>
 
-<file path=customXml/itemProps2.xml><?xml version="1.0" encoding="utf-8"?>
-<ds:datastoreItem xmlns:ds="http://schemas.openxmlformats.org/officeDocument/2006/customXml" ds:itemID="{983658B0-B94E-4C2C-B45C-2F06A54F1409}">
+<file path=customXml/itemProps3.xml><?xml version="1.0" encoding="utf-8"?>
+<ds:datastoreItem xmlns:ds="http://schemas.openxmlformats.org/officeDocument/2006/customXml" ds:itemID="{64F7848B-4C6F-4348-B4B7-5F5BA7D9C422}">
   <ds:schemaRefs>
-    <ds:schemaRef ds:uri="http://schemas.openxmlformats.org/officeDocument/2006/bibliography"/>
-  </ds:schemaRefs>
-</ds:datastoreItem>
-</file>
-
-<file path=customXml/itemProps3.xml><?xml version="1.0" encoding="utf-8"?>
-<ds:datastoreItem xmlns:ds="http://schemas.openxmlformats.org/officeDocument/2006/customXml" ds:itemID="{11111111-1234-1234-1234-123412341234}">
-  <ds:schemaRefs>
-    <ds:schemaRef ds:uri="http://customooxmlschemas.google.com/"/>
-    <ds:schemaRef ds:uri="http://schemas.openxmlformats.org/officeDocument/2006/relationships"/>
+    <ds:schemaRef ds:uri="http://schemas.microsoft.com/office/2006/metadata/properties"/>
+    <ds:schemaRef ds:uri="http://schemas.microsoft.com/office/infopath/2007/PartnerControls"/>
   </ds:schemaRefs>
 </ds:datastoreItem>
 </file>
@@ -30587,10 +30587,10 @@
 </file>
 
 <file path=customXml/itemProps5.xml><?xml version="1.0" encoding="utf-8"?>
-<ds:datastoreItem xmlns:ds="http://schemas.openxmlformats.org/officeDocument/2006/customXml" ds:itemID="{64F7848B-4C6F-4348-B4B7-5F5BA7D9C422}">
+<ds:datastoreItem xmlns:ds="http://schemas.openxmlformats.org/officeDocument/2006/customXml" ds:itemID="{11111111-1234-1234-1234-123412341234}">
   <ds:schemaRefs>
-    <ds:schemaRef ds:uri="http://schemas.microsoft.com/office/2006/metadata/properties"/>
-    <ds:schemaRef ds:uri="http://schemas.microsoft.com/office/infopath/2007/PartnerControls"/>
+    <ds:schemaRef ds:uri="http://customooxmlschemas.google.com/"/>
+    <ds:schemaRef ds:uri="http://schemas.openxmlformats.org/officeDocument/2006/relationships"/>
   </ds:schemaRefs>
 </ds:datastoreItem>
 </file>
</xml_diff>